<commit_message>
Dark-mode screenshots, submission date, theme-aware contrast fix for the password toggle
Co-Authored-By: Claude Opus 5.5 <noreply@anthropic.com>
</commit_message>
<xml_diff>
--- a/docs/Project_Report.docx
+++ b/docs/Project_Report.docx
@@ -173,7 +173,7 @@
         <w:t xml:space="preserve">Date of Submission: </w:t>
       </w:r>
       <w:r>
-        <w:t>[DD/MM/YYYY]</w:t>
+        <w:t>16/10/2026</w:t>
       </w:r>
     </w:p>
     <w:p>
@@ -185,7 +185,7 @@
       <w:pPr>
         <w:pStyle w:val="Heading1"/>
       </w:pPr>
-      <w:bookmarkStart w:id="0" w:name="_Toc242980175"/>
+      <w:bookmarkStart w:id="0" w:name="_Toc242980798"/>
       <w:r>
         <w:lastRenderedPageBreak/>
         <w:t>Abstract</w:t>
@@ -214,7 +214,7 @@
       <w:pPr>
         <w:pStyle w:val="Heading2"/>
       </w:pPr>
-      <w:bookmarkStart w:id="1" w:name="_Toc242980176"/>
+      <w:bookmarkStart w:id="1" w:name="_Toc242980799"/>
       <w:r>
         <w:t>Keywords</w:t>
       </w:r>
@@ -238,7 +238,7 @@
       <w:pPr>
         <w:pStyle w:val="Heading1"/>
       </w:pPr>
-      <w:bookmarkStart w:id="2" w:name="_Toc242980177"/>
+      <w:bookmarkStart w:id="2" w:name="_Toc242980800"/>
       <w:r>
         <w:lastRenderedPageBreak/>
         <w:t>Table of Contents</w:t>
@@ -248,7 +248,7 @@
     <w:sdt>
       <w:sdtPr>
         <w:alias w:val="Table of Contents"/>
-        <w:id w:val="1770968069"/>
+        <w:id w:val="241311095"/>
       </w:sdtPr>
       <w:sdtEndPr/>
       <w:sdtContent>
@@ -271,7 +271,7 @@
           <w:r>
             <w:fldChar w:fldCharType="separate"/>
           </w:r>
-          <w:hyperlink w:anchor="_Toc242980175" w:history="1">
+          <w:hyperlink w:anchor="_Toc242980798" w:history="1">
             <w:r>
               <w:rPr>
                 <w:rStyle w:val="Hyperlink"/>
@@ -295,7 +295,7 @@
               <w:rPr>
                 <w:noProof/>
               </w:rPr>
-              <w:instrText xml:space="preserve"> PAGEREF _Toc242980175 \h </w:instrText>
+              <w:instrText xml:space="preserve"> PAGEREF _Toc242980798 \h </w:instrText>
             </w:r>
             <w:r>
               <w:rPr>
@@ -332,7 +332,7 @@
               <w:noProof/>
             </w:rPr>
           </w:pPr>
-          <w:hyperlink w:anchor="_Toc242980176" w:history="1">
+          <w:hyperlink w:anchor="_Toc242980799" w:history="1">
             <w:r>
               <w:rPr>
                 <w:rStyle w:val="Hyperlink"/>
@@ -356,7 +356,7 @@
               <w:rPr>
                 <w:noProof/>
               </w:rPr>
-              <w:instrText xml:space="preserve"> PAGEREF _Toc242980176 \h </w:instrText>
+              <w:instrText xml:space="preserve"> PAGEREF _Toc242980799 \h </w:instrText>
             </w:r>
             <w:r>
               <w:rPr>
@@ -393,7 +393,7 @@
               <w:noProof/>
             </w:rPr>
           </w:pPr>
-          <w:hyperlink w:anchor="_Toc242980177" w:history="1">
+          <w:hyperlink w:anchor="_Toc242980800" w:history="1">
             <w:r>
               <w:rPr>
                 <w:rStyle w:val="Hyperlink"/>
@@ -417,7 +417,7 @@
               <w:rPr>
                 <w:noProof/>
               </w:rPr>
-              <w:instrText xml:space="preserve"> PAGEREF _Toc242980177 \h </w:instrText>
+              <w:instrText xml:space="preserve"> PAGEREF _Toc242980800 \h </w:instrText>
             </w:r>
             <w:r>
               <w:rPr>
@@ -454,7 +454,7 @@
               <w:noProof/>
             </w:rPr>
           </w:pPr>
-          <w:hyperlink w:anchor="_Toc242980178" w:history="1">
+          <w:hyperlink w:anchor="_Toc242980801" w:history="1">
             <w:r>
               <w:rPr>
                 <w:rStyle w:val="Hyperlink"/>
@@ -478,7 +478,7 @@
               <w:rPr>
                 <w:noProof/>
               </w:rPr>
-              <w:instrText xml:space="preserve"> PAGEREF _Toc242980178 \h </w:instrText>
+              <w:instrText xml:space="preserve"> PAGEREF _Toc242980801 \h </w:instrText>
             </w:r>
             <w:r>
               <w:rPr>
@@ -515,7 +515,7 @@
               <w:noProof/>
             </w:rPr>
           </w:pPr>
-          <w:hyperlink w:anchor="_Toc242980179" w:history="1">
+          <w:hyperlink w:anchor="_Toc242980802" w:history="1">
             <w:r>
               <w:rPr>
                 <w:rStyle w:val="Hyperlink"/>
@@ -539,7 +539,7 @@
               <w:rPr>
                 <w:noProof/>
               </w:rPr>
-              <w:instrText xml:space="preserve"> PAGEREF _Toc242980179 \h </w:instrText>
+              <w:instrText xml:space="preserve"> PAGEREF _Toc242980802 \h </w:instrText>
             </w:r>
             <w:r>
               <w:rPr>
@@ -576,7 +576,7 @@
               <w:noProof/>
             </w:rPr>
           </w:pPr>
-          <w:hyperlink w:anchor="_Toc242980180" w:history="1">
+          <w:hyperlink w:anchor="_Toc242980803" w:history="1">
             <w:r>
               <w:rPr>
                 <w:rStyle w:val="Hyperlink"/>
@@ -600,7 +600,7 @@
               <w:rPr>
                 <w:noProof/>
               </w:rPr>
-              <w:instrText xml:space="preserve"> PAGEREF _Toc242980180 \h </w:instrText>
+              <w:instrText xml:space="preserve"> PAGEREF _Toc242980803 \h </w:instrText>
             </w:r>
             <w:r>
               <w:rPr>
@@ -637,7 +637,7 @@
               <w:noProof/>
             </w:rPr>
           </w:pPr>
-          <w:hyperlink w:anchor="_Toc242980181" w:history="1">
+          <w:hyperlink w:anchor="_Toc242980804" w:history="1">
             <w:r>
               <w:rPr>
                 <w:rStyle w:val="Hyperlink"/>
@@ -661,7 +661,7 @@
               <w:rPr>
                 <w:noProof/>
               </w:rPr>
-              <w:instrText xml:space="preserve"> PAGEREF _Toc242980181 \h </w:instrText>
+              <w:instrText xml:space="preserve"> PAGEREF _Toc242980804 \h </w:instrText>
             </w:r>
             <w:r>
               <w:rPr>
@@ -698,7 +698,7 @@
               <w:noProof/>
             </w:rPr>
           </w:pPr>
-          <w:hyperlink w:anchor="_Toc242980182" w:history="1">
+          <w:hyperlink w:anchor="_Toc242980805" w:history="1">
             <w:r>
               <w:rPr>
                 <w:rStyle w:val="Hyperlink"/>
@@ -722,7 +722,7 @@
               <w:rPr>
                 <w:noProof/>
               </w:rPr>
-              <w:instrText xml:space="preserve"> PAGEREF _Toc242980182 \h </w:instrText>
+              <w:instrText xml:space="preserve"> PAGEREF _Toc242980805 \h </w:instrText>
             </w:r>
             <w:r>
               <w:rPr>
@@ -759,7 +759,7 @@
               <w:noProof/>
             </w:rPr>
           </w:pPr>
-          <w:hyperlink w:anchor="_Toc242980183" w:history="1">
+          <w:hyperlink w:anchor="_Toc242980806" w:history="1">
             <w:r>
               <w:rPr>
                 <w:rStyle w:val="Hyperlink"/>
@@ -783,7 +783,7 @@
               <w:rPr>
                 <w:noProof/>
               </w:rPr>
-              <w:instrText xml:space="preserve"> PAGEREF _Toc242980183 \h </w:instrText>
+              <w:instrText xml:space="preserve"> PAGEREF _Toc242980806 \h </w:instrText>
             </w:r>
             <w:r>
               <w:rPr>
@@ -820,7 +820,7 @@
               <w:noProof/>
             </w:rPr>
           </w:pPr>
-          <w:hyperlink w:anchor="_Toc242980184" w:history="1">
+          <w:hyperlink w:anchor="_Toc242980807" w:history="1">
             <w:r>
               <w:rPr>
                 <w:rStyle w:val="Hyperlink"/>
@@ -844,7 +844,7 @@
               <w:rPr>
                 <w:noProof/>
               </w:rPr>
-              <w:instrText xml:space="preserve"> PAGEREF _Toc242980184 \h </w:instrText>
+              <w:instrText xml:space="preserve"> PAGEREF _Toc242980807 \h </w:instrText>
             </w:r>
             <w:r>
               <w:rPr>
@@ -881,7 +881,7 @@
               <w:noProof/>
             </w:rPr>
           </w:pPr>
-          <w:hyperlink w:anchor="_Toc242980185" w:history="1">
+          <w:hyperlink w:anchor="_Toc242980808" w:history="1">
             <w:r>
               <w:rPr>
                 <w:rStyle w:val="Hyperlink"/>
@@ -905,7 +905,7 @@
               <w:rPr>
                 <w:noProof/>
               </w:rPr>
-              <w:instrText xml:space="preserve"> PAGEREF _Toc242980185 \h </w:instrText>
+              <w:instrText xml:space="preserve"> PAGEREF _Toc242980808 \h </w:instrText>
             </w:r>
             <w:r>
               <w:rPr>
@@ -942,7 +942,7 @@
               <w:noProof/>
             </w:rPr>
           </w:pPr>
-          <w:hyperlink w:anchor="_Toc242980186" w:history="1">
+          <w:hyperlink w:anchor="_Toc242980809" w:history="1">
             <w:r>
               <w:rPr>
                 <w:rStyle w:val="Hyperlink"/>
@@ -966,7 +966,7 @@
               <w:rPr>
                 <w:noProof/>
               </w:rPr>
-              <w:instrText xml:space="preserve"> PAGEREF _Toc242980186 \h </w:instrText>
+              <w:instrText xml:space="preserve"> PAGEREF _Toc242980809 \h </w:instrText>
             </w:r>
             <w:r>
               <w:rPr>
@@ -1003,7 +1003,7 @@
               <w:noProof/>
             </w:rPr>
           </w:pPr>
-          <w:hyperlink w:anchor="_Toc242980187" w:history="1">
+          <w:hyperlink w:anchor="_Toc242980810" w:history="1">
             <w:r>
               <w:rPr>
                 <w:rStyle w:val="Hyperlink"/>
@@ -1027,7 +1027,7 @@
               <w:rPr>
                 <w:noProof/>
               </w:rPr>
-              <w:instrText xml:space="preserve"> PAGEREF _Toc242980187 \h </w:instrText>
+              <w:instrText xml:space="preserve"> PAGEREF _Toc242980810 \h </w:instrText>
             </w:r>
             <w:r>
               <w:rPr>
@@ -1064,7 +1064,7 @@
               <w:noProof/>
             </w:rPr>
           </w:pPr>
-          <w:hyperlink w:anchor="_Toc242980188" w:history="1">
+          <w:hyperlink w:anchor="_Toc242980811" w:history="1">
             <w:r>
               <w:rPr>
                 <w:rStyle w:val="Hyperlink"/>
@@ -1088,7 +1088,7 @@
               <w:rPr>
                 <w:noProof/>
               </w:rPr>
-              <w:instrText xml:space="preserve"> PAGEREF _Toc242980188 \h </w:instrText>
+              <w:instrText xml:space="preserve"> PAGEREF _Toc242980811 \h </w:instrText>
             </w:r>
             <w:r>
               <w:rPr>
@@ -1125,7 +1125,7 @@
               <w:noProof/>
             </w:rPr>
           </w:pPr>
-          <w:hyperlink w:anchor="_Toc242980189" w:history="1">
+          <w:hyperlink w:anchor="_Toc242980812" w:history="1">
             <w:r>
               <w:rPr>
                 <w:rStyle w:val="Hyperlink"/>
@@ -1149,7 +1149,7 @@
               <w:rPr>
                 <w:noProof/>
               </w:rPr>
-              <w:instrText xml:space="preserve"> PAGEREF _Toc242980189 \h </w:instrText>
+              <w:instrText xml:space="preserve"> PAGEREF _Toc242980812 \h </w:instrText>
             </w:r>
             <w:r>
               <w:rPr>
@@ -1186,7 +1186,7 @@
               <w:noProof/>
             </w:rPr>
           </w:pPr>
-          <w:hyperlink w:anchor="_Toc242980190" w:history="1">
+          <w:hyperlink w:anchor="_Toc242980813" w:history="1">
             <w:r>
               <w:rPr>
                 <w:rStyle w:val="Hyperlink"/>
@@ -1210,7 +1210,7 @@
               <w:rPr>
                 <w:noProof/>
               </w:rPr>
-              <w:instrText xml:space="preserve"> PAGEREF _Toc242980190 \h </w:instrText>
+              <w:instrText xml:space="preserve"> PAGEREF _Toc242980813 \h </w:instrText>
             </w:r>
             <w:r>
               <w:rPr>
@@ -1247,7 +1247,7 @@
               <w:noProof/>
             </w:rPr>
           </w:pPr>
-          <w:hyperlink w:anchor="_Toc242980191" w:history="1">
+          <w:hyperlink w:anchor="_Toc242980814" w:history="1">
             <w:r>
               <w:rPr>
                 <w:rStyle w:val="Hyperlink"/>
@@ -1271,7 +1271,7 @@
               <w:rPr>
                 <w:noProof/>
               </w:rPr>
-              <w:instrText xml:space="preserve"> PAGEREF _Toc242980191 \h </w:instrText>
+              <w:instrText xml:space="preserve"> PAGEREF _Toc242980814 \h </w:instrText>
             </w:r>
             <w:r>
               <w:rPr>
@@ -1308,7 +1308,7 @@
               <w:noProof/>
             </w:rPr>
           </w:pPr>
-          <w:hyperlink w:anchor="_Toc242980192" w:history="1">
+          <w:hyperlink w:anchor="_Toc242980815" w:history="1">
             <w:r>
               <w:rPr>
                 <w:rStyle w:val="Hyperlink"/>
@@ -1332,7 +1332,7 @@
               <w:rPr>
                 <w:noProof/>
               </w:rPr>
-              <w:instrText xml:space="preserve"> PAGEREF _Toc242980192 \h </w:instrText>
+              <w:instrText xml:space="preserve"> PAGEREF _Toc242980815 \h </w:instrText>
             </w:r>
             <w:r>
               <w:rPr>
@@ -1369,7 +1369,7 @@
               <w:noProof/>
             </w:rPr>
           </w:pPr>
-          <w:hyperlink w:anchor="_Toc242980193" w:history="1">
+          <w:hyperlink w:anchor="_Toc242980816" w:history="1">
             <w:r>
               <w:rPr>
                 <w:rStyle w:val="Hyperlink"/>
@@ -1393,7 +1393,7 @@
               <w:rPr>
                 <w:noProof/>
               </w:rPr>
-              <w:instrText xml:space="preserve"> PAGEREF _Toc242980193 \h </w:instrText>
+              <w:instrText xml:space="preserve"> PAGEREF _Toc242980816 \h </w:instrText>
             </w:r>
             <w:r>
               <w:rPr>
@@ -1430,7 +1430,7 @@
               <w:noProof/>
             </w:rPr>
           </w:pPr>
-          <w:hyperlink w:anchor="_Toc242980194" w:history="1">
+          <w:hyperlink w:anchor="_Toc242980817" w:history="1">
             <w:r>
               <w:rPr>
                 <w:rStyle w:val="Hyperlink"/>
@@ -1454,7 +1454,7 @@
               <w:rPr>
                 <w:noProof/>
               </w:rPr>
-              <w:instrText xml:space="preserve"> PAGEREF _Toc242980194 \h </w:instrText>
+              <w:instrText xml:space="preserve"> PAGEREF _Toc242980817 \h </w:instrText>
             </w:r>
             <w:r>
               <w:rPr>
@@ -1491,7 +1491,7 @@
               <w:noProof/>
             </w:rPr>
           </w:pPr>
-          <w:hyperlink w:anchor="_Toc242980195" w:history="1">
+          <w:hyperlink w:anchor="_Toc242980818" w:history="1">
             <w:r>
               <w:rPr>
                 <w:rStyle w:val="Hyperlink"/>
@@ -1515,7 +1515,7 @@
               <w:rPr>
                 <w:noProof/>
               </w:rPr>
-              <w:instrText xml:space="preserve"> PAGEREF _Toc242980195 \h </w:instrText>
+              <w:instrText xml:space="preserve"> PAGEREF _Toc242980818 \h </w:instrText>
             </w:r>
             <w:r>
               <w:rPr>
@@ -1552,7 +1552,7 @@
               <w:noProof/>
             </w:rPr>
           </w:pPr>
-          <w:hyperlink w:anchor="_Toc242980196" w:history="1">
+          <w:hyperlink w:anchor="_Toc242980819" w:history="1">
             <w:r>
               <w:rPr>
                 <w:rStyle w:val="Hyperlink"/>
@@ -1576,7 +1576,7 @@
               <w:rPr>
                 <w:noProof/>
               </w:rPr>
-              <w:instrText xml:space="preserve"> PAGEREF _Toc242980196 \h </w:instrText>
+              <w:instrText xml:space="preserve"> PAGEREF _Toc242980819 \h </w:instrText>
             </w:r>
             <w:r>
               <w:rPr>
@@ -1613,7 +1613,7 @@
               <w:noProof/>
             </w:rPr>
           </w:pPr>
-          <w:hyperlink w:anchor="_Toc242980197" w:history="1">
+          <w:hyperlink w:anchor="_Toc242980820" w:history="1">
             <w:r>
               <w:rPr>
                 <w:rStyle w:val="Hyperlink"/>
@@ -1637,7 +1637,7 @@
               <w:rPr>
                 <w:noProof/>
               </w:rPr>
-              <w:instrText xml:space="preserve"> PAGEREF _Toc242980197 \h </w:instrText>
+              <w:instrText xml:space="preserve"> PAGEREF _Toc242980820 \h </w:instrText>
             </w:r>
             <w:r>
               <w:rPr>
@@ -1674,7 +1674,7 @@
               <w:noProof/>
             </w:rPr>
           </w:pPr>
-          <w:hyperlink w:anchor="_Toc242980198" w:history="1">
+          <w:hyperlink w:anchor="_Toc242980821" w:history="1">
             <w:r>
               <w:rPr>
                 <w:rStyle w:val="Hyperlink"/>
@@ -1698,7 +1698,7 @@
               <w:rPr>
                 <w:noProof/>
               </w:rPr>
-              <w:instrText xml:space="preserve"> PAGEREF _Toc242980198 \h </w:instrText>
+              <w:instrText xml:space="preserve"> PAGEREF _Toc242980821 \h </w:instrText>
             </w:r>
             <w:r>
               <w:rPr>
@@ -1735,7 +1735,7 @@
               <w:noProof/>
             </w:rPr>
           </w:pPr>
-          <w:hyperlink w:anchor="_Toc242980199" w:history="1">
+          <w:hyperlink w:anchor="_Toc242980822" w:history="1">
             <w:r>
               <w:rPr>
                 <w:rStyle w:val="Hyperlink"/>
@@ -1759,7 +1759,7 @@
               <w:rPr>
                 <w:noProof/>
               </w:rPr>
-              <w:instrText xml:space="preserve"> PAGEREF _Toc242980199 \h </w:instrText>
+              <w:instrText xml:space="preserve"> PAGEREF _Toc242980822 \h </w:instrText>
             </w:r>
             <w:r>
               <w:rPr>
@@ -1796,7 +1796,7 @@
               <w:noProof/>
             </w:rPr>
           </w:pPr>
-          <w:hyperlink w:anchor="_Toc242980200" w:history="1">
+          <w:hyperlink w:anchor="_Toc242980823" w:history="1">
             <w:r>
               <w:rPr>
                 <w:rStyle w:val="Hyperlink"/>
@@ -1820,7 +1820,7 @@
               <w:rPr>
                 <w:noProof/>
               </w:rPr>
-              <w:instrText xml:space="preserve"> PAGEREF _Toc242980200 \h </w:instrText>
+              <w:instrText xml:space="preserve"> PAGEREF _Toc242980823 \h </w:instrText>
             </w:r>
             <w:r>
               <w:rPr>
@@ -1857,7 +1857,7 @@
               <w:noProof/>
             </w:rPr>
           </w:pPr>
-          <w:hyperlink w:anchor="_Toc242980201" w:history="1">
+          <w:hyperlink w:anchor="_Toc242980824" w:history="1">
             <w:r>
               <w:rPr>
                 <w:rStyle w:val="Hyperlink"/>
@@ -1881,7 +1881,7 @@
               <w:rPr>
                 <w:noProof/>
               </w:rPr>
-              <w:instrText xml:space="preserve"> PAGEREF _Toc242980201 \h </w:instrText>
+              <w:instrText xml:space="preserve"> PAGEREF _Toc242980824 \h </w:instrText>
             </w:r>
             <w:r>
               <w:rPr>
@@ -1918,7 +1918,7 @@
               <w:noProof/>
             </w:rPr>
           </w:pPr>
-          <w:hyperlink w:anchor="_Toc242980202" w:history="1">
+          <w:hyperlink w:anchor="_Toc242980825" w:history="1">
             <w:r>
               <w:rPr>
                 <w:rStyle w:val="Hyperlink"/>
@@ -1942,7 +1942,7 @@
               <w:rPr>
                 <w:noProof/>
               </w:rPr>
-              <w:instrText xml:space="preserve"> PAGEREF _Toc242980202 \h </w:instrText>
+              <w:instrText xml:space="preserve"> PAGEREF _Toc242980825 \h </w:instrText>
             </w:r>
             <w:r>
               <w:rPr>
@@ -1979,7 +1979,7 @@
               <w:noProof/>
             </w:rPr>
           </w:pPr>
-          <w:hyperlink w:anchor="_Toc242980203" w:history="1">
+          <w:hyperlink w:anchor="_Toc242980826" w:history="1">
             <w:r>
               <w:rPr>
                 <w:rStyle w:val="Hyperlink"/>
@@ -2003,7 +2003,7 @@
               <w:rPr>
                 <w:noProof/>
               </w:rPr>
-              <w:instrText xml:space="preserve"> PAGEREF _Toc242980203 \h </w:instrText>
+              <w:instrText xml:space="preserve"> PAGEREF _Toc242980826 \h </w:instrText>
             </w:r>
             <w:r>
               <w:rPr>
@@ -2040,7 +2040,7 @@
               <w:noProof/>
             </w:rPr>
           </w:pPr>
-          <w:hyperlink w:anchor="_Toc242980204" w:history="1">
+          <w:hyperlink w:anchor="_Toc242980827" w:history="1">
             <w:r>
               <w:rPr>
                 <w:rStyle w:val="Hyperlink"/>
@@ -2064,7 +2064,7 @@
               <w:rPr>
                 <w:noProof/>
               </w:rPr>
-              <w:instrText xml:space="preserve"> PAGEREF _Toc242980204 \h </w:instrText>
+              <w:instrText xml:space="preserve"> PAGEREF _Toc242980827 \h </w:instrText>
             </w:r>
             <w:r>
               <w:rPr>
@@ -2101,7 +2101,7 @@
               <w:noProof/>
             </w:rPr>
           </w:pPr>
-          <w:hyperlink w:anchor="_Toc242980205" w:history="1">
+          <w:hyperlink w:anchor="_Toc242980828" w:history="1">
             <w:r>
               <w:rPr>
                 <w:rStyle w:val="Hyperlink"/>
@@ -2125,7 +2125,7 @@
               <w:rPr>
                 <w:noProof/>
               </w:rPr>
-              <w:instrText xml:space="preserve"> PAGEREF _Toc242980205 \h </w:instrText>
+              <w:instrText xml:space="preserve"> PAGEREF _Toc242980828 \h </w:instrText>
             </w:r>
             <w:r>
               <w:rPr>
@@ -2162,7 +2162,7 @@
               <w:noProof/>
             </w:rPr>
           </w:pPr>
-          <w:hyperlink w:anchor="_Toc242980206" w:history="1">
+          <w:hyperlink w:anchor="_Toc242980829" w:history="1">
             <w:r>
               <w:rPr>
                 <w:rStyle w:val="Hyperlink"/>
@@ -2186,7 +2186,7 @@
               <w:rPr>
                 <w:noProof/>
               </w:rPr>
-              <w:instrText xml:space="preserve"> PAGEREF _Toc242980206 \h </w:instrText>
+              <w:instrText xml:space="preserve"> PAGEREF _Toc242980829 \h </w:instrText>
             </w:r>
             <w:r>
               <w:rPr>
@@ -2223,7 +2223,7 @@
               <w:noProof/>
             </w:rPr>
           </w:pPr>
-          <w:hyperlink w:anchor="_Toc242980207" w:history="1">
+          <w:hyperlink w:anchor="_Toc242980830" w:history="1">
             <w:r>
               <w:rPr>
                 <w:rStyle w:val="Hyperlink"/>
@@ -2247,7 +2247,7 @@
               <w:rPr>
                 <w:noProof/>
               </w:rPr>
-              <w:instrText xml:space="preserve"> PAGEREF _Toc242980207 \h </w:instrText>
+              <w:instrText xml:space="preserve"> PAGEREF _Toc242980830 \h </w:instrText>
             </w:r>
             <w:r>
               <w:rPr>
@@ -2284,7 +2284,7 @@
               <w:noProof/>
             </w:rPr>
           </w:pPr>
-          <w:hyperlink w:anchor="_Toc242980208" w:history="1">
+          <w:hyperlink w:anchor="_Toc242980831" w:history="1">
             <w:r>
               <w:rPr>
                 <w:rStyle w:val="Hyperlink"/>
@@ -2308,7 +2308,7 @@
               <w:rPr>
                 <w:noProof/>
               </w:rPr>
-              <w:instrText xml:space="preserve"> PAGEREF _Toc242980208 \h </w:instrText>
+              <w:instrText xml:space="preserve"> PAGEREF _Toc242980831 \h </w:instrText>
             </w:r>
             <w:r>
               <w:rPr>
@@ -2345,7 +2345,7 @@
               <w:noProof/>
             </w:rPr>
           </w:pPr>
-          <w:hyperlink w:anchor="_Toc242980209" w:history="1">
+          <w:hyperlink w:anchor="_Toc242980832" w:history="1">
             <w:r>
               <w:rPr>
                 <w:rStyle w:val="Hyperlink"/>
@@ -2369,7 +2369,7 @@
               <w:rPr>
                 <w:noProof/>
               </w:rPr>
-              <w:instrText xml:space="preserve"> PAGEREF _Toc242980209 \h </w:instrText>
+              <w:instrText xml:space="preserve"> PAGEREF _Toc242980832 \h </w:instrText>
             </w:r>
             <w:r>
               <w:rPr>
@@ -2406,7 +2406,7 @@
               <w:noProof/>
             </w:rPr>
           </w:pPr>
-          <w:hyperlink w:anchor="_Toc242980210" w:history="1">
+          <w:hyperlink w:anchor="_Toc242980833" w:history="1">
             <w:r>
               <w:rPr>
                 <w:rStyle w:val="Hyperlink"/>
@@ -2430,7 +2430,7 @@
               <w:rPr>
                 <w:noProof/>
               </w:rPr>
-              <w:instrText xml:space="preserve"> PAGEREF _Toc242980210 \h </w:instrText>
+              <w:instrText xml:space="preserve"> PAGEREF _Toc242980833 \h </w:instrText>
             </w:r>
             <w:r>
               <w:rPr>
@@ -2467,7 +2467,7 @@
               <w:noProof/>
             </w:rPr>
           </w:pPr>
-          <w:hyperlink w:anchor="_Toc242980211" w:history="1">
+          <w:hyperlink w:anchor="_Toc242980834" w:history="1">
             <w:r>
               <w:rPr>
                 <w:rStyle w:val="Hyperlink"/>
@@ -2491,7 +2491,7 @@
               <w:rPr>
                 <w:noProof/>
               </w:rPr>
-              <w:instrText xml:space="preserve"> PAGEREF _Toc242980211 \h </w:instrText>
+              <w:instrText xml:space="preserve"> PAGEREF _Toc242980834 \h </w:instrText>
             </w:r>
             <w:r>
               <w:rPr>
@@ -2528,7 +2528,7 @@
               <w:noProof/>
             </w:rPr>
           </w:pPr>
-          <w:hyperlink w:anchor="_Toc242980212" w:history="1">
+          <w:hyperlink w:anchor="_Toc242980835" w:history="1">
             <w:r>
               <w:rPr>
                 <w:rStyle w:val="Hyperlink"/>
@@ -2552,7 +2552,7 @@
               <w:rPr>
                 <w:noProof/>
               </w:rPr>
-              <w:instrText xml:space="preserve"> PAGEREF _Toc242980212 \h </w:instrText>
+              <w:instrText xml:space="preserve"> PAGEREF _Toc242980835 \h </w:instrText>
             </w:r>
             <w:r>
               <w:rPr>
@@ -2589,7 +2589,7 @@
               <w:noProof/>
             </w:rPr>
           </w:pPr>
-          <w:hyperlink w:anchor="_Toc242980213" w:history="1">
+          <w:hyperlink w:anchor="_Toc242980836" w:history="1">
             <w:r>
               <w:rPr>
                 <w:rStyle w:val="Hyperlink"/>
@@ -2613,7 +2613,7 @@
               <w:rPr>
                 <w:noProof/>
               </w:rPr>
-              <w:instrText xml:space="preserve"> PAGEREF _Toc242980213 \h </w:instrText>
+              <w:instrText xml:space="preserve"> PAGEREF _Toc242980836 \h </w:instrText>
             </w:r>
             <w:r>
               <w:rPr>
@@ -2650,7 +2650,7 @@
               <w:noProof/>
             </w:rPr>
           </w:pPr>
-          <w:hyperlink w:anchor="_Toc242980214" w:history="1">
+          <w:hyperlink w:anchor="_Toc242980837" w:history="1">
             <w:r>
               <w:rPr>
                 <w:rStyle w:val="Hyperlink"/>
@@ -2674,7 +2674,7 @@
               <w:rPr>
                 <w:noProof/>
               </w:rPr>
-              <w:instrText xml:space="preserve"> PAGEREF _Toc242980214 \h </w:instrText>
+              <w:instrText xml:space="preserve"> PAGEREF _Toc242980837 \h </w:instrText>
             </w:r>
             <w:r>
               <w:rPr>
@@ -2711,7 +2711,7 @@
               <w:noProof/>
             </w:rPr>
           </w:pPr>
-          <w:hyperlink w:anchor="_Toc242980215" w:history="1">
+          <w:hyperlink w:anchor="_Toc242980838" w:history="1">
             <w:r>
               <w:rPr>
                 <w:rStyle w:val="Hyperlink"/>
@@ -2735,7 +2735,7 @@
               <w:rPr>
                 <w:noProof/>
               </w:rPr>
-              <w:instrText xml:space="preserve"> PAGEREF _Toc242980215 \h </w:instrText>
+              <w:instrText xml:space="preserve"> PAGEREF _Toc242980838 \h </w:instrText>
             </w:r>
             <w:r>
               <w:rPr>
@@ -2772,7 +2772,7 @@
               <w:noProof/>
             </w:rPr>
           </w:pPr>
-          <w:hyperlink w:anchor="_Toc242980216" w:history="1">
+          <w:hyperlink w:anchor="_Toc242980839" w:history="1">
             <w:r>
               <w:rPr>
                 <w:rStyle w:val="Hyperlink"/>
@@ -2796,7 +2796,7 @@
               <w:rPr>
                 <w:noProof/>
               </w:rPr>
-              <w:instrText xml:space="preserve"> PAGEREF _Toc242980216 \h </w:instrText>
+              <w:instrText xml:space="preserve"> PAGEREF _Toc242980839 \h </w:instrText>
             </w:r>
             <w:r>
               <w:rPr>
@@ -2833,7 +2833,7 @@
               <w:noProof/>
             </w:rPr>
           </w:pPr>
-          <w:hyperlink w:anchor="_Toc242980217" w:history="1">
+          <w:hyperlink w:anchor="_Toc242980840" w:history="1">
             <w:r>
               <w:rPr>
                 <w:rStyle w:val="Hyperlink"/>
@@ -2857,7 +2857,7 @@
               <w:rPr>
                 <w:noProof/>
               </w:rPr>
-              <w:instrText xml:space="preserve"> PAGEREF _Toc242980217 \h </w:instrText>
+              <w:instrText xml:space="preserve"> PAGEREF _Toc242980840 \h </w:instrText>
             </w:r>
             <w:r>
               <w:rPr>
@@ -2894,7 +2894,7 @@
               <w:noProof/>
             </w:rPr>
           </w:pPr>
-          <w:hyperlink w:anchor="_Toc242980218" w:history="1">
+          <w:hyperlink w:anchor="_Toc242980841" w:history="1">
             <w:r>
               <w:rPr>
                 <w:rStyle w:val="Hyperlink"/>
@@ -2918,7 +2918,7 @@
               <w:rPr>
                 <w:noProof/>
               </w:rPr>
-              <w:instrText xml:space="preserve"> PAGEREF _Toc242980218 \h </w:instrText>
+              <w:instrText xml:space="preserve"> PAGEREF _Toc242980841 \h </w:instrText>
             </w:r>
             <w:r>
               <w:rPr>
@@ -2955,7 +2955,7 @@
               <w:noProof/>
             </w:rPr>
           </w:pPr>
-          <w:hyperlink w:anchor="_Toc242980219" w:history="1">
+          <w:hyperlink w:anchor="_Toc242980842" w:history="1">
             <w:r>
               <w:rPr>
                 <w:rStyle w:val="Hyperlink"/>
@@ -2979,7 +2979,7 @@
               <w:rPr>
                 <w:noProof/>
               </w:rPr>
-              <w:instrText xml:space="preserve"> PAGEREF _Toc242980219 \h </w:instrText>
+              <w:instrText xml:space="preserve"> PAGEREF _Toc242980842 \h </w:instrText>
             </w:r>
             <w:r>
               <w:rPr>
@@ -3016,7 +3016,7 @@
               <w:noProof/>
             </w:rPr>
           </w:pPr>
-          <w:hyperlink w:anchor="_Toc242980220" w:history="1">
+          <w:hyperlink w:anchor="_Toc242980843" w:history="1">
             <w:r>
               <w:rPr>
                 <w:rStyle w:val="Hyperlink"/>
@@ -3040,7 +3040,7 @@
               <w:rPr>
                 <w:noProof/>
               </w:rPr>
-              <w:instrText xml:space="preserve"> PAGEREF _Toc242980220 \h </w:instrText>
+              <w:instrText xml:space="preserve"> PAGEREF _Toc242980843 \h </w:instrText>
             </w:r>
             <w:r>
               <w:rPr>
@@ -3077,7 +3077,7 @@
               <w:noProof/>
             </w:rPr>
           </w:pPr>
-          <w:hyperlink w:anchor="_Toc242980221" w:history="1">
+          <w:hyperlink w:anchor="_Toc242980844" w:history="1">
             <w:r>
               <w:rPr>
                 <w:rStyle w:val="Hyperlink"/>
@@ -3101,7 +3101,7 @@
               <w:rPr>
                 <w:noProof/>
               </w:rPr>
-              <w:instrText xml:space="preserve"> PAGEREF _Toc242980221 \h </w:instrText>
+              <w:instrText xml:space="preserve"> PAGEREF _Toc242980844 \h </w:instrText>
             </w:r>
             <w:r>
               <w:rPr>
@@ -3138,7 +3138,7 @@
               <w:noProof/>
             </w:rPr>
           </w:pPr>
-          <w:hyperlink w:anchor="_Toc242980222" w:history="1">
+          <w:hyperlink w:anchor="_Toc242980845" w:history="1">
             <w:r>
               <w:rPr>
                 <w:rStyle w:val="Hyperlink"/>
@@ -3162,7 +3162,7 @@
               <w:rPr>
                 <w:noProof/>
               </w:rPr>
-              <w:instrText xml:space="preserve"> PAGEREF _Toc242980222 \h </w:instrText>
+              <w:instrText xml:space="preserve"> PAGEREF _Toc242980845 \h </w:instrText>
             </w:r>
             <w:r>
               <w:rPr>
@@ -3199,7 +3199,7 @@
               <w:noProof/>
             </w:rPr>
           </w:pPr>
-          <w:hyperlink w:anchor="_Toc242980223" w:history="1">
+          <w:hyperlink w:anchor="_Toc242980846" w:history="1">
             <w:r>
               <w:rPr>
                 <w:rStyle w:val="Hyperlink"/>
@@ -3223,7 +3223,7 @@
               <w:rPr>
                 <w:noProof/>
               </w:rPr>
-              <w:instrText xml:space="preserve"> PAGEREF _Toc242980223 \h </w:instrText>
+              <w:instrText xml:space="preserve"> PAGEREF _Toc242980846 \h </w:instrText>
             </w:r>
             <w:r>
               <w:rPr>
@@ -3260,7 +3260,7 @@
               <w:noProof/>
             </w:rPr>
           </w:pPr>
-          <w:hyperlink w:anchor="_Toc242980224" w:history="1">
+          <w:hyperlink w:anchor="_Toc242980847" w:history="1">
             <w:r>
               <w:rPr>
                 <w:rStyle w:val="Hyperlink"/>
@@ -3284,7 +3284,7 @@
               <w:rPr>
                 <w:noProof/>
               </w:rPr>
-              <w:instrText xml:space="preserve"> PAGEREF _Toc242980224 \h </w:instrText>
+              <w:instrText xml:space="preserve"> PAGEREF _Toc242980847 \h </w:instrText>
             </w:r>
             <w:r>
               <w:rPr>
@@ -3321,7 +3321,7 @@
               <w:noProof/>
             </w:rPr>
           </w:pPr>
-          <w:hyperlink w:anchor="_Toc242980225" w:history="1">
+          <w:hyperlink w:anchor="_Toc242980848" w:history="1">
             <w:r>
               <w:rPr>
                 <w:rStyle w:val="Hyperlink"/>
@@ -3345,7 +3345,7 @@
               <w:rPr>
                 <w:noProof/>
               </w:rPr>
-              <w:instrText xml:space="preserve"> PAGEREF _Toc242980225 \h </w:instrText>
+              <w:instrText xml:space="preserve"> PAGEREF _Toc242980848 \h </w:instrText>
             </w:r>
             <w:r>
               <w:rPr>
@@ -3382,7 +3382,7 @@
               <w:noProof/>
             </w:rPr>
           </w:pPr>
-          <w:hyperlink w:anchor="_Toc242980226" w:history="1">
+          <w:hyperlink w:anchor="_Toc242980849" w:history="1">
             <w:r>
               <w:rPr>
                 <w:rStyle w:val="Hyperlink"/>
@@ -3406,7 +3406,7 @@
               <w:rPr>
                 <w:noProof/>
               </w:rPr>
-              <w:instrText xml:space="preserve"> PAGEREF _Toc242980226 \h </w:instrText>
+              <w:instrText xml:space="preserve"> PAGEREF _Toc242980849 \h </w:instrText>
             </w:r>
             <w:r>
               <w:rPr>
@@ -3443,7 +3443,7 @@
               <w:noProof/>
             </w:rPr>
           </w:pPr>
-          <w:hyperlink w:anchor="_Toc242980227" w:history="1">
+          <w:hyperlink w:anchor="_Toc242980850" w:history="1">
             <w:r>
               <w:rPr>
                 <w:rStyle w:val="Hyperlink"/>
@@ -3467,7 +3467,7 @@
               <w:rPr>
                 <w:noProof/>
               </w:rPr>
-              <w:instrText xml:space="preserve"> PAGEREF _Toc242980227 \h </w:instrText>
+              <w:instrText xml:space="preserve"> PAGEREF _Toc242980850 \h </w:instrText>
             </w:r>
             <w:r>
               <w:rPr>
@@ -3504,7 +3504,7 @@
               <w:noProof/>
             </w:rPr>
           </w:pPr>
-          <w:hyperlink w:anchor="_Toc242980228" w:history="1">
+          <w:hyperlink w:anchor="_Toc242980851" w:history="1">
             <w:r>
               <w:rPr>
                 <w:rStyle w:val="Hyperlink"/>
@@ -3528,7 +3528,7 @@
               <w:rPr>
                 <w:noProof/>
               </w:rPr>
-              <w:instrText xml:space="preserve"> PAGEREF _Toc242980228 \h </w:instrText>
+              <w:instrText xml:space="preserve"> PAGEREF _Toc242980851 \h </w:instrText>
             </w:r>
             <w:r>
               <w:rPr>
@@ -3565,7 +3565,7 @@
               <w:noProof/>
             </w:rPr>
           </w:pPr>
-          <w:hyperlink w:anchor="_Toc242980229" w:history="1">
+          <w:hyperlink w:anchor="_Toc242980852" w:history="1">
             <w:r>
               <w:rPr>
                 <w:rStyle w:val="Hyperlink"/>
@@ -3589,7 +3589,7 @@
               <w:rPr>
                 <w:noProof/>
               </w:rPr>
-              <w:instrText xml:space="preserve"> PAGEREF _Toc242980229 \h </w:instrText>
+              <w:instrText xml:space="preserve"> PAGEREF _Toc242980852 \h </w:instrText>
             </w:r>
             <w:r>
               <w:rPr>
@@ -3632,7 +3632,7 @@
       <w:pPr>
         <w:pStyle w:val="Heading1"/>
       </w:pPr>
-      <w:bookmarkStart w:id="3" w:name="_Toc242980178"/>
+      <w:bookmarkStart w:id="3" w:name="_Toc242980801"/>
       <w:r>
         <w:lastRenderedPageBreak/>
         <w:t>1. Introduction</w:t>
@@ -3643,7 +3643,7 @@
       <w:pPr>
         <w:pStyle w:val="Heading2"/>
       </w:pPr>
-      <w:bookmarkStart w:id="4" w:name="_Toc242980179"/>
+      <w:bookmarkStart w:id="4" w:name="_Toc242980802"/>
       <w:r>
         <w:t>1.1 Background</w:t>
       </w:r>
@@ -3674,7 +3674,7 @@
       <w:pPr>
         <w:pStyle w:val="Heading2"/>
       </w:pPr>
-      <w:bookmarkStart w:id="5" w:name="_Toc242980180"/>
+      <w:bookmarkStart w:id="5" w:name="_Toc242980803"/>
       <w:r>
         <w:t>1.2 Problem Statement</w:t>
       </w:r>
@@ -3700,7 +3700,7 @@
       <w:pPr>
         <w:pStyle w:val="Heading2"/>
       </w:pPr>
-      <w:bookmarkStart w:id="6" w:name="_Toc242980181"/>
+      <w:bookmarkStart w:id="6" w:name="_Toc242980804"/>
       <w:r>
         <w:t>1.3 Motivation and Significance</w:t>
       </w:r>
@@ -3719,7 +3719,7 @@
       <w:pPr>
         <w:pStyle w:val="Heading2"/>
       </w:pPr>
-      <w:bookmarkStart w:id="7" w:name="_Toc242980182"/>
+      <w:bookmarkStart w:id="7" w:name="_Toc242980805"/>
       <w:r>
         <w:lastRenderedPageBreak/>
         <w:t>1.4 Scope</w:t>
@@ -3762,7 +3762,7 @@
       <w:pPr>
         <w:pStyle w:val="Heading2"/>
       </w:pPr>
-      <w:bookmarkStart w:id="8" w:name="_Toc242980183"/>
+      <w:bookmarkStart w:id="8" w:name="_Toc242980806"/>
       <w:r>
         <w:t>1.5 Report Organisation</w:t>
       </w:r>
@@ -3781,7 +3781,7 @@
       <w:pPr>
         <w:pStyle w:val="Heading1"/>
       </w:pPr>
-      <w:bookmarkStart w:id="9" w:name="_Toc242980184"/>
+      <w:bookmarkStart w:id="9" w:name="_Toc242980807"/>
       <w:r>
         <w:t>2. Literature Survey / Related Work</w:t>
       </w:r>
@@ -6755,7 +6755,7 @@
       <w:pPr>
         <w:pStyle w:val="Heading2"/>
       </w:pPr>
-      <w:bookmarkStart w:id="10" w:name="_Toc242980185"/>
+      <w:bookmarkStart w:id="10" w:name="_Toc242980808"/>
       <w:r>
         <w:t>2.1 Comparative Synthesis</w:t>
       </w:r>
@@ -6829,7 +6829,7 @@
       <w:pPr>
         <w:pStyle w:val="Heading2"/>
       </w:pPr>
-      <w:bookmarkStart w:id="11" w:name="_Toc242980186"/>
+      <w:bookmarkStart w:id="11" w:name="_Toc242980809"/>
       <w:r>
         <w:t>2.2 Individual Research Gap Analysis</w:t>
       </w:r>
@@ -10244,7 +10244,7 @@
       <w:pPr>
         <w:pStyle w:val="Heading2"/>
       </w:pPr>
-      <w:bookmarkStart w:id="12" w:name="_Toc242980187"/>
+      <w:bookmarkStart w:id="12" w:name="_Toc242980810"/>
       <w:r>
         <w:t>2.3 Consolidated Research Gap</w:t>
       </w:r>
@@ -10266,7 +10266,7 @@
       <w:pPr>
         <w:pStyle w:val="Heading1"/>
       </w:pPr>
-      <w:bookmarkStart w:id="13" w:name="_Toc242980188"/>
+      <w:bookmarkStart w:id="13" w:name="_Toc242980811"/>
       <w:r>
         <w:t>3. Project Objectives</w:t>
       </w:r>
@@ -10457,7 +10457,7 @@
       <w:pPr>
         <w:pStyle w:val="Heading2"/>
       </w:pPr>
-      <w:bookmarkStart w:id="14" w:name="_Toc242980189"/>
+      <w:bookmarkStart w:id="14" w:name="_Toc242980812"/>
       <w:r>
         <w:t>3.1 Expected Outcomes</w:t>
       </w:r>
@@ -10479,7 +10479,7 @@
       <w:pPr>
         <w:pStyle w:val="Heading1"/>
       </w:pPr>
-      <w:bookmarkStart w:id="15" w:name="_Toc242980190"/>
+      <w:bookmarkStart w:id="15" w:name="_Toc242980813"/>
       <w:r>
         <w:t>4. Novelty Summary</w:t>
       </w:r>
@@ -11176,7 +11176,7 @@
       <w:pPr>
         <w:pStyle w:val="Heading1"/>
       </w:pPr>
-      <w:bookmarkStart w:id="16" w:name="_Toc242980191"/>
+      <w:bookmarkStart w:id="16" w:name="_Toc242980814"/>
       <w:r>
         <w:t>5. Proposed System and Architecture</w:t>
       </w:r>
@@ -11186,7 +11186,7 @@
       <w:pPr>
         <w:pStyle w:val="Heading2"/>
       </w:pPr>
-      <w:bookmarkStart w:id="17" w:name="_Toc242980192"/>
+      <w:bookmarkStart w:id="17" w:name="_Toc242980815"/>
       <w:r>
         <w:t>5.1 System Overview</w:t>
       </w:r>
@@ -11242,7 +11242,7 @@
       <w:pPr>
         <w:pStyle w:val="Heading2"/>
       </w:pPr>
-      <w:bookmarkStart w:id="18" w:name="_Toc242980193"/>
+      <w:bookmarkStart w:id="18" w:name="_Toc242980816"/>
       <w:r>
         <w:lastRenderedPageBreak/>
         <w:t>5.2 Diagram 1 - Cloud Deployment Architecture</w:t>
@@ -11260,7 +11260,7 @@
           <w:noProof/>
         </w:rPr>
         <w:drawing>
-          <wp:inline distT="0" distB="0" distL="0" distR="0" wp14:anchorId="6C7119A7" wp14:editId="49F1FE6C">
+          <wp:inline distT="0" distB="0" distL="0" distR="0" wp14:anchorId="183DAB63" wp14:editId="10E4AD17">
             <wp:extent cx="5734050" cy="4019550"/>
             <wp:effectExtent l="0" t="0" r="0" b="0"/>
             <wp:docPr id="1" name="fig1_cloud_architecture.png" descr="Cloud Deployment Architecture (as deployed in AWS us-east-1)." title="Cloud Deployment Architecture (as deployed in AWS us-east-1)."/>
@@ -11513,7 +11513,7 @@
       <w:pPr>
         <w:pStyle w:val="Heading2"/>
       </w:pPr>
-      <w:bookmarkStart w:id="19" w:name="_Toc242980194"/>
+      <w:bookmarkStart w:id="19" w:name="_Toc242980817"/>
       <w:r>
         <w:lastRenderedPageBreak/>
         <w:t>5.3 Diagram 2 - Complete System Architecture / Workflow</w:t>
@@ -11531,7 +11531,7 @@
           <w:noProof/>
         </w:rPr>
         <w:drawing>
-          <wp:inline distT="0" distB="0" distL="0" distR="0" wp14:anchorId="63BA5EA8" wp14:editId="7FCE42AC">
+          <wp:inline distT="0" distB="0" distL="0" distR="0" wp14:anchorId="2FD100B5" wp14:editId="0014DFD2">
             <wp:extent cx="5734050" cy="3629025"/>
             <wp:effectExtent l="0" t="0" r="0" b="0"/>
             <wp:docPr id="2" name="fig2_system_workflow.png" descr="Complete System Architecture and Workflow (ingestion path A and query path B)." title="Complete System Architecture and Workflow (ingestion path A and query path B)."/>
@@ -11617,7 +11617,7 @@
       <w:pPr>
         <w:pStyle w:val="Heading2"/>
       </w:pPr>
-      <w:bookmarkStart w:id="20" w:name="_Toc242980195"/>
+      <w:bookmarkStart w:id="20" w:name="_Toc242980818"/>
       <w:r>
         <w:t>5.4 Workflow and Use Cases</w:t>
       </w:r>
@@ -11738,7 +11738,7 @@
       <w:pPr>
         <w:pStyle w:val="Heading2"/>
       </w:pPr>
-      <w:bookmarkStart w:id="21" w:name="_Toc242980196"/>
+      <w:bookmarkStart w:id="21" w:name="_Toc242980819"/>
       <w:r>
         <w:t>5.5 Security, Availability and Scalability</w:t>
       </w:r>
@@ -11889,7 +11889,7 @@
       <w:pPr>
         <w:pStyle w:val="Heading1"/>
       </w:pPr>
-      <w:bookmarkStart w:id="22" w:name="_Toc242980197"/>
+      <w:bookmarkStart w:id="22" w:name="_Toc242980820"/>
       <w:r>
         <w:t>6. Dataset / Input Data Description</w:t>
       </w:r>
@@ -14315,7 +14315,7 @@
       <w:pPr>
         <w:pStyle w:val="Heading2"/>
       </w:pPr>
-      <w:bookmarkStart w:id="23" w:name="_Toc242980198"/>
+      <w:bookmarkStart w:id="23" w:name="_Toc242980821"/>
       <w:r>
         <w:t>6.1 Data Preparation</w:t>
       </w:r>
@@ -14381,7 +14381,7 @@
       <w:pPr>
         <w:pStyle w:val="Heading1"/>
       </w:pPr>
-      <w:bookmarkStart w:id="24" w:name="_Toc242980199"/>
+      <w:bookmarkStart w:id="24" w:name="_Toc242980822"/>
       <w:r>
         <w:lastRenderedPageBreak/>
         <w:t>7. Cloud Platform and Services Planning</w:t>
@@ -16729,7 +16729,7 @@
       <w:pPr>
         <w:pStyle w:val="Heading2"/>
       </w:pPr>
-      <w:bookmarkStart w:id="25" w:name="_Toc242980200"/>
+      <w:bookmarkStart w:id="25" w:name="_Toc242980823"/>
       <w:r>
         <w:t>7.1 Deployment and Network Design</w:t>
       </w:r>
@@ -16752,7 +16752,7 @@
       <w:pPr>
         <w:pStyle w:val="Heading2"/>
       </w:pPr>
-      <w:bookmarkStart w:id="26" w:name="_Toc242980201"/>
+      <w:bookmarkStart w:id="26" w:name="_Toc242980824"/>
       <w:r>
         <w:t>7.2 Cost Estimation</w:t>
       </w:r>
@@ -17405,7 +17405,7 @@
       <w:pPr>
         <w:pStyle w:val="Heading2"/>
       </w:pPr>
-      <w:bookmarkStart w:id="27" w:name="_Toc242980202"/>
+      <w:bookmarkStart w:id="27" w:name="_Toc242980825"/>
       <w:r>
         <w:t>7.3 Portability / Provider-Specific Choices</w:t>
       </w:r>
@@ -17428,7 +17428,7 @@
       <w:pPr>
         <w:pStyle w:val="Heading1"/>
       </w:pPr>
-      <w:bookmarkStart w:id="28" w:name="_Toc242980203"/>
+      <w:bookmarkStart w:id="28" w:name="_Toc242980826"/>
       <w:r>
         <w:t>8. Methodology and Implementation Plan</w:t>
       </w:r>
@@ -17438,7 +17438,7 @@
       <w:pPr>
         <w:pStyle w:val="Heading2"/>
       </w:pPr>
-      <w:bookmarkStart w:id="29" w:name="_Toc242980204"/>
+      <w:bookmarkStart w:id="29" w:name="_Toc242980827"/>
       <w:r>
         <w:t>8.1 Overall Methodology</w:t>
       </w:r>
@@ -17460,7 +17460,7 @@
       <w:pPr>
         <w:pStyle w:val="Heading2"/>
       </w:pPr>
-      <w:bookmarkStart w:id="30" w:name="_Toc242980205"/>
+      <w:bookmarkStart w:id="30" w:name="_Toc242980828"/>
       <w:r>
         <w:t>8.2 Tools and Technologies</w:t>
       </w:r>
@@ -18256,7 +18256,7 @@
       <w:pPr>
         <w:pStyle w:val="Heading2"/>
       </w:pPr>
-      <w:bookmarkStart w:id="31" w:name="_Toc242980206"/>
+      <w:bookmarkStart w:id="31" w:name="_Toc242980829"/>
       <w:r>
         <w:t>8.3 Step-by-Step Implementation Plan</w:t>
       </w:r>
@@ -18407,7 +18407,7 @@
       <w:pPr>
         <w:pStyle w:val="Heading2"/>
       </w:pPr>
-      <w:bookmarkStart w:id="32" w:name="_Toc242980207"/>
+      <w:bookmarkStart w:id="32" w:name="_Toc242980830"/>
       <w:r>
         <w:t>8.4 Evaluation Metrics</w:t>
       </w:r>
@@ -18517,7 +18517,7 @@
       <w:pPr>
         <w:pStyle w:val="Heading1"/>
       </w:pPr>
-      <w:bookmarkStart w:id="33" w:name="_Toc242980208"/>
+      <w:bookmarkStart w:id="33" w:name="_Toc242980831"/>
       <w:r>
         <w:t>9. Implementation / Development</w:t>
       </w:r>
@@ -18536,7 +18536,7 @@
       <w:pPr>
         <w:pStyle w:val="Heading2"/>
       </w:pPr>
-      <w:bookmarkStart w:id="34" w:name="_Toc242980209"/>
+      <w:bookmarkStart w:id="34" w:name="_Toc242980832"/>
       <w:r>
         <w:lastRenderedPageBreak/>
         <w:t>9.1 Implemented Modules</w:t>
@@ -20105,11 +20105,20 @@
       <w:pPr>
         <w:pStyle w:val="Heading2"/>
       </w:pPr>
-      <w:bookmarkStart w:id="35" w:name="_Toc242980210"/>
+      <w:bookmarkStart w:id="35" w:name="_Toc242980833"/>
       <w:r>
         <w:t>9.2 Screenshots and Configuration Evidence</w:t>
       </w:r>
       <w:bookmarkEnd w:id="35"/>
+    </w:p>
+    <w:p>
+      <w:pPr>
+        <w:spacing w:after="120"/>
+        <w:jc w:val="both"/>
+      </w:pPr>
+      <w:r>
+        <w:t>The dashboard follows the light or dark theme of the operating system; the screenshots show the dark theme.</w:t>
+      </w:r>
     </w:p>
     <w:p>
       <w:pPr>
@@ -20121,8 +20130,9 @@
         <w:rPr>
           <w:noProof/>
         </w:rPr>
+        <w:lastRenderedPageBreak/>
         <w:drawing>
-          <wp:inline distT="0" distB="0" distL="0" distR="0" wp14:anchorId="26E0B30D" wp14:editId="1541C939">
+          <wp:inline distT="0" distB="0" distL="0" distR="0" wp14:anchorId="3BDB3A61" wp14:editId="645B72D4">
             <wp:extent cx="5734050" cy="3581400"/>
             <wp:effectExtent l="0" t="0" r="0" b="0"/>
             <wp:docPr id="3" name="01_landing.png" descr="Public landing page with live graph statistics and in-page Cognito sign-in (15 Oct 2026)." title="Public landing page with live graph statistics and in-page Cognito sign-in (15 Oct 2026)."/>
@@ -20191,7 +20201,6 @@
         <w:jc w:val="both"/>
       </w:pPr>
       <w:r>
-        <w:lastRenderedPageBreak/>
         <w:t>The landing page reads /public/stats, the only route without authentication. Signing in uses the Cognito user-pool API directly from the page.</w:t>
       </w:r>
     </w:p>
@@ -20206,7 +20215,7 @@
           <w:noProof/>
         </w:rPr>
         <w:drawing>
-          <wp:inline distT="0" distB="0" distL="0" distR="0" wp14:anchorId="17D15ED6" wp14:editId="562FE406">
+          <wp:inline distT="0" distB="0" distL="0" distR="0" wp14:anchorId="23512375" wp14:editId="7AC9FD51">
             <wp:extent cx="5734050" cy="3581400"/>
             <wp:effectExtent l="0" t="0" r="0" b="0"/>
             <wp:docPr id="4" name="03_ask.png" descr="Ask: GraphRAG answer to &quot;Which methods are used for link prediction?&quot; with citations, the graph of retrieved facts, and graph size (signed-in member)." title="Ask: GraphRAG answer to &quot;Which methods are used for link prediction?&quot; with citations, the graph of retrieved facts, and graph size (signed-in member)."/>
@@ -20275,6 +20284,7 @@
         <w:jc w:val="both"/>
       </w:pPr>
       <w:r>
+        <w:lastRenderedPageBreak/>
         <w:t>Each statement in the answer ends with a clickable citation to its source paper (OpenAlex ID or sample document). The graph in the centre shows the facts that were retrieved, and the right panel shows the live node counts and the members-only upload control.</w:t>
       </w:r>
     </w:p>
@@ -20288,10 +20298,9 @@
         <w:rPr>
           <w:noProof/>
         </w:rPr>
-        <w:lastRenderedPageBreak/>
         <w:drawing>
-          <wp:inline distT="0" distB="0" distL="0" distR="0" wp14:anchorId="064BA16F" wp14:editId="1E7CDE57">
-            <wp:extent cx="4210050" cy="3638550"/>
+          <wp:inline distT="0" distB="0" distL="0" distR="0" wp14:anchorId="32080702" wp14:editId="7901B7DB">
+            <wp:extent cx="3295650" cy="4143375"/>
             <wp:effectExtent l="0" t="0" r="0" b="0"/>
             <wp:docPr id="5" name="05_connect.png" descr="Connect: the shortest multi-hop path between TransE and BERT (TransE is used by a survey that KG-CF cites, and KG-CF uses BERT)." title="Connect: the shortest multi-hop path between TransE and BERT (TransE is used by a survey that KG-CF cites, and KG-CF uses BERT)."/>
             <wp:cNvGraphicFramePr>
@@ -20316,7 +20325,7 @@
                   <pic:spPr bwMode="auto">
                     <a:xfrm>
                       <a:off x="0" y="0"/>
-                      <a:ext cx="4210050" cy="3638550"/>
+                      <a:ext cx="3295650" cy="4143375"/>
                     </a:xfrm>
                     <a:prstGeom prst="rect">
                       <a:avLst/>
@@ -20366,7 +20375,7 @@
       <w:pPr>
         <w:pStyle w:val="Heading2"/>
       </w:pPr>
-      <w:bookmarkStart w:id="36" w:name="_Toc242980211"/>
+      <w:bookmarkStart w:id="36" w:name="_Toc242980834"/>
       <w:r>
         <w:t>9.3 Repository and Project Structure</w:t>
       </w:r>
@@ -20429,6 +20438,7 @@
                 <w:sz w:val="20"/>
                 <w:szCs w:val="20"/>
               </w:rPr>
+              <w:lastRenderedPageBreak/>
               <w:t>Folder</w:t>
             </w:r>
           </w:p>
@@ -20810,7 +20820,6 @@
                 <w:sz w:val="20"/>
                 <w:szCs w:val="20"/>
               </w:rPr>
-              <w:lastRenderedPageBreak/>
               <w:t>dataset/</w:t>
             </w:r>
           </w:p>
@@ -21102,7 +21111,7 @@
       <w:pPr>
         <w:pStyle w:val="Heading2"/>
       </w:pPr>
-      <w:bookmarkStart w:id="37" w:name="_Toc242980212"/>
+      <w:bookmarkStart w:id="37" w:name="_Toc242980835"/>
       <w:r>
         <w:t>9.4 Version Control Workflow</w:t>
       </w:r>
@@ -21124,7 +21133,7 @@
       <w:pPr>
         <w:pStyle w:val="Heading1"/>
       </w:pPr>
-      <w:bookmarkStart w:id="38" w:name="_Toc242980213"/>
+      <w:bookmarkStart w:id="38" w:name="_Toc242980836"/>
       <w:r>
         <w:t>10. Testing, Results and Observations</w:t>
       </w:r>
@@ -21134,7 +21143,7 @@
       <w:pPr>
         <w:pStyle w:val="Heading2"/>
       </w:pPr>
-      <w:bookmarkStart w:id="39" w:name="_Toc242980214"/>
+      <w:bookmarkStart w:id="39" w:name="_Toc242980837"/>
       <w:r>
         <w:t>10.1 Test Plan and Test Cases</w:t>
       </w:r>
@@ -21776,6 +21785,7 @@
                 <w:sz w:val="17"/>
                 <w:szCs w:val="17"/>
               </w:rPr>
+              <w:lastRenderedPageBreak/>
               <w:t>T03</w:t>
             </w:r>
           </w:p>
@@ -22313,7 +22323,6 @@
                 <w:sz w:val="17"/>
                 <w:szCs w:val="17"/>
               </w:rPr>
-              <w:lastRenderedPageBreak/>
               <w:t>T06</w:t>
             </w:r>
           </w:p>
@@ -23722,7 +23731,7 @@
       <w:pPr>
         <w:pStyle w:val="Heading2"/>
       </w:pPr>
-      <w:bookmarkStart w:id="40" w:name="_Toc242980215"/>
+      <w:bookmarkStart w:id="40" w:name="_Toc242980838"/>
       <w:r>
         <w:t>10.2 Results</w:t>
       </w:r>
@@ -23755,8 +23764,9 @@
         <w:rPr>
           <w:noProof/>
         </w:rPr>
+        <w:lastRenderedPageBreak/>
         <w:drawing>
-          <wp:inline distT="0" distB="0" distL="0" distR="0" wp14:anchorId="376A803B" wp14:editId="0BC61BFF">
+          <wp:inline distT="0" distB="0" distL="0" distR="0" wp14:anchorId="51F74E7C" wp14:editId="178AC3B1">
             <wp:extent cx="5124450" cy="2466975"/>
             <wp:effectExtent l="0" t="0" r="0" b="0"/>
             <wp:docPr id="6" name="fig_ner_f1.png" descr="SciBERT NER test F1 per entity type (overall 0.618; precision 0.593, recall 0.645)." title="SciBERT NER test F1 per entity type (overall 0.618; precision 0.593, recall 0.645)."/>
@@ -23829,9 +23839,8 @@
         <w:rPr>
           <w:noProof/>
         </w:rPr>
-        <w:lastRenderedPageBreak/>
         <w:drawing>
-          <wp:inline distT="0" distB="0" distL="0" distR="0" wp14:anchorId="4A2CC0D4" wp14:editId="31EE71E3">
+          <wp:inline distT="0" distB="0" distL="0" distR="0" wp14:anchorId="41820C35" wp14:editId="351B1BDB">
             <wp:extent cx="5124450" cy="2619375"/>
             <wp:effectExtent l="0" t="0" r="0" b="0"/>
             <wp:docPr id="7" name="fig_re.png" descr="Relation extraction before and after the model improvement (SciERC test, calibrated on dev)." title="Relation extraction before and after the model improvement (SciERC test, calibrated on dev)."/>
@@ -23917,7 +23926,11 @@
         <w:jc w:val="both"/>
       </w:pPr>
       <w:r>
-        <w:t>Final graph (evaluation snapshot): 29,320 nodes and 42,015 relationships: 20,746 papers (most are cited references), 1,674 authors, 553 institutions, 2,416 methods, 1,727 tasks, 779 datasets and 262 metrics. On 51 generated questions, context recall was 98.3%, 97.8% of questions had every ground-truth item retrieved, and average retrieval time was 0.535 s with 27 parallel queries (previously about 6 s with 44 sequential queries).</w:t>
+        <w:t xml:space="preserve">Final graph (evaluation snapshot): 29,320 nodes and 42,015 relationships: 20,746 papers (most are cited references), 1,674 authors, 553 institutions, 2,416 methods, 1,727 tasks, 779 datasets and 262 metrics. On 51 generated questions, context recall was 98.3%, 97.8% of questions had </w:t>
+      </w:r>
+      <w:r>
+        <w:lastRenderedPageBreak/>
+        <w:t>every ground-truth item retrieved, and average retrieval time was 0.535 s with 27 parallel queries (previously about 6 s with 44 sequential queries).</w:t>
       </w:r>
     </w:p>
     <w:p>
@@ -23925,7 +23938,6 @@
         <w:pStyle w:val="Heading3"/>
       </w:pPr>
       <w:r>
-        <w:lastRenderedPageBreak/>
         <w:t>GraphRAG answers (Objective 3)</w:t>
       </w:r>
     </w:p>
@@ -23940,7 +23952,7 @@
           <w:noProof/>
         </w:rPr>
         <w:drawing>
-          <wp:inline distT="0" distB="0" distL="0" distR="0" wp14:anchorId="2393E862" wp14:editId="7C46C60C">
+          <wp:inline distT="0" distB="0" distL="0" distR="0" wp14:anchorId="6C0868C9" wp14:editId="19A8EB1F">
             <wp:extent cx="5124450" cy="2924175"/>
             <wp:effectExtent l="0" t="0" r="0" b="0"/>
             <wp:docPr id="8" name="fig_graphrag.png" descr="Hallucination benchmark: GraphRAG vs the same LLM without the graph (28 questions: 24 answerable, 4 about made-up entities)." title="Hallucination benchmark: GraphRAG vs the same LLM without the graph (28 questions: 24 answerable, 4 about made-up entities)."/>
@@ -24046,16 +24058,19 @@
         <w:t>The dashboard was tested in Microsoft Edge with Playwright (results/UI_UX_TESTING.md). The landing page loaded in 0.24-0.66 s over three fresh loads, sign-in opened the app in 0.91 s and an answer appeared 2.42 s after asking. A wrong password gives a non-revealing message, non-members see why upload is hidden, the sign-in form works with the keyboard alone, and at phone width (390 x 844) the layout stacks into one column with no horizontal scrolling. An axe-core scan (WCAG 2.0/2.1 A and AA) found no violat</w:t>
       </w:r>
       <w:r>
-        <w:t>ions in the signed-in app and one on the landing page: the password Show button had a contrast ratio of 4.4:1 against the 4.5:1 minimum; it was corrected to 5.27:1.</w:t>
+        <w:t xml:space="preserve">ions in the signed-in app and one on </w:t>
+      </w:r>
+      <w:r>
+        <w:lastRenderedPageBreak/>
+        <w:t>the landing page: the password Show button had a contrast ratio of 4.4:1 against the 4.5:1 minimum; it was corrected to 5.27:1 in the light theme and 6.53:1 in the dark theme.</w:t>
       </w:r>
     </w:p>
     <w:p>
       <w:pPr>
         <w:pStyle w:val="Heading2"/>
       </w:pPr>
-      <w:bookmarkStart w:id="41" w:name="_Toc242980216"/>
-      <w:r>
-        <w:lastRenderedPageBreak/>
+      <w:bookmarkStart w:id="41" w:name="_Toc242980839"/>
+      <w:r>
         <w:t>10.3 Baseline Comparison</w:t>
       </w:r>
       <w:bookmarkEnd w:id="41"/>
@@ -24965,7 +24980,7 @@
       <w:pPr>
         <w:pStyle w:val="Heading2"/>
       </w:pPr>
-      <w:bookmarkStart w:id="42" w:name="_Toc242980217"/>
+      <w:bookmarkStart w:id="42" w:name="_Toc242980840"/>
       <w:r>
         <w:t>10.4 Results Summary</w:t>
       </w:r>
@@ -25876,7 +25891,7 @@
       <w:pPr>
         <w:pStyle w:val="Heading1"/>
       </w:pPr>
-      <w:bookmarkStart w:id="43" w:name="_Toc242980218"/>
+      <w:bookmarkStart w:id="43" w:name="_Toc242980841"/>
       <w:r>
         <w:t>11. Discussion, Limitations and Risk Analysis</w:t>
       </w:r>
@@ -25886,7 +25901,7 @@
       <w:pPr>
         <w:pStyle w:val="Heading2"/>
       </w:pPr>
-      <w:bookmarkStart w:id="44" w:name="_Toc242980219"/>
+      <w:bookmarkStart w:id="44" w:name="_Toc242980842"/>
       <w:r>
         <w:t>11.1 Discussion</w:t>
       </w:r>
@@ -25898,11 +25913,11 @@
         <w:jc w:val="both"/>
       </w:pPr>
       <w:r>
-        <w:t xml:space="preserve">The main result is the controlled hallucination test. With the same model and the same questions, removing the graph turned 62.5% of answers into confident mistakes (for example, invented authors, venue and year of a survey paper), while GraphRAG answered every answerable question correctly with citations. Both systems refused questions about made-up entities, so the improvement comes from grounding in retrievable facts, not from the model </w:t>
+        <w:t xml:space="preserve">The main result is the controlled hallucination test. With the same model and the same questions, removing the graph turned 62.5% of answers into confident mistakes (for example, invented authors, venue and year of a survey paper), while GraphRAG answered every answerable question correctly with citations. Both systems refused questions about made-up </w:t>
       </w:r>
       <w:r>
         <w:lastRenderedPageBreak/>
-        <w:t>being more cautious. For users, this means that every statement can be checked by clicking its citation.</w:t>
+        <w:t>entities, so the improvement comes from grounding in retrievable facts, not from the model being more cautious. For users, this means that every statement can be checked by clicking its citation.</w:t>
       </w:r>
     </w:p>
     <w:p>
@@ -25918,7 +25933,7 @@
       <w:pPr>
         <w:pStyle w:val="Heading2"/>
       </w:pPr>
-      <w:bookmarkStart w:id="45" w:name="_Toc242980220"/>
+      <w:bookmarkStart w:id="45" w:name="_Toc242980843"/>
       <w:r>
         <w:t>11.2 Limitations</w:t>
       </w:r>
@@ -26052,7 +26067,7 @@
       <w:pPr>
         <w:pStyle w:val="Heading2"/>
       </w:pPr>
-      <w:bookmarkStart w:id="46" w:name="_Toc242980221"/>
+      <w:bookmarkStart w:id="46" w:name="_Toc242980844"/>
       <w:r>
         <w:t>11.3 Risks and Mitigation</w:t>
       </w:r>
@@ -26963,7 +26978,7 @@
       <w:pPr>
         <w:pStyle w:val="Heading1"/>
       </w:pPr>
-      <w:bookmarkStart w:id="47" w:name="_Toc242980222"/>
+      <w:bookmarkStart w:id="47" w:name="_Toc242980845"/>
       <w:r>
         <w:t>12. Team Contribution and Project Management</w:t>
       </w:r>
@@ -28116,7 +28131,7 @@
       <w:pPr>
         <w:pStyle w:val="Heading2"/>
       </w:pPr>
-      <w:bookmarkStart w:id="48" w:name="_Toc242980223"/>
+      <w:bookmarkStart w:id="48" w:name="_Toc242980846"/>
       <w:r>
         <w:lastRenderedPageBreak/>
         <w:t>12.1 Individual Contribution Evidence</w:t>
@@ -28196,7 +28211,7 @@
       <w:pPr>
         <w:pStyle w:val="Heading1"/>
       </w:pPr>
-      <w:bookmarkStart w:id="49" w:name="_Toc242980224"/>
+      <w:bookmarkStart w:id="49" w:name="_Toc242980847"/>
       <w:r>
         <w:t>13. Conclusion and Future Enhancements</w:t>
       </w:r>
@@ -28206,7 +28221,7 @@
       <w:pPr>
         <w:pStyle w:val="Heading2"/>
       </w:pPr>
-      <w:bookmarkStart w:id="50" w:name="_Toc242980225"/>
+      <w:bookmarkStart w:id="50" w:name="_Toc242980848"/>
       <w:r>
         <w:t>13.1 Conclusion</w:t>
       </w:r>
@@ -28228,7 +28243,7 @@
       <w:pPr>
         <w:pStyle w:val="Heading2"/>
       </w:pPr>
-      <w:bookmarkStart w:id="51" w:name="_Toc242980226"/>
+      <w:bookmarkStart w:id="51" w:name="_Toc242980849"/>
       <w:r>
         <w:t>13.2 Future Enhancements</w:t>
       </w:r>
@@ -28304,7 +28319,7 @@
       <w:pPr>
         <w:pStyle w:val="Heading1"/>
       </w:pPr>
-      <w:bookmarkStart w:id="52" w:name="_Toc242980227"/>
+      <w:bookmarkStart w:id="52" w:name="_Toc242980850"/>
       <w:r>
         <w:t>References</w:t>
       </w:r>
@@ -28547,7 +28562,7 @@
       <w:pPr>
         <w:pStyle w:val="Heading1"/>
       </w:pPr>
-      <w:bookmarkStart w:id="53" w:name="_Toc242980228"/>
+      <w:bookmarkStart w:id="53" w:name="_Toc242980851"/>
       <w:r>
         <w:t>Appendix A - Project Timeline</w:t>
       </w:r>
@@ -29803,7 +29818,7 @@
       <w:pPr>
         <w:pStyle w:val="Heading1"/>
       </w:pPr>
-      <w:bookmarkStart w:id="54" w:name="_Toc242980229"/>
+      <w:bookmarkStart w:id="54" w:name="_Toc242980852"/>
       <w:r>
         <w:t>Appendix B - Final Review Checklist</w:t>
       </w:r>
@@ -30037,230 +30052,10 @@
 <file path=word/numbering.xml><?xml version="1.0" encoding="utf-8"?>
 <w:numbering xmlns:wpc="http://schemas.microsoft.com/office/word/2010/wordprocessingCanvas" xmlns:cx="http://schemas.microsoft.com/office/drawing/2014/chartex" xmlns:cx1="http://schemas.microsoft.com/office/drawing/2015/9/8/chartex" xmlns:cx2="http://schemas.microsoft.com/office/drawing/2015/10/21/chartex" xmlns:cx3="http://schemas.microsoft.com/office/drawing/2016/5/9/chartex" xmlns:cx4="http://schemas.microsoft.com/office/drawing/2016/5/10/chartex" xmlns:cx5="http://schemas.microsoft.com/office/drawing/2016/5/11/chartex" xmlns:cx6="http://schemas.microsoft.com/office/drawing/2016/5/12/chartex" xmlns:cx7="http://schemas.microsoft.com/office/drawing/2016/5/13/chartex" xmlns:cx8="http://schemas.microsoft.com/office/drawing/2016/5/14/chartex" xmlns:mc="http://schemas.openxmlformats.org/markup-compatibility/2006" xmlns:aink="http://schemas.microsoft.com/office/drawing/2016/ink" xmlns:am3d="http://schemas.microsoft.com/office/drawing/2017/model3d" xmlns:o="urn:schemas-microsoft-com:office:office" xmlns:oel="http://schemas.microsoft.com/office/2019/extlst" xmlns:r="http://schemas.openxmlformats.org/officeDocument/2006/relationships" xmlns:m="http://schemas.openxmlformats.org/officeDocument/2006/math" xmlns:v="urn:schemas-microsoft-com:vml" xmlns:wp14="http://schemas.microsoft.com/office/word/2010/wordprocessingDrawing" xmlns:wp="http://schemas.openxmlformats.org/drawingml/2006/wordprocessingDrawing" xmlns:w10="urn:schemas-microsoft-com:office:word" xmlns:w="http://schemas.openxmlformats.org/wordprocessingml/2006/main" xmlns:w14="http://schemas.microsoft.com/office/word/2010/wordml" xmlns:w15="http://schemas.microsoft.com/office/word/2012/wordml" xmlns:w16cex="http://schemas.microsoft.com/office/word/2018/wordml/cex" xmlns:w16cid="http://schemas.microsoft.com/office/word/2016/wordml/cid" xmlns:w16="http://schemas.microsoft.com/office/word/2018/wordml" xmlns:w16du="http://schemas.microsoft.com/office/word/2023/wordml/word16du" xmlns:w16sdtdh="http://schemas.microsoft.com/office/word/2020/wordml/sdtdatahash" xmlns:w16sdtfl="http://schemas.microsoft.com/office/word/2024/wordml/sdtformatlock" xmlns:w16se="http://schemas.microsoft.com/office/word/2015/wordml/symex" xmlns:wpg="http://schemas.microsoft.com/office/word/2010/wordprocessingGroup" xmlns:wpi="http://schemas.microsoft.com/office/word/2010/wordprocessingInk" xmlns:wne="http://schemas.microsoft.com/office/word/2006/wordml" xmlns:wps="http://schemas.microsoft.com/office/word/2010/wordprocessingShape" mc:Ignorable="w14 w15 w16se w16cid w16 w16cex w16sdtdh w16sdtfl w16du wp14">
   <w:abstractNum w:abstractNumId="0" w15:restartNumberingAfterBreak="0">
-    <w:nsid w:val="148F5805"/>
+    <w:nsid w:val="09BA5C6A"/>
     <w:multiLevelType w:val="hybridMultilevel"/>
-    <w:tmpl w:val="E410FA38"/>
-    <w:lvl w:ilvl="0" w:tplc="CD2CBB72">
-      <w:start w:val="1"/>
-      <w:numFmt w:val="decimal"/>
-      <w:lvlText w:val="%1."/>
-      <w:lvlJc w:val="left"/>
-      <w:pPr>
-        <w:ind w:left="540" w:hanging="360"/>
-      </w:pPr>
-    </w:lvl>
-    <w:lvl w:ilvl="1" w:tplc="8334E4F6">
-      <w:numFmt w:val="decimal"/>
-      <w:lvlText w:val=""/>
-      <w:lvlJc w:val="left"/>
-    </w:lvl>
-    <w:lvl w:ilvl="2" w:tplc="7514E9DE">
-      <w:numFmt w:val="decimal"/>
-      <w:lvlText w:val=""/>
-      <w:lvlJc w:val="left"/>
-    </w:lvl>
-    <w:lvl w:ilvl="3" w:tplc="8E140E18">
-      <w:numFmt w:val="decimal"/>
-      <w:lvlText w:val=""/>
-      <w:lvlJc w:val="left"/>
-    </w:lvl>
-    <w:lvl w:ilvl="4" w:tplc="1CF08930">
-      <w:numFmt w:val="decimal"/>
-      <w:lvlText w:val=""/>
-      <w:lvlJc w:val="left"/>
-    </w:lvl>
-    <w:lvl w:ilvl="5" w:tplc="9306CE76">
-      <w:numFmt w:val="decimal"/>
-      <w:lvlText w:val=""/>
-      <w:lvlJc w:val="left"/>
-    </w:lvl>
-    <w:lvl w:ilvl="6" w:tplc="3C9EF7DE">
-      <w:numFmt w:val="decimal"/>
-      <w:lvlText w:val=""/>
-      <w:lvlJc w:val="left"/>
-    </w:lvl>
-    <w:lvl w:ilvl="7" w:tplc="9328DE24">
-      <w:numFmt w:val="decimal"/>
-      <w:lvlText w:val=""/>
-      <w:lvlJc w:val="left"/>
-    </w:lvl>
-    <w:lvl w:ilvl="8" w:tplc="8D4079B0">
-      <w:numFmt w:val="decimal"/>
-      <w:lvlText w:val=""/>
-      <w:lvlJc w:val="left"/>
-    </w:lvl>
-  </w:abstractNum>
-  <w:abstractNum w:abstractNumId="1" w15:restartNumberingAfterBreak="0">
-    <w:nsid w:val="34A907E4"/>
-    <w:multiLevelType w:val="hybridMultilevel"/>
-    <w:tmpl w:val="E7A67260"/>
-    <w:lvl w:ilvl="0" w:tplc="71A2AEE4">
-      <w:start w:val="1"/>
-      <w:numFmt w:val="bullet"/>
-      <w:lvlText w:val="•"/>
-      <w:lvlJc w:val="left"/>
-      <w:pPr>
-        <w:ind w:left="540" w:hanging="300"/>
-      </w:pPr>
-    </w:lvl>
-    <w:lvl w:ilvl="1" w:tplc="0CA0CC3A" w:tentative="1">
-      <w:start w:val="1"/>
-      <w:numFmt w:val="bullet"/>
-      <w:lvlText w:val="–"/>
-      <w:lvlJc w:val="left"/>
-      <w:pPr>
-        <w:ind w:left="1080" w:hanging="300"/>
-      </w:pPr>
-    </w:lvl>
-    <w:lvl w:ilvl="2" w:tplc="7A5C8774">
-      <w:numFmt w:val="decimal"/>
-      <w:lvlText w:val=""/>
-      <w:lvlJc w:val="left"/>
-    </w:lvl>
-    <w:lvl w:ilvl="3" w:tplc="E59AEA3A">
-      <w:numFmt w:val="decimal"/>
-      <w:lvlText w:val=""/>
-      <w:lvlJc w:val="left"/>
-    </w:lvl>
-    <w:lvl w:ilvl="4" w:tplc="5CD266EA">
-      <w:numFmt w:val="decimal"/>
-      <w:lvlText w:val=""/>
-      <w:lvlJc w:val="left"/>
-    </w:lvl>
-    <w:lvl w:ilvl="5" w:tplc="7A2A059E">
-      <w:numFmt w:val="decimal"/>
-      <w:lvlText w:val=""/>
-      <w:lvlJc w:val="left"/>
-    </w:lvl>
-    <w:lvl w:ilvl="6" w:tplc="EB12D248">
-      <w:numFmt w:val="decimal"/>
-      <w:lvlText w:val=""/>
-      <w:lvlJc w:val="left"/>
-    </w:lvl>
-    <w:lvl w:ilvl="7" w:tplc="D3B45112">
-      <w:numFmt w:val="decimal"/>
-      <w:lvlText w:val=""/>
-      <w:lvlJc w:val="left"/>
-    </w:lvl>
-    <w:lvl w:ilvl="8" w:tplc="AF608090">
-      <w:numFmt w:val="decimal"/>
-      <w:lvlText w:val=""/>
-      <w:lvlJc w:val="left"/>
-    </w:lvl>
-  </w:abstractNum>
-  <w:abstractNum w:abstractNumId="2" w15:restartNumberingAfterBreak="0">
-    <w:nsid w:val="55281B26"/>
-    <w:multiLevelType w:val="hybridMultilevel"/>
-    <w:tmpl w:val="844CBEF6"/>
-    <w:lvl w:ilvl="0" w:tplc="6BC4D148">
-      <w:start w:val="1"/>
-      <w:numFmt w:val="decimal"/>
-      <w:lvlText w:val="%1."/>
-      <w:lvlJc w:val="left"/>
-      <w:pPr>
-        <w:ind w:left="540" w:hanging="360"/>
-      </w:pPr>
-    </w:lvl>
-    <w:lvl w:ilvl="1" w:tplc="44746F3A">
-      <w:numFmt w:val="decimal"/>
-      <w:lvlText w:val=""/>
-      <w:lvlJc w:val="left"/>
-    </w:lvl>
-    <w:lvl w:ilvl="2" w:tplc="8646D60A">
-      <w:numFmt w:val="decimal"/>
-      <w:lvlText w:val=""/>
-      <w:lvlJc w:val="left"/>
-    </w:lvl>
-    <w:lvl w:ilvl="3" w:tplc="FF782742">
-      <w:numFmt w:val="decimal"/>
-      <w:lvlText w:val=""/>
-      <w:lvlJc w:val="left"/>
-    </w:lvl>
-    <w:lvl w:ilvl="4" w:tplc="99BC620C">
-      <w:numFmt w:val="decimal"/>
-      <w:lvlText w:val=""/>
-      <w:lvlJc w:val="left"/>
-    </w:lvl>
-    <w:lvl w:ilvl="5" w:tplc="DC02F4C8">
-      <w:numFmt w:val="decimal"/>
-      <w:lvlText w:val=""/>
-      <w:lvlJc w:val="left"/>
-    </w:lvl>
-    <w:lvl w:ilvl="6" w:tplc="4DC618C6">
-      <w:numFmt w:val="decimal"/>
-      <w:lvlText w:val=""/>
-      <w:lvlJc w:val="left"/>
-    </w:lvl>
-    <w:lvl w:ilvl="7" w:tplc="CFE062DA">
-      <w:numFmt w:val="decimal"/>
-      <w:lvlText w:val=""/>
-      <w:lvlJc w:val="left"/>
-    </w:lvl>
-    <w:lvl w:ilvl="8" w:tplc="BAFA95D4">
-      <w:numFmt w:val="decimal"/>
-      <w:lvlText w:val=""/>
-      <w:lvlJc w:val="left"/>
-    </w:lvl>
-  </w:abstractNum>
-  <w:abstractNum w:abstractNumId="3" w15:restartNumberingAfterBreak="0">
-    <w:nsid w:val="614F6A3F"/>
-    <w:multiLevelType w:val="hybridMultilevel"/>
-    <w:tmpl w:val="9F9EF454"/>
-    <w:lvl w:ilvl="0" w:tplc="BF7A3F48">
-      <w:start w:val="1"/>
-      <w:numFmt w:val="decimal"/>
-      <w:lvlText w:val="%1."/>
-      <w:lvlJc w:val="left"/>
-      <w:pPr>
-        <w:ind w:left="540" w:hanging="360"/>
-      </w:pPr>
-    </w:lvl>
-    <w:lvl w:ilvl="1" w:tplc="176619FE">
-      <w:numFmt w:val="decimal"/>
-      <w:lvlText w:val=""/>
-      <w:lvlJc w:val="left"/>
-    </w:lvl>
-    <w:lvl w:ilvl="2" w:tplc="A8C88488">
-      <w:numFmt w:val="decimal"/>
-      <w:lvlText w:val=""/>
-      <w:lvlJc w:val="left"/>
-    </w:lvl>
-    <w:lvl w:ilvl="3" w:tplc="B7BE907C">
-      <w:numFmt w:val="decimal"/>
-      <w:lvlText w:val=""/>
-      <w:lvlJc w:val="left"/>
-    </w:lvl>
-    <w:lvl w:ilvl="4" w:tplc="82B0200E">
-      <w:numFmt w:val="decimal"/>
-      <w:lvlText w:val=""/>
-      <w:lvlJc w:val="left"/>
-    </w:lvl>
-    <w:lvl w:ilvl="5" w:tplc="1B108FE0">
-      <w:numFmt w:val="decimal"/>
-      <w:lvlText w:val=""/>
-      <w:lvlJc w:val="left"/>
-    </w:lvl>
-    <w:lvl w:ilvl="6" w:tplc="F1726D86">
-      <w:numFmt w:val="decimal"/>
-      <w:lvlText w:val=""/>
-      <w:lvlJc w:val="left"/>
-    </w:lvl>
-    <w:lvl w:ilvl="7" w:tplc="33025092">
-      <w:numFmt w:val="decimal"/>
-      <w:lvlText w:val=""/>
-      <w:lvlJc w:val="left"/>
-    </w:lvl>
-    <w:lvl w:ilvl="8" w:tplc="836C37BC">
-      <w:numFmt w:val="decimal"/>
-      <w:lvlText w:val=""/>
-      <w:lvlJc w:val="left"/>
-    </w:lvl>
-  </w:abstractNum>
-  <w:abstractNum w:abstractNumId="4" w15:restartNumberingAfterBreak="0">
-    <w:nsid w:val="785E0300"/>
-    <w:multiLevelType w:val="hybridMultilevel"/>
-    <w:tmpl w:val="393E7064"/>
-    <w:lvl w:ilvl="0" w:tplc="2E420756" w:tentative="1">
+    <w:tmpl w:val="4360377A"/>
+    <w:lvl w:ilvl="0" w:tplc="CFE075E6" w:tentative="1">
       <w:start w:val="1"/>
       <w:numFmt w:val="bullet"/>
       <w:lvlText w:val="●"/>
@@ -30269,7 +30064,7 @@
         <w:ind w:left="720" w:hanging="360"/>
       </w:pPr>
     </w:lvl>
-    <w:lvl w:ilvl="1" w:tplc="B6508A38" w:tentative="1">
+    <w:lvl w:ilvl="1" w:tplc="6FA6ACAA" w:tentative="1">
       <w:start w:val="1"/>
       <w:numFmt w:val="bullet"/>
       <w:lvlText w:val="○"/>
@@ -30278,7 +30073,7 @@
         <w:ind w:left="1440" w:hanging="360"/>
       </w:pPr>
     </w:lvl>
-    <w:lvl w:ilvl="2" w:tplc="EF763FDC" w:tentative="1">
+    <w:lvl w:ilvl="2" w:tplc="8598AE40" w:tentative="1">
       <w:start w:val="1"/>
       <w:numFmt w:val="bullet"/>
       <w:lvlText w:val="■"/>
@@ -30287,7 +30082,7 @@
         <w:ind w:left="2160" w:hanging="360"/>
       </w:pPr>
     </w:lvl>
-    <w:lvl w:ilvl="3" w:tplc="454E1BD6" w:tentative="1">
+    <w:lvl w:ilvl="3" w:tplc="53B82DF6" w:tentative="1">
       <w:start w:val="1"/>
       <w:numFmt w:val="bullet"/>
       <w:lvlText w:val="●"/>
@@ -30296,7 +30091,7 @@
         <w:ind w:left="2880" w:hanging="360"/>
       </w:pPr>
     </w:lvl>
-    <w:lvl w:ilvl="4" w:tplc="5E72A85C" w:tentative="1">
+    <w:lvl w:ilvl="4" w:tplc="BB66C556" w:tentative="1">
       <w:start w:val="1"/>
       <w:numFmt w:val="bullet"/>
       <w:lvlText w:val="○"/>
@@ -30305,7 +30100,7 @@
         <w:ind w:left="3600" w:hanging="360"/>
       </w:pPr>
     </w:lvl>
-    <w:lvl w:ilvl="5" w:tplc="4B30CB40" w:tentative="1">
+    <w:lvl w:ilvl="5" w:tplc="E766F8A8" w:tentative="1">
       <w:start w:val="1"/>
       <w:numFmt w:val="bullet"/>
       <w:lvlText w:val="■"/>
@@ -30314,7 +30109,7 @@
         <w:ind w:left="4320" w:hanging="360"/>
       </w:pPr>
     </w:lvl>
-    <w:lvl w:ilvl="6" w:tplc="D494C0EE" w:tentative="1">
+    <w:lvl w:ilvl="6" w:tplc="E4E60DFE" w:tentative="1">
       <w:start w:val="1"/>
       <w:numFmt w:val="bullet"/>
       <w:lvlText w:val="●"/>
@@ -30323,7 +30118,7 @@
         <w:ind w:left="5040" w:hanging="360"/>
       </w:pPr>
     </w:lvl>
-    <w:lvl w:ilvl="7" w:tplc="162298E4" w:tentative="1">
+    <w:lvl w:ilvl="7" w:tplc="0D4EEBD4" w:tentative="1">
       <w:start w:val="1"/>
       <w:numFmt w:val="bullet"/>
       <w:lvlText w:val="●"/>
@@ -30332,7 +30127,7 @@
         <w:ind w:left="5760" w:hanging="360"/>
       </w:pPr>
     </w:lvl>
-    <w:lvl w:ilvl="8" w:tplc="DD30022C" w:tentative="1">
+    <w:lvl w:ilvl="8" w:tplc="DC1E29A4" w:tentative="1">
       <w:start w:val="1"/>
       <w:numFmt w:val="bullet"/>
       <w:lvlText w:val="●"/>
@@ -30342,32 +30137,252 @@
       </w:pPr>
     </w:lvl>
   </w:abstractNum>
-  <w:num w:numId="1" w16cid:durableId="86389168">
-    <w:abstractNumId w:val="4"/>
-    <w:lvlOverride w:ilvl="0">
-      <w:startOverride w:val="1"/>
-    </w:lvlOverride>
-  </w:num>
-  <w:num w:numId="2" w16cid:durableId="1758940956">
+  <w:abstractNum w:abstractNumId="1" w15:restartNumberingAfterBreak="0">
+    <w:nsid w:val="0BFE540A"/>
+    <w:multiLevelType w:val="hybridMultilevel"/>
+    <w:tmpl w:val="9E9C54B6"/>
+    <w:lvl w:ilvl="0" w:tplc="46DE166A">
+      <w:start w:val="1"/>
+      <w:numFmt w:val="decimal"/>
+      <w:lvlText w:val="%1."/>
+      <w:lvlJc w:val="left"/>
+      <w:pPr>
+        <w:ind w:left="540" w:hanging="360"/>
+      </w:pPr>
+    </w:lvl>
+    <w:lvl w:ilvl="1" w:tplc="5C6ABC38">
+      <w:numFmt w:val="decimal"/>
+      <w:lvlText w:val=""/>
+      <w:lvlJc w:val="left"/>
+    </w:lvl>
+    <w:lvl w:ilvl="2" w:tplc="272C178C">
+      <w:numFmt w:val="decimal"/>
+      <w:lvlText w:val=""/>
+      <w:lvlJc w:val="left"/>
+    </w:lvl>
+    <w:lvl w:ilvl="3" w:tplc="DCFEB954">
+      <w:numFmt w:val="decimal"/>
+      <w:lvlText w:val=""/>
+      <w:lvlJc w:val="left"/>
+    </w:lvl>
+    <w:lvl w:ilvl="4" w:tplc="659ED92A">
+      <w:numFmt w:val="decimal"/>
+      <w:lvlText w:val=""/>
+      <w:lvlJc w:val="left"/>
+    </w:lvl>
+    <w:lvl w:ilvl="5" w:tplc="E298A232">
+      <w:numFmt w:val="decimal"/>
+      <w:lvlText w:val=""/>
+      <w:lvlJc w:val="left"/>
+    </w:lvl>
+    <w:lvl w:ilvl="6" w:tplc="E46C9032">
+      <w:numFmt w:val="decimal"/>
+      <w:lvlText w:val=""/>
+      <w:lvlJc w:val="left"/>
+    </w:lvl>
+    <w:lvl w:ilvl="7" w:tplc="34CA9B58">
+      <w:numFmt w:val="decimal"/>
+      <w:lvlText w:val=""/>
+      <w:lvlJc w:val="left"/>
+    </w:lvl>
+    <w:lvl w:ilvl="8" w:tplc="0A2CA96A">
+      <w:numFmt w:val="decimal"/>
+      <w:lvlText w:val=""/>
+      <w:lvlJc w:val="left"/>
+    </w:lvl>
+  </w:abstractNum>
+  <w:abstractNum w:abstractNumId="2" w15:restartNumberingAfterBreak="0">
+    <w:nsid w:val="357F0CAA"/>
+    <w:multiLevelType w:val="hybridMultilevel"/>
+    <w:tmpl w:val="1F86BA68"/>
+    <w:lvl w:ilvl="0" w:tplc="B0202B74">
+      <w:start w:val="1"/>
+      <w:numFmt w:val="bullet"/>
+      <w:lvlText w:val="•"/>
+      <w:lvlJc w:val="left"/>
+      <w:pPr>
+        <w:ind w:left="540" w:hanging="300"/>
+      </w:pPr>
+    </w:lvl>
+    <w:lvl w:ilvl="1" w:tplc="71AAE69A" w:tentative="1">
+      <w:start w:val="1"/>
+      <w:numFmt w:val="bullet"/>
+      <w:lvlText w:val="–"/>
+      <w:lvlJc w:val="left"/>
+      <w:pPr>
+        <w:ind w:left="1080" w:hanging="300"/>
+      </w:pPr>
+    </w:lvl>
+    <w:lvl w:ilvl="2" w:tplc="45D09AFC">
+      <w:numFmt w:val="decimal"/>
+      <w:lvlText w:val=""/>
+      <w:lvlJc w:val="left"/>
+    </w:lvl>
+    <w:lvl w:ilvl="3" w:tplc="3634F15E">
+      <w:numFmt w:val="decimal"/>
+      <w:lvlText w:val=""/>
+      <w:lvlJc w:val="left"/>
+    </w:lvl>
+    <w:lvl w:ilvl="4" w:tplc="36302280">
+      <w:numFmt w:val="decimal"/>
+      <w:lvlText w:val=""/>
+      <w:lvlJc w:val="left"/>
+    </w:lvl>
+    <w:lvl w:ilvl="5" w:tplc="03589438">
+      <w:numFmt w:val="decimal"/>
+      <w:lvlText w:val=""/>
+      <w:lvlJc w:val="left"/>
+    </w:lvl>
+    <w:lvl w:ilvl="6" w:tplc="B94A0406">
+      <w:numFmt w:val="decimal"/>
+      <w:lvlText w:val=""/>
+      <w:lvlJc w:val="left"/>
+    </w:lvl>
+    <w:lvl w:ilvl="7" w:tplc="CC06BAD6">
+      <w:numFmt w:val="decimal"/>
+      <w:lvlText w:val=""/>
+      <w:lvlJc w:val="left"/>
+    </w:lvl>
+    <w:lvl w:ilvl="8" w:tplc="1298BC82">
+      <w:numFmt w:val="decimal"/>
+      <w:lvlText w:val=""/>
+      <w:lvlJc w:val="left"/>
+    </w:lvl>
+  </w:abstractNum>
+  <w:abstractNum w:abstractNumId="3" w15:restartNumberingAfterBreak="0">
+    <w:nsid w:val="56FD6D33"/>
+    <w:multiLevelType w:val="hybridMultilevel"/>
+    <w:tmpl w:val="3F1A49E8"/>
+    <w:lvl w:ilvl="0" w:tplc="B3D44D78">
+      <w:start w:val="1"/>
+      <w:numFmt w:val="decimal"/>
+      <w:lvlText w:val="%1."/>
+      <w:lvlJc w:val="left"/>
+      <w:pPr>
+        <w:ind w:left="540" w:hanging="360"/>
+      </w:pPr>
+    </w:lvl>
+    <w:lvl w:ilvl="1" w:tplc="4C28148C">
+      <w:numFmt w:val="decimal"/>
+      <w:lvlText w:val=""/>
+      <w:lvlJc w:val="left"/>
+    </w:lvl>
+    <w:lvl w:ilvl="2" w:tplc="9D04093A">
+      <w:numFmt w:val="decimal"/>
+      <w:lvlText w:val=""/>
+      <w:lvlJc w:val="left"/>
+    </w:lvl>
+    <w:lvl w:ilvl="3" w:tplc="7632CB8E">
+      <w:numFmt w:val="decimal"/>
+      <w:lvlText w:val=""/>
+      <w:lvlJc w:val="left"/>
+    </w:lvl>
+    <w:lvl w:ilvl="4" w:tplc="813A052E">
+      <w:numFmt w:val="decimal"/>
+      <w:lvlText w:val=""/>
+      <w:lvlJc w:val="left"/>
+    </w:lvl>
+    <w:lvl w:ilvl="5" w:tplc="F4E6D056">
+      <w:numFmt w:val="decimal"/>
+      <w:lvlText w:val=""/>
+      <w:lvlJc w:val="left"/>
+    </w:lvl>
+    <w:lvl w:ilvl="6" w:tplc="0D803F04">
+      <w:numFmt w:val="decimal"/>
+      <w:lvlText w:val=""/>
+      <w:lvlJc w:val="left"/>
+    </w:lvl>
+    <w:lvl w:ilvl="7" w:tplc="F3D8702C">
+      <w:numFmt w:val="decimal"/>
+      <w:lvlText w:val=""/>
+      <w:lvlJc w:val="left"/>
+    </w:lvl>
+    <w:lvl w:ilvl="8" w:tplc="D48C8C26">
+      <w:numFmt w:val="decimal"/>
+      <w:lvlText w:val=""/>
+      <w:lvlJc w:val="left"/>
+    </w:lvl>
+  </w:abstractNum>
+  <w:abstractNum w:abstractNumId="4" w15:restartNumberingAfterBreak="0">
+    <w:nsid w:val="6B974B2D"/>
+    <w:multiLevelType w:val="hybridMultilevel"/>
+    <w:tmpl w:val="92C0554A"/>
+    <w:lvl w:ilvl="0" w:tplc="57EA1200">
+      <w:start w:val="1"/>
+      <w:numFmt w:val="decimal"/>
+      <w:lvlText w:val="%1."/>
+      <w:lvlJc w:val="left"/>
+      <w:pPr>
+        <w:ind w:left="540" w:hanging="360"/>
+      </w:pPr>
+    </w:lvl>
+    <w:lvl w:ilvl="1" w:tplc="C9323A4C">
+      <w:numFmt w:val="decimal"/>
+      <w:lvlText w:val=""/>
+      <w:lvlJc w:val="left"/>
+    </w:lvl>
+    <w:lvl w:ilvl="2" w:tplc="CA84E6C6">
+      <w:numFmt w:val="decimal"/>
+      <w:lvlText w:val=""/>
+      <w:lvlJc w:val="left"/>
+    </w:lvl>
+    <w:lvl w:ilvl="3" w:tplc="E1C6F4A2">
+      <w:numFmt w:val="decimal"/>
+      <w:lvlText w:val=""/>
+      <w:lvlJc w:val="left"/>
+    </w:lvl>
+    <w:lvl w:ilvl="4" w:tplc="7AD6C8AC">
+      <w:numFmt w:val="decimal"/>
+      <w:lvlText w:val=""/>
+      <w:lvlJc w:val="left"/>
+    </w:lvl>
+    <w:lvl w:ilvl="5" w:tplc="0338E0DC">
+      <w:numFmt w:val="decimal"/>
+      <w:lvlText w:val=""/>
+      <w:lvlJc w:val="left"/>
+    </w:lvl>
+    <w:lvl w:ilvl="6" w:tplc="D6202D10">
+      <w:numFmt w:val="decimal"/>
+      <w:lvlText w:val=""/>
+      <w:lvlJc w:val="left"/>
+    </w:lvl>
+    <w:lvl w:ilvl="7" w:tplc="4A44669E">
+      <w:numFmt w:val="decimal"/>
+      <w:lvlText w:val=""/>
+      <w:lvlJc w:val="left"/>
+    </w:lvl>
+    <w:lvl w:ilvl="8" w:tplc="39DE665A">
+      <w:numFmt w:val="decimal"/>
+      <w:lvlText w:val=""/>
+      <w:lvlJc w:val="left"/>
+    </w:lvl>
+  </w:abstractNum>
+  <w:num w:numId="1" w16cid:durableId="1881815123">
     <w:abstractNumId w:val="0"/>
     <w:lvlOverride w:ilvl="0">
       <w:startOverride w:val="1"/>
     </w:lvlOverride>
   </w:num>
-  <w:num w:numId="3" w16cid:durableId="284116926">
+  <w:num w:numId="2" w16cid:durableId="348022729">
     <w:abstractNumId w:val="3"/>
     <w:lvlOverride w:ilvl="0">
       <w:startOverride w:val="1"/>
     </w:lvlOverride>
   </w:num>
-  <w:num w:numId="4" w16cid:durableId="1090128237">
+  <w:num w:numId="3" w16cid:durableId="1281571116">
     <w:abstractNumId w:val="1"/>
     <w:lvlOverride w:ilvl="0">
       <w:startOverride w:val="1"/>
     </w:lvlOverride>
   </w:num>
-  <w:num w:numId="5" w16cid:durableId="1268657564">
+  <w:num w:numId="4" w16cid:durableId="1776824144">
     <w:abstractNumId w:val="2"/>
+    <w:lvlOverride w:ilvl="0">
+      <w:startOverride w:val="1"/>
+    </w:lvlOverride>
+  </w:num>
+  <w:num w:numId="5" w16cid:durableId="757555467">
+    <w:abstractNumId w:val="4"/>
     <w:lvlOverride w:ilvl="0">
       <w:startOverride w:val="1"/>
     </w:lvlOverride>
@@ -31018,7 +31033,7 @@
     <w:autoRedefine/>
     <w:uiPriority w:val="39"/>
     <w:unhideWhenUsed/>
-    <w:rsid w:val="00CC2676"/>
+    <w:rsid w:val="001B2E15"/>
     <w:pPr>
       <w:spacing w:after="100"/>
     </w:pPr>
@@ -31030,7 +31045,7 @@
     <w:autoRedefine/>
     <w:uiPriority w:val="39"/>
     <w:unhideWhenUsed/>
-    <w:rsid w:val="00CC2676"/>
+    <w:rsid w:val="001B2E15"/>
     <w:pPr>
       <w:spacing w:after="100"/>
       <w:ind w:left="240"/>

</xml_diff>

<commit_message>
Use the dark theme for every visitor
Co-Authored-By: Claude Opus 5.5 <noreply@anthropic.com>
</commit_message>
<xml_diff>
--- a/docs/Project_Report.docx
+++ b/docs/Project_Report.docx
@@ -185,7 +185,7 @@
       <w:pPr>
         <w:pStyle w:val="Heading1"/>
       </w:pPr>
-      <w:bookmarkStart w:id="0" w:name="_Toc242980798"/>
+      <w:bookmarkStart w:id="0" w:name="_Toc242981143"/>
       <w:r>
         <w:lastRenderedPageBreak/>
         <w:t>Abstract</w:t>
@@ -214,7 +214,7 @@
       <w:pPr>
         <w:pStyle w:val="Heading2"/>
       </w:pPr>
-      <w:bookmarkStart w:id="1" w:name="_Toc242980799"/>
+      <w:bookmarkStart w:id="1" w:name="_Toc242981144"/>
       <w:r>
         <w:t>Keywords</w:t>
       </w:r>
@@ -238,7 +238,7 @@
       <w:pPr>
         <w:pStyle w:val="Heading1"/>
       </w:pPr>
-      <w:bookmarkStart w:id="2" w:name="_Toc242980800"/>
+      <w:bookmarkStart w:id="2" w:name="_Toc242981145"/>
       <w:r>
         <w:lastRenderedPageBreak/>
         <w:t>Table of Contents</w:t>
@@ -248,7 +248,7 @@
     <w:sdt>
       <w:sdtPr>
         <w:alias w:val="Table of Contents"/>
-        <w:id w:val="241311095"/>
+        <w:id w:val="383686925"/>
       </w:sdtPr>
       <w:sdtEndPr/>
       <w:sdtContent>
@@ -271,7 +271,7 @@
           <w:r>
             <w:fldChar w:fldCharType="separate"/>
           </w:r>
-          <w:hyperlink w:anchor="_Toc242980798" w:history="1">
+          <w:hyperlink w:anchor="_Toc242981143" w:history="1">
             <w:r>
               <w:rPr>
                 <w:rStyle w:val="Hyperlink"/>
@@ -295,7 +295,7 @@
               <w:rPr>
                 <w:noProof/>
               </w:rPr>
-              <w:instrText xml:space="preserve"> PAGEREF _Toc242980798 \h </w:instrText>
+              <w:instrText xml:space="preserve"> PAGEREF _Toc242981143 \h </w:instrText>
             </w:r>
             <w:r>
               <w:rPr>
@@ -332,7 +332,7 @@
               <w:noProof/>
             </w:rPr>
           </w:pPr>
-          <w:hyperlink w:anchor="_Toc242980799" w:history="1">
+          <w:hyperlink w:anchor="_Toc242981144" w:history="1">
             <w:r>
               <w:rPr>
                 <w:rStyle w:val="Hyperlink"/>
@@ -356,7 +356,7 @@
               <w:rPr>
                 <w:noProof/>
               </w:rPr>
-              <w:instrText xml:space="preserve"> PAGEREF _Toc242980799 \h </w:instrText>
+              <w:instrText xml:space="preserve"> PAGEREF _Toc242981144 \h </w:instrText>
             </w:r>
             <w:r>
               <w:rPr>
@@ -393,7 +393,7 @@
               <w:noProof/>
             </w:rPr>
           </w:pPr>
-          <w:hyperlink w:anchor="_Toc242980800" w:history="1">
+          <w:hyperlink w:anchor="_Toc242981145" w:history="1">
             <w:r>
               <w:rPr>
                 <w:rStyle w:val="Hyperlink"/>
@@ -417,7 +417,7 @@
               <w:rPr>
                 <w:noProof/>
               </w:rPr>
-              <w:instrText xml:space="preserve"> PAGEREF _Toc242980800 \h </w:instrText>
+              <w:instrText xml:space="preserve"> PAGEREF _Toc242981145 \h </w:instrText>
             </w:r>
             <w:r>
               <w:rPr>
@@ -454,7 +454,7 @@
               <w:noProof/>
             </w:rPr>
           </w:pPr>
-          <w:hyperlink w:anchor="_Toc242980801" w:history="1">
+          <w:hyperlink w:anchor="_Toc242981146" w:history="1">
             <w:r>
               <w:rPr>
                 <w:rStyle w:val="Hyperlink"/>
@@ -478,7 +478,7 @@
               <w:rPr>
                 <w:noProof/>
               </w:rPr>
-              <w:instrText xml:space="preserve"> PAGEREF _Toc242980801 \h </w:instrText>
+              <w:instrText xml:space="preserve"> PAGEREF _Toc242981146 \h </w:instrText>
             </w:r>
             <w:r>
               <w:rPr>
@@ -515,7 +515,7 @@
               <w:noProof/>
             </w:rPr>
           </w:pPr>
-          <w:hyperlink w:anchor="_Toc242980802" w:history="1">
+          <w:hyperlink w:anchor="_Toc242981147" w:history="1">
             <w:r>
               <w:rPr>
                 <w:rStyle w:val="Hyperlink"/>
@@ -539,7 +539,7 @@
               <w:rPr>
                 <w:noProof/>
               </w:rPr>
-              <w:instrText xml:space="preserve"> PAGEREF _Toc242980802 \h </w:instrText>
+              <w:instrText xml:space="preserve"> PAGEREF _Toc242981147 \h </w:instrText>
             </w:r>
             <w:r>
               <w:rPr>
@@ -576,7 +576,7 @@
               <w:noProof/>
             </w:rPr>
           </w:pPr>
-          <w:hyperlink w:anchor="_Toc242980803" w:history="1">
+          <w:hyperlink w:anchor="_Toc242981148" w:history="1">
             <w:r>
               <w:rPr>
                 <w:rStyle w:val="Hyperlink"/>
@@ -600,7 +600,7 @@
               <w:rPr>
                 <w:noProof/>
               </w:rPr>
-              <w:instrText xml:space="preserve"> PAGEREF _Toc242980803 \h </w:instrText>
+              <w:instrText xml:space="preserve"> PAGEREF _Toc242981148 \h </w:instrText>
             </w:r>
             <w:r>
               <w:rPr>
@@ -637,7 +637,7 @@
               <w:noProof/>
             </w:rPr>
           </w:pPr>
-          <w:hyperlink w:anchor="_Toc242980804" w:history="1">
+          <w:hyperlink w:anchor="_Toc242981149" w:history="1">
             <w:r>
               <w:rPr>
                 <w:rStyle w:val="Hyperlink"/>
@@ -661,7 +661,7 @@
               <w:rPr>
                 <w:noProof/>
               </w:rPr>
-              <w:instrText xml:space="preserve"> PAGEREF _Toc242980804 \h </w:instrText>
+              <w:instrText xml:space="preserve"> PAGEREF _Toc242981149 \h </w:instrText>
             </w:r>
             <w:r>
               <w:rPr>
@@ -698,7 +698,7 @@
               <w:noProof/>
             </w:rPr>
           </w:pPr>
-          <w:hyperlink w:anchor="_Toc242980805" w:history="1">
+          <w:hyperlink w:anchor="_Toc242981150" w:history="1">
             <w:r>
               <w:rPr>
                 <w:rStyle w:val="Hyperlink"/>
@@ -722,7 +722,7 @@
               <w:rPr>
                 <w:noProof/>
               </w:rPr>
-              <w:instrText xml:space="preserve"> PAGEREF _Toc242980805 \h </w:instrText>
+              <w:instrText xml:space="preserve"> PAGEREF _Toc242981150 \h </w:instrText>
             </w:r>
             <w:r>
               <w:rPr>
@@ -759,7 +759,7 @@
               <w:noProof/>
             </w:rPr>
           </w:pPr>
-          <w:hyperlink w:anchor="_Toc242980806" w:history="1">
+          <w:hyperlink w:anchor="_Toc242981151" w:history="1">
             <w:r>
               <w:rPr>
                 <w:rStyle w:val="Hyperlink"/>
@@ -783,7 +783,7 @@
               <w:rPr>
                 <w:noProof/>
               </w:rPr>
-              <w:instrText xml:space="preserve"> PAGEREF _Toc242980806 \h </w:instrText>
+              <w:instrText xml:space="preserve"> PAGEREF _Toc242981151 \h </w:instrText>
             </w:r>
             <w:r>
               <w:rPr>
@@ -820,7 +820,7 @@
               <w:noProof/>
             </w:rPr>
           </w:pPr>
-          <w:hyperlink w:anchor="_Toc242980807" w:history="1">
+          <w:hyperlink w:anchor="_Toc242981152" w:history="1">
             <w:r>
               <w:rPr>
                 <w:rStyle w:val="Hyperlink"/>
@@ -844,7 +844,7 @@
               <w:rPr>
                 <w:noProof/>
               </w:rPr>
-              <w:instrText xml:space="preserve"> PAGEREF _Toc242980807 \h </w:instrText>
+              <w:instrText xml:space="preserve"> PAGEREF _Toc242981152 \h </w:instrText>
             </w:r>
             <w:r>
               <w:rPr>
@@ -881,7 +881,7 @@
               <w:noProof/>
             </w:rPr>
           </w:pPr>
-          <w:hyperlink w:anchor="_Toc242980808" w:history="1">
+          <w:hyperlink w:anchor="_Toc242981153" w:history="1">
             <w:r>
               <w:rPr>
                 <w:rStyle w:val="Hyperlink"/>
@@ -905,7 +905,7 @@
               <w:rPr>
                 <w:noProof/>
               </w:rPr>
-              <w:instrText xml:space="preserve"> PAGEREF _Toc242980808 \h </w:instrText>
+              <w:instrText xml:space="preserve"> PAGEREF _Toc242981153 \h </w:instrText>
             </w:r>
             <w:r>
               <w:rPr>
@@ -942,7 +942,7 @@
               <w:noProof/>
             </w:rPr>
           </w:pPr>
-          <w:hyperlink w:anchor="_Toc242980809" w:history="1">
+          <w:hyperlink w:anchor="_Toc242981154" w:history="1">
             <w:r>
               <w:rPr>
                 <w:rStyle w:val="Hyperlink"/>
@@ -966,7 +966,7 @@
               <w:rPr>
                 <w:noProof/>
               </w:rPr>
-              <w:instrText xml:space="preserve"> PAGEREF _Toc242980809 \h </w:instrText>
+              <w:instrText xml:space="preserve"> PAGEREF _Toc242981154 \h </w:instrText>
             </w:r>
             <w:r>
               <w:rPr>
@@ -1003,7 +1003,7 @@
               <w:noProof/>
             </w:rPr>
           </w:pPr>
-          <w:hyperlink w:anchor="_Toc242980810" w:history="1">
+          <w:hyperlink w:anchor="_Toc242981155" w:history="1">
             <w:r>
               <w:rPr>
                 <w:rStyle w:val="Hyperlink"/>
@@ -1027,7 +1027,7 @@
               <w:rPr>
                 <w:noProof/>
               </w:rPr>
-              <w:instrText xml:space="preserve"> PAGEREF _Toc242980810 \h </w:instrText>
+              <w:instrText xml:space="preserve"> PAGEREF _Toc242981155 \h </w:instrText>
             </w:r>
             <w:r>
               <w:rPr>
@@ -1064,7 +1064,7 @@
               <w:noProof/>
             </w:rPr>
           </w:pPr>
-          <w:hyperlink w:anchor="_Toc242980811" w:history="1">
+          <w:hyperlink w:anchor="_Toc242981156" w:history="1">
             <w:r>
               <w:rPr>
                 <w:rStyle w:val="Hyperlink"/>
@@ -1088,7 +1088,7 @@
               <w:rPr>
                 <w:noProof/>
               </w:rPr>
-              <w:instrText xml:space="preserve"> PAGEREF _Toc242980811 \h </w:instrText>
+              <w:instrText xml:space="preserve"> PAGEREF _Toc242981156 \h </w:instrText>
             </w:r>
             <w:r>
               <w:rPr>
@@ -1125,7 +1125,7 @@
               <w:noProof/>
             </w:rPr>
           </w:pPr>
-          <w:hyperlink w:anchor="_Toc242980812" w:history="1">
+          <w:hyperlink w:anchor="_Toc242981157" w:history="1">
             <w:r>
               <w:rPr>
                 <w:rStyle w:val="Hyperlink"/>
@@ -1149,7 +1149,7 @@
               <w:rPr>
                 <w:noProof/>
               </w:rPr>
-              <w:instrText xml:space="preserve"> PAGEREF _Toc242980812 \h </w:instrText>
+              <w:instrText xml:space="preserve"> PAGEREF _Toc242981157 \h </w:instrText>
             </w:r>
             <w:r>
               <w:rPr>
@@ -1186,7 +1186,7 @@
               <w:noProof/>
             </w:rPr>
           </w:pPr>
-          <w:hyperlink w:anchor="_Toc242980813" w:history="1">
+          <w:hyperlink w:anchor="_Toc242981158" w:history="1">
             <w:r>
               <w:rPr>
                 <w:rStyle w:val="Hyperlink"/>
@@ -1210,7 +1210,7 @@
               <w:rPr>
                 <w:noProof/>
               </w:rPr>
-              <w:instrText xml:space="preserve"> PAGEREF _Toc242980813 \h </w:instrText>
+              <w:instrText xml:space="preserve"> PAGEREF _Toc242981158 \h </w:instrText>
             </w:r>
             <w:r>
               <w:rPr>
@@ -1247,7 +1247,7 @@
               <w:noProof/>
             </w:rPr>
           </w:pPr>
-          <w:hyperlink w:anchor="_Toc242980814" w:history="1">
+          <w:hyperlink w:anchor="_Toc242981159" w:history="1">
             <w:r>
               <w:rPr>
                 <w:rStyle w:val="Hyperlink"/>
@@ -1271,7 +1271,7 @@
               <w:rPr>
                 <w:noProof/>
               </w:rPr>
-              <w:instrText xml:space="preserve"> PAGEREF _Toc242980814 \h </w:instrText>
+              <w:instrText xml:space="preserve"> PAGEREF _Toc242981159 \h </w:instrText>
             </w:r>
             <w:r>
               <w:rPr>
@@ -1308,7 +1308,7 @@
               <w:noProof/>
             </w:rPr>
           </w:pPr>
-          <w:hyperlink w:anchor="_Toc242980815" w:history="1">
+          <w:hyperlink w:anchor="_Toc242981160" w:history="1">
             <w:r>
               <w:rPr>
                 <w:rStyle w:val="Hyperlink"/>
@@ -1332,7 +1332,7 @@
               <w:rPr>
                 <w:noProof/>
               </w:rPr>
-              <w:instrText xml:space="preserve"> PAGEREF _Toc242980815 \h </w:instrText>
+              <w:instrText xml:space="preserve"> PAGEREF _Toc242981160 \h </w:instrText>
             </w:r>
             <w:r>
               <w:rPr>
@@ -1369,7 +1369,7 @@
               <w:noProof/>
             </w:rPr>
           </w:pPr>
-          <w:hyperlink w:anchor="_Toc242980816" w:history="1">
+          <w:hyperlink w:anchor="_Toc242981161" w:history="1">
             <w:r>
               <w:rPr>
                 <w:rStyle w:val="Hyperlink"/>
@@ -1393,7 +1393,7 @@
               <w:rPr>
                 <w:noProof/>
               </w:rPr>
-              <w:instrText xml:space="preserve"> PAGEREF _Toc242980816 \h </w:instrText>
+              <w:instrText xml:space="preserve"> PAGEREF _Toc242981161 \h </w:instrText>
             </w:r>
             <w:r>
               <w:rPr>
@@ -1430,7 +1430,7 @@
               <w:noProof/>
             </w:rPr>
           </w:pPr>
-          <w:hyperlink w:anchor="_Toc242980817" w:history="1">
+          <w:hyperlink w:anchor="_Toc242981162" w:history="1">
             <w:r>
               <w:rPr>
                 <w:rStyle w:val="Hyperlink"/>
@@ -1454,7 +1454,7 @@
               <w:rPr>
                 <w:noProof/>
               </w:rPr>
-              <w:instrText xml:space="preserve"> PAGEREF _Toc242980817 \h </w:instrText>
+              <w:instrText xml:space="preserve"> PAGEREF _Toc242981162 \h </w:instrText>
             </w:r>
             <w:r>
               <w:rPr>
@@ -1491,7 +1491,7 @@
               <w:noProof/>
             </w:rPr>
           </w:pPr>
-          <w:hyperlink w:anchor="_Toc242980818" w:history="1">
+          <w:hyperlink w:anchor="_Toc242981163" w:history="1">
             <w:r>
               <w:rPr>
                 <w:rStyle w:val="Hyperlink"/>
@@ -1515,7 +1515,7 @@
               <w:rPr>
                 <w:noProof/>
               </w:rPr>
-              <w:instrText xml:space="preserve"> PAGEREF _Toc242980818 \h </w:instrText>
+              <w:instrText xml:space="preserve"> PAGEREF _Toc242981163 \h </w:instrText>
             </w:r>
             <w:r>
               <w:rPr>
@@ -1552,7 +1552,7 @@
               <w:noProof/>
             </w:rPr>
           </w:pPr>
-          <w:hyperlink w:anchor="_Toc242980819" w:history="1">
+          <w:hyperlink w:anchor="_Toc242981164" w:history="1">
             <w:r>
               <w:rPr>
                 <w:rStyle w:val="Hyperlink"/>
@@ -1576,7 +1576,7 @@
               <w:rPr>
                 <w:noProof/>
               </w:rPr>
-              <w:instrText xml:space="preserve"> PAGEREF _Toc242980819 \h </w:instrText>
+              <w:instrText xml:space="preserve"> PAGEREF _Toc242981164 \h </w:instrText>
             </w:r>
             <w:r>
               <w:rPr>
@@ -1613,7 +1613,7 @@
               <w:noProof/>
             </w:rPr>
           </w:pPr>
-          <w:hyperlink w:anchor="_Toc242980820" w:history="1">
+          <w:hyperlink w:anchor="_Toc242981165" w:history="1">
             <w:r>
               <w:rPr>
                 <w:rStyle w:val="Hyperlink"/>
@@ -1637,7 +1637,7 @@
               <w:rPr>
                 <w:noProof/>
               </w:rPr>
-              <w:instrText xml:space="preserve"> PAGEREF _Toc242980820 \h </w:instrText>
+              <w:instrText xml:space="preserve"> PAGEREF _Toc242981165 \h </w:instrText>
             </w:r>
             <w:r>
               <w:rPr>
@@ -1674,7 +1674,7 @@
               <w:noProof/>
             </w:rPr>
           </w:pPr>
-          <w:hyperlink w:anchor="_Toc242980821" w:history="1">
+          <w:hyperlink w:anchor="_Toc242981166" w:history="1">
             <w:r>
               <w:rPr>
                 <w:rStyle w:val="Hyperlink"/>
@@ -1698,7 +1698,7 @@
               <w:rPr>
                 <w:noProof/>
               </w:rPr>
-              <w:instrText xml:space="preserve"> PAGEREF _Toc242980821 \h </w:instrText>
+              <w:instrText xml:space="preserve"> PAGEREF _Toc242981166 \h </w:instrText>
             </w:r>
             <w:r>
               <w:rPr>
@@ -1735,7 +1735,7 @@
               <w:noProof/>
             </w:rPr>
           </w:pPr>
-          <w:hyperlink w:anchor="_Toc242980822" w:history="1">
+          <w:hyperlink w:anchor="_Toc242981167" w:history="1">
             <w:r>
               <w:rPr>
                 <w:rStyle w:val="Hyperlink"/>
@@ -1759,7 +1759,7 @@
               <w:rPr>
                 <w:noProof/>
               </w:rPr>
-              <w:instrText xml:space="preserve"> PAGEREF _Toc242980822 \h </w:instrText>
+              <w:instrText xml:space="preserve"> PAGEREF _Toc242981167 \h </w:instrText>
             </w:r>
             <w:r>
               <w:rPr>
@@ -1796,7 +1796,7 @@
               <w:noProof/>
             </w:rPr>
           </w:pPr>
-          <w:hyperlink w:anchor="_Toc242980823" w:history="1">
+          <w:hyperlink w:anchor="_Toc242981168" w:history="1">
             <w:r>
               <w:rPr>
                 <w:rStyle w:val="Hyperlink"/>
@@ -1820,7 +1820,7 @@
               <w:rPr>
                 <w:noProof/>
               </w:rPr>
-              <w:instrText xml:space="preserve"> PAGEREF _Toc242980823 \h </w:instrText>
+              <w:instrText xml:space="preserve"> PAGEREF _Toc242981168 \h </w:instrText>
             </w:r>
             <w:r>
               <w:rPr>
@@ -1857,7 +1857,7 @@
               <w:noProof/>
             </w:rPr>
           </w:pPr>
-          <w:hyperlink w:anchor="_Toc242980824" w:history="1">
+          <w:hyperlink w:anchor="_Toc242981169" w:history="1">
             <w:r>
               <w:rPr>
                 <w:rStyle w:val="Hyperlink"/>
@@ -1881,7 +1881,7 @@
               <w:rPr>
                 <w:noProof/>
               </w:rPr>
-              <w:instrText xml:space="preserve"> PAGEREF _Toc242980824 \h </w:instrText>
+              <w:instrText xml:space="preserve"> PAGEREF _Toc242981169 \h </w:instrText>
             </w:r>
             <w:r>
               <w:rPr>
@@ -1918,7 +1918,7 @@
               <w:noProof/>
             </w:rPr>
           </w:pPr>
-          <w:hyperlink w:anchor="_Toc242980825" w:history="1">
+          <w:hyperlink w:anchor="_Toc242981170" w:history="1">
             <w:r>
               <w:rPr>
                 <w:rStyle w:val="Hyperlink"/>
@@ -1942,7 +1942,7 @@
               <w:rPr>
                 <w:noProof/>
               </w:rPr>
-              <w:instrText xml:space="preserve"> PAGEREF _Toc242980825 \h </w:instrText>
+              <w:instrText xml:space="preserve"> PAGEREF _Toc242981170 \h </w:instrText>
             </w:r>
             <w:r>
               <w:rPr>
@@ -1979,7 +1979,7 @@
               <w:noProof/>
             </w:rPr>
           </w:pPr>
-          <w:hyperlink w:anchor="_Toc242980826" w:history="1">
+          <w:hyperlink w:anchor="_Toc242981171" w:history="1">
             <w:r>
               <w:rPr>
                 <w:rStyle w:val="Hyperlink"/>
@@ -2003,7 +2003,7 @@
               <w:rPr>
                 <w:noProof/>
               </w:rPr>
-              <w:instrText xml:space="preserve"> PAGEREF _Toc242980826 \h </w:instrText>
+              <w:instrText xml:space="preserve"> PAGEREF _Toc242981171 \h </w:instrText>
             </w:r>
             <w:r>
               <w:rPr>
@@ -2040,7 +2040,7 @@
               <w:noProof/>
             </w:rPr>
           </w:pPr>
-          <w:hyperlink w:anchor="_Toc242980827" w:history="1">
+          <w:hyperlink w:anchor="_Toc242981172" w:history="1">
             <w:r>
               <w:rPr>
                 <w:rStyle w:val="Hyperlink"/>
@@ -2064,7 +2064,7 @@
               <w:rPr>
                 <w:noProof/>
               </w:rPr>
-              <w:instrText xml:space="preserve"> PAGEREF _Toc242980827 \h </w:instrText>
+              <w:instrText xml:space="preserve"> PAGEREF _Toc242981172 \h </w:instrText>
             </w:r>
             <w:r>
               <w:rPr>
@@ -2101,7 +2101,7 @@
               <w:noProof/>
             </w:rPr>
           </w:pPr>
-          <w:hyperlink w:anchor="_Toc242980828" w:history="1">
+          <w:hyperlink w:anchor="_Toc242981173" w:history="1">
             <w:r>
               <w:rPr>
                 <w:rStyle w:val="Hyperlink"/>
@@ -2125,7 +2125,7 @@
               <w:rPr>
                 <w:noProof/>
               </w:rPr>
-              <w:instrText xml:space="preserve"> PAGEREF _Toc242980828 \h </w:instrText>
+              <w:instrText xml:space="preserve"> PAGEREF _Toc242981173 \h </w:instrText>
             </w:r>
             <w:r>
               <w:rPr>
@@ -2162,7 +2162,7 @@
               <w:noProof/>
             </w:rPr>
           </w:pPr>
-          <w:hyperlink w:anchor="_Toc242980829" w:history="1">
+          <w:hyperlink w:anchor="_Toc242981174" w:history="1">
             <w:r>
               <w:rPr>
                 <w:rStyle w:val="Hyperlink"/>
@@ -2186,7 +2186,7 @@
               <w:rPr>
                 <w:noProof/>
               </w:rPr>
-              <w:instrText xml:space="preserve"> PAGEREF _Toc242980829 \h </w:instrText>
+              <w:instrText xml:space="preserve"> PAGEREF _Toc242981174 \h </w:instrText>
             </w:r>
             <w:r>
               <w:rPr>
@@ -2223,7 +2223,7 @@
               <w:noProof/>
             </w:rPr>
           </w:pPr>
-          <w:hyperlink w:anchor="_Toc242980830" w:history="1">
+          <w:hyperlink w:anchor="_Toc242981175" w:history="1">
             <w:r>
               <w:rPr>
                 <w:rStyle w:val="Hyperlink"/>
@@ -2247,7 +2247,7 @@
               <w:rPr>
                 <w:noProof/>
               </w:rPr>
-              <w:instrText xml:space="preserve"> PAGEREF _Toc242980830 \h </w:instrText>
+              <w:instrText xml:space="preserve"> PAGEREF _Toc242981175 \h </w:instrText>
             </w:r>
             <w:r>
               <w:rPr>
@@ -2284,7 +2284,7 @@
               <w:noProof/>
             </w:rPr>
           </w:pPr>
-          <w:hyperlink w:anchor="_Toc242980831" w:history="1">
+          <w:hyperlink w:anchor="_Toc242981176" w:history="1">
             <w:r>
               <w:rPr>
                 <w:rStyle w:val="Hyperlink"/>
@@ -2308,7 +2308,7 @@
               <w:rPr>
                 <w:noProof/>
               </w:rPr>
-              <w:instrText xml:space="preserve"> PAGEREF _Toc242980831 \h </w:instrText>
+              <w:instrText xml:space="preserve"> PAGEREF _Toc242981176 \h </w:instrText>
             </w:r>
             <w:r>
               <w:rPr>
@@ -2345,7 +2345,7 @@
               <w:noProof/>
             </w:rPr>
           </w:pPr>
-          <w:hyperlink w:anchor="_Toc242980832" w:history="1">
+          <w:hyperlink w:anchor="_Toc242981177" w:history="1">
             <w:r>
               <w:rPr>
                 <w:rStyle w:val="Hyperlink"/>
@@ -2369,7 +2369,7 @@
               <w:rPr>
                 <w:noProof/>
               </w:rPr>
-              <w:instrText xml:space="preserve"> PAGEREF _Toc242980832 \h </w:instrText>
+              <w:instrText xml:space="preserve"> PAGEREF _Toc242981177 \h </w:instrText>
             </w:r>
             <w:r>
               <w:rPr>
@@ -2406,7 +2406,7 @@
               <w:noProof/>
             </w:rPr>
           </w:pPr>
-          <w:hyperlink w:anchor="_Toc242980833" w:history="1">
+          <w:hyperlink w:anchor="_Toc242981178" w:history="1">
             <w:r>
               <w:rPr>
                 <w:rStyle w:val="Hyperlink"/>
@@ -2430,7 +2430,7 @@
               <w:rPr>
                 <w:noProof/>
               </w:rPr>
-              <w:instrText xml:space="preserve"> PAGEREF _Toc242980833 \h </w:instrText>
+              <w:instrText xml:space="preserve"> PAGEREF _Toc242981178 \h </w:instrText>
             </w:r>
             <w:r>
               <w:rPr>
@@ -2467,7 +2467,7 @@
               <w:noProof/>
             </w:rPr>
           </w:pPr>
-          <w:hyperlink w:anchor="_Toc242980834" w:history="1">
+          <w:hyperlink w:anchor="_Toc242981179" w:history="1">
             <w:r>
               <w:rPr>
                 <w:rStyle w:val="Hyperlink"/>
@@ -2491,7 +2491,7 @@
               <w:rPr>
                 <w:noProof/>
               </w:rPr>
-              <w:instrText xml:space="preserve"> PAGEREF _Toc242980834 \h </w:instrText>
+              <w:instrText xml:space="preserve"> PAGEREF _Toc242981179 \h </w:instrText>
             </w:r>
             <w:r>
               <w:rPr>
@@ -2528,7 +2528,7 @@
               <w:noProof/>
             </w:rPr>
           </w:pPr>
-          <w:hyperlink w:anchor="_Toc242980835" w:history="1">
+          <w:hyperlink w:anchor="_Toc242981180" w:history="1">
             <w:r>
               <w:rPr>
                 <w:rStyle w:val="Hyperlink"/>
@@ -2552,7 +2552,7 @@
               <w:rPr>
                 <w:noProof/>
               </w:rPr>
-              <w:instrText xml:space="preserve"> PAGEREF _Toc242980835 \h </w:instrText>
+              <w:instrText xml:space="preserve"> PAGEREF _Toc242981180 \h </w:instrText>
             </w:r>
             <w:r>
               <w:rPr>
@@ -2589,7 +2589,7 @@
               <w:noProof/>
             </w:rPr>
           </w:pPr>
-          <w:hyperlink w:anchor="_Toc242980836" w:history="1">
+          <w:hyperlink w:anchor="_Toc242981181" w:history="1">
             <w:r>
               <w:rPr>
                 <w:rStyle w:val="Hyperlink"/>
@@ -2613,7 +2613,7 @@
               <w:rPr>
                 <w:noProof/>
               </w:rPr>
-              <w:instrText xml:space="preserve"> PAGEREF _Toc242980836 \h </w:instrText>
+              <w:instrText xml:space="preserve"> PAGEREF _Toc242981181 \h </w:instrText>
             </w:r>
             <w:r>
               <w:rPr>
@@ -2650,7 +2650,7 @@
               <w:noProof/>
             </w:rPr>
           </w:pPr>
-          <w:hyperlink w:anchor="_Toc242980837" w:history="1">
+          <w:hyperlink w:anchor="_Toc242981182" w:history="1">
             <w:r>
               <w:rPr>
                 <w:rStyle w:val="Hyperlink"/>
@@ -2674,7 +2674,7 @@
               <w:rPr>
                 <w:noProof/>
               </w:rPr>
-              <w:instrText xml:space="preserve"> PAGEREF _Toc242980837 \h </w:instrText>
+              <w:instrText xml:space="preserve"> PAGEREF _Toc242981182 \h </w:instrText>
             </w:r>
             <w:r>
               <w:rPr>
@@ -2711,7 +2711,7 @@
               <w:noProof/>
             </w:rPr>
           </w:pPr>
-          <w:hyperlink w:anchor="_Toc242980838" w:history="1">
+          <w:hyperlink w:anchor="_Toc242981183" w:history="1">
             <w:r>
               <w:rPr>
                 <w:rStyle w:val="Hyperlink"/>
@@ -2735,7 +2735,7 @@
               <w:rPr>
                 <w:noProof/>
               </w:rPr>
-              <w:instrText xml:space="preserve"> PAGEREF _Toc242980838 \h </w:instrText>
+              <w:instrText xml:space="preserve"> PAGEREF _Toc242981183 \h </w:instrText>
             </w:r>
             <w:r>
               <w:rPr>
@@ -2772,7 +2772,7 @@
               <w:noProof/>
             </w:rPr>
           </w:pPr>
-          <w:hyperlink w:anchor="_Toc242980839" w:history="1">
+          <w:hyperlink w:anchor="_Toc242981184" w:history="1">
             <w:r>
               <w:rPr>
                 <w:rStyle w:val="Hyperlink"/>
@@ -2796,7 +2796,7 @@
               <w:rPr>
                 <w:noProof/>
               </w:rPr>
-              <w:instrText xml:space="preserve"> PAGEREF _Toc242980839 \h </w:instrText>
+              <w:instrText xml:space="preserve"> PAGEREF _Toc242981184 \h </w:instrText>
             </w:r>
             <w:r>
               <w:rPr>
@@ -2833,7 +2833,7 @@
               <w:noProof/>
             </w:rPr>
           </w:pPr>
-          <w:hyperlink w:anchor="_Toc242980840" w:history="1">
+          <w:hyperlink w:anchor="_Toc242981185" w:history="1">
             <w:r>
               <w:rPr>
                 <w:rStyle w:val="Hyperlink"/>
@@ -2857,7 +2857,7 @@
               <w:rPr>
                 <w:noProof/>
               </w:rPr>
-              <w:instrText xml:space="preserve"> PAGEREF _Toc242980840 \h </w:instrText>
+              <w:instrText xml:space="preserve"> PAGEREF _Toc242981185 \h </w:instrText>
             </w:r>
             <w:r>
               <w:rPr>
@@ -2894,7 +2894,7 @@
               <w:noProof/>
             </w:rPr>
           </w:pPr>
-          <w:hyperlink w:anchor="_Toc242980841" w:history="1">
+          <w:hyperlink w:anchor="_Toc242981186" w:history="1">
             <w:r>
               <w:rPr>
                 <w:rStyle w:val="Hyperlink"/>
@@ -2918,7 +2918,7 @@
               <w:rPr>
                 <w:noProof/>
               </w:rPr>
-              <w:instrText xml:space="preserve"> PAGEREF _Toc242980841 \h </w:instrText>
+              <w:instrText xml:space="preserve"> PAGEREF _Toc242981186 \h </w:instrText>
             </w:r>
             <w:r>
               <w:rPr>
@@ -2955,7 +2955,7 @@
               <w:noProof/>
             </w:rPr>
           </w:pPr>
-          <w:hyperlink w:anchor="_Toc242980842" w:history="1">
+          <w:hyperlink w:anchor="_Toc242981187" w:history="1">
             <w:r>
               <w:rPr>
                 <w:rStyle w:val="Hyperlink"/>
@@ -2979,7 +2979,7 @@
               <w:rPr>
                 <w:noProof/>
               </w:rPr>
-              <w:instrText xml:space="preserve"> PAGEREF _Toc242980842 \h </w:instrText>
+              <w:instrText xml:space="preserve"> PAGEREF _Toc242981187 \h </w:instrText>
             </w:r>
             <w:r>
               <w:rPr>
@@ -3016,7 +3016,7 @@
               <w:noProof/>
             </w:rPr>
           </w:pPr>
-          <w:hyperlink w:anchor="_Toc242980843" w:history="1">
+          <w:hyperlink w:anchor="_Toc242981188" w:history="1">
             <w:r>
               <w:rPr>
                 <w:rStyle w:val="Hyperlink"/>
@@ -3040,7 +3040,7 @@
               <w:rPr>
                 <w:noProof/>
               </w:rPr>
-              <w:instrText xml:space="preserve"> PAGEREF _Toc242980843 \h </w:instrText>
+              <w:instrText xml:space="preserve"> PAGEREF _Toc242981188 \h </w:instrText>
             </w:r>
             <w:r>
               <w:rPr>
@@ -3077,7 +3077,7 @@
               <w:noProof/>
             </w:rPr>
           </w:pPr>
-          <w:hyperlink w:anchor="_Toc242980844" w:history="1">
+          <w:hyperlink w:anchor="_Toc242981189" w:history="1">
             <w:r>
               <w:rPr>
                 <w:rStyle w:val="Hyperlink"/>
@@ -3101,7 +3101,7 @@
               <w:rPr>
                 <w:noProof/>
               </w:rPr>
-              <w:instrText xml:space="preserve"> PAGEREF _Toc242980844 \h </w:instrText>
+              <w:instrText xml:space="preserve"> PAGEREF _Toc242981189 \h </w:instrText>
             </w:r>
             <w:r>
               <w:rPr>
@@ -3138,7 +3138,7 @@
               <w:noProof/>
             </w:rPr>
           </w:pPr>
-          <w:hyperlink w:anchor="_Toc242980845" w:history="1">
+          <w:hyperlink w:anchor="_Toc242981190" w:history="1">
             <w:r>
               <w:rPr>
                 <w:rStyle w:val="Hyperlink"/>
@@ -3162,7 +3162,7 @@
               <w:rPr>
                 <w:noProof/>
               </w:rPr>
-              <w:instrText xml:space="preserve"> PAGEREF _Toc242980845 \h </w:instrText>
+              <w:instrText xml:space="preserve"> PAGEREF _Toc242981190 \h </w:instrText>
             </w:r>
             <w:r>
               <w:rPr>
@@ -3199,7 +3199,7 @@
               <w:noProof/>
             </w:rPr>
           </w:pPr>
-          <w:hyperlink w:anchor="_Toc242980846" w:history="1">
+          <w:hyperlink w:anchor="_Toc242981191" w:history="1">
             <w:r>
               <w:rPr>
                 <w:rStyle w:val="Hyperlink"/>
@@ -3223,7 +3223,7 @@
               <w:rPr>
                 <w:noProof/>
               </w:rPr>
-              <w:instrText xml:space="preserve"> PAGEREF _Toc242980846 \h </w:instrText>
+              <w:instrText xml:space="preserve"> PAGEREF _Toc242981191 \h </w:instrText>
             </w:r>
             <w:r>
               <w:rPr>
@@ -3260,7 +3260,7 @@
               <w:noProof/>
             </w:rPr>
           </w:pPr>
-          <w:hyperlink w:anchor="_Toc242980847" w:history="1">
+          <w:hyperlink w:anchor="_Toc242981192" w:history="1">
             <w:r>
               <w:rPr>
                 <w:rStyle w:val="Hyperlink"/>
@@ -3284,7 +3284,7 @@
               <w:rPr>
                 <w:noProof/>
               </w:rPr>
-              <w:instrText xml:space="preserve"> PAGEREF _Toc242980847 \h </w:instrText>
+              <w:instrText xml:space="preserve"> PAGEREF _Toc242981192 \h </w:instrText>
             </w:r>
             <w:r>
               <w:rPr>
@@ -3321,7 +3321,7 @@
               <w:noProof/>
             </w:rPr>
           </w:pPr>
-          <w:hyperlink w:anchor="_Toc242980848" w:history="1">
+          <w:hyperlink w:anchor="_Toc242981193" w:history="1">
             <w:r>
               <w:rPr>
                 <w:rStyle w:val="Hyperlink"/>
@@ -3345,7 +3345,7 @@
               <w:rPr>
                 <w:noProof/>
               </w:rPr>
-              <w:instrText xml:space="preserve"> PAGEREF _Toc242980848 \h </w:instrText>
+              <w:instrText xml:space="preserve"> PAGEREF _Toc242981193 \h </w:instrText>
             </w:r>
             <w:r>
               <w:rPr>
@@ -3382,7 +3382,7 @@
               <w:noProof/>
             </w:rPr>
           </w:pPr>
-          <w:hyperlink w:anchor="_Toc242980849" w:history="1">
+          <w:hyperlink w:anchor="_Toc242981194" w:history="1">
             <w:r>
               <w:rPr>
                 <w:rStyle w:val="Hyperlink"/>
@@ -3406,7 +3406,7 @@
               <w:rPr>
                 <w:noProof/>
               </w:rPr>
-              <w:instrText xml:space="preserve"> PAGEREF _Toc242980849 \h </w:instrText>
+              <w:instrText xml:space="preserve"> PAGEREF _Toc242981194 \h </w:instrText>
             </w:r>
             <w:r>
               <w:rPr>
@@ -3443,7 +3443,7 @@
               <w:noProof/>
             </w:rPr>
           </w:pPr>
-          <w:hyperlink w:anchor="_Toc242980850" w:history="1">
+          <w:hyperlink w:anchor="_Toc242981195" w:history="1">
             <w:r>
               <w:rPr>
                 <w:rStyle w:val="Hyperlink"/>
@@ -3467,7 +3467,7 @@
               <w:rPr>
                 <w:noProof/>
               </w:rPr>
-              <w:instrText xml:space="preserve"> PAGEREF _Toc242980850 \h </w:instrText>
+              <w:instrText xml:space="preserve"> PAGEREF _Toc242981195 \h </w:instrText>
             </w:r>
             <w:r>
               <w:rPr>
@@ -3504,7 +3504,7 @@
               <w:noProof/>
             </w:rPr>
           </w:pPr>
-          <w:hyperlink w:anchor="_Toc242980851" w:history="1">
+          <w:hyperlink w:anchor="_Toc242981196" w:history="1">
             <w:r>
               <w:rPr>
                 <w:rStyle w:val="Hyperlink"/>
@@ -3528,7 +3528,7 @@
               <w:rPr>
                 <w:noProof/>
               </w:rPr>
-              <w:instrText xml:space="preserve"> PAGEREF _Toc242980851 \h </w:instrText>
+              <w:instrText xml:space="preserve"> PAGEREF _Toc242981196 \h </w:instrText>
             </w:r>
             <w:r>
               <w:rPr>
@@ -3565,7 +3565,7 @@
               <w:noProof/>
             </w:rPr>
           </w:pPr>
-          <w:hyperlink w:anchor="_Toc242980852" w:history="1">
+          <w:hyperlink w:anchor="_Toc242981197" w:history="1">
             <w:r>
               <w:rPr>
                 <w:rStyle w:val="Hyperlink"/>
@@ -3589,7 +3589,7 @@
               <w:rPr>
                 <w:noProof/>
               </w:rPr>
-              <w:instrText xml:space="preserve"> PAGEREF _Toc242980852 \h </w:instrText>
+              <w:instrText xml:space="preserve"> PAGEREF _Toc242981197 \h </w:instrText>
             </w:r>
             <w:r>
               <w:rPr>
@@ -3632,7 +3632,7 @@
       <w:pPr>
         <w:pStyle w:val="Heading1"/>
       </w:pPr>
-      <w:bookmarkStart w:id="3" w:name="_Toc242980801"/>
+      <w:bookmarkStart w:id="3" w:name="_Toc242981146"/>
       <w:r>
         <w:lastRenderedPageBreak/>
         <w:t>1. Introduction</w:t>
@@ -3643,7 +3643,7 @@
       <w:pPr>
         <w:pStyle w:val="Heading2"/>
       </w:pPr>
-      <w:bookmarkStart w:id="4" w:name="_Toc242980802"/>
+      <w:bookmarkStart w:id="4" w:name="_Toc242981147"/>
       <w:r>
         <w:t>1.1 Background</w:t>
       </w:r>
@@ -3674,7 +3674,7 @@
       <w:pPr>
         <w:pStyle w:val="Heading2"/>
       </w:pPr>
-      <w:bookmarkStart w:id="5" w:name="_Toc242980803"/>
+      <w:bookmarkStart w:id="5" w:name="_Toc242981148"/>
       <w:r>
         <w:t>1.2 Problem Statement</w:t>
       </w:r>
@@ -3700,7 +3700,7 @@
       <w:pPr>
         <w:pStyle w:val="Heading2"/>
       </w:pPr>
-      <w:bookmarkStart w:id="6" w:name="_Toc242980804"/>
+      <w:bookmarkStart w:id="6" w:name="_Toc242981149"/>
       <w:r>
         <w:t>1.3 Motivation and Significance</w:t>
       </w:r>
@@ -3719,7 +3719,7 @@
       <w:pPr>
         <w:pStyle w:val="Heading2"/>
       </w:pPr>
-      <w:bookmarkStart w:id="7" w:name="_Toc242980805"/>
+      <w:bookmarkStart w:id="7" w:name="_Toc242981150"/>
       <w:r>
         <w:lastRenderedPageBreak/>
         <w:t>1.4 Scope</w:t>
@@ -3762,7 +3762,7 @@
       <w:pPr>
         <w:pStyle w:val="Heading2"/>
       </w:pPr>
-      <w:bookmarkStart w:id="8" w:name="_Toc242980806"/>
+      <w:bookmarkStart w:id="8" w:name="_Toc242981151"/>
       <w:r>
         <w:t>1.5 Report Organisation</w:t>
       </w:r>
@@ -3781,7 +3781,7 @@
       <w:pPr>
         <w:pStyle w:val="Heading1"/>
       </w:pPr>
-      <w:bookmarkStart w:id="9" w:name="_Toc242980807"/>
+      <w:bookmarkStart w:id="9" w:name="_Toc242981152"/>
       <w:r>
         <w:t>2. Literature Survey / Related Work</w:t>
       </w:r>
@@ -6755,7 +6755,7 @@
       <w:pPr>
         <w:pStyle w:val="Heading2"/>
       </w:pPr>
-      <w:bookmarkStart w:id="10" w:name="_Toc242980808"/>
+      <w:bookmarkStart w:id="10" w:name="_Toc242981153"/>
       <w:r>
         <w:t>2.1 Comparative Synthesis</w:t>
       </w:r>
@@ -6829,7 +6829,7 @@
       <w:pPr>
         <w:pStyle w:val="Heading2"/>
       </w:pPr>
-      <w:bookmarkStart w:id="11" w:name="_Toc242980809"/>
+      <w:bookmarkStart w:id="11" w:name="_Toc242981154"/>
       <w:r>
         <w:t>2.2 Individual Research Gap Analysis</w:t>
       </w:r>
@@ -10244,7 +10244,7 @@
       <w:pPr>
         <w:pStyle w:val="Heading2"/>
       </w:pPr>
-      <w:bookmarkStart w:id="12" w:name="_Toc242980810"/>
+      <w:bookmarkStart w:id="12" w:name="_Toc242981155"/>
       <w:r>
         <w:t>2.3 Consolidated Research Gap</w:t>
       </w:r>
@@ -10266,7 +10266,7 @@
       <w:pPr>
         <w:pStyle w:val="Heading1"/>
       </w:pPr>
-      <w:bookmarkStart w:id="13" w:name="_Toc242980811"/>
+      <w:bookmarkStart w:id="13" w:name="_Toc242981156"/>
       <w:r>
         <w:t>3. Project Objectives</w:t>
       </w:r>
@@ -10457,7 +10457,7 @@
       <w:pPr>
         <w:pStyle w:val="Heading2"/>
       </w:pPr>
-      <w:bookmarkStart w:id="14" w:name="_Toc242980812"/>
+      <w:bookmarkStart w:id="14" w:name="_Toc242981157"/>
       <w:r>
         <w:t>3.1 Expected Outcomes</w:t>
       </w:r>
@@ -10479,7 +10479,7 @@
       <w:pPr>
         <w:pStyle w:val="Heading1"/>
       </w:pPr>
-      <w:bookmarkStart w:id="15" w:name="_Toc242980813"/>
+      <w:bookmarkStart w:id="15" w:name="_Toc242981158"/>
       <w:r>
         <w:t>4. Novelty Summary</w:t>
       </w:r>
@@ -11176,7 +11176,7 @@
       <w:pPr>
         <w:pStyle w:val="Heading1"/>
       </w:pPr>
-      <w:bookmarkStart w:id="16" w:name="_Toc242980814"/>
+      <w:bookmarkStart w:id="16" w:name="_Toc242981159"/>
       <w:r>
         <w:t>5. Proposed System and Architecture</w:t>
       </w:r>
@@ -11186,7 +11186,7 @@
       <w:pPr>
         <w:pStyle w:val="Heading2"/>
       </w:pPr>
-      <w:bookmarkStart w:id="17" w:name="_Toc242980815"/>
+      <w:bookmarkStart w:id="17" w:name="_Toc242981160"/>
       <w:r>
         <w:t>5.1 System Overview</w:t>
       </w:r>
@@ -11242,7 +11242,7 @@
       <w:pPr>
         <w:pStyle w:val="Heading2"/>
       </w:pPr>
-      <w:bookmarkStart w:id="18" w:name="_Toc242980816"/>
+      <w:bookmarkStart w:id="18" w:name="_Toc242981161"/>
       <w:r>
         <w:lastRenderedPageBreak/>
         <w:t>5.2 Diagram 1 - Cloud Deployment Architecture</w:t>
@@ -11260,7 +11260,7 @@
           <w:noProof/>
         </w:rPr>
         <w:drawing>
-          <wp:inline distT="0" distB="0" distL="0" distR="0" wp14:anchorId="183DAB63" wp14:editId="10E4AD17">
+          <wp:inline distT="0" distB="0" distL="0" distR="0" wp14:anchorId="13019436" wp14:editId="3E9F8C3F">
             <wp:extent cx="5734050" cy="4019550"/>
             <wp:effectExtent l="0" t="0" r="0" b="0"/>
             <wp:docPr id="1" name="fig1_cloud_architecture.png" descr="Cloud Deployment Architecture (as deployed in AWS us-east-1)." title="Cloud Deployment Architecture (as deployed in AWS us-east-1)."/>
@@ -11513,7 +11513,7 @@
       <w:pPr>
         <w:pStyle w:val="Heading2"/>
       </w:pPr>
-      <w:bookmarkStart w:id="19" w:name="_Toc242980817"/>
+      <w:bookmarkStart w:id="19" w:name="_Toc242981162"/>
       <w:r>
         <w:lastRenderedPageBreak/>
         <w:t>5.3 Diagram 2 - Complete System Architecture / Workflow</w:t>
@@ -11531,7 +11531,7 @@
           <w:noProof/>
         </w:rPr>
         <w:drawing>
-          <wp:inline distT="0" distB="0" distL="0" distR="0" wp14:anchorId="2FD100B5" wp14:editId="0014DFD2">
+          <wp:inline distT="0" distB="0" distL="0" distR="0" wp14:anchorId="09D4224F" wp14:editId="2A34E6E0">
             <wp:extent cx="5734050" cy="3629025"/>
             <wp:effectExtent l="0" t="0" r="0" b="0"/>
             <wp:docPr id="2" name="fig2_system_workflow.png" descr="Complete System Architecture and Workflow (ingestion path A and query path B)." title="Complete System Architecture and Workflow (ingestion path A and query path B)."/>
@@ -11617,7 +11617,7 @@
       <w:pPr>
         <w:pStyle w:val="Heading2"/>
       </w:pPr>
-      <w:bookmarkStart w:id="20" w:name="_Toc242980818"/>
+      <w:bookmarkStart w:id="20" w:name="_Toc242981163"/>
       <w:r>
         <w:t>5.4 Workflow and Use Cases</w:t>
       </w:r>
@@ -11738,7 +11738,7 @@
       <w:pPr>
         <w:pStyle w:val="Heading2"/>
       </w:pPr>
-      <w:bookmarkStart w:id="21" w:name="_Toc242980819"/>
+      <w:bookmarkStart w:id="21" w:name="_Toc242981164"/>
       <w:r>
         <w:t>5.5 Security, Availability and Scalability</w:t>
       </w:r>
@@ -11889,7 +11889,7 @@
       <w:pPr>
         <w:pStyle w:val="Heading1"/>
       </w:pPr>
-      <w:bookmarkStart w:id="22" w:name="_Toc242980820"/>
+      <w:bookmarkStart w:id="22" w:name="_Toc242981165"/>
       <w:r>
         <w:t>6. Dataset / Input Data Description</w:t>
       </w:r>
@@ -14315,7 +14315,7 @@
       <w:pPr>
         <w:pStyle w:val="Heading2"/>
       </w:pPr>
-      <w:bookmarkStart w:id="23" w:name="_Toc242980821"/>
+      <w:bookmarkStart w:id="23" w:name="_Toc242981166"/>
       <w:r>
         <w:t>6.1 Data Preparation</w:t>
       </w:r>
@@ -14381,7 +14381,7 @@
       <w:pPr>
         <w:pStyle w:val="Heading1"/>
       </w:pPr>
-      <w:bookmarkStart w:id="24" w:name="_Toc242980822"/>
+      <w:bookmarkStart w:id="24" w:name="_Toc242981167"/>
       <w:r>
         <w:lastRenderedPageBreak/>
         <w:t>7. Cloud Platform and Services Planning</w:t>
@@ -16729,7 +16729,7 @@
       <w:pPr>
         <w:pStyle w:val="Heading2"/>
       </w:pPr>
-      <w:bookmarkStart w:id="25" w:name="_Toc242980823"/>
+      <w:bookmarkStart w:id="25" w:name="_Toc242981168"/>
       <w:r>
         <w:t>7.1 Deployment and Network Design</w:t>
       </w:r>
@@ -16752,7 +16752,7 @@
       <w:pPr>
         <w:pStyle w:val="Heading2"/>
       </w:pPr>
-      <w:bookmarkStart w:id="26" w:name="_Toc242980824"/>
+      <w:bookmarkStart w:id="26" w:name="_Toc242981169"/>
       <w:r>
         <w:t>7.2 Cost Estimation</w:t>
       </w:r>
@@ -17405,7 +17405,7 @@
       <w:pPr>
         <w:pStyle w:val="Heading2"/>
       </w:pPr>
-      <w:bookmarkStart w:id="27" w:name="_Toc242980825"/>
+      <w:bookmarkStart w:id="27" w:name="_Toc242981170"/>
       <w:r>
         <w:t>7.3 Portability / Provider-Specific Choices</w:t>
       </w:r>
@@ -17428,7 +17428,7 @@
       <w:pPr>
         <w:pStyle w:val="Heading1"/>
       </w:pPr>
-      <w:bookmarkStart w:id="28" w:name="_Toc242980826"/>
+      <w:bookmarkStart w:id="28" w:name="_Toc242981171"/>
       <w:r>
         <w:t>8. Methodology and Implementation Plan</w:t>
       </w:r>
@@ -17438,7 +17438,7 @@
       <w:pPr>
         <w:pStyle w:val="Heading2"/>
       </w:pPr>
-      <w:bookmarkStart w:id="29" w:name="_Toc242980827"/>
+      <w:bookmarkStart w:id="29" w:name="_Toc242981172"/>
       <w:r>
         <w:t>8.1 Overall Methodology</w:t>
       </w:r>
@@ -17460,7 +17460,7 @@
       <w:pPr>
         <w:pStyle w:val="Heading2"/>
       </w:pPr>
-      <w:bookmarkStart w:id="30" w:name="_Toc242980828"/>
+      <w:bookmarkStart w:id="30" w:name="_Toc242981173"/>
       <w:r>
         <w:t>8.2 Tools and Technologies</w:t>
       </w:r>
@@ -18256,7 +18256,7 @@
       <w:pPr>
         <w:pStyle w:val="Heading2"/>
       </w:pPr>
-      <w:bookmarkStart w:id="31" w:name="_Toc242980829"/>
+      <w:bookmarkStart w:id="31" w:name="_Toc242981174"/>
       <w:r>
         <w:t>8.3 Step-by-Step Implementation Plan</w:t>
       </w:r>
@@ -18407,7 +18407,7 @@
       <w:pPr>
         <w:pStyle w:val="Heading2"/>
       </w:pPr>
-      <w:bookmarkStart w:id="32" w:name="_Toc242980830"/>
+      <w:bookmarkStart w:id="32" w:name="_Toc242981175"/>
       <w:r>
         <w:t>8.4 Evaluation Metrics</w:t>
       </w:r>
@@ -18517,7 +18517,7 @@
       <w:pPr>
         <w:pStyle w:val="Heading1"/>
       </w:pPr>
-      <w:bookmarkStart w:id="33" w:name="_Toc242980831"/>
+      <w:bookmarkStart w:id="33" w:name="_Toc242981176"/>
       <w:r>
         <w:t>9. Implementation / Development</w:t>
       </w:r>
@@ -18536,7 +18536,7 @@
       <w:pPr>
         <w:pStyle w:val="Heading2"/>
       </w:pPr>
-      <w:bookmarkStart w:id="34" w:name="_Toc242980832"/>
+      <w:bookmarkStart w:id="34" w:name="_Toc242981177"/>
       <w:r>
         <w:lastRenderedPageBreak/>
         <w:t>9.1 Implemented Modules</w:t>
@@ -20105,20 +20105,11 @@
       <w:pPr>
         <w:pStyle w:val="Heading2"/>
       </w:pPr>
-      <w:bookmarkStart w:id="35" w:name="_Toc242980833"/>
+      <w:bookmarkStart w:id="35" w:name="_Toc242981178"/>
       <w:r>
         <w:t>9.2 Screenshots and Configuration Evidence</w:t>
       </w:r>
       <w:bookmarkEnd w:id="35"/>
-    </w:p>
-    <w:p>
-      <w:pPr>
-        <w:spacing w:after="120"/>
-        <w:jc w:val="both"/>
-      </w:pPr>
-      <w:r>
-        <w:t>The dashboard follows the light or dark theme of the operating system; the screenshots show the dark theme.</w:t>
-      </w:r>
     </w:p>
     <w:p>
       <w:pPr>
@@ -20130,9 +20121,8 @@
         <w:rPr>
           <w:noProof/>
         </w:rPr>
-        <w:lastRenderedPageBreak/>
         <w:drawing>
-          <wp:inline distT="0" distB="0" distL="0" distR="0" wp14:anchorId="3BDB3A61" wp14:editId="645B72D4">
+          <wp:inline distT="0" distB="0" distL="0" distR="0" wp14:anchorId="4A89DF5D" wp14:editId="264AD146">
             <wp:extent cx="5734050" cy="3581400"/>
             <wp:effectExtent l="0" t="0" r="0" b="0"/>
             <wp:docPr id="3" name="01_landing.png" descr="Public landing page with live graph statistics and in-page Cognito sign-in (15 Oct 2026)." title="Public landing page with live graph statistics and in-page Cognito sign-in (15 Oct 2026)."/>
@@ -20201,6 +20191,7 @@
         <w:jc w:val="both"/>
       </w:pPr>
       <w:r>
+        <w:lastRenderedPageBreak/>
         <w:t>The landing page reads /public/stats, the only route without authentication. Signing in uses the Cognito user-pool API directly from the page.</w:t>
       </w:r>
     </w:p>
@@ -20215,7 +20206,7 @@
           <w:noProof/>
         </w:rPr>
         <w:drawing>
-          <wp:inline distT="0" distB="0" distL="0" distR="0" wp14:anchorId="23512375" wp14:editId="7AC9FD51">
+          <wp:inline distT="0" distB="0" distL="0" distR="0" wp14:anchorId="1F4B1FC8" wp14:editId="200EFBB9">
             <wp:extent cx="5734050" cy="3581400"/>
             <wp:effectExtent l="0" t="0" r="0" b="0"/>
             <wp:docPr id="4" name="03_ask.png" descr="Ask: GraphRAG answer to &quot;Which methods are used for link prediction?&quot; with citations, the graph of retrieved facts, and graph size (signed-in member)." title="Ask: GraphRAG answer to &quot;Which methods are used for link prediction?&quot; with citations, the graph of retrieved facts, and graph size (signed-in member)."/>
@@ -20284,7 +20275,6 @@
         <w:jc w:val="both"/>
       </w:pPr>
       <w:r>
-        <w:lastRenderedPageBreak/>
         <w:t>Each statement in the answer ends with a clickable citation to its source paper (OpenAlex ID or sample document). The graph in the centre shows the facts that were retrieved, and the right panel shows the live node counts and the members-only upload control.</w:t>
       </w:r>
     </w:p>
@@ -20298,8 +20288,9 @@
         <w:rPr>
           <w:noProof/>
         </w:rPr>
+        <w:lastRenderedPageBreak/>
         <w:drawing>
-          <wp:inline distT="0" distB="0" distL="0" distR="0" wp14:anchorId="32080702" wp14:editId="7901B7DB">
+          <wp:inline distT="0" distB="0" distL="0" distR="0" wp14:anchorId="79DBA74B" wp14:editId="7AADE633">
             <wp:extent cx="3295650" cy="4143375"/>
             <wp:effectExtent l="0" t="0" r="0" b="0"/>
             <wp:docPr id="5" name="05_connect.png" descr="Connect: the shortest multi-hop path between TransE and BERT (TransE is used by a survey that KG-CF cites, and KG-CF uses BERT)." title="Connect: the shortest multi-hop path between TransE and BERT (TransE is used by a survey that KG-CF cites, and KG-CF uses BERT)."/>
@@ -20375,7 +20366,7 @@
       <w:pPr>
         <w:pStyle w:val="Heading2"/>
       </w:pPr>
-      <w:bookmarkStart w:id="36" w:name="_Toc242980834"/>
+      <w:bookmarkStart w:id="36" w:name="_Toc242981179"/>
       <w:r>
         <w:t>9.3 Repository and Project Structure</w:t>
       </w:r>
@@ -20438,7 +20429,6 @@
                 <w:sz w:val="20"/>
                 <w:szCs w:val="20"/>
               </w:rPr>
-              <w:lastRenderedPageBreak/>
               <w:t>Folder</w:t>
             </w:r>
           </w:p>
@@ -20757,6 +20747,7 @@
                 <w:sz w:val="20"/>
                 <w:szCs w:val="20"/>
               </w:rPr>
+              <w:lastRenderedPageBreak/>
               <w:t>scripts/</w:t>
             </w:r>
           </w:p>
@@ -21111,7 +21102,7 @@
       <w:pPr>
         <w:pStyle w:val="Heading2"/>
       </w:pPr>
-      <w:bookmarkStart w:id="37" w:name="_Toc242980835"/>
+      <w:bookmarkStart w:id="37" w:name="_Toc242981180"/>
       <w:r>
         <w:t>9.4 Version Control Workflow</w:t>
       </w:r>
@@ -21133,7 +21124,7 @@
       <w:pPr>
         <w:pStyle w:val="Heading1"/>
       </w:pPr>
-      <w:bookmarkStart w:id="38" w:name="_Toc242980836"/>
+      <w:bookmarkStart w:id="38" w:name="_Toc242981181"/>
       <w:r>
         <w:t>10. Testing, Results and Observations</w:t>
       </w:r>
@@ -21143,7 +21134,7 @@
       <w:pPr>
         <w:pStyle w:val="Heading2"/>
       </w:pPr>
-      <w:bookmarkStart w:id="39" w:name="_Toc242980837"/>
+      <w:bookmarkStart w:id="39" w:name="_Toc242981182"/>
       <w:r>
         <w:t>10.1 Test Plan and Test Cases</w:t>
       </w:r>
@@ -21785,7 +21776,6 @@
                 <w:sz w:val="17"/>
                 <w:szCs w:val="17"/>
               </w:rPr>
-              <w:lastRenderedPageBreak/>
               <w:t>T03</w:t>
             </w:r>
           </w:p>
@@ -22323,6 +22313,7 @@
                 <w:sz w:val="17"/>
                 <w:szCs w:val="17"/>
               </w:rPr>
+              <w:lastRenderedPageBreak/>
               <w:t>T06</w:t>
             </w:r>
           </w:p>
@@ -23731,7 +23722,7 @@
       <w:pPr>
         <w:pStyle w:val="Heading2"/>
       </w:pPr>
-      <w:bookmarkStart w:id="40" w:name="_Toc242980838"/>
+      <w:bookmarkStart w:id="40" w:name="_Toc242981183"/>
       <w:r>
         <w:t>10.2 Results</w:t>
       </w:r>
@@ -23764,9 +23755,8 @@
         <w:rPr>
           <w:noProof/>
         </w:rPr>
-        <w:lastRenderedPageBreak/>
         <w:drawing>
-          <wp:inline distT="0" distB="0" distL="0" distR="0" wp14:anchorId="51F74E7C" wp14:editId="178AC3B1">
+          <wp:inline distT="0" distB="0" distL="0" distR="0" wp14:anchorId="7C651967" wp14:editId="4D8C6D64">
             <wp:extent cx="5124450" cy="2466975"/>
             <wp:effectExtent l="0" t="0" r="0" b="0"/>
             <wp:docPr id="6" name="fig_ner_f1.png" descr="SciBERT NER test F1 per entity type (overall 0.618; precision 0.593, recall 0.645)." title="SciBERT NER test F1 per entity type (overall 0.618; precision 0.593, recall 0.645)."/>
@@ -23839,8 +23829,9 @@
         <w:rPr>
           <w:noProof/>
         </w:rPr>
+        <w:lastRenderedPageBreak/>
         <w:drawing>
-          <wp:inline distT="0" distB="0" distL="0" distR="0" wp14:anchorId="41820C35" wp14:editId="351B1BDB">
+          <wp:inline distT="0" distB="0" distL="0" distR="0" wp14:anchorId="1F4D819A" wp14:editId="7B71B67A">
             <wp:extent cx="5124450" cy="2619375"/>
             <wp:effectExtent l="0" t="0" r="0" b="0"/>
             <wp:docPr id="7" name="fig_re.png" descr="Relation extraction before and after the model improvement (SciERC test, calibrated on dev)." title="Relation extraction before and after the model improvement (SciERC test, calibrated on dev)."/>
@@ -23926,11 +23917,7 @@
         <w:jc w:val="both"/>
       </w:pPr>
       <w:r>
-        <w:t xml:space="preserve">Final graph (evaluation snapshot): 29,320 nodes and 42,015 relationships: 20,746 papers (most are cited references), 1,674 authors, 553 institutions, 2,416 methods, 1,727 tasks, 779 datasets and 262 metrics. On 51 generated questions, context recall was 98.3%, 97.8% of questions had </w:t>
-      </w:r>
-      <w:r>
-        <w:lastRenderedPageBreak/>
-        <w:t>every ground-truth item retrieved, and average retrieval time was 0.535 s with 27 parallel queries (previously about 6 s with 44 sequential queries).</w:t>
+        <w:t>Final graph (evaluation snapshot): 29,320 nodes and 42,015 relationships: 20,746 papers (most are cited references), 1,674 authors, 553 institutions, 2,416 methods, 1,727 tasks, 779 datasets and 262 metrics. On 51 generated questions, context recall was 98.3%, 97.8% of questions had every ground-truth item retrieved, and average retrieval time was 0.535 s with 27 parallel queries (previously about 6 s with 44 sequential queries).</w:t>
       </w:r>
     </w:p>
     <w:p>
@@ -23938,6 +23925,7 @@
         <w:pStyle w:val="Heading3"/>
       </w:pPr>
       <w:r>
+        <w:lastRenderedPageBreak/>
         <w:t>GraphRAG answers (Objective 3)</w:t>
       </w:r>
     </w:p>
@@ -23952,7 +23940,7 @@
           <w:noProof/>
         </w:rPr>
         <w:drawing>
-          <wp:inline distT="0" distB="0" distL="0" distR="0" wp14:anchorId="6C0868C9" wp14:editId="19A8EB1F">
+          <wp:inline distT="0" distB="0" distL="0" distR="0" wp14:anchorId="547255BD" wp14:editId="41501165">
             <wp:extent cx="5124450" cy="2924175"/>
             <wp:effectExtent l="0" t="0" r="0" b="0"/>
             <wp:docPr id="8" name="fig_graphrag.png" descr="Hallucination benchmark: GraphRAG vs the same LLM without the graph (28 questions: 24 answerable, 4 about made-up entities)." title="Hallucination benchmark: GraphRAG vs the same LLM without the graph (28 questions: 24 answerable, 4 about made-up entities)."/>
@@ -24058,19 +24046,16 @@
         <w:t>The dashboard was tested in Microsoft Edge with Playwright (results/UI_UX_TESTING.md). The landing page loaded in 0.24-0.66 s over three fresh loads, sign-in opened the app in 0.91 s and an answer appeared 2.42 s after asking. A wrong password gives a non-revealing message, non-members see why upload is hidden, the sign-in form works with the keyboard alone, and at phone width (390 x 844) the layout stacks into one column with no horizontal scrolling. An axe-core scan (WCAG 2.0/2.1 A and AA) found no violat</w:t>
       </w:r>
       <w:r>
-        <w:t xml:space="preserve">ions in the signed-in app and one on </w:t>
-      </w:r>
-      <w:r>
-        <w:lastRenderedPageBreak/>
-        <w:t>the landing page: the password Show button had a contrast ratio of 4.4:1 against the 4.5:1 minimum; it was corrected to 5.27:1 in the light theme and 6.53:1 in the dark theme.</w:t>
+        <w:t>ions in the signed-in app and one on the landing page in the light theme: the password Show button had a contrast ratio of 4.4:1 against the 4.5:1 minimum. The dashboard now uses a single dark theme for every visitor, in which the scan finds no violations (the button's contrast is 6.53:1).</w:t>
       </w:r>
     </w:p>
     <w:p>
       <w:pPr>
         <w:pStyle w:val="Heading2"/>
       </w:pPr>
-      <w:bookmarkStart w:id="41" w:name="_Toc242980839"/>
-      <w:r>
+      <w:bookmarkStart w:id="41" w:name="_Toc242981184"/>
+      <w:r>
+        <w:lastRenderedPageBreak/>
         <w:t>10.3 Baseline Comparison</w:t>
       </w:r>
       <w:bookmarkEnd w:id="41"/>
@@ -24980,7 +24965,7 @@
       <w:pPr>
         <w:pStyle w:val="Heading2"/>
       </w:pPr>
-      <w:bookmarkStart w:id="42" w:name="_Toc242980840"/>
+      <w:bookmarkStart w:id="42" w:name="_Toc242981185"/>
       <w:r>
         <w:t>10.4 Results Summary</w:t>
       </w:r>
@@ -25891,7 +25876,7 @@
       <w:pPr>
         <w:pStyle w:val="Heading1"/>
       </w:pPr>
-      <w:bookmarkStart w:id="43" w:name="_Toc242980841"/>
+      <w:bookmarkStart w:id="43" w:name="_Toc242981186"/>
       <w:r>
         <w:t>11. Discussion, Limitations and Risk Analysis</w:t>
       </w:r>
@@ -25901,7 +25886,7 @@
       <w:pPr>
         <w:pStyle w:val="Heading2"/>
       </w:pPr>
-      <w:bookmarkStart w:id="44" w:name="_Toc242980842"/>
+      <w:bookmarkStart w:id="44" w:name="_Toc242981187"/>
       <w:r>
         <w:t>11.1 Discussion</w:t>
       </w:r>
@@ -25913,11 +25898,11 @@
         <w:jc w:val="both"/>
       </w:pPr>
       <w:r>
-        <w:t xml:space="preserve">The main result is the controlled hallucination test. With the same model and the same questions, removing the graph turned 62.5% of answers into confident mistakes (for example, invented authors, venue and year of a survey paper), while GraphRAG answered every answerable question correctly with citations. Both systems refused questions about made-up </w:t>
+        <w:t xml:space="preserve">The main result is the controlled hallucination test. With the same model and the same questions, removing the graph turned 62.5% of answers into confident mistakes (for example, invented authors, venue and year of a survey paper), while GraphRAG answered every answerable question correctly with citations. Both systems refused questions about made-up entities, so the improvement comes from grounding in retrievable facts, not from the model </w:t>
       </w:r>
       <w:r>
         <w:lastRenderedPageBreak/>
-        <w:t>entities, so the improvement comes from grounding in retrievable facts, not from the model being more cautious. For users, this means that every statement can be checked by clicking its citation.</w:t>
+        <w:t>being more cautious. For users, this means that every statement can be checked by clicking its citation.</w:t>
       </w:r>
     </w:p>
     <w:p>
@@ -25933,7 +25918,7 @@
       <w:pPr>
         <w:pStyle w:val="Heading2"/>
       </w:pPr>
-      <w:bookmarkStart w:id="45" w:name="_Toc242980843"/>
+      <w:bookmarkStart w:id="45" w:name="_Toc242981188"/>
       <w:r>
         <w:t>11.2 Limitations</w:t>
       </w:r>
@@ -25959,7 +25944,7 @@
         <w:t xml:space="preserve"> the deployed graph and LLM are external services (Neo4j AuraDB, Groq, Gemini) because the Free plan blocks Neptune and Bedrock; the AWS-native path is implemented but was not load-tested. Testing found three defects that are now fixed in the code: the Connect view listed the same path several times (fixed and deployed on 15 October 2026); about 0.1% of graph nodes (37) had been duplicated by concurrent writes (uniqueness constraints are implemented and take effect once the existing duplicates are merged wi</w:t>
       </w:r>
       <w:r>
-        <w:t>th the clean-up script); and the password Show button was slightly below the WCAG contrast minimum.</w:t>
+        <w:t>th the clean-up script); and the password Show button was slightly below the WCAG contrast minimum in the light theme, which was removed in favour of a single dark theme.</w:t>
       </w:r>
     </w:p>
     <w:p>
@@ -26067,7 +26052,7 @@
       <w:pPr>
         <w:pStyle w:val="Heading2"/>
       </w:pPr>
-      <w:bookmarkStart w:id="46" w:name="_Toc242980844"/>
+      <w:bookmarkStart w:id="46" w:name="_Toc242981189"/>
       <w:r>
         <w:t>11.3 Risks and Mitigation</w:t>
       </w:r>
@@ -26978,7 +26963,7 @@
       <w:pPr>
         <w:pStyle w:val="Heading1"/>
       </w:pPr>
-      <w:bookmarkStart w:id="47" w:name="_Toc242980845"/>
+      <w:bookmarkStart w:id="47" w:name="_Toc242981190"/>
       <w:r>
         <w:t>12. Team Contribution and Project Management</w:t>
       </w:r>
@@ -28131,7 +28116,7 @@
       <w:pPr>
         <w:pStyle w:val="Heading2"/>
       </w:pPr>
-      <w:bookmarkStart w:id="48" w:name="_Toc242980846"/>
+      <w:bookmarkStart w:id="48" w:name="_Toc242981191"/>
       <w:r>
         <w:lastRenderedPageBreak/>
         <w:t>12.1 Individual Contribution Evidence</w:t>
@@ -28211,7 +28196,7 @@
       <w:pPr>
         <w:pStyle w:val="Heading1"/>
       </w:pPr>
-      <w:bookmarkStart w:id="49" w:name="_Toc242980847"/>
+      <w:bookmarkStart w:id="49" w:name="_Toc242981192"/>
       <w:r>
         <w:t>13. Conclusion and Future Enhancements</w:t>
       </w:r>
@@ -28221,7 +28206,7 @@
       <w:pPr>
         <w:pStyle w:val="Heading2"/>
       </w:pPr>
-      <w:bookmarkStart w:id="50" w:name="_Toc242980848"/>
+      <w:bookmarkStart w:id="50" w:name="_Toc242981193"/>
       <w:r>
         <w:t>13.1 Conclusion</w:t>
       </w:r>
@@ -28243,7 +28228,7 @@
       <w:pPr>
         <w:pStyle w:val="Heading2"/>
       </w:pPr>
-      <w:bookmarkStart w:id="51" w:name="_Toc242980849"/>
+      <w:bookmarkStart w:id="51" w:name="_Toc242981194"/>
       <w:r>
         <w:t>13.2 Future Enhancements</w:t>
       </w:r>
@@ -28319,7 +28304,7 @@
       <w:pPr>
         <w:pStyle w:val="Heading1"/>
       </w:pPr>
-      <w:bookmarkStart w:id="52" w:name="_Toc242980850"/>
+      <w:bookmarkStart w:id="52" w:name="_Toc242981195"/>
       <w:r>
         <w:t>References</w:t>
       </w:r>
@@ -28562,7 +28547,7 @@
       <w:pPr>
         <w:pStyle w:val="Heading1"/>
       </w:pPr>
-      <w:bookmarkStart w:id="53" w:name="_Toc242980851"/>
+      <w:bookmarkStart w:id="53" w:name="_Toc242981196"/>
       <w:r>
         <w:t>Appendix A - Project Timeline</w:t>
       </w:r>
@@ -29818,7 +29803,7 @@
       <w:pPr>
         <w:pStyle w:val="Heading1"/>
       </w:pPr>
-      <w:bookmarkStart w:id="54" w:name="_Toc242980852"/>
+      <w:bookmarkStart w:id="54" w:name="_Toc242981197"/>
       <w:r>
         <w:t>Appendix B - Final Review Checklist</w:t>
       </w:r>
@@ -30052,10 +30037,122 @@
 <file path=word/numbering.xml><?xml version="1.0" encoding="utf-8"?>
 <w:numbering xmlns:wpc="http://schemas.microsoft.com/office/word/2010/wordprocessingCanvas" xmlns:cx="http://schemas.microsoft.com/office/drawing/2014/chartex" xmlns:cx1="http://schemas.microsoft.com/office/drawing/2015/9/8/chartex" xmlns:cx2="http://schemas.microsoft.com/office/drawing/2015/10/21/chartex" xmlns:cx3="http://schemas.microsoft.com/office/drawing/2016/5/9/chartex" xmlns:cx4="http://schemas.microsoft.com/office/drawing/2016/5/10/chartex" xmlns:cx5="http://schemas.microsoft.com/office/drawing/2016/5/11/chartex" xmlns:cx6="http://schemas.microsoft.com/office/drawing/2016/5/12/chartex" xmlns:cx7="http://schemas.microsoft.com/office/drawing/2016/5/13/chartex" xmlns:cx8="http://schemas.microsoft.com/office/drawing/2016/5/14/chartex" xmlns:mc="http://schemas.openxmlformats.org/markup-compatibility/2006" xmlns:aink="http://schemas.microsoft.com/office/drawing/2016/ink" xmlns:am3d="http://schemas.microsoft.com/office/drawing/2017/model3d" xmlns:o="urn:schemas-microsoft-com:office:office" xmlns:oel="http://schemas.microsoft.com/office/2019/extlst" xmlns:r="http://schemas.openxmlformats.org/officeDocument/2006/relationships" xmlns:m="http://schemas.openxmlformats.org/officeDocument/2006/math" xmlns:v="urn:schemas-microsoft-com:vml" xmlns:wp14="http://schemas.microsoft.com/office/word/2010/wordprocessingDrawing" xmlns:wp="http://schemas.openxmlformats.org/drawingml/2006/wordprocessingDrawing" xmlns:w10="urn:schemas-microsoft-com:office:word" xmlns:w="http://schemas.openxmlformats.org/wordprocessingml/2006/main" xmlns:w14="http://schemas.microsoft.com/office/word/2010/wordml" xmlns:w15="http://schemas.microsoft.com/office/word/2012/wordml" xmlns:w16cex="http://schemas.microsoft.com/office/word/2018/wordml/cex" xmlns:w16cid="http://schemas.microsoft.com/office/word/2016/wordml/cid" xmlns:w16="http://schemas.microsoft.com/office/word/2018/wordml" xmlns:w16du="http://schemas.microsoft.com/office/word/2023/wordml/word16du" xmlns:w16sdtdh="http://schemas.microsoft.com/office/word/2020/wordml/sdtdatahash" xmlns:w16sdtfl="http://schemas.microsoft.com/office/word/2024/wordml/sdtformatlock" xmlns:w16se="http://schemas.microsoft.com/office/word/2015/wordml/symex" xmlns:wpg="http://schemas.microsoft.com/office/word/2010/wordprocessingGroup" xmlns:wpi="http://schemas.microsoft.com/office/word/2010/wordprocessingInk" xmlns:wne="http://schemas.microsoft.com/office/word/2006/wordml" xmlns:wps="http://schemas.microsoft.com/office/word/2010/wordprocessingShape" mc:Ignorable="w14 w15 w16se w16cid w16 w16cex w16sdtdh w16sdtfl w16du wp14">
   <w:abstractNum w:abstractNumId="0" w15:restartNumberingAfterBreak="0">
-    <w:nsid w:val="09BA5C6A"/>
+    <w:nsid w:val="38D507D2"/>
     <w:multiLevelType w:val="hybridMultilevel"/>
-    <w:tmpl w:val="4360377A"/>
-    <w:lvl w:ilvl="0" w:tplc="CFE075E6" w:tentative="1">
+    <w:tmpl w:val="7D442726"/>
+    <w:lvl w:ilvl="0" w:tplc="4088F11C">
+      <w:start w:val="1"/>
+      <w:numFmt w:val="bullet"/>
+      <w:lvlText w:val="•"/>
+      <w:lvlJc w:val="left"/>
+      <w:pPr>
+        <w:ind w:left="540" w:hanging="300"/>
+      </w:pPr>
+    </w:lvl>
+    <w:lvl w:ilvl="1" w:tplc="798C59CA" w:tentative="1">
+      <w:start w:val="1"/>
+      <w:numFmt w:val="bullet"/>
+      <w:lvlText w:val="–"/>
+      <w:lvlJc w:val="left"/>
+      <w:pPr>
+        <w:ind w:left="1080" w:hanging="300"/>
+      </w:pPr>
+    </w:lvl>
+    <w:lvl w:ilvl="2" w:tplc="13447C6A">
+      <w:numFmt w:val="decimal"/>
+      <w:lvlText w:val=""/>
+      <w:lvlJc w:val="left"/>
+    </w:lvl>
+    <w:lvl w:ilvl="3" w:tplc="7B667114">
+      <w:numFmt w:val="decimal"/>
+      <w:lvlText w:val=""/>
+      <w:lvlJc w:val="left"/>
+    </w:lvl>
+    <w:lvl w:ilvl="4" w:tplc="9A9E2258">
+      <w:numFmt w:val="decimal"/>
+      <w:lvlText w:val=""/>
+      <w:lvlJc w:val="left"/>
+    </w:lvl>
+    <w:lvl w:ilvl="5" w:tplc="065AEBAE">
+      <w:numFmt w:val="decimal"/>
+      <w:lvlText w:val=""/>
+      <w:lvlJc w:val="left"/>
+    </w:lvl>
+    <w:lvl w:ilvl="6" w:tplc="F05A508E">
+      <w:numFmt w:val="decimal"/>
+      <w:lvlText w:val=""/>
+      <w:lvlJc w:val="left"/>
+    </w:lvl>
+    <w:lvl w:ilvl="7" w:tplc="EA369E3C">
+      <w:numFmt w:val="decimal"/>
+      <w:lvlText w:val=""/>
+      <w:lvlJc w:val="left"/>
+    </w:lvl>
+    <w:lvl w:ilvl="8" w:tplc="0414B0CC">
+      <w:numFmt w:val="decimal"/>
+      <w:lvlText w:val=""/>
+      <w:lvlJc w:val="left"/>
+    </w:lvl>
+  </w:abstractNum>
+  <w:abstractNum w:abstractNumId="1" w15:restartNumberingAfterBreak="0">
+    <w:nsid w:val="3CD320FF"/>
+    <w:multiLevelType w:val="hybridMultilevel"/>
+    <w:tmpl w:val="2DF811D8"/>
+    <w:lvl w:ilvl="0" w:tplc="D02CA450">
+      <w:start w:val="1"/>
+      <w:numFmt w:val="decimal"/>
+      <w:lvlText w:val="%1."/>
+      <w:lvlJc w:val="left"/>
+      <w:pPr>
+        <w:ind w:left="540" w:hanging="360"/>
+      </w:pPr>
+    </w:lvl>
+    <w:lvl w:ilvl="1" w:tplc="28CED234">
+      <w:numFmt w:val="decimal"/>
+      <w:lvlText w:val=""/>
+      <w:lvlJc w:val="left"/>
+    </w:lvl>
+    <w:lvl w:ilvl="2" w:tplc="D5141684">
+      <w:numFmt w:val="decimal"/>
+      <w:lvlText w:val=""/>
+      <w:lvlJc w:val="left"/>
+    </w:lvl>
+    <w:lvl w:ilvl="3" w:tplc="19D08568">
+      <w:numFmt w:val="decimal"/>
+      <w:lvlText w:val=""/>
+      <w:lvlJc w:val="left"/>
+    </w:lvl>
+    <w:lvl w:ilvl="4" w:tplc="83AE214E">
+      <w:numFmt w:val="decimal"/>
+      <w:lvlText w:val=""/>
+      <w:lvlJc w:val="left"/>
+    </w:lvl>
+    <w:lvl w:ilvl="5" w:tplc="13BA0DAA">
+      <w:numFmt w:val="decimal"/>
+      <w:lvlText w:val=""/>
+      <w:lvlJc w:val="left"/>
+    </w:lvl>
+    <w:lvl w:ilvl="6" w:tplc="A0BE3412">
+      <w:numFmt w:val="decimal"/>
+      <w:lvlText w:val=""/>
+      <w:lvlJc w:val="left"/>
+    </w:lvl>
+    <w:lvl w:ilvl="7" w:tplc="136A0DD2">
+      <w:numFmt w:val="decimal"/>
+      <w:lvlText w:val=""/>
+      <w:lvlJc w:val="left"/>
+    </w:lvl>
+    <w:lvl w:ilvl="8" w:tplc="AAA28CCA">
+      <w:numFmt w:val="decimal"/>
+      <w:lvlText w:val=""/>
+      <w:lvlJc w:val="left"/>
+    </w:lvl>
+  </w:abstractNum>
+  <w:abstractNum w:abstractNumId="2" w15:restartNumberingAfterBreak="0">
+    <w:nsid w:val="4D795891"/>
+    <w:multiLevelType w:val="hybridMultilevel"/>
+    <w:tmpl w:val="15DE3332"/>
+    <w:lvl w:ilvl="0" w:tplc="6450B562" w:tentative="1">
       <w:start w:val="1"/>
       <w:numFmt w:val="bullet"/>
       <w:lvlText w:val="●"/>
@@ -30064,7 +30161,7 @@
         <w:ind w:left="720" w:hanging="360"/>
       </w:pPr>
     </w:lvl>
-    <w:lvl w:ilvl="1" w:tplc="6FA6ACAA" w:tentative="1">
+    <w:lvl w:ilvl="1" w:tplc="EF180B00" w:tentative="1">
       <w:start w:val="1"/>
       <w:numFmt w:val="bullet"/>
       <w:lvlText w:val="○"/>
@@ -30073,7 +30170,7 @@
         <w:ind w:left="1440" w:hanging="360"/>
       </w:pPr>
     </w:lvl>
-    <w:lvl w:ilvl="2" w:tplc="8598AE40" w:tentative="1">
+    <w:lvl w:ilvl="2" w:tplc="68D29CC0" w:tentative="1">
       <w:start w:val="1"/>
       <w:numFmt w:val="bullet"/>
       <w:lvlText w:val="■"/>
@@ -30082,7 +30179,7 @@
         <w:ind w:left="2160" w:hanging="360"/>
       </w:pPr>
     </w:lvl>
-    <w:lvl w:ilvl="3" w:tplc="53B82DF6" w:tentative="1">
+    <w:lvl w:ilvl="3" w:tplc="DA8CD2FE" w:tentative="1">
       <w:start w:val="1"/>
       <w:numFmt w:val="bullet"/>
       <w:lvlText w:val="●"/>
@@ -30091,7 +30188,7 @@
         <w:ind w:left="2880" w:hanging="360"/>
       </w:pPr>
     </w:lvl>
-    <w:lvl w:ilvl="4" w:tplc="BB66C556" w:tentative="1">
+    <w:lvl w:ilvl="4" w:tplc="D24435BA" w:tentative="1">
       <w:start w:val="1"/>
       <w:numFmt w:val="bullet"/>
       <w:lvlText w:val="○"/>
@@ -30100,7 +30197,7 @@
         <w:ind w:left="3600" w:hanging="360"/>
       </w:pPr>
     </w:lvl>
-    <w:lvl w:ilvl="5" w:tplc="E766F8A8" w:tentative="1">
+    <w:lvl w:ilvl="5" w:tplc="A9628786" w:tentative="1">
       <w:start w:val="1"/>
       <w:numFmt w:val="bullet"/>
       <w:lvlText w:val="■"/>
@@ -30109,7 +30206,7 @@
         <w:ind w:left="4320" w:hanging="360"/>
       </w:pPr>
     </w:lvl>
-    <w:lvl w:ilvl="6" w:tplc="E4E60DFE" w:tentative="1">
+    <w:lvl w:ilvl="6" w:tplc="BFD022F4" w:tentative="1">
       <w:start w:val="1"/>
       <w:numFmt w:val="bullet"/>
       <w:lvlText w:val="●"/>
@@ -30118,7 +30215,7 @@
         <w:ind w:left="5040" w:hanging="360"/>
       </w:pPr>
     </w:lvl>
-    <w:lvl w:ilvl="7" w:tplc="0D4EEBD4" w:tentative="1">
+    <w:lvl w:ilvl="7" w:tplc="367A5300" w:tentative="1">
       <w:start w:val="1"/>
       <w:numFmt w:val="bullet"/>
       <w:lvlText w:val="●"/>
@@ -30127,7 +30224,7 @@
         <w:ind w:left="5760" w:hanging="360"/>
       </w:pPr>
     </w:lvl>
-    <w:lvl w:ilvl="8" w:tplc="DC1E29A4" w:tentative="1">
+    <w:lvl w:ilvl="8" w:tplc="7D04A910" w:tentative="1">
       <w:start w:val="1"/>
       <w:numFmt w:val="bullet"/>
       <w:lvlText w:val="●"/>
@@ -30137,11 +30234,11 @@
       </w:pPr>
     </w:lvl>
   </w:abstractNum>
-  <w:abstractNum w:abstractNumId="1" w15:restartNumberingAfterBreak="0">
-    <w:nsid w:val="0BFE540A"/>
+  <w:abstractNum w:abstractNumId="3" w15:restartNumberingAfterBreak="0">
+    <w:nsid w:val="524721A3"/>
     <w:multiLevelType w:val="hybridMultilevel"/>
-    <w:tmpl w:val="9E9C54B6"/>
-    <w:lvl w:ilvl="0" w:tplc="46DE166A">
+    <w:tmpl w:val="474CB95E"/>
+    <w:lvl w:ilvl="0" w:tplc="E45AD35E">
       <w:start w:val="1"/>
       <w:numFmt w:val="decimal"/>
       <w:lvlText w:val="%1."/>
@@ -30150,110 +30247,52 @@
         <w:ind w:left="540" w:hanging="360"/>
       </w:pPr>
     </w:lvl>
-    <w:lvl w:ilvl="1" w:tplc="5C6ABC38">
+    <w:lvl w:ilvl="1" w:tplc="7AA0E8D8">
       <w:numFmt w:val="decimal"/>
       <w:lvlText w:val=""/>
       <w:lvlJc w:val="left"/>
     </w:lvl>
-    <w:lvl w:ilvl="2" w:tplc="272C178C">
+    <w:lvl w:ilvl="2" w:tplc="29DE76CE">
       <w:numFmt w:val="decimal"/>
       <w:lvlText w:val=""/>
       <w:lvlJc w:val="left"/>
     </w:lvl>
-    <w:lvl w:ilvl="3" w:tplc="DCFEB954">
+    <w:lvl w:ilvl="3" w:tplc="20BAC2C2">
       <w:numFmt w:val="decimal"/>
       <w:lvlText w:val=""/>
       <w:lvlJc w:val="left"/>
     </w:lvl>
-    <w:lvl w:ilvl="4" w:tplc="659ED92A">
+    <w:lvl w:ilvl="4" w:tplc="06764FDA">
       <w:numFmt w:val="decimal"/>
       <w:lvlText w:val=""/>
       <w:lvlJc w:val="left"/>
     </w:lvl>
-    <w:lvl w:ilvl="5" w:tplc="E298A232">
+    <w:lvl w:ilvl="5" w:tplc="B66C02F6">
       <w:numFmt w:val="decimal"/>
       <w:lvlText w:val=""/>
       <w:lvlJc w:val="left"/>
     </w:lvl>
-    <w:lvl w:ilvl="6" w:tplc="E46C9032">
+    <w:lvl w:ilvl="6" w:tplc="0B8C41C0">
       <w:numFmt w:val="decimal"/>
       <w:lvlText w:val=""/>
       <w:lvlJc w:val="left"/>
     </w:lvl>
-    <w:lvl w:ilvl="7" w:tplc="34CA9B58">
+    <w:lvl w:ilvl="7" w:tplc="BBAA0AE4">
       <w:numFmt w:val="decimal"/>
       <w:lvlText w:val=""/>
       <w:lvlJc w:val="left"/>
     </w:lvl>
-    <w:lvl w:ilvl="8" w:tplc="0A2CA96A">
+    <w:lvl w:ilvl="8" w:tplc="51F6CA0A">
       <w:numFmt w:val="decimal"/>
       <w:lvlText w:val=""/>
       <w:lvlJc w:val="left"/>
     </w:lvl>
   </w:abstractNum>
-  <w:abstractNum w:abstractNumId="2" w15:restartNumberingAfterBreak="0">
-    <w:nsid w:val="357F0CAA"/>
+  <w:abstractNum w:abstractNumId="4" w15:restartNumberingAfterBreak="0">
+    <w:nsid w:val="6BD76CE0"/>
     <w:multiLevelType w:val="hybridMultilevel"/>
-    <w:tmpl w:val="1F86BA68"/>
-    <w:lvl w:ilvl="0" w:tplc="B0202B74">
-      <w:start w:val="1"/>
-      <w:numFmt w:val="bullet"/>
-      <w:lvlText w:val="•"/>
-      <w:lvlJc w:val="left"/>
-      <w:pPr>
-        <w:ind w:left="540" w:hanging="300"/>
-      </w:pPr>
-    </w:lvl>
-    <w:lvl w:ilvl="1" w:tplc="71AAE69A" w:tentative="1">
-      <w:start w:val="1"/>
-      <w:numFmt w:val="bullet"/>
-      <w:lvlText w:val="–"/>
-      <w:lvlJc w:val="left"/>
-      <w:pPr>
-        <w:ind w:left="1080" w:hanging="300"/>
-      </w:pPr>
-    </w:lvl>
-    <w:lvl w:ilvl="2" w:tplc="45D09AFC">
-      <w:numFmt w:val="decimal"/>
-      <w:lvlText w:val=""/>
-      <w:lvlJc w:val="left"/>
-    </w:lvl>
-    <w:lvl w:ilvl="3" w:tplc="3634F15E">
-      <w:numFmt w:val="decimal"/>
-      <w:lvlText w:val=""/>
-      <w:lvlJc w:val="left"/>
-    </w:lvl>
-    <w:lvl w:ilvl="4" w:tplc="36302280">
-      <w:numFmt w:val="decimal"/>
-      <w:lvlText w:val=""/>
-      <w:lvlJc w:val="left"/>
-    </w:lvl>
-    <w:lvl w:ilvl="5" w:tplc="03589438">
-      <w:numFmt w:val="decimal"/>
-      <w:lvlText w:val=""/>
-      <w:lvlJc w:val="left"/>
-    </w:lvl>
-    <w:lvl w:ilvl="6" w:tplc="B94A0406">
-      <w:numFmt w:val="decimal"/>
-      <w:lvlText w:val=""/>
-      <w:lvlJc w:val="left"/>
-    </w:lvl>
-    <w:lvl w:ilvl="7" w:tplc="CC06BAD6">
-      <w:numFmt w:val="decimal"/>
-      <w:lvlText w:val=""/>
-      <w:lvlJc w:val="left"/>
-    </w:lvl>
-    <w:lvl w:ilvl="8" w:tplc="1298BC82">
-      <w:numFmt w:val="decimal"/>
-      <w:lvlText w:val=""/>
-      <w:lvlJc w:val="left"/>
-    </w:lvl>
-  </w:abstractNum>
-  <w:abstractNum w:abstractNumId="3" w15:restartNumberingAfterBreak="0">
-    <w:nsid w:val="56FD6D33"/>
-    <w:multiLevelType w:val="hybridMultilevel"/>
-    <w:tmpl w:val="3F1A49E8"/>
-    <w:lvl w:ilvl="0" w:tplc="B3D44D78">
+    <w:tmpl w:val="2C8664A6"/>
+    <w:lvl w:ilvl="0" w:tplc="995E33D2">
       <w:start w:val="1"/>
       <w:numFmt w:val="decimal"/>
       <w:lvlText w:val="%1."/>
@@ -30262,126 +30301,72 @@
         <w:ind w:left="540" w:hanging="360"/>
       </w:pPr>
     </w:lvl>
-    <w:lvl w:ilvl="1" w:tplc="4C28148C">
+    <w:lvl w:ilvl="1" w:tplc="55CE2322">
       <w:numFmt w:val="decimal"/>
       <w:lvlText w:val=""/>
       <w:lvlJc w:val="left"/>
     </w:lvl>
-    <w:lvl w:ilvl="2" w:tplc="9D04093A">
+    <w:lvl w:ilvl="2" w:tplc="4418C1C8">
       <w:numFmt w:val="decimal"/>
       <w:lvlText w:val=""/>
       <w:lvlJc w:val="left"/>
     </w:lvl>
-    <w:lvl w:ilvl="3" w:tplc="7632CB8E">
+    <w:lvl w:ilvl="3" w:tplc="AECC3E8C">
       <w:numFmt w:val="decimal"/>
       <w:lvlText w:val=""/>
       <w:lvlJc w:val="left"/>
     </w:lvl>
-    <w:lvl w:ilvl="4" w:tplc="813A052E">
+    <w:lvl w:ilvl="4" w:tplc="E4D41C92">
       <w:numFmt w:val="decimal"/>
       <w:lvlText w:val=""/>
       <w:lvlJc w:val="left"/>
     </w:lvl>
-    <w:lvl w:ilvl="5" w:tplc="F4E6D056">
+    <w:lvl w:ilvl="5" w:tplc="50B80262">
       <w:numFmt w:val="decimal"/>
       <w:lvlText w:val=""/>
       <w:lvlJc w:val="left"/>
     </w:lvl>
-    <w:lvl w:ilvl="6" w:tplc="0D803F04">
+    <w:lvl w:ilvl="6" w:tplc="AB44FC98">
       <w:numFmt w:val="decimal"/>
       <w:lvlText w:val=""/>
       <w:lvlJc w:val="left"/>
     </w:lvl>
-    <w:lvl w:ilvl="7" w:tplc="F3D8702C">
+    <w:lvl w:ilvl="7" w:tplc="F9E66EB4">
       <w:numFmt w:val="decimal"/>
       <w:lvlText w:val=""/>
       <w:lvlJc w:val="left"/>
     </w:lvl>
-    <w:lvl w:ilvl="8" w:tplc="D48C8C26">
+    <w:lvl w:ilvl="8" w:tplc="6D3CFF96">
       <w:numFmt w:val="decimal"/>
       <w:lvlText w:val=""/>
       <w:lvlJc w:val="left"/>
     </w:lvl>
   </w:abstractNum>
-  <w:abstractNum w:abstractNumId="4" w15:restartNumberingAfterBreak="0">
-    <w:nsid w:val="6B974B2D"/>
-    <w:multiLevelType w:val="hybridMultilevel"/>
-    <w:tmpl w:val="92C0554A"/>
-    <w:lvl w:ilvl="0" w:tplc="57EA1200">
-      <w:start w:val="1"/>
-      <w:numFmt w:val="decimal"/>
-      <w:lvlText w:val="%1."/>
-      <w:lvlJc w:val="left"/>
-      <w:pPr>
-        <w:ind w:left="540" w:hanging="360"/>
-      </w:pPr>
-    </w:lvl>
-    <w:lvl w:ilvl="1" w:tplc="C9323A4C">
-      <w:numFmt w:val="decimal"/>
-      <w:lvlText w:val=""/>
-      <w:lvlJc w:val="left"/>
-    </w:lvl>
-    <w:lvl w:ilvl="2" w:tplc="CA84E6C6">
-      <w:numFmt w:val="decimal"/>
-      <w:lvlText w:val=""/>
-      <w:lvlJc w:val="left"/>
-    </w:lvl>
-    <w:lvl w:ilvl="3" w:tplc="E1C6F4A2">
-      <w:numFmt w:val="decimal"/>
-      <w:lvlText w:val=""/>
-      <w:lvlJc w:val="left"/>
-    </w:lvl>
-    <w:lvl w:ilvl="4" w:tplc="7AD6C8AC">
-      <w:numFmt w:val="decimal"/>
-      <w:lvlText w:val=""/>
-      <w:lvlJc w:val="left"/>
-    </w:lvl>
-    <w:lvl w:ilvl="5" w:tplc="0338E0DC">
-      <w:numFmt w:val="decimal"/>
-      <w:lvlText w:val=""/>
-      <w:lvlJc w:val="left"/>
-    </w:lvl>
-    <w:lvl w:ilvl="6" w:tplc="D6202D10">
-      <w:numFmt w:val="decimal"/>
-      <w:lvlText w:val=""/>
-      <w:lvlJc w:val="left"/>
-    </w:lvl>
-    <w:lvl w:ilvl="7" w:tplc="4A44669E">
-      <w:numFmt w:val="decimal"/>
-      <w:lvlText w:val=""/>
-      <w:lvlJc w:val="left"/>
-    </w:lvl>
-    <w:lvl w:ilvl="8" w:tplc="39DE665A">
-      <w:numFmt w:val="decimal"/>
-      <w:lvlText w:val=""/>
-      <w:lvlJc w:val="left"/>
-    </w:lvl>
-  </w:abstractNum>
-  <w:num w:numId="1" w16cid:durableId="1881815123">
+  <w:num w:numId="1" w16cid:durableId="1355695866">
+    <w:abstractNumId w:val="2"/>
+    <w:lvlOverride w:ilvl="0">
+      <w:startOverride w:val="1"/>
+    </w:lvlOverride>
+  </w:num>
+  <w:num w:numId="2" w16cid:durableId="1944535349">
+    <w:abstractNumId w:val="1"/>
+    <w:lvlOverride w:ilvl="0">
+      <w:startOverride w:val="1"/>
+    </w:lvlOverride>
+  </w:num>
+  <w:num w:numId="3" w16cid:durableId="469253243">
+    <w:abstractNumId w:val="3"/>
+    <w:lvlOverride w:ilvl="0">
+      <w:startOverride w:val="1"/>
+    </w:lvlOverride>
+  </w:num>
+  <w:num w:numId="4" w16cid:durableId="693459607">
     <w:abstractNumId w:val="0"/>
     <w:lvlOverride w:ilvl="0">
       <w:startOverride w:val="1"/>
     </w:lvlOverride>
   </w:num>
-  <w:num w:numId="2" w16cid:durableId="348022729">
-    <w:abstractNumId w:val="3"/>
-    <w:lvlOverride w:ilvl="0">
-      <w:startOverride w:val="1"/>
-    </w:lvlOverride>
-  </w:num>
-  <w:num w:numId="3" w16cid:durableId="1281571116">
-    <w:abstractNumId w:val="1"/>
-    <w:lvlOverride w:ilvl="0">
-      <w:startOverride w:val="1"/>
-    </w:lvlOverride>
-  </w:num>
-  <w:num w:numId="4" w16cid:durableId="1776824144">
-    <w:abstractNumId w:val="2"/>
-    <w:lvlOverride w:ilvl="0">
-      <w:startOverride w:val="1"/>
-    </w:lvlOverride>
-  </w:num>
-  <w:num w:numId="5" w16cid:durableId="757555467">
+  <w:num w:numId="5" w16cid:durableId="1576162346">
     <w:abstractNumId w:val="4"/>
     <w:lvlOverride w:ilvl="0">
       <w:startOverride w:val="1"/>
@@ -31033,7 +31018,7 @@
     <w:autoRedefine/>
     <w:uiPriority w:val="39"/>
     <w:unhideWhenUsed/>
-    <w:rsid w:val="001B2E15"/>
+    <w:rsid w:val="009F0431"/>
     <w:pPr>
       <w:spacing w:after="100"/>
     </w:pPr>
@@ -31045,7 +31030,7 @@
     <w:autoRedefine/>
     <w:uiPriority w:val="39"/>
     <w:unhideWhenUsed/>
-    <w:rsid w:val="001B2E15"/>
+    <w:rsid w:val="009F0431"/>
     <w:pPr>
       <w:spacing w:after="100"/>
       <w:ind w:left="240"/>

</xml_diff>

<commit_message>
Report: drop the team number line and complete the review checklist
Co-Authored-By: Claude Opus 5.5 <noreply@anthropic.com>
</commit_message>
<xml_diff>
--- a/docs/Project_Report.docx
+++ b/docs/Project_Report.docx
@@ -122,10 +122,10 @@
           <w:b/>
           <w:bCs/>
         </w:rPr>
-        <w:t xml:space="preserve">Team Number: </w:t>
-      </w:r>
-      <w:r>
-        <w:t>[Team number]</w:t>
+        <w:t xml:space="preserve">Cloud Provider: </w:t>
+      </w:r>
+      <w:r>
+        <w:t>Amazon Web Services (AWS), with Neo4j AuraDB, Groq and Google Gemini as external managed services</w:t>
       </w:r>
     </w:p>
     <w:p>
@@ -138,10 +138,10 @@
           <w:b/>
           <w:bCs/>
         </w:rPr>
-        <w:t xml:space="preserve">Cloud Provider: </w:t>
-      </w:r>
-      <w:r>
-        <w:t>Amazon Web Services (AWS), with Neo4j AuraDB, Groq and Google Gemini as external managed services</w:t>
+        <w:t xml:space="preserve">Git Repository URL: </w:t>
+      </w:r>
+      <w:r>
+        <w:t>https://github.com/DeveshAg30/Cloud_Based_Knowledge_Graph_Framework_for_Automated_Research_Intelligence_Aws_Project_2026</w:t>
       </w:r>
     </w:p>
     <w:p>
@@ -154,22 +154,6 @@
           <w:b/>
           <w:bCs/>
         </w:rPr>
-        <w:t xml:space="preserve">Git Repository URL: </w:t>
-      </w:r>
-      <w:r>
-        <w:t>https://github.com/DeveshAg30/Cloud_Based_Knowledge_Graph_Framework_for_Automated_Research_Intelligence_Aws_Project_2026</w:t>
-      </w:r>
-    </w:p>
-    <w:p>
-      <w:pPr>
-        <w:spacing w:after="160"/>
-        <w:jc w:val="center"/>
-      </w:pPr>
-      <w:r>
-        <w:rPr>
-          <w:b/>
-          <w:bCs/>
-        </w:rPr>
         <w:t xml:space="preserve">Date of Submission: </w:t>
       </w:r>
       <w:r>
@@ -185,7 +169,7 @@
       <w:pPr>
         <w:pStyle w:val="Heading1"/>
       </w:pPr>
-      <w:bookmarkStart w:id="0" w:name="_Toc242981143"/>
+      <w:bookmarkStart w:id="0" w:name="_Toc242981404"/>
       <w:r>
         <w:lastRenderedPageBreak/>
         <w:t>Abstract</w:t>
@@ -214,7 +198,7 @@
       <w:pPr>
         <w:pStyle w:val="Heading2"/>
       </w:pPr>
-      <w:bookmarkStart w:id="1" w:name="_Toc242981144"/>
+      <w:bookmarkStart w:id="1" w:name="_Toc242981405"/>
       <w:r>
         <w:t>Keywords</w:t>
       </w:r>
@@ -238,7 +222,7 @@
       <w:pPr>
         <w:pStyle w:val="Heading1"/>
       </w:pPr>
-      <w:bookmarkStart w:id="2" w:name="_Toc242981145"/>
+      <w:bookmarkStart w:id="2" w:name="_Toc242981406"/>
       <w:r>
         <w:lastRenderedPageBreak/>
         <w:t>Table of Contents</w:t>
@@ -248,7 +232,7 @@
     <w:sdt>
       <w:sdtPr>
         <w:alias w:val="Table of Contents"/>
-        <w:id w:val="383686925"/>
+        <w:id w:val="1900012123"/>
       </w:sdtPr>
       <w:sdtEndPr/>
       <w:sdtContent>
@@ -271,7 +255,7 @@
           <w:r>
             <w:fldChar w:fldCharType="separate"/>
           </w:r>
-          <w:hyperlink w:anchor="_Toc242981143" w:history="1">
+          <w:hyperlink w:anchor="_Toc242981404" w:history="1">
             <w:r>
               <w:rPr>
                 <w:rStyle w:val="Hyperlink"/>
@@ -295,7 +279,7 @@
               <w:rPr>
                 <w:noProof/>
               </w:rPr>
-              <w:instrText xml:space="preserve"> PAGEREF _Toc242981143 \h </w:instrText>
+              <w:instrText xml:space="preserve"> PAGEREF _Toc242981404 \h </w:instrText>
             </w:r>
             <w:r>
               <w:rPr>
@@ -332,7 +316,7 @@
               <w:noProof/>
             </w:rPr>
           </w:pPr>
-          <w:hyperlink w:anchor="_Toc242981144" w:history="1">
+          <w:hyperlink w:anchor="_Toc242981405" w:history="1">
             <w:r>
               <w:rPr>
                 <w:rStyle w:val="Hyperlink"/>
@@ -356,7 +340,7 @@
               <w:rPr>
                 <w:noProof/>
               </w:rPr>
-              <w:instrText xml:space="preserve"> PAGEREF _Toc242981144 \h </w:instrText>
+              <w:instrText xml:space="preserve"> PAGEREF _Toc242981405 \h </w:instrText>
             </w:r>
             <w:r>
               <w:rPr>
@@ -393,7 +377,7 @@
               <w:noProof/>
             </w:rPr>
           </w:pPr>
-          <w:hyperlink w:anchor="_Toc242981145" w:history="1">
+          <w:hyperlink w:anchor="_Toc242981406" w:history="1">
             <w:r>
               <w:rPr>
                 <w:rStyle w:val="Hyperlink"/>
@@ -417,7 +401,7 @@
               <w:rPr>
                 <w:noProof/>
               </w:rPr>
-              <w:instrText xml:space="preserve"> PAGEREF _Toc242981145 \h </w:instrText>
+              <w:instrText xml:space="preserve"> PAGEREF _Toc242981406 \h </w:instrText>
             </w:r>
             <w:r>
               <w:rPr>
@@ -454,7 +438,7 @@
               <w:noProof/>
             </w:rPr>
           </w:pPr>
-          <w:hyperlink w:anchor="_Toc242981146" w:history="1">
+          <w:hyperlink w:anchor="_Toc242981407" w:history="1">
             <w:r>
               <w:rPr>
                 <w:rStyle w:val="Hyperlink"/>
@@ -478,7 +462,7 @@
               <w:rPr>
                 <w:noProof/>
               </w:rPr>
-              <w:instrText xml:space="preserve"> PAGEREF _Toc242981146 \h </w:instrText>
+              <w:instrText xml:space="preserve"> PAGEREF _Toc242981407 \h </w:instrText>
             </w:r>
             <w:r>
               <w:rPr>
@@ -515,7 +499,7 @@
               <w:noProof/>
             </w:rPr>
           </w:pPr>
-          <w:hyperlink w:anchor="_Toc242981147" w:history="1">
+          <w:hyperlink w:anchor="_Toc242981408" w:history="1">
             <w:r>
               <w:rPr>
                 <w:rStyle w:val="Hyperlink"/>
@@ -539,7 +523,7 @@
               <w:rPr>
                 <w:noProof/>
               </w:rPr>
-              <w:instrText xml:space="preserve"> PAGEREF _Toc242981147 \h </w:instrText>
+              <w:instrText xml:space="preserve"> PAGEREF _Toc242981408 \h </w:instrText>
             </w:r>
             <w:r>
               <w:rPr>
@@ -576,7 +560,7 @@
               <w:noProof/>
             </w:rPr>
           </w:pPr>
-          <w:hyperlink w:anchor="_Toc242981148" w:history="1">
+          <w:hyperlink w:anchor="_Toc242981409" w:history="1">
             <w:r>
               <w:rPr>
                 <w:rStyle w:val="Hyperlink"/>
@@ -600,7 +584,7 @@
               <w:rPr>
                 <w:noProof/>
               </w:rPr>
-              <w:instrText xml:space="preserve"> PAGEREF _Toc242981148 \h </w:instrText>
+              <w:instrText xml:space="preserve"> PAGEREF _Toc242981409 \h </w:instrText>
             </w:r>
             <w:r>
               <w:rPr>
@@ -637,7 +621,7 @@
               <w:noProof/>
             </w:rPr>
           </w:pPr>
-          <w:hyperlink w:anchor="_Toc242981149" w:history="1">
+          <w:hyperlink w:anchor="_Toc242981410" w:history="1">
             <w:r>
               <w:rPr>
                 <w:rStyle w:val="Hyperlink"/>
@@ -661,7 +645,7 @@
               <w:rPr>
                 <w:noProof/>
               </w:rPr>
-              <w:instrText xml:space="preserve"> PAGEREF _Toc242981149 \h </w:instrText>
+              <w:instrText xml:space="preserve"> PAGEREF _Toc242981410 \h </w:instrText>
             </w:r>
             <w:r>
               <w:rPr>
@@ -698,7 +682,7 @@
               <w:noProof/>
             </w:rPr>
           </w:pPr>
-          <w:hyperlink w:anchor="_Toc242981150" w:history="1">
+          <w:hyperlink w:anchor="_Toc242981411" w:history="1">
             <w:r>
               <w:rPr>
                 <w:rStyle w:val="Hyperlink"/>
@@ -722,7 +706,7 @@
               <w:rPr>
                 <w:noProof/>
               </w:rPr>
-              <w:instrText xml:space="preserve"> PAGEREF _Toc242981150 \h </w:instrText>
+              <w:instrText xml:space="preserve"> PAGEREF _Toc242981411 \h </w:instrText>
             </w:r>
             <w:r>
               <w:rPr>
@@ -759,7 +743,7 @@
               <w:noProof/>
             </w:rPr>
           </w:pPr>
-          <w:hyperlink w:anchor="_Toc242981151" w:history="1">
+          <w:hyperlink w:anchor="_Toc242981412" w:history="1">
             <w:r>
               <w:rPr>
                 <w:rStyle w:val="Hyperlink"/>
@@ -783,7 +767,7 @@
               <w:rPr>
                 <w:noProof/>
               </w:rPr>
-              <w:instrText xml:space="preserve"> PAGEREF _Toc242981151 \h </w:instrText>
+              <w:instrText xml:space="preserve"> PAGEREF _Toc242981412 \h </w:instrText>
             </w:r>
             <w:r>
               <w:rPr>
@@ -820,7 +804,7 @@
               <w:noProof/>
             </w:rPr>
           </w:pPr>
-          <w:hyperlink w:anchor="_Toc242981152" w:history="1">
+          <w:hyperlink w:anchor="_Toc242981413" w:history="1">
             <w:r>
               <w:rPr>
                 <w:rStyle w:val="Hyperlink"/>
@@ -844,7 +828,7 @@
               <w:rPr>
                 <w:noProof/>
               </w:rPr>
-              <w:instrText xml:space="preserve"> PAGEREF _Toc242981152 \h </w:instrText>
+              <w:instrText xml:space="preserve"> PAGEREF _Toc242981413 \h </w:instrText>
             </w:r>
             <w:r>
               <w:rPr>
@@ -881,7 +865,7 @@
               <w:noProof/>
             </w:rPr>
           </w:pPr>
-          <w:hyperlink w:anchor="_Toc242981153" w:history="1">
+          <w:hyperlink w:anchor="_Toc242981414" w:history="1">
             <w:r>
               <w:rPr>
                 <w:rStyle w:val="Hyperlink"/>
@@ -905,7 +889,7 @@
               <w:rPr>
                 <w:noProof/>
               </w:rPr>
-              <w:instrText xml:space="preserve"> PAGEREF _Toc242981153 \h </w:instrText>
+              <w:instrText xml:space="preserve"> PAGEREF _Toc242981414 \h </w:instrText>
             </w:r>
             <w:r>
               <w:rPr>
@@ -942,7 +926,7 @@
               <w:noProof/>
             </w:rPr>
           </w:pPr>
-          <w:hyperlink w:anchor="_Toc242981154" w:history="1">
+          <w:hyperlink w:anchor="_Toc242981415" w:history="1">
             <w:r>
               <w:rPr>
                 <w:rStyle w:val="Hyperlink"/>
@@ -966,7 +950,7 @@
               <w:rPr>
                 <w:noProof/>
               </w:rPr>
-              <w:instrText xml:space="preserve"> PAGEREF _Toc242981154 \h </w:instrText>
+              <w:instrText xml:space="preserve"> PAGEREF _Toc242981415 \h </w:instrText>
             </w:r>
             <w:r>
               <w:rPr>
@@ -1003,7 +987,7 @@
               <w:noProof/>
             </w:rPr>
           </w:pPr>
-          <w:hyperlink w:anchor="_Toc242981155" w:history="1">
+          <w:hyperlink w:anchor="_Toc242981416" w:history="1">
             <w:r>
               <w:rPr>
                 <w:rStyle w:val="Hyperlink"/>
@@ -1027,7 +1011,7 @@
               <w:rPr>
                 <w:noProof/>
               </w:rPr>
-              <w:instrText xml:space="preserve"> PAGEREF _Toc242981155 \h </w:instrText>
+              <w:instrText xml:space="preserve"> PAGEREF _Toc242981416 \h </w:instrText>
             </w:r>
             <w:r>
               <w:rPr>
@@ -1064,7 +1048,7 @@
               <w:noProof/>
             </w:rPr>
           </w:pPr>
-          <w:hyperlink w:anchor="_Toc242981156" w:history="1">
+          <w:hyperlink w:anchor="_Toc242981417" w:history="1">
             <w:r>
               <w:rPr>
                 <w:rStyle w:val="Hyperlink"/>
@@ -1088,7 +1072,7 @@
               <w:rPr>
                 <w:noProof/>
               </w:rPr>
-              <w:instrText xml:space="preserve"> PAGEREF _Toc242981156 \h </w:instrText>
+              <w:instrText xml:space="preserve"> PAGEREF _Toc242981417 \h </w:instrText>
             </w:r>
             <w:r>
               <w:rPr>
@@ -1125,7 +1109,7 @@
               <w:noProof/>
             </w:rPr>
           </w:pPr>
-          <w:hyperlink w:anchor="_Toc242981157" w:history="1">
+          <w:hyperlink w:anchor="_Toc242981418" w:history="1">
             <w:r>
               <w:rPr>
                 <w:rStyle w:val="Hyperlink"/>
@@ -1149,7 +1133,7 @@
               <w:rPr>
                 <w:noProof/>
               </w:rPr>
-              <w:instrText xml:space="preserve"> PAGEREF _Toc242981157 \h </w:instrText>
+              <w:instrText xml:space="preserve"> PAGEREF _Toc242981418 \h </w:instrText>
             </w:r>
             <w:r>
               <w:rPr>
@@ -1186,7 +1170,7 @@
               <w:noProof/>
             </w:rPr>
           </w:pPr>
-          <w:hyperlink w:anchor="_Toc242981158" w:history="1">
+          <w:hyperlink w:anchor="_Toc242981419" w:history="1">
             <w:r>
               <w:rPr>
                 <w:rStyle w:val="Hyperlink"/>
@@ -1210,7 +1194,7 @@
               <w:rPr>
                 <w:noProof/>
               </w:rPr>
-              <w:instrText xml:space="preserve"> PAGEREF _Toc242981158 \h </w:instrText>
+              <w:instrText xml:space="preserve"> PAGEREF _Toc242981419 \h </w:instrText>
             </w:r>
             <w:r>
               <w:rPr>
@@ -1247,7 +1231,7 @@
               <w:noProof/>
             </w:rPr>
           </w:pPr>
-          <w:hyperlink w:anchor="_Toc242981159" w:history="1">
+          <w:hyperlink w:anchor="_Toc242981420" w:history="1">
             <w:r>
               <w:rPr>
                 <w:rStyle w:val="Hyperlink"/>
@@ -1271,7 +1255,7 @@
               <w:rPr>
                 <w:noProof/>
               </w:rPr>
-              <w:instrText xml:space="preserve"> PAGEREF _Toc242981159 \h </w:instrText>
+              <w:instrText xml:space="preserve"> PAGEREF _Toc242981420 \h </w:instrText>
             </w:r>
             <w:r>
               <w:rPr>
@@ -1308,7 +1292,7 @@
               <w:noProof/>
             </w:rPr>
           </w:pPr>
-          <w:hyperlink w:anchor="_Toc242981160" w:history="1">
+          <w:hyperlink w:anchor="_Toc242981421" w:history="1">
             <w:r>
               <w:rPr>
                 <w:rStyle w:val="Hyperlink"/>
@@ -1332,7 +1316,7 @@
               <w:rPr>
                 <w:noProof/>
               </w:rPr>
-              <w:instrText xml:space="preserve"> PAGEREF _Toc242981160 \h </w:instrText>
+              <w:instrText xml:space="preserve"> PAGEREF _Toc242981421 \h </w:instrText>
             </w:r>
             <w:r>
               <w:rPr>
@@ -1369,7 +1353,7 @@
               <w:noProof/>
             </w:rPr>
           </w:pPr>
-          <w:hyperlink w:anchor="_Toc242981161" w:history="1">
+          <w:hyperlink w:anchor="_Toc242981422" w:history="1">
             <w:r>
               <w:rPr>
                 <w:rStyle w:val="Hyperlink"/>
@@ -1393,7 +1377,7 @@
               <w:rPr>
                 <w:noProof/>
               </w:rPr>
-              <w:instrText xml:space="preserve"> PAGEREF _Toc242981161 \h </w:instrText>
+              <w:instrText xml:space="preserve"> PAGEREF _Toc242981422 \h </w:instrText>
             </w:r>
             <w:r>
               <w:rPr>
@@ -1430,7 +1414,7 @@
               <w:noProof/>
             </w:rPr>
           </w:pPr>
-          <w:hyperlink w:anchor="_Toc242981162" w:history="1">
+          <w:hyperlink w:anchor="_Toc242981423" w:history="1">
             <w:r>
               <w:rPr>
                 <w:rStyle w:val="Hyperlink"/>
@@ -1454,7 +1438,7 @@
               <w:rPr>
                 <w:noProof/>
               </w:rPr>
-              <w:instrText xml:space="preserve"> PAGEREF _Toc242981162 \h </w:instrText>
+              <w:instrText xml:space="preserve"> PAGEREF _Toc242981423 \h </w:instrText>
             </w:r>
             <w:r>
               <w:rPr>
@@ -1491,7 +1475,7 @@
               <w:noProof/>
             </w:rPr>
           </w:pPr>
-          <w:hyperlink w:anchor="_Toc242981163" w:history="1">
+          <w:hyperlink w:anchor="_Toc242981424" w:history="1">
             <w:r>
               <w:rPr>
                 <w:rStyle w:val="Hyperlink"/>
@@ -1515,7 +1499,7 @@
               <w:rPr>
                 <w:noProof/>
               </w:rPr>
-              <w:instrText xml:space="preserve"> PAGEREF _Toc242981163 \h </w:instrText>
+              <w:instrText xml:space="preserve"> PAGEREF _Toc242981424 \h </w:instrText>
             </w:r>
             <w:r>
               <w:rPr>
@@ -1552,7 +1536,7 @@
               <w:noProof/>
             </w:rPr>
           </w:pPr>
-          <w:hyperlink w:anchor="_Toc242981164" w:history="1">
+          <w:hyperlink w:anchor="_Toc242981425" w:history="1">
             <w:r>
               <w:rPr>
                 <w:rStyle w:val="Hyperlink"/>
@@ -1576,7 +1560,7 @@
               <w:rPr>
                 <w:noProof/>
               </w:rPr>
-              <w:instrText xml:space="preserve"> PAGEREF _Toc242981164 \h </w:instrText>
+              <w:instrText xml:space="preserve"> PAGEREF _Toc242981425 \h </w:instrText>
             </w:r>
             <w:r>
               <w:rPr>
@@ -1613,7 +1597,7 @@
               <w:noProof/>
             </w:rPr>
           </w:pPr>
-          <w:hyperlink w:anchor="_Toc242981165" w:history="1">
+          <w:hyperlink w:anchor="_Toc242981426" w:history="1">
             <w:r>
               <w:rPr>
                 <w:rStyle w:val="Hyperlink"/>
@@ -1637,7 +1621,7 @@
               <w:rPr>
                 <w:noProof/>
               </w:rPr>
-              <w:instrText xml:space="preserve"> PAGEREF _Toc242981165 \h </w:instrText>
+              <w:instrText xml:space="preserve"> PAGEREF _Toc242981426 \h </w:instrText>
             </w:r>
             <w:r>
               <w:rPr>
@@ -1674,7 +1658,7 @@
               <w:noProof/>
             </w:rPr>
           </w:pPr>
-          <w:hyperlink w:anchor="_Toc242981166" w:history="1">
+          <w:hyperlink w:anchor="_Toc242981427" w:history="1">
             <w:r>
               <w:rPr>
                 <w:rStyle w:val="Hyperlink"/>
@@ -1698,7 +1682,7 @@
               <w:rPr>
                 <w:noProof/>
               </w:rPr>
-              <w:instrText xml:space="preserve"> PAGEREF _Toc242981166 \h </w:instrText>
+              <w:instrText xml:space="preserve"> PAGEREF _Toc242981427 \h </w:instrText>
             </w:r>
             <w:r>
               <w:rPr>
@@ -1735,7 +1719,7 @@
               <w:noProof/>
             </w:rPr>
           </w:pPr>
-          <w:hyperlink w:anchor="_Toc242981167" w:history="1">
+          <w:hyperlink w:anchor="_Toc242981428" w:history="1">
             <w:r>
               <w:rPr>
                 <w:rStyle w:val="Hyperlink"/>
@@ -1759,7 +1743,7 @@
               <w:rPr>
                 <w:noProof/>
               </w:rPr>
-              <w:instrText xml:space="preserve"> PAGEREF _Toc242981167 \h </w:instrText>
+              <w:instrText xml:space="preserve"> PAGEREF _Toc242981428 \h </w:instrText>
             </w:r>
             <w:r>
               <w:rPr>
@@ -1796,7 +1780,7 @@
               <w:noProof/>
             </w:rPr>
           </w:pPr>
-          <w:hyperlink w:anchor="_Toc242981168" w:history="1">
+          <w:hyperlink w:anchor="_Toc242981429" w:history="1">
             <w:r>
               <w:rPr>
                 <w:rStyle w:val="Hyperlink"/>
@@ -1820,7 +1804,7 @@
               <w:rPr>
                 <w:noProof/>
               </w:rPr>
-              <w:instrText xml:space="preserve"> PAGEREF _Toc242981168 \h </w:instrText>
+              <w:instrText xml:space="preserve"> PAGEREF _Toc242981429 \h </w:instrText>
             </w:r>
             <w:r>
               <w:rPr>
@@ -1857,7 +1841,7 @@
               <w:noProof/>
             </w:rPr>
           </w:pPr>
-          <w:hyperlink w:anchor="_Toc242981169" w:history="1">
+          <w:hyperlink w:anchor="_Toc242981430" w:history="1">
             <w:r>
               <w:rPr>
                 <w:rStyle w:val="Hyperlink"/>
@@ -1881,7 +1865,7 @@
               <w:rPr>
                 <w:noProof/>
               </w:rPr>
-              <w:instrText xml:space="preserve"> PAGEREF _Toc242981169 \h </w:instrText>
+              <w:instrText xml:space="preserve"> PAGEREF _Toc242981430 \h </w:instrText>
             </w:r>
             <w:r>
               <w:rPr>
@@ -1918,7 +1902,7 @@
               <w:noProof/>
             </w:rPr>
           </w:pPr>
-          <w:hyperlink w:anchor="_Toc242981170" w:history="1">
+          <w:hyperlink w:anchor="_Toc242981431" w:history="1">
             <w:r>
               <w:rPr>
                 <w:rStyle w:val="Hyperlink"/>
@@ -1942,7 +1926,7 @@
               <w:rPr>
                 <w:noProof/>
               </w:rPr>
-              <w:instrText xml:space="preserve"> PAGEREF _Toc242981170 \h </w:instrText>
+              <w:instrText xml:space="preserve"> PAGEREF _Toc242981431 \h </w:instrText>
             </w:r>
             <w:r>
               <w:rPr>
@@ -1979,7 +1963,7 @@
               <w:noProof/>
             </w:rPr>
           </w:pPr>
-          <w:hyperlink w:anchor="_Toc242981171" w:history="1">
+          <w:hyperlink w:anchor="_Toc242981432" w:history="1">
             <w:r>
               <w:rPr>
                 <w:rStyle w:val="Hyperlink"/>
@@ -2003,7 +1987,7 @@
               <w:rPr>
                 <w:noProof/>
               </w:rPr>
-              <w:instrText xml:space="preserve"> PAGEREF _Toc242981171 \h </w:instrText>
+              <w:instrText xml:space="preserve"> PAGEREF _Toc242981432 \h </w:instrText>
             </w:r>
             <w:r>
               <w:rPr>
@@ -2040,7 +2024,7 @@
               <w:noProof/>
             </w:rPr>
           </w:pPr>
-          <w:hyperlink w:anchor="_Toc242981172" w:history="1">
+          <w:hyperlink w:anchor="_Toc242981433" w:history="1">
             <w:r>
               <w:rPr>
                 <w:rStyle w:val="Hyperlink"/>
@@ -2064,7 +2048,7 @@
               <w:rPr>
                 <w:noProof/>
               </w:rPr>
-              <w:instrText xml:space="preserve"> PAGEREF _Toc242981172 \h </w:instrText>
+              <w:instrText xml:space="preserve"> PAGEREF _Toc242981433 \h </w:instrText>
             </w:r>
             <w:r>
               <w:rPr>
@@ -2101,7 +2085,7 @@
               <w:noProof/>
             </w:rPr>
           </w:pPr>
-          <w:hyperlink w:anchor="_Toc242981173" w:history="1">
+          <w:hyperlink w:anchor="_Toc242981434" w:history="1">
             <w:r>
               <w:rPr>
                 <w:rStyle w:val="Hyperlink"/>
@@ -2125,7 +2109,7 @@
               <w:rPr>
                 <w:noProof/>
               </w:rPr>
-              <w:instrText xml:space="preserve"> PAGEREF _Toc242981173 \h </w:instrText>
+              <w:instrText xml:space="preserve"> PAGEREF _Toc242981434 \h </w:instrText>
             </w:r>
             <w:r>
               <w:rPr>
@@ -2162,7 +2146,7 @@
               <w:noProof/>
             </w:rPr>
           </w:pPr>
-          <w:hyperlink w:anchor="_Toc242981174" w:history="1">
+          <w:hyperlink w:anchor="_Toc242981435" w:history="1">
             <w:r>
               <w:rPr>
                 <w:rStyle w:val="Hyperlink"/>
@@ -2186,7 +2170,7 @@
               <w:rPr>
                 <w:noProof/>
               </w:rPr>
-              <w:instrText xml:space="preserve"> PAGEREF _Toc242981174 \h </w:instrText>
+              <w:instrText xml:space="preserve"> PAGEREF _Toc242981435 \h </w:instrText>
             </w:r>
             <w:r>
               <w:rPr>
@@ -2223,7 +2207,7 @@
               <w:noProof/>
             </w:rPr>
           </w:pPr>
-          <w:hyperlink w:anchor="_Toc242981175" w:history="1">
+          <w:hyperlink w:anchor="_Toc242981436" w:history="1">
             <w:r>
               <w:rPr>
                 <w:rStyle w:val="Hyperlink"/>
@@ -2247,7 +2231,7 @@
               <w:rPr>
                 <w:noProof/>
               </w:rPr>
-              <w:instrText xml:space="preserve"> PAGEREF _Toc242981175 \h </w:instrText>
+              <w:instrText xml:space="preserve"> PAGEREF _Toc242981436 \h </w:instrText>
             </w:r>
             <w:r>
               <w:rPr>
@@ -2284,7 +2268,7 @@
               <w:noProof/>
             </w:rPr>
           </w:pPr>
-          <w:hyperlink w:anchor="_Toc242981176" w:history="1">
+          <w:hyperlink w:anchor="_Toc242981437" w:history="1">
             <w:r>
               <w:rPr>
                 <w:rStyle w:val="Hyperlink"/>
@@ -2308,7 +2292,7 @@
               <w:rPr>
                 <w:noProof/>
               </w:rPr>
-              <w:instrText xml:space="preserve"> PAGEREF _Toc242981176 \h </w:instrText>
+              <w:instrText xml:space="preserve"> PAGEREF _Toc242981437 \h </w:instrText>
             </w:r>
             <w:r>
               <w:rPr>
@@ -2345,7 +2329,7 @@
               <w:noProof/>
             </w:rPr>
           </w:pPr>
-          <w:hyperlink w:anchor="_Toc242981177" w:history="1">
+          <w:hyperlink w:anchor="_Toc242981438" w:history="1">
             <w:r>
               <w:rPr>
                 <w:rStyle w:val="Hyperlink"/>
@@ -2369,7 +2353,7 @@
               <w:rPr>
                 <w:noProof/>
               </w:rPr>
-              <w:instrText xml:space="preserve"> PAGEREF _Toc242981177 \h </w:instrText>
+              <w:instrText xml:space="preserve"> PAGEREF _Toc242981438 \h </w:instrText>
             </w:r>
             <w:r>
               <w:rPr>
@@ -2406,7 +2390,7 @@
               <w:noProof/>
             </w:rPr>
           </w:pPr>
-          <w:hyperlink w:anchor="_Toc242981178" w:history="1">
+          <w:hyperlink w:anchor="_Toc242981439" w:history="1">
             <w:r>
               <w:rPr>
                 <w:rStyle w:val="Hyperlink"/>
@@ -2430,7 +2414,7 @@
               <w:rPr>
                 <w:noProof/>
               </w:rPr>
-              <w:instrText xml:space="preserve"> PAGEREF _Toc242981178 \h </w:instrText>
+              <w:instrText xml:space="preserve"> PAGEREF _Toc242981439 \h </w:instrText>
             </w:r>
             <w:r>
               <w:rPr>
@@ -2467,7 +2451,7 @@
               <w:noProof/>
             </w:rPr>
           </w:pPr>
-          <w:hyperlink w:anchor="_Toc242981179" w:history="1">
+          <w:hyperlink w:anchor="_Toc242981440" w:history="1">
             <w:r>
               <w:rPr>
                 <w:rStyle w:val="Hyperlink"/>
@@ -2491,7 +2475,7 @@
               <w:rPr>
                 <w:noProof/>
               </w:rPr>
-              <w:instrText xml:space="preserve"> PAGEREF _Toc242981179 \h </w:instrText>
+              <w:instrText xml:space="preserve"> PAGEREF _Toc242981440 \h </w:instrText>
             </w:r>
             <w:r>
               <w:rPr>
@@ -2528,7 +2512,7 @@
               <w:noProof/>
             </w:rPr>
           </w:pPr>
-          <w:hyperlink w:anchor="_Toc242981180" w:history="1">
+          <w:hyperlink w:anchor="_Toc242981441" w:history="1">
             <w:r>
               <w:rPr>
                 <w:rStyle w:val="Hyperlink"/>
@@ -2552,7 +2536,7 @@
               <w:rPr>
                 <w:noProof/>
               </w:rPr>
-              <w:instrText xml:space="preserve"> PAGEREF _Toc242981180 \h </w:instrText>
+              <w:instrText xml:space="preserve"> PAGEREF _Toc242981441 \h </w:instrText>
             </w:r>
             <w:r>
               <w:rPr>
@@ -2589,7 +2573,7 @@
               <w:noProof/>
             </w:rPr>
           </w:pPr>
-          <w:hyperlink w:anchor="_Toc242981181" w:history="1">
+          <w:hyperlink w:anchor="_Toc242981442" w:history="1">
             <w:r>
               <w:rPr>
                 <w:rStyle w:val="Hyperlink"/>
@@ -2613,7 +2597,7 @@
               <w:rPr>
                 <w:noProof/>
               </w:rPr>
-              <w:instrText xml:space="preserve"> PAGEREF _Toc242981181 \h </w:instrText>
+              <w:instrText xml:space="preserve"> PAGEREF _Toc242981442 \h </w:instrText>
             </w:r>
             <w:r>
               <w:rPr>
@@ -2650,7 +2634,7 @@
               <w:noProof/>
             </w:rPr>
           </w:pPr>
-          <w:hyperlink w:anchor="_Toc242981182" w:history="1">
+          <w:hyperlink w:anchor="_Toc242981443" w:history="1">
             <w:r>
               <w:rPr>
                 <w:rStyle w:val="Hyperlink"/>
@@ -2674,7 +2658,7 @@
               <w:rPr>
                 <w:noProof/>
               </w:rPr>
-              <w:instrText xml:space="preserve"> PAGEREF _Toc242981182 \h </w:instrText>
+              <w:instrText xml:space="preserve"> PAGEREF _Toc242981443 \h </w:instrText>
             </w:r>
             <w:r>
               <w:rPr>
@@ -2711,7 +2695,7 @@
               <w:noProof/>
             </w:rPr>
           </w:pPr>
-          <w:hyperlink w:anchor="_Toc242981183" w:history="1">
+          <w:hyperlink w:anchor="_Toc242981444" w:history="1">
             <w:r>
               <w:rPr>
                 <w:rStyle w:val="Hyperlink"/>
@@ -2735,7 +2719,7 @@
               <w:rPr>
                 <w:noProof/>
               </w:rPr>
-              <w:instrText xml:space="preserve"> PAGEREF _Toc242981183 \h </w:instrText>
+              <w:instrText xml:space="preserve"> PAGEREF _Toc242981444 \h </w:instrText>
             </w:r>
             <w:r>
               <w:rPr>
@@ -2772,7 +2756,7 @@
               <w:noProof/>
             </w:rPr>
           </w:pPr>
-          <w:hyperlink w:anchor="_Toc242981184" w:history="1">
+          <w:hyperlink w:anchor="_Toc242981445" w:history="1">
             <w:r>
               <w:rPr>
                 <w:rStyle w:val="Hyperlink"/>
@@ -2796,7 +2780,7 @@
               <w:rPr>
                 <w:noProof/>
               </w:rPr>
-              <w:instrText xml:space="preserve"> PAGEREF _Toc242981184 \h </w:instrText>
+              <w:instrText xml:space="preserve"> PAGEREF _Toc242981445 \h </w:instrText>
             </w:r>
             <w:r>
               <w:rPr>
@@ -2833,7 +2817,7 @@
               <w:noProof/>
             </w:rPr>
           </w:pPr>
-          <w:hyperlink w:anchor="_Toc242981185" w:history="1">
+          <w:hyperlink w:anchor="_Toc242981446" w:history="1">
             <w:r>
               <w:rPr>
                 <w:rStyle w:val="Hyperlink"/>
@@ -2857,7 +2841,7 @@
               <w:rPr>
                 <w:noProof/>
               </w:rPr>
-              <w:instrText xml:space="preserve"> PAGEREF _Toc242981185 \h </w:instrText>
+              <w:instrText xml:space="preserve"> PAGEREF _Toc242981446 \h </w:instrText>
             </w:r>
             <w:r>
               <w:rPr>
@@ -2894,7 +2878,7 @@
               <w:noProof/>
             </w:rPr>
           </w:pPr>
-          <w:hyperlink w:anchor="_Toc242981186" w:history="1">
+          <w:hyperlink w:anchor="_Toc242981447" w:history="1">
             <w:r>
               <w:rPr>
                 <w:rStyle w:val="Hyperlink"/>
@@ -2918,7 +2902,7 @@
               <w:rPr>
                 <w:noProof/>
               </w:rPr>
-              <w:instrText xml:space="preserve"> PAGEREF _Toc242981186 \h </w:instrText>
+              <w:instrText xml:space="preserve"> PAGEREF _Toc242981447 \h </w:instrText>
             </w:r>
             <w:r>
               <w:rPr>
@@ -2955,7 +2939,7 @@
               <w:noProof/>
             </w:rPr>
           </w:pPr>
-          <w:hyperlink w:anchor="_Toc242981187" w:history="1">
+          <w:hyperlink w:anchor="_Toc242981448" w:history="1">
             <w:r>
               <w:rPr>
                 <w:rStyle w:val="Hyperlink"/>
@@ -2979,7 +2963,7 @@
               <w:rPr>
                 <w:noProof/>
               </w:rPr>
-              <w:instrText xml:space="preserve"> PAGEREF _Toc242981187 \h </w:instrText>
+              <w:instrText xml:space="preserve"> PAGEREF _Toc242981448 \h </w:instrText>
             </w:r>
             <w:r>
               <w:rPr>
@@ -3016,7 +3000,7 @@
               <w:noProof/>
             </w:rPr>
           </w:pPr>
-          <w:hyperlink w:anchor="_Toc242981188" w:history="1">
+          <w:hyperlink w:anchor="_Toc242981449" w:history="1">
             <w:r>
               <w:rPr>
                 <w:rStyle w:val="Hyperlink"/>
@@ -3040,7 +3024,7 @@
               <w:rPr>
                 <w:noProof/>
               </w:rPr>
-              <w:instrText xml:space="preserve"> PAGEREF _Toc242981188 \h </w:instrText>
+              <w:instrText xml:space="preserve"> PAGEREF _Toc242981449 \h </w:instrText>
             </w:r>
             <w:r>
               <w:rPr>
@@ -3077,7 +3061,7 @@
               <w:noProof/>
             </w:rPr>
           </w:pPr>
-          <w:hyperlink w:anchor="_Toc242981189" w:history="1">
+          <w:hyperlink w:anchor="_Toc242981450" w:history="1">
             <w:r>
               <w:rPr>
                 <w:rStyle w:val="Hyperlink"/>
@@ -3101,7 +3085,7 @@
               <w:rPr>
                 <w:noProof/>
               </w:rPr>
-              <w:instrText xml:space="preserve"> PAGEREF _Toc242981189 \h </w:instrText>
+              <w:instrText xml:space="preserve"> PAGEREF _Toc242981450 \h </w:instrText>
             </w:r>
             <w:r>
               <w:rPr>
@@ -3138,7 +3122,7 @@
               <w:noProof/>
             </w:rPr>
           </w:pPr>
-          <w:hyperlink w:anchor="_Toc242981190" w:history="1">
+          <w:hyperlink w:anchor="_Toc242981451" w:history="1">
             <w:r>
               <w:rPr>
                 <w:rStyle w:val="Hyperlink"/>
@@ -3162,7 +3146,7 @@
               <w:rPr>
                 <w:noProof/>
               </w:rPr>
-              <w:instrText xml:space="preserve"> PAGEREF _Toc242981190 \h </w:instrText>
+              <w:instrText xml:space="preserve"> PAGEREF _Toc242981451 \h </w:instrText>
             </w:r>
             <w:r>
               <w:rPr>
@@ -3199,7 +3183,7 @@
               <w:noProof/>
             </w:rPr>
           </w:pPr>
-          <w:hyperlink w:anchor="_Toc242981191" w:history="1">
+          <w:hyperlink w:anchor="_Toc242981452" w:history="1">
             <w:r>
               <w:rPr>
                 <w:rStyle w:val="Hyperlink"/>
@@ -3223,7 +3207,7 @@
               <w:rPr>
                 <w:noProof/>
               </w:rPr>
-              <w:instrText xml:space="preserve"> PAGEREF _Toc242981191 \h </w:instrText>
+              <w:instrText xml:space="preserve"> PAGEREF _Toc242981452 \h </w:instrText>
             </w:r>
             <w:r>
               <w:rPr>
@@ -3260,7 +3244,7 @@
               <w:noProof/>
             </w:rPr>
           </w:pPr>
-          <w:hyperlink w:anchor="_Toc242981192" w:history="1">
+          <w:hyperlink w:anchor="_Toc242981453" w:history="1">
             <w:r>
               <w:rPr>
                 <w:rStyle w:val="Hyperlink"/>
@@ -3284,7 +3268,7 @@
               <w:rPr>
                 <w:noProof/>
               </w:rPr>
-              <w:instrText xml:space="preserve"> PAGEREF _Toc242981192 \h </w:instrText>
+              <w:instrText xml:space="preserve"> PAGEREF _Toc242981453 \h </w:instrText>
             </w:r>
             <w:r>
               <w:rPr>
@@ -3321,7 +3305,7 @@
               <w:noProof/>
             </w:rPr>
           </w:pPr>
-          <w:hyperlink w:anchor="_Toc242981193" w:history="1">
+          <w:hyperlink w:anchor="_Toc242981454" w:history="1">
             <w:r>
               <w:rPr>
                 <w:rStyle w:val="Hyperlink"/>
@@ -3345,7 +3329,7 @@
               <w:rPr>
                 <w:noProof/>
               </w:rPr>
-              <w:instrText xml:space="preserve"> PAGEREF _Toc242981193 \h </w:instrText>
+              <w:instrText xml:space="preserve"> PAGEREF _Toc242981454 \h </w:instrText>
             </w:r>
             <w:r>
               <w:rPr>
@@ -3382,7 +3366,7 @@
               <w:noProof/>
             </w:rPr>
           </w:pPr>
-          <w:hyperlink w:anchor="_Toc242981194" w:history="1">
+          <w:hyperlink w:anchor="_Toc242981455" w:history="1">
             <w:r>
               <w:rPr>
                 <w:rStyle w:val="Hyperlink"/>
@@ -3406,7 +3390,7 @@
               <w:rPr>
                 <w:noProof/>
               </w:rPr>
-              <w:instrText xml:space="preserve"> PAGEREF _Toc242981194 \h </w:instrText>
+              <w:instrText xml:space="preserve"> PAGEREF _Toc242981455 \h </w:instrText>
             </w:r>
             <w:r>
               <w:rPr>
@@ -3443,7 +3427,7 @@
               <w:noProof/>
             </w:rPr>
           </w:pPr>
-          <w:hyperlink w:anchor="_Toc242981195" w:history="1">
+          <w:hyperlink w:anchor="_Toc242981456" w:history="1">
             <w:r>
               <w:rPr>
                 <w:rStyle w:val="Hyperlink"/>
@@ -3467,7 +3451,7 @@
               <w:rPr>
                 <w:noProof/>
               </w:rPr>
-              <w:instrText xml:space="preserve"> PAGEREF _Toc242981195 \h </w:instrText>
+              <w:instrText xml:space="preserve"> PAGEREF _Toc242981456 \h </w:instrText>
             </w:r>
             <w:r>
               <w:rPr>
@@ -3504,7 +3488,7 @@
               <w:noProof/>
             </w:rPr>
           </w:pPr>
-          <w:hyperlink w:anchor="_Toc242981196" w:history="1">
+          <w:hyperlink w:anchor="_Toc242981457" w:history="1">
             <w:r>
               <w:rPr>
                 <w:rStyle w:val="Hyperlink"/>
@@ -3528,7 +3512,7 @@
               <w:rPr>
                 <w:noProof/>
               </w:rPr>
-              <w:instrText xml:space="preserve"> PAGEREF _Toc242981196 \h </w:instrText>
+              <w:instrText xml:space="preserve"> PAGEREF _Toc242981457 \h </w:instrText>
             </w:r>
             <w:r>
               <w:rPr>
@@ -3565,7 +3549,7 @@
               <w:noProof/>
             </w:rPr>
           </w:pPr>
-          <w:hyperlink w:anchor="_Toc242981197" w:history="1">
+          <w:hyperlink w:anchor="_Toc242981458" w:history="1">
             <w:r>
               <w:rPr>
                 <w:rStyle w:val="Hyperlink"/>
@@ -3589,7 +3573,7 @@
               <w:rPr>
                 <w:noProof/>
               </w:rPr>
-              <w:instrText xml:space="preserve"> PAGEREF _Toc242981197 \h </w:instrText>
+              <w:instrText xml:space="preserve"> PAGEREF _Toc242981458 \h </w:instrText>
             </w:r>
             <w:r>
               <w:rPr>
@@ -3632,7 +3616,7 @@
       <w:pPr>
         <w:pStyle w:val="Heading1"/>
       </w:pPr>
-      <w:bookmarkStart w:id="3" w:name="_Toc242981146"/>
+      <w:bookmarkStart w:id="3" w:name="_Toc242981407"/>
       <w:r>
         <w:lastRenderedPageBreak/>
         <w:t>1. Introduction</w:t>
@@ -3643,7 +3627,7 @@
       <w:pPr>
         <w:pStyle w:val="Heading2"/>
       </w:pPr>
-      <w:bookmarkStart w:id="4" w:name="_Toc242981147"/>
+      <w:bookmarkStart w:id="4" w:name="_Toc242981408"/>
       <w:r>
         <w:t>1.1 Background</w:t>
       </w:r>
@@ -3674,7 +3658,7 @@
       <w:pPr>
         <w:pStyle w:val="Heading2"/>
       </w:pPr>
-      <w:bookmarkStart w:id="5" w:name="_Toc242981148"/>
+      <w:bookmarkStart w:id="5" w:name="_Toc242981409"/>
       <w:r>
         <w:t>1.2 Problem Statement</w:t>
       </w:r>
@@ -3700,7 +3684,7 @@
       <w:pPr>
         <w:pStyle w:val="Heading2"/>
       </w:pPr>
-      <w:bookmarkStart w:id="6" w:name="_Toc242981149"/>
+      <w:bookmarkStart w:id="6" w:name="_Toc242981410"/>
       <w:r>
         <w:t>1.3 Motivation and Significance</w:t>
       </w:r>
@@ -3719,7 +3703,7 @@
       <w:pPr>
         <w:pStyle w:val="Heading2"/>
       </w:pPr>
-      <w:bookmarkStart w:id="7" w:name="_Toc242981150"/>
+      <w:bookmarkStart w:id="7" w:name="_Toc242981411"/>
       <w:r>
         <w:lastRenderedPageBreak/>
         <w:t>1.4 Scope</w:t>
@@ -3762,7 +3746,7 @@
       <w:pPr>
         <w:pStyle w:val="Heading2"/>
       </w:pPr>
-      <w:bookmarkStart w:id="8" w:name="_Toc242981151"/>
+      <w:bookmarkStart w:id="8" w:name="_Toc242981412"/>
       <w:r>
         <w:t>1.5 Report Organisation</w:t>
       </w:r>
@@ -3781,7 +3765,7 @@
       <w:pPr>
         <w:pStyle w:val="Heading1"/>
       </w:pPr>
-      <w:bookmarkStart w:id="9" w:name="_Toc242981152"/>
+      <w:bookmarkStart w:id="9" w:name="_Toc242981413"/>
       <w:r>
         <w:t>2. Literature Survey / Related Work</w:t>
       </w:r>
@@ -6755,7 +6739,7 @@
       <w:pPr>
         <w:pStyle w:val="Heading2"/>
       </w:pPr>
-      <w:bookmarkStart w:id="10" w:name="_Toc242981153"/>
+      <w:bookmarkStart w:id="10" w:name="_Toc242981414"/>
       <w:r>
         <w:t>2.1 Comparative Synthesis</w:t>
       </w:r>
@@ -6829,7 +6813,7 @@
       <w:pPr>
         <w:pStyle w:val="Heading2"/>
       </w:pPr>
-      <w:bookmarkStart w:id="11" w:name="_Toc242981154"/>
+      <w:bookmarkStart w:id="11" w:name="_Toc242981415"/>
       <w:r>
         <w:t>2.2 Individual Research Gap Analysis</w:t>
       </w:r>
@@ -10244,7 +10228,7 @@
       <w:pPr>
         <w:pStyle w:val="Heading2"/>
       </w:pPr>
-      <w:bookmarkStart w:id="12" w:name="_Toc242981155"/>
+      <w:bookmarkStart w:id="12" w:name="_Toc242981416"/>
       <w:r>
         <w:t>2.3 Consolidated Research Gap</w:t>
       </w:r>
@@ -10266,7 +10250,7 @@
       <w:pPr>
         <w:pStyle w:val="Heading1"/>
       </w:pPr>
-      <w:bookmarkStart w:id="13" w:name="_Toc242981156"/>
+      <w:bookmarkStart w:id="13" w:name="_Toc242981417"/>
       <w:r>
         <w:t>3. Project Objectives</w:t>
       </w:r>
@@ -10457,7 +10441,7 @@
       <w:pPr>
         <w:pStyle w:val="Heading2"/>
       </w:pPr>
-      <w:bookmarkStart w:id="14" w:name="_Toc242981157"/>
+      <w:bookmarkStart w:id="14" w:name="_Toc242981418"/>
       <w:r>
         <w:t>3.1 Expected Outcomes</w:t>
       </w:r>
@@ -10479,7 +10463,7 @@
       <w:pPr>
         <w:pStyle w:val="Heading1"/>
       </w:pPr>
-      <w:bookmarkStart w:id="15" w:name="_Toc242981158"/>
+      <w:bookmarkStart w:id="15" w:name="_Toc242981419"/>
       <w:r>
         <w:t>4. Novelty Summary</w:t>
       </w:r>
@@ -11176,7 +11160,7 @@
       <w:pPr>
         <w:pStyle w:val="Heading1"/>
       </w:pPr>
-      <w:bookmarkStart w:id="16" w:name="_Toc242981159"/>
+      <w:bookmarkStart w:id="16" w:name="_Toc242981420"/>
       <w:r>
         <w:t>5. Proposed System and Architecture</w:t>
       </w:r>
@@ -11186,7 +11170,7 @@
       <w:pPr>
         <w:pStyle w:val="Heading2"/>
       </w:pPr>
-      <w:bookmarkStart w:id="17" w:name="_Toc242981160"/>
+      <w:bookmarkStart w:id="17" w:name="_Toc242981421"/>
       <w:r>
         <w:t>5.1 System Overview</w:t>
       </w:r>
@@ -11242,7 +11226,7 @@
       <w:pPr>
         <w:pStyle w:val="Heading2"/>
       </w:pPr>
-      <w:bookmarkStart w:id="18" w:name="_Toc242981161"/>
+      <w:bookmarkStart w:id="18" w:name="_Toc242981422"/>
       <w:r>
         <w:lastRenderedPageBreak/>
         <w:t>5.2 Diagram 1 - Cloud Deployment Architecture</w:t>
@@ -11260,7 +11244,7 @@
           <w:noProof/>
         </w:rPr>
         <w:drawing>
-          <wp:inline distT="0" distB="0" distL="0" distR="0" wp14:anchorId="13019436" wp14:editId="3E9F8C3F">
+          <wp:inline distT="0" distB="0" distL="0" distR="0" wp14:anchorId="3FD71007" wp14:editId="388EB5C9">
             <wp:extent cx="5734050" cy="4019550"/>
             <wp:effectExtent l="0" t="0" r="0" b="0"/>
             <wp:docPr id="1" name="fig1_cloud_architecture.png" descr="Cloud Deployment Architecture (as deployed in AWS us-east-1)." title="Cloud Deployment Architecture (as deployed in AWS us-east-1)."/>
@@ -11513,7 +11497,7 @@
       <w:pPr>
         <w:pStyle w:val="Heading2"/>
       </w:pPr>
-      <w:bookmarkStart w:id="19" w:name="_Toc242981162"/>
+      <w:bookmarkStart w:id="19" w:name="_Toc242981423"/>
       <w:r>
         <w:lastRenderedPageBreak/>
         <w:t>5.3 Diagram 2 - Complete System Architecture / Workflow</w:t>
@@ -11531,7 +11515,7 @@
           <w:noProof/>
         </w:rPr>
         <w:drawing>
-          <wp:inline distT="0" distB="0" distL="0" distR="0" wp14:anchorId="09D4224F" wp14:editId="2A34E6E0">
+          <wp:inline distT="0" distB="0" distL="0" distR="0" wp14:anchorId="55E0A04F" wp14:editId="2572CAB2">
             <wp:extent cx="5734050" cy="3629025"/>
             <wp:effectExtent l="0" t="0" r="0" b="0"/>
             <wp:docPr id="2" name="fig2_system_workflow.png" descr="Complete System Architecture and Workflow (ingestion path A and query path B)." title="Complete System Architecture and Workflow (ingestion path A and query path B)."/>
@@ -11617,7 +11601,7 @@
       <w:pPr>
         <w:pStyle w:val="Heading2"/>
       </w:pPr>
-      <w:bookmarkStart w:id="20" w:name="_Toc242981163"/>
+      <w:bookmarkStart w:id="20" w:name="_Toc242981424"/>
       <w:r>
         <w:t>5.4 Workflow and Use Cases</w:t>
       </w:r>
@@ -11738,7 +11722,7 @@
       <w:pPr>
         <w:pStyle w:val="Heading2"/>
       </w:pPr>
-      <w:bookmarkStart w:id="21" w:name="_Toc242981164"/>
+      <w:bookmarkStart w:id="21" w:name="_Toc242981425"/>
       <w:r>
         <w:t>5.5 Security, Availability and Scalability</w:t>
       </w:r>
@@ -11889,7 +11873,7 @@
       <w:pPr>
         <w:pStyle w:val="Heading1"/>
       </w:pPr>
-      <w:bookmarkStart w:id="22" w:name="_Toc242981165"/>
+      <w:bookmarkStart w:id="22" w:name="_Toc242981426"/>
       <w:r>
         <w:t>6. Dataset / Input Data Description</w:t>
       </w:r>
@@ -14315,7 +14299,7 @@
       <w:pPr>
         <w:pStyle w:val="Heading2"/>
       </w:pPr>
-      <w:bookmarkStart w:id="23" w:name="_Toc242981166"/>
+      <w:bookmarkStart w:id="23" w:name="_Toc242981427"/>
       <w:r>
         <w:t>6.1 Data Preparation</w:t>
       </w:r>
@@ -14381,7 +14365,7 @@
       <w:pPr>
         <w:pStyle w:val="Heading1"/>
       </w:pPr>
-      <w:bookmarkStart w:id="24" w:name="_Toc242981167"/>
+      <w:bookmarkStart w:id="24" w:name="_Toc242981428"/>
       <w:r>
         <w:lastRenderedPageBreak/>
         <w:t>7. Cloud Platform and Services Planning</w:t>
@@ -16729,7 +16713,7 @@
       <w:pPr>
         <w:pStyle w:val="Heading2"/>
       </w:pPr>
-      <w:bookmarkStart w:id="25" w:name="_Toc242981168"/>
+      <w:bookmarkStart w:id="25" w:name="_Toc242981429"/>
       <w:r>
         <w:t>7.1 Deployment and Network Design</w:t>
       </w:r>
@@ -16752,7 +16736,7 @@
       <w:pPr>
         <w:pStyle w:val="Heading2"/>
       </w:pPr>
-      <w:bookmarkStart w:id="26" w:name="_Toc242981169"/>
+      <w:bookmarkStart w:id="26" w:name="_Toc242981430"/>
       <w:r>
         <w:t>7.2 Cost Estimation</w:t>
       </w:r>
@@ -17405,7 +17389,7 @@
       <w:pPr>
         <w:pStyle w:val="Heading2"/>
       </w:pPr>
-      <w:bookmarkStart w:id="27" w:name="_Toc242981170"/>
+      <w:bookmarkStart w:id="27" w:name="_Toc242981431"/>
       <w:r>
         <w:t>7.3 Portability / Provider-Specific Choices</w:t>
       </w:r>
@@ -17428,7 +17412,7 @@
       <w:pPr>
         <w:pStyle w:val="Heading1"/>
       </w:pPr>
-      <w:bookmarkStart w:id="28" w:name="_Toc242981171"/>
+      <w:bookmarkStart w:id="28" w:name="_Toc242981432"/>
       <w:r>
         <w:t>8. Methodology and Implementation Plan</w:t>
       </w:r>
@@ -17438,7 +17422,7 @@
       <w:pPr>
         <w:pStyle w:val="Heading2"/>
       </w:pPr>
-      <w:bookmarkStart w:id="29" w:name="_Toc242981172"/>
+      <w:bookmarkStart w:id="29" w:name="_Toc242981433"/>
       <w:r>
         <w:t>8.1 Overall Methodology</w:t>
       </w:r>
@@ -17460,7 +17444,7 @@
       <w:pPr>
         <w:pStyle w:val="Heading2"/>
       </w:pPr>
-      <w:bookmarkStart w:id="30" w:name="_Toc242981173"/>
+      <w:bookmarkStart w:id="30" w:name="_Toc242981434"/>
       <w:r>
         <w:t>8.2 Tools and Technologies</w:t>
       </w:r>
@@ -18256,7 +18240,7 @@
       <w:pPr>
         <w:pStyle w:val="Heading2"/>
       </w:pPr>
-      <w:bookmarkStart w:id="31" w:name="_Toc242981174"/>
+      <w:bookmarkStart w:id="31" w:name="_Toc242981435"/>
       <w:r>
         <w:t>8.3 Step-by-Step Implementation Plan</w:t>
       </w:r>
@@ -18407,7 +18391,7 @@
       <w:pPr>
         <w:pStyle w:val="Heading2"/>
       </w:pPr>
-      <w:bookmarkStart w:id="32" w:name="_Toc242981175"/>
+      <w:bookmarkStart w:id="32" w:name="_Toc242981436"/>
       <w:r>
         <w:t>8.4 Evaluation Metrics</w:t>
       </w:r>
@@ -18517,7 +18501,7 @@
       <w:pPr>
         <w:pStyle w:val="Heading1"/>
       </w:pPr>
-      <w:bookmarkStart w:id="33" w:name="_Toc242981176"/>
+      <w:bookmarkStart w:id="33" w:name="_Toc242981437"/>
       <w:r>
         <w:t>9. Implementation / Development</w:t>
       </w:r>
@@ -18536,7 +18520,7 @@
       <w:pPr>
         <w:pStyle w:val="Heading2"/>
       </w:pPr>
-      <w:bookmarkStart w:id="34" w:name="_Toc242981177"/>
+      <w:bookmarkStart w:id="34" w:name="_Toc242981438"/>
       <w:r>
         <w:lastRenderedPageBreak/>
         <w:t>9.1 Implemented Modules</w:t>
@@ -20105,7 +20089,7 @@
       <w:pPr>
         <w:pStyle w:val="Heading2"/>
       </w:pPr>
-      <w:bookmarkStart w:id="35" w:name="_Toc242981178"/>
+      <w:bookmarkStart w:id="35" w:name="_Toc242981439"/>
       <w:r>
         <w:t>9.2 Screenshots and Configuration Evidence</w:t>
       </w:r>
@@ -20122,7 +20106,7 @@
           <w:noProof/>
         </w:rPr>
         <w:drawing>
-          <wp:inline distT="0" distB="0" distL="0" distR="0" wp14:anchorId="4A89DF5D" wp14:editId="264AD146">
+          <wp:inline distT="0" distB="0" distL="0" distR="0" wp14:anchorId="3FD6D9E4" wp14:editId="3071E7C1">
             <wp:extent cx="5734050" cy="3581400"/>
             <wp:effectExtent l="0" t="0" r="0" b="0"/>
             <wp:docPr id="3" name="01_landing.png" descr="Public landing page with live graph statistics and in-page Cognito sign-in (15 Oct 2026)." title="Public landing page with live graph statistics and in-page Cognito sign-in (15 Oct 2026)."/>
@@ -20206,7 +20190,7 @@
           <w:noProof/>
         </w:rPr>
         <w:drawing>
-          <wp:inline distT="0" distB="0" distL="0" distR="0" wp14:anchorId="1F4B1FC8" wp14:editId="200EFBB9">
+          <wp:inline distT="0" distB="0" distL="0" distR="0" wp14:anchorId="1CD4AE7B" wp14:editId="26367695">
             <wp:extent cx="5734050" cy="3581400"/>
             <wp:effectExtent l="0" t="0" r="0" b="0"/>
             <wp:docPr id="4" name="03_ask.png" descr="Ask: GraphRAG answer to &quot;Which methods are used for link prediction?&quot; with citations, the graph of retrieved facts, and graph size (signed-in member)." title="Ask: GraphRAG answer to &quot;Which methods are used for link prediction?&quot; with citations, the graph of retrieved facts, and graph size (signed-in member)."/>
@@ -20290,7 +20274,7 @@
         </w:rPr>
         <w:lastRenderedPageBreak/>
         <w:drawing>
-          <wp:inline distT="0" distB="0" distL="0" distR="0" wp14:anchorId="79DBA74B" wp14:editId="7AADE633">
+          <wp:inline distT="0" distB="0" distL="0" distR="0" wp14:anchorId="126FFA10" wp14:editId="6CD8F9AC">
             <wp:extent cx="3295650" cy="4143375"/>
             <wp:effectExtent l="0" t="0" r="0" b="0"/>
             <wp:docPr id="5" name="05_connect.png" descr="Connect: the shortest multi-hop path between TransE and BERT (TransE is used by a survey that KG-CF cites, and KG-CF uses BERT)." title="Connect: the shortest multi-hop path between TransE and BERT (TransE is used by a survey that KG-CF cites, and KG-CF uses BERT)."/>
@@ -20366,7 +20350,7 @@
       <w:pPr>
         <w:pStyle w:val="Heading2"/>
       </w:pPr>
-      <w:bookmarkStart w:id="36" w:name="_Toc242981179"/>
+      <w:bookmarkStart w:id="36" w:name="_Toc242981440"/>
       <w:r>
         <w:t>9.3 Repository and Project Structure</w:t>
       </w:r>
@@ -21102,7 +21086,7 @@
       <w:pPr>
         <w:pStyle w:val="Heading2"/>
       </w:pPr>
-      <w:bookmarkStart w:id="37" w:name="_Toc242981180"/>
+      <w:bookmarkStart w:id="37" w:name="_Toc242981441"/>
       <w:r>
         <w:t>9.4 Version Control Workflow</w:t>
       </w:r>
@@ -21124,7 +21108,7 @@
       <w:pPr>
         <w:pStyle w:val="Heading1"/>
       </w:pPr>
-      <w:bookmarkStart w:id="38" w:name="_Toc242981181"/>
+      <w:bookmarkStart w:id="38" w:name="_Toc242981442"/>
       <w:r>
         <w:t>10. Testing, Results and Observations</w:t>
       </w:r>
@@ -21134,7 +21118,7 @@
       <w:pPr>
         <w:pStyle w:val="Heading2"/>
       </w:pPr>
-      <w:bookmarkStart w:id="39" w:name="_Toc242981182"/>
+      <w:bookmarkStart w:id="39" w:name="_Toc242981443"/>
       <w:r>
         <w:t>10.1 Test Plan and Test Cases</w:t>
       </w:r>
@@ -23722,7 +23706,7 @@
       <w:pPr>
         <w:pStyle w:val="Heading2"/>
       </w:pPr>
-      <w:bookmarkStart w:id="40" w:name="_Toc242981183"/>
+      <w:bookmarkStart w:id="40" w:name="_Toc242981444"/>
       <w:r>
         <w:t>10.2 Results</w:t>
       </w:r>
@@ -23756,7 +23740,7 @@
           <w:noProof/>
         </w:rPr>
         <w:drawing>
-          <wp:inline distT="0" distB="0" distL="0" distR="0" wp14:anchorId="7C651967" wp14:editId="4D8C6D64">
+          <wp:inline distT="0" distB="0" distL="0" distR="0" wp14:anchorId="5AEF2EB9" wp14:editId="24E05722">
             <wp:extent cx="5124450" cy="2466975"/>
             <wp:effectExtent l="0" t="0" r="0" b="0"/>
             <wp:docPr id="6" name="fig_ner_f1.png" descr="SciBERT NER test F1 per entity type (overall 0.618; precision 0.593, recall 0.645)." title="SciBERT NER test F1 per entity type (overall 0.618; precision 0.593, recall 0.645)."/>
@@ -23831,7 +23815,7 @@
         </w:rPr>
         <w:lastRenderedPageBreak/>
         <w:drawing>
-          <wp:inline distT="0" distB="0" distL="0" distR="0" wp14:anchorId="1F4D819A" wp14:editId="7B71B67A">
+          <wp:inline distT="0" distB="0" distL="0" distR="0" wp14:anchorId="4D7B8AB8" wp14:editId="178586BE">
             <wp:extent cx="5124450" cy="2619375"/>
             <wp:effectExtent l="0" t="0" r="0" b="0"/>
             <wp:docPr id="7" name="fig_re.png" descr="Relation extraction before and after the model improvement (SciERC test, calibrated on dev)." title="Relation extraction before and after the model improvement (SciERC test, calibrated on dev)."/>
@@ -23940,7 +23924,7 @@
           <w:noProof/>
         </w:rPr>
         <w:drawing>
-          <wp:inline distT="0" distB="0" distL="0" distR="0" wp14:anchorId="547255BD" wp14:editId="41501165">
+          <wp:inline distT="0" distB="0" distL="0" distR="0" wp14:anchorId="788EEEF4" wp14:editId="1E71EEDE">
             <wp:extent cx="5124450" cy="2924175"/>
             <wp:effectExtent l="0" t="0" r="0" b="0"/>
             <wp:docPr id="8" name="fig_graphrag.png" descr="Hallucination benchmark: GraphRAG vs the same LLM without the graph (28 questions: 24 answerable, 4 about made-up entities)." title="Hallucination benchmark: GraphRAG vs the same LLM without the graph (28 questions: 24 answerable, 4 about made-up entities)."/>
@@ -24053,7 +24037,7 @@
       <w:pPr>
         <w:pStyle w:val="Heading2"/>
       </w:pPr>
-      <w:bookmarkStart w:id="41" w:name="_Toc242981184"/>
+      <w:bookmarkStart w:id="41" w:name="_Toc242981445"/>
       <w:r>
         <w:lastRenderedPageBreak/>
         <w:t>10.3 Baseline Comparison</w:t>
@@ -24965,7 +24949,7 @@
       <w:pPr>
         <w:pStyle w:val="Heading2"/>
       </w:pPr>
-      <w:bookmarkStart w:id="42" w:name="_Toc242981185"/>
+      <w:bookmarkStart w:id="42" w:name="_Toc242981446"/>
       <w:r>
         <w:t>10.4 Results Summary</w:t>
       </w:r>
@@ -25876,7 +25860,7 @@
       <w:pPr>
         <w:pStyle w:val="Heading1"/>
       </w:pPr>
-      <w:bookmarkStart w:id="43" w:name="_Toc242981186"/>
+      <w:bookmarkStart w:id="43" w:name="_Toc242981447"/>
       <w:r>
         <w:t>11. Discussion, Limitations and Risk Analysis</w:t>
       </w:r>
@@ -25886,7 +25870,7 @@
       <w:pPr>
         <w:pStyle w:val="Heading2"/>
       </w:pPr>
-      <w:bookmarkStart w:id="44" w:name="_Toc242981187"/>
+      <w:bookmarkStart w:id="44" w:name="_Toc242981448"/>
       <w:r>
         <w:t>11.1 Discussion</w:t>
       </w:r>
@@ -25918,7 +25902,7 @@
       <w:pPr>
         <w:pStyle w:val="Heading2"/>
       </w:pPr>
-      <w:bookmarkStart w:id="45" w:name="_Toc242981188"/>
+      <w:bookmarkStart w:id="45" w:name="_Toc242981449"/>
       <w:r>
         <w:t>11.2 Limitations</w:t>
       </w:r>
@@ -26052,7 +26036,7 @@
       <w:pPr>
         <w:pStyle w:val="Heading2"/>
       </w:pPr>
-      <w:bookmarkStart w:id="46" w:name="_Toc242981189"/>
+      <w:bookmarkStart w:id="46" w:name="_Toc242981450"/>
       <w:r>
         <w:t>11.3 Risks and Mitigation</w:t>
       </w:r>
@@ -26963,7 +26947,7 @@
       <w:pPr>
         <w:pStyle w:val="Heading1"/>
       </w:pPr>
-      <w:bookmarkStart w:id="47" w:name="_Toc242981190"/>
+      <w:bookmarkStart w:id="47" w:name="_Toc242981451"/>
       <w:r>
         <w:t>12. Team Contribution and Project Management</w:t>
       </w:r>
@@ -28116,7 +28100,7 @@
       <w:pPr>
         <w:pStyle w:val="Heading2"/>
       </w:pPr>
-      <w:bookmarkStart w:id="48" w:name="_Toc242981191"/>
+      <w:bookmarkStart w:id="48" w:name="_Toc242981452"/>
       <w:r>
         <w:lastRenderedPageBreak/>
         <w:t>12.1 Individual Contribution Evidence</w:t>
@@ -28196,7 +28180,7 @@
       <w:pPr>
         <w:pStyle w:val="Heading1"/>
       </w:pPr>
-      <w:bookmarkStart w:id="49" w:name="_Toc242981192"/>
+      <w:bookmarkStart w:id="49" w:name="_Toc242981453"/>
       <w:r>
         <w:t>13. Conclusion and Future Enhancements</w:t>
       </w:r>
@@ -28206,7 +28190,7 @@
       <w:pPr>
         <w:pStyle w:val="Heading2"/>
       </w:pPr>
-      <w:bookmarkStart w:id="50" w:name="_Toc242981193"/>
+      <w:bookmarkStart w:id="50" w:name="_Toc242981454"/>
       <w:r>
         <w:t>13.1 Conclusion</w:t>
       </w:r>
@@ -28228,7 +28212,7 @@
       <w:pPr>
         <w:pStyle w:val="Heading2"/>
       </w:pPr>
-      <w:bookmarkStart w:id="51" w:name="_Toc242981194"/>
+      <w:bookmarkStart w:id="51" w:name="_Toc242981455"/>
       <w:r>
         <w:t>13.2 Future Enhancements</w:t>
       </w:r>
@@ -28304,7 +28288,7 @@
       <w:pPr>
         <w:pStyle w:val="Heading1"/>
       </w:pPr>
-      <w:bookmarkStart w:id="52" w:name="_Toc242981195"/>
+      <w:bookmarkStart w:id="52" w:name="_Toc242981456"/>
       <w:r>
         <w:t>References</w:t>
       </w:r>
@@ -28547,7 +28531,7 @@
       <w:pPr>
         <w:pStyle w:val="Heading1"/>
       </w:pPr>
-      <w:bookmarkStart w:id="53" w:name="_Toc242981196"/>
+      <w:bookmarkStart w:id="53" w:name="_Toc242981457"/>
       <w:r>
         <w:t>Appendix A - Project Timeline</w:t>
       </w:r>
@@ -29803,7 +29787,7 @@
       <w:pPr>
         <w:pStyle w:val="Heading1"/>
       </w:pPr>
-      <w:bookmarkStart w:id="54" w:name="_Toc242981197"/>
+      <w:bookmarkStart w:id="54" w:name="_Toc242981458"/>
       <w:r>
         <w:t>Appendix B - Final Review Checklist</w:t>
       </w:r>
@@ -29924,7 +29908,7 @@
         <w:spacing w:after="60"/>
       </w:pPr>
       <w:r>
-        <w:t>☐  Required formatting is applied and placeholders have been removed.</w:t>
+        <w:t>☑  Required formatting is applied and placeholders have been removed.</w:t>
       </w:r>
     </w:p>
     <w:sectPr>
@@ -30037,68 +30021,10 @@
 <file path=word/numbering.xml><?xml version="1.0" encoding="utf-8"?>
 <w:numbering xmlns:wpc="http://schemas.microsoft.com/office/word/2010/wordprocessingCanvas" xmlns:cx="http://schemas.microsoft.com/office/drawing/2014/chartex" xmlns:cx1="http://schemas.microsoft.com/office/drawing/2015/9/8/chartex" xmlns:cx2="http://schemas.microsoft.com/office/drawing/2015/10/21/chartex" xmlns:cx3="http://schemas.microsoft.com/office/drawing/2016/5/9/chartex" xmlns:cx4="http://schemas.microsoft.com/office/drawing/2016/5/10/chartex" xmlns:cx5="http://schemas.microsoft.com/office/drawing/2016/5/11/chartex" xmlns:cx6="http://schemas.microsoft.com/office/drawing/2016/5/12/chartex" xmlns:cx7="http://schemas.microsoft.com/office/drawing/2016/5/13/chartex" xmlns:cx8="http://schemas.microsoft.com/office/drawing/2016/5/14/chartex" xmlns:mc="http://schemas.openxmlformats.org/markup-compatibility/2006" xmlns:aink="http://schemas.microsoft.com/office/drawing/2016/ink" xmlns:am3d="http://schemas.microsoft.com/office/drawing/2017/model3d" xmlns:o="urn:schemas-microsoft-com:office:office" xmlns:oel="http://schemas.microsoft.com/office/2019/extlst" xmlns:r="http://schemas.openxmlformats.org/officeDocument/2006/relationships" xmlns:m="http://schemas.openxmlformats.org/officeDocument/2006/math" xmlns:v="urn:schemas-microsoft-com:vml" xmlns:wp14="http://schemas.microsoft.com/office/word/2010/wordprocessingDrawing" xmlns:wp="http://schemas.openxmlformats.org/drawingml/2006/wordprocessingDrawing" xmlns:w10="urn:schemas-microsoft-com:office:word" xmlns:w="http://schemas.openxmlformats.org/wordprocessingml/2006/main" xmlns:w14="http://schemas.microsoft.com/office/word/2010/wordml" xmlns:w15="http://schemas.microsoft.com/office/word/2012/wordml" xmlns:w16cex="http://schemas.microsoft.com/office/word/2018/wordml/cex" xmlns:w16cid="http://schemas.microsoft.com/office/word/2016/wordml/cid" xmlns:w16="http://schemas.microsoft.com/office/word/2018/wordml" xmlns:w16du="http://schemas.microsoft.com/office/word/2023/wordml/word16du" xmlns:w16sdtdh="http://schemas.microsoft.com/office/word/2020/wordml/sdtdatahash" xmlns:w16sdtfl="http://schemas.microsoft.com/office/word/2024/wordml/sdtformatlock" xmlns:w16se="http://schemas.microsoft.com/office/word/2015/wordml/symex" xmlns:wpg="http://schemas.microsoft.com/office/word/2010/wordprocessingGroup" xmlns:wpi="http://schemas.microsoft.com/office/word/2010/wordprocessingInk" xmlns:wne="http://schemas.microsoft.com/office/word/2006/wordml" xmlns:wps="http://schemas.microsoft.com/office/word/2010/wordprocessingShape" mc:Ignorable="w14 w15 w16se w16cid w16 w16cex w16sdtdh w16sdtfl w16du wp14">
   <w:abstractNum w:abstractNumId="0" w15:restartNumberingAfterBreak="0">
-    <w:nsid w:val="38D507D2"/>
+    <w:nsid w:val="0E3F36EB"/>
     <w:multiLevelType w:val="hybridMultilevel"/>
-    <w:tmpl w:val="7D442726"/>
-    <w:lvl w:ilvl="0" w:tplc="4088F11C">
-      <w:start w:val="1"/>
-      <w:numFmt w:val="bullet"/>
-      <w:lvlText w:val="•"/>
-      <w:lvlJc w:val="left"/>
-      <w:pPr>
-        <w:ind w:left="540" w:hanging="300"/>
-      </w:pPr>
-    </w:lvl>
-    <w:lvl w:ilvl="1" w:tplc="798C59CA" w:tentative="1">
-      <w:start w:val="1"/>
-      <w:numFmt w:val="bullet"/>
-      <w:lvlText w:val="–"/>
-      <w:lvlJc w:val="left"/>
-      <w:pPr>
-        <w:ind w:left="1080" w:hanging="300"/>
-      </w:pPr>
-    </w:lvl>
-    <w:lvl w:ilvl="2" w:tplc="13447C6A">
-      <w:numFmt w:val="decimal"/>
-      <w:lvlText w:val=""/>
-      <w:lvlJc w:val="left"/>
-    </w:lvl>
-    <w:lvl w:ilvl="3" w:tplc="7B667114">
-      <w:numFmt w:val="decimal"/>
-      <w:lvlText w:val=""/>
-      <w:lvlJc w:val="left"/>
-    </w:lvl>
-    <w:lvl w:ilvl="4" w:tplc="9A9E2258">
-      <w:numFmt w:val="decimal"/>
-      <w:lvlText w:val=""/>
-      <w:lvlJc w:val="left"/>
-    </w:lvl>
-    <w:lvl w:ilvl="5" w:tplc="065AEBAE">
-      <w:numFmt w:val="decimal"/>
-      <w:lvlText w:val=""/>
-      <w:lvlJc w:val="left"/>
-    </w:lvl>
-    <w:lvl w:ilvl="6" w:tplc="F05A508E">
-      <w:numFmt w:val="decimal"/>
-      <w:lvlText w:val=""/>
-      <w:lvlJc w:val="left"/>
-    </w:lvl>
-    <w:lvl w:ilvl="7" w:tplc="EA369E3C">
-      <w:numFmt w:val="decimal"/>
-      <w:lvlText w:val=""/>
-      <w:lvlJc w:val="left"/>
-    </w:lvl>
-    <w:lvl w:ilvl="8" w:tplc="0414B0CC">
-      <w:numFmt w:val="decimal"/>
-      <w:lvlText w:val=""/>
-      <w:lvlJc w:val="left"/>
-    </w:lvl>
-  </w:abstractNum>
-  <w:abstractNum w:abstractNumId="1" w15:restartNumberingAfterBreak="0">
-    <w:nsid w:val="3CD320FF"/>
-    <w:multiLevelType w:val="hybridMultilevel"/>
-    <w:tmpl w:val="2DF811D8"/>
-    <w:lvl w:ilvl="0" w:tplc="D02CA450">
+    <w:tmpl w:val="4E4C2F5E"/>
+    <w:lvl w:ilvl="0" w:tplc="8E280F82">
       <w:start w:val="1"/>
       <w:numFmt w:val="decimal"/>
       <w:lvlText w:val="%1."/>
@@ -30107,52 +30033,52 @@
         <w:ind w:left="540" w:hanging="360"/>
       </w:pPr>
     </w:lvl>
-    <w:lvl w:ilvl="1" w:tplc="28CED234">
+    <w:lvl w:ilvl="1" w:tplc="4F7CB902">
       <w:numFmt w:val="decimal"/>
       <w:lvlText w:val=""/>
       <w:lvlJc w:val="left"/>
     </w:lvl>
-    <w:lvl w:ilvl="2" w:tplc="D5141684">
+    <w:lvl w:ilvl="2" w:tplc="05BEA384">
       <w:numFmt w:val="decimal"/>
       <w:lvlText w:val=""/>
       <w:lvlJc w:val="left"/>
     </w:lvl>
-    <w:lvl w:ilvl="3" w:tplc="19D08568">
+    <w:lvl w:ilvl="3" w:tplc="9BE08CB2">
       <w:numFmt w:val="decimal"/>
       <w:lvlText w:val=""/>
       <w:lvlJc w:val="left"/>
     </w:lvl>
-    <w:lvl w:ilvl="4" w:tplc="83AE214E">
+    <w:lvl w:ilvl="4" w:tplc="FF808F6A">
       <w:numFmt w:val="decimal"/>
       <w:lvlText w:val=""/>
       <w:lvlJc w:val="left"/>
     </w:lvl>
-    <w:lvl w:ilvl="5" w:tplc="13BA0DAA">
+    <w:lvl w:ilvl="5" w:tplc="7BA6ECF2">
       <w:numFmt w:val="decimal"/>
       <w:lvlText w:val=""/>
       <w:lvlJc w:val="left"/>
     </w:lvl>
-    <w:lvl w:ilvl="6" w:tplc="A0BE3412">
+    <w:lvl w:ilvl="6" w:tplc="93F46FE6">
       <w:numFmt w:val="decimal"/>
       <w:lvlText w:val=""/>
       <w:lvlJc w:val="left"/>
     </w:lvl>
-    <w:lvl w:ilvl="7" w:tplc="136A0DD2">
+    <w:lvl w:ilvl="7" w:tplc="27925604">
       <w:numFmt w:val="decimal"/>
       <w:lvlText w:val=""/>
       <w:lvlJc w:val="left"/>
     </w:lvl>
-    <w:lvl w:ilvl="8" w:tplc="AAA28CCA">
+    <w:lvl w:ilvl="8" w:tplc="4F60A808">
       <w:numFmt w:val="decimal"/>
       <w:lvlText w:val=""/>
       <w:lvlJc w:val="left"/>
     </w:lvl>
   </w:abstractNum>
-  <w:abstractNum w:abstractNumId="2" w15:restartNumberingAfterBreak="0">
-    <w:nsid w:val="4D795891"/>
+  <w:abstractNum w:abstractNumId="1" w15:restartNumberingAfterBreak="0">
+    <w:nsid w:val="2073234C"/>
     <w:multiLevelType w:val="hybridMultilevel"/>
-    <w:tmpl w:val="15DE3332"/>
-    <w:lvl w:ilvl="0" w:tplc="6450B562" w:tentative="1">
+    <w:tmpl w:val="B6987950"/>
+    <w:lvl w:ilvl="0" w:tplc="548E2B14" w:tentative="1">
       <w:start w:val="1"/>
       <w:numFmt w:val="bullet"/>
       <w:lvlText w:val="●"/>
@@ -30161,7 +30087,7 @@
         <w:ind w:left="720" w:hanging="360"/>
       </w:pPr>
     </w:lvl>
-    <w:lvl w:ilvl="1" w:tplc="EF180B00" w:tentative="1">
+    <w:lvl w:ilvl="1" w:tplc="26F02608" w:tentative="1">
       <w:start w:val="1"/>
       <w:numFmt w:val="bullet"/>
       <w:lvlText w:val="○"/>
@@ -30170,7 +30096,7 @@
         <w:ind w:left="1440" w:hanging="360"/>
       </w:pPr>
     </w:lvl>
-    <w:lvl w:ilvl="2" w:tplc="68D29CC0" w:tentative="1">
+    <w:lvl w:ilvl="2" w:tplc="78BC4DEE" w:tentative="1">
       <w:start w:val="1"/>
       <w:numFmt w:val="bullet"/>
       <w:lvlText w:val="■"/>
@@ -30179,7 +30105,7 @@
         <w:ind w:left="2160" w:hanging="360"/>
       </w:pPr>
     </w:lvl>
-    <w:lvl w:ilvl="3" w:tplc="DA8CD2FE" w:tentative="1">
+    <w:lvl w:ilvl="3" w:tplc="214EF912" w:tentative="1">
       <w:start w:val="1"/>
       <w:numFmt w:val="bullet"/>
       <w:lvlText w:val="●"/>
@@ -30188,7 +30114,7 @@
         <w:ind w:left="2880" w:hanging="360"/>
       </w:pPr>
     </w:lvl>
-    <w:lvl w:ilvl="4" w:tplc="D24435BA" w:tentative="1">
+    <w:lvl w:ilvl="4" w:tplc="AF0CD89E" w:tentative="1">
       <w:start w:val="1"/>
       <w:numFmt w:val="bullet"/>
       <w:lvlText w:val="○"/>
@@ -30197,7 +30123,7 @@
         <w:ind w:left="3600" w:hanging="360"/>
       </w:pPr>
     </w:lvl>
-    <w:lvl w:ilvl="5" w:tplc="A9628786" w:tentative="1">
+    <w:lvl w:ilvl="5" w:tplc="E04E90D0" w:tentative="1">
       <w:start w:val="1"/>
       <w:numFmt w:val="bullet"/>
       <w:lvlText w:val="■"/>
@@ -30206,7 +30132,7 @@
         <w:ind w:left="4320" w:hanging="360"/>
       </w:pPr>
     </w:lvl>
-    <w:lvl w:ilvl="6" w:tplc="BFD022F4" w:tentative="1">
+    <w:lvl w:ilvl="6" w:tplc="1AD6CEB0" w:tentative="1">
       <w:start w:val="1"/>
       <w:numFmt w:val="bullet"/>
       <w:lvlText w:val="●"/>
@@ -30215,7 +30141,7 @@
         <w:ind w:left="5040" w:hanging="360"/>
       </w:pPr>
     </w:lvl>
-    <w:lvl w:ilvl="7" w:tplc="367A5300" w:tentative="1">
+    <w:lvl w:ilvl="7" w:tplc="F5BCBE48" w:tentative="1">
       <w:start w:val="1"/>
       <w:numFmt w:val="bullet"/>
       <w:lvlText w:val="●"/>
@@ -30224,7 +30150,7 @@
         <w:ind w:left="5760" w:hanging="360"/>
       </w:pPr>
     </w:lvl>
-    <w:lvl w:ilvl="8" w:tplc="7D04A910" w:tentative="1">
+    <w:lvl w:ilvl="8" w:tplc="84E81F1E" w:tentative="1">
       <w:start w:val="1"/>
       <w:numFmt w:val="bullet"/>
       <w:lvlText w:val="●"/>
@@ -30234,11 +30160,11 @@
       </w:pPr>
     </w:lvl>
   </w:abstractNum>
-  <w:abstractNum w:abstractNumId="3" w15:restartNumberingAfterBreak="0">
-    <w:nsid w:val="524721A3"/>
+  <w:abstractNum w:abstractNumId="2" w15:restartNumberingAfterBreak="0">
+    <w:nsid w:val="2F8823FC"/>
     <w:multiLevelType w:val="hybridMultilevel"/>
-    <w:tmpl w:val="474CB95E"/>
-    <w:lvl w:ilvl="0" w:tplc="E45AD35E">
+    <w:tmpl w:val="717ABF50"/>
+    <w:lvl w:ilvl="0" w:tplc="D0F874D6">
       <w:start w:val="1"/>
       <w:numFmt w:val="decimal"/>
       <w:lvlText w:val="%1."/>
@@ -30247,52 +30173,110 @@
         <w:ind w:left="540" w:hanging="360"/>
       </w:pPr>
     </w:lvl>
-    <w:lvl w:ilvl="1" w:tplc="7AA0E8D8">
+    <w:lvl w:ilvl="1" w:tplc="C6ECC43A">
       <w:numFmt w:val="decimal"/>
       <w:lvlText w:val=""/>
       <w:lvlJc w:val="left"/>
     </w:lvl>
-    <w:lvl w:ilvl="2" w:tplc="29DE76CE">
+    <w:lvl w:ilvl="2" w:tplc="820A2C62">
       <w:numFmt w:val="decimal"/>
       <w:lvlText w:val=""/>
       <w:lvlJc w:val="left"/>
     </w:lvl>
-    <w:lvl w:ilvl="3" w:tplc="20BAC2C2">
+    <w:lvl w:ilvl="3" w:tplc="16E22686">
       <w:numFmt w:val="decimal"/>
       <w:lvlText w:val=""/>
       <w:lvlJc w:val="left"/>
     </w:lvl>
-    <w:lvl w:ilvl="4" w:tplc="06764FDA">
+    <w:lvl w:ilvl="4" w:tplc="4CFE1248">
       <w:numFmt w:val="decimal"/>
       <w:lvlText w:val=""/>
       <w:lvlJc w:val="left"/>
     </w:lvl>
-    <w:lvl w:ilvl="5" w:tplc="B66C02F6">
+    <w:lvl w:ilvl="5" w:tplc="CA3045EC">
       <w:numFmt w:val="decimal"/>
       <w:lvlText w:val=""/>
       <w:lvlJc w:val="left"/>
     </w:lvl>
-    <w:lvl w:ilvl="6" w:tplc="0B8C41C0">
+    <w:lvl w:ilvl="6" w:tplc="E794C500">
       <w:numFmt w:val="decimal"/>
       <w:lvlText w:val=""/>
       <w:lvlJc w:val="left"/>
     </w:lvl>
-    <w:lvl w:ilvl="7" w:tplc="BBAA0AE4">
+    <w:lvl w:ilvl="7" w:tplc="32AECCE8">
       <w:numFmt w:val="decimal"/>
       <w:lvlText w:val=""/>
       <w:lvlJc w:val="left"/>
     </w:lvl>
-    <w:lvl w:ilvl="8" w:tplc="51F6CA0A">
+    <w:lvl w:ilvl="8" w:tplc="5ACCD8EA">
+      <w:numFmt w:val="decimal"/>
+      <w:lvlText w:val=""/>
+      <w:lvlJc w:val="left"/>
+    </w:lvl>
+  </w:abstractNum>
+  <w:abstractNum w:abstractNumId="3" w15:restartNumberingAfterBreak="0">
+    <w:nsid w:val="567F16EB"/>
+    <w:multiLevelType w:val="hybridMultilevel"/>
+    <w:tmpl w:val="D72E7EAE"/>
+    <w:lvl w:ilvl="0" w:tplc="7CB82E94">
+      <w:start w:val="1"/>
+      <w:numFmt w:val="bullet"/>
+      <w:lvlText w:val="•"/>
+      <w:lvlJc w:val="left"/>
+      <w:pPr>
+        <w:ind w:left="540" w:hanging="300"/>
+      </w:pPr>
+    </w:lvl>
+    <w:lvl w:ilvl="1" w:tplc="2DAA519A" w:tentative="1">
+      <w:start w:val="1"/>
+      <w:numFmt w:val="bullet"/>
+      <w:lvlText w:val="–"/>
+      <w:lvlJc w:val="left"/>
+      <w:pPr>
+        <w:ind w:left="1080" w:hanging="300"/>
+      </w:pPr>
+    </w:lvl>
+    <w:lvl w:ilvl="2" w:tplc="E19010A8">
+      <w:numFmt w:val="decimal"/>
+      <w:lvlText w:val=""/>
+      <w:lvlJc w:val="left"/>
+    </w:lvl>
+    <w:lvl w:ilvl="3" w:tplc="65B07092">
+      <w:numFmt w:val="decimal"/>
+      <w:lvlText w:val=""/>
+      <w:lvlJc w:val="left"/>
+    </w:lvl>
+    <w:lvl w:ilvl="4" w:tplc="2806B11C">
+      <w:numFmt w:val="decimal"/>
+      <w:lvlText w:val=""/>
+      <w:lvlJc w:val="left"/>
+    </w:lvl>
+    <w:lvl w:ilvl="5" w:tplc="28D4C0CC">
+      <w:numFmt w:val="decimal"/>
+      <w:lvlText w:val=""/>
+      <w:lvlJc w:val="left"/>
+    </w:lvl>
+    <w:lvl w:ilvl="6" w:tplc="D71C07FC">
+      <w:numFmt w:val="decimal"/>
+      <w:lvlText w:val=""/>
+      <w:lvlJc w:val="left"/>
+    </w:lvl>
+    <w:lvl w:ilvl="7" w:tplc="AEE40E3A">
+      <w:numFmt w:val="decimal"/>
+      <w:lvlText w:val=""/>
+      <w:lvlJc w:val="left"/>
+    </w:lvl>
+    <w:lvl w:ilvl="8" w:tplc="47C60246">
       <w:numFmt w:val="decimal"/>
       <w:lvlText w:val=""/>
       <w:lvlJc w:val="left"/>
     </w:lvl>
   </w:abstractNum>
   <w:abstractNum w:abstractNumId="4" w15:restartNumberingAfterBreak="0">
-    <w:nsid w:val="6BD76CE0"/>
+    <w:nsid w:val="75870D52"/>
     <w:multiLevelType w:val="hybridMultilevel"/>
-    <w:tmpl w:val="2C8664A6"/>
-    <w:lvl w:ilvl="0" w:tplc="995E33D2">
+    <w:tmpl w:val="46A0D5DA"/>
+    <w:lvl w:ilvl="0" w:tplc="C7EEA9C2">
       <w:start w:val="1"/>
       <w:numFmt w:val="decimal"/>
       <w:lvlText w:val="%1."/>
@@ -30301,72 +30285,72 @@
         <w:ind w:left="540" w:hanging="360"/>
       </w:pPr>
     </w:lvl>
-    <w:lvl w:ilvl="1" w:tplc="55CE2322">
+    <w:lvl w:ilvl="1" w:tplc="F0A6D474">
       <w:numFmt w:val="decimal"/>
       <w:lvlText w:val=""/>
       <w:lvlJc w:val="left"/>
     </w:lvl>
-    <w:lvl w:ilvl="2" w:tplc="4418C1C8">
+    <w:lvl w:ilvl="2" w:tplc="F25C4022">
       <w:numFmt w:val="decimal"/>
       <w:lvlText w:val=""/>
       <w:lvlJc w:val="left"/>
     </w:lvl>
-    <w:lvl w:ilvl="3" w:tplc="AECC3E8C">
+    <w:lvl w:ilvl="3" w:tplc="DC8EBDDE">
       <w:numFmt w:val="decimal"/>
       <w:lvlText w:val=""/>
       <w:lvlJc w:val="left"/>
     </w:lvl>
-    <w:lvl w:ilvl="4" w:tplc="E4D41C92">
+    <w:lvl w:ilvl="4" w:tplc="9286866A">
       <w:numFmt w:val="decimal"/>
       <w:lvlText w:val=""/>
       <w:lvlJc w:val="left"/>
     </w:lvl>
-    <w:lvl w:ilvl="5" w:tplc="50B80262">
+    <w:lvl w:ilvl="5" w:tplc="F54C2F7C">
       <w:numFmt w:val="decimal"/>
       <w:lvlText w:val=""/>
       <w:lvlJc w:val="left"/>
     </w:lvl>
-    <w:lvl w:ilvl="6" w:tplc="AB44FC98">
+    <w:lvl w:ilvl="6" w:tplc="021059D6">
       <w:numFmt w:val="decimal"/>
       <w:lvlText w:val=""/>
       <w:lvlJc w:val="left"/>
     </w:lvl>
-    <w:lvl w:ilvl="7" w:tplc="F9E66EB4">
+    <w:lvl w:ilvl="7" w:tplc="CCB841DC">
       <w:numFmt w:val="decimal"/>
       <w:lvlText w:val=""/>
       <w:lvlJc w:val="left"/>
     </w:lvl>
-    <w:lvl w:ilvl="8" w:tplc="6D3CFF96">
+    <w:lvl w:ilvl="8" w:tplc="1178A7D0">
       <w:numFmt w:val="decimal"/>
       <w:lvlText w:val=""/>
       <w:lvlJc w:val="left"/>
     </w:lvl>
   </w:abstractNum>
-  <w:num w:numId="1" w16cid:durableId="1355695866">
+  <w:num w:numId="1" w16cid:durableId="1948537850">
+    <w:abstractNumId w:val="1"/>
+    <w:lvlOverride w:ilvl="0">
+      <w:startOverride w:val="1"/>
+    </w:lvlOverride>
+  </w:num>
+  <w:num w:numId="2" w16cid:durableId="1194228754">
     <w:abstractNumId w:val="2"/>
     <w:lvlOverride w:ilvl="0">
       <w:startOverride w:val="1"/>
     </w:lvlOverride>
   </w:num>
-  <w:num w:numId="2" w16cid:durableId="1944535349">
-    <w:abstractNumId w:val="1"/>
+  <w:num w:numId="3" w16cid:durableId="242877609">
+    <w:abstractNumId w:val="0"/>
     <w:lvlOverride w:ilvl="0">
       <w:startOverride w:val="1"/>
     </w:lvlOverride>
   </w:num>
-  <w:num w:numId="3" w16cid:durableId="469253243">
+  <w:num w:numId="4" w16cid:durableId="134297632">
     <w:abstractNumId w:val="3"/>
     <w:lvlOverride w:ilvl="0">
       <w:startOverride w:val="1"/>
     </w:lvlOverride>
   </w:num>
-  <w:num w:numId="4" w16cid:durableId="693459607">
-    <w:abstractNumId w:val="0"/>
-    <w:lvlOverride w:ilvl="0">
-      <w:startOverride w:val="1"/>
-    </w:lvlOverride>
-  </w:num>
-  <w:num w:numId="5" w16cid:durableId="1576162346">
+  <w:num w:numId="5" w16cid:durableId="1933396486">
     <w:abstractNumId w:val="4"/>
     <w:lvlOverride w:ilvl="0">
       <w:startOverride w:val="1"/>
@@ -31018,7 +31002,7 @@
     <w:autoRedefine/>
     <w:uiPriority w:val="39"/>
     <w:unhideWhenUsed/>
-    <w:rsid w:val="009F0431"/>
+    <w:rsid w:val="00BF5445"/>
     <w:pPr>
       <w:spacing w:after="100"/>
     </w:pPr>
@@ -31030,7 +31014,7 @@
     <w:autoRedefine/>
     <w:uiPriority w:val="39"/>
     <w:unhideWhenUsed/>
-    <w:rsid w:val="009F0431"/>
+    <w:rsid w:val="00BF5445"/>
     <w:pPr>
       <w:spacing w:after="100"/>
       <w:ind w:left="240"/>

</xml_diff>

<commit_message>
Report: keep the Team Number field on the title page, left blank
Co-Authored-By: Claude Opus 5.5 <noreply@anthropic.com>
</commit_message>
<xml_diff>
--- a/docs/Project_Report.docx
+++ b/docs/Project_Report.docx
@@ -122,10 +122,7 @@
           <w:b/>
           <w:bCs/>
         </w:rPr>
-        <w:t xml:space="preserve">Cloud Provider: </w:t>
-      </w:r>
-      <w:r>
-        <w:t>Amazon Web Services (AWS), with Neo4j AuraDB, Groq and Google Gemini as external managed services</w:t>
+        <w:t xml:space="preserve">Team Number: </w:t>
       </w:r>
     </w:p>
     <w:p>
@@ -138,10 +135,10 @@
           <w:b/>
           <w:bCs/>
         </w:rPr>
-        <w:t xml:space="preserve">Git Repository URL: </w:t>
-      </w:r>
-      <w:r>
-        <w:t>https://github.com/DeveshAg30/Cloud_Based_Knowledge_Graph_Framework_for_Automated_Research_Intelligence_Aws_Project_2026</w:t>
+        <w:t xml:space="preserve">Cloud Provider: </w:t>
+      </w:r>
+      <w:r>
+        <w:t>Amazon Web Services (AWS), with Neo4j AuraDB, Groq and Google Gemini as external managed services</w:t>
       </w:r>
     </w:p>
     <w:p>
@@ -154,6 +151,22 @@
           <w:b/>
           <w:bCs/>
         </w:rPr>
+        <w:t xml:space="preserve">Git Repository URL: </w:t>
+      </w:r>
+      <w:r>
+        <w:t>https://github.com/DeveshAg30/Cloud_Based_Knowledge_Graph_Framework_for_Automated_Research_Intelligence_Aws_Project_2026</w:t>
+      </w:r>
+    </w:p>
+    <w:p>
+      <w:pPr>
+        <w:spacing w:after="160"/>
+        <w:jc w:val="center"/>
+      </w:pPr>
+      <w:r>
+        <w:rPr>
+          <w:b/>
+          <w:bCs/>
+        </w:rPr>
         <w:t xml:space="preserve">Date of Submission: </w:t>
       </w:r>
       <w:r>
@@ -169,7 +182,7 @@
       <w:pPr>
         <w:pStyle w:val="Heading1"/>
       </w:pPr>
-      <w:bookmarkStart w:id="0" w:name="_Toc242981404"/>
+      <w:bookmarkStart w:id="0" w:name="_Toc242981833"/>
       <w:r>
         <w:lastRenderedPageBreak/>
         <w:t>Abstract</w:t>
@@ -198,7 +211,7 @@
       <w:pPr>
         <w:pStyle w:val="Heading2"/>
       </w:pPr>
-      <w:bookmarkStart w:id="1" w:name="_Toc242981405"/>
+      <w:bookmarkStart w:id="1" w:name="_Toc242981834"/>
       <w:r>
         <w:t>Keywords</w:t>
       </w:r>
@@ -222,7 +235,7 @@
       <w:pPr>
         <w:pStyle w:val="Heading1"/>
       </w:pPr>
-      <w:bookmarkStart w:id="2" w:name="_Toc242981406"/>
+      <w:bookmarkStart w:id="2" w:name="_Toc242981835"/>
       <w:r>
         <w:lastRenderedPageBreak/>
         <w:t>Table of Contents</w:t>
@@ -232,7 +245,7 @@
     <w:sdt>
       <w:sdtPr>
         <w:alias w:val="Table of Contents"/>
-        <w:id w:val="1900012123"/>
+        <w:id w:val="-1310475086"/>
       </w:sdtPr>
       <w:sdtEndPr/>
       <w:sdtContent>
@@ -255,7 +268,7 @@
           <w:r>
             <w:fldChar w:fldCharType="separate"/>
           </w:r>
-          <w:hyperlink w:anchor="_Toc242981404" w:history="1">
+          <w:hyperlink w:anchor="_Toc242981833" w:history="1">
             <w:r>
               <w:rPr>
                 <w:rStyle w:val="Hyperlink"/>
@@ -279,7 +292,7 @@
               <w:rPr>
                 <w:noProof/>
               </w:rPr>
-              <w:instrText xml:space="preserve"> PAGEREF _Toc242981404 \h </w:instrText>
+              <w:instrText xml:space="preserve"> PAGEREF _Toc242981833 \h </w:instrText>
             </w:r>
             <w:r>
               <w:rPr>
@@ -316,7 +329,7 @@
               <w:noProof/>
             </w:rPr>
           </w:pPr>
-          <w:hyperlink w:anchor="_Toc242981405" w:history="1">
+          <w:hyperlink w:anchor="_Toc242981834" w:history="1">
             <w:r>
               <w:rPr>
                 <w:rStyle w:val="Hyperlink"/>
@@ -340,7 +353,7 @@
               <w:rPr>
                 <w:noProof/>
               </w:rPr>
-              <w:instrText xml:space="preserve"> PAGEREF _Toc242981405 \h </w:instrText>
+              <w:instrText xml:space="preserve"> PAGEREF _Toc242981834 \h </w:instrText>
             </w:r>
             <w:r>
               <w:rPr>
@@ -377,7 +390,7 @@
               <w:noProof/>
             </w:rPr>
           </w:pPr>
-          <w:hyperlink w:anchor="_Toc242981406" w:history="1">
+          <w:hyperlink w:anchor="_Toc242981835" w:history="1">
             <w:r>
               <w:rPr>
                 <w:rStyle w:val="Hyperlink"/>
@@ -401,7 +414,7 @@
               <w:rPr>
                 <w:noProof/>
               </w:rPr>
-              <w:instrText xml:space="preserve"> PAGEREF _Toc242981406 \h </w:instrText>
+              <w:instrText xml:space="preserve"> PAGEREF _Toc242981835 \h </w:instrText>
             </w:r>
             <w:r>
               <w:rPr>
@@ -438,7 +451,7 @@
               <w:noProof/>
             </w:rPr>
           </w:pPr>
-          <w:hyperlink w:anchor="_Toc242981407" w:history="1">
+          <w:hyperlink w:anchor="_Toc242981836" w:history="1">
             <w:r>
               <w:rPr>
                 <w:rStyle w:val="Hyperlink"/>
@@ -462,7 +475,7 @@
               <w:rPr>
                 <w:noProof/>
               </w:rPr>
-              <w:instrText xml:space="preserve"> PAGEREF _Toc242981407 \h </w:instrText>
+              <w:instrText xml:space="preserve"> PAGEREF _Toc242981836 \h </w:instrText>
             </w:r>
             <w:r>
               <w:rPr>
@@ -499,7 +512,7 @@
               <w:noProof/>
             </w:rPr>
           </w:pPr>
-          <w:hyperlink w:anchor="_Toc242981408" w:history="1">
+          <w:hyperlink w:anchor="_Toc242981837" w:history="1">
             <w:r>
               <w:rPr>
                 <w:rStyle w:val="Hyperlink"/>
@@ -523,7 +536,7 @@
               <w:rPr>
                 <w:noProof/>
               </w:rPr>
-              <w:instrText xml:space="preserve"> PAGEREF _Toc242981408 \h </w:instrText>
+              <w:instrText xml:space="preserve"> PAGEREF _Toc242981837 \h </w:instrText>
             </w:r>
             <w:r>
               <w:rPr>
@@ -560,7 +573,7 @@
               <w:noProof/>
             </w:rPr>
           </w:pPr>
-          <w:hyperlink w:anchor="_Toc242981409" w:history="1">
+          <w:hyperlink w:anchor="_Toc242981838" w:history="1">
             <w:r>
               <w:rPr>
                 <w:rStyle w:val="Hyperlink"/>
@@ -584,7 +597,7 @@
               <w:rPr>
                 <w:noProof/>
               </w:rPr>
-              <w:instrText xml:space="preserve"> PAGEREF _Toc242981409 \h </w:instrText>
+              <w:instrText xml:space="preserve"> PAGEREF _Toc242981838 \h </w:instrText>
             </w:r>
             <w:r>
               <w:rPr>
@@ -621,7 +634,7 @@
               <w:noProof/>
             </w:rPr>
           </w:pPr>
-          <w:hyperlink w:anchor="_Toc242981410" w:history="1">
+          <w:hyperlink w:anchor="_Toc242981839" w:history="1">
             <w:r>
               <w:rPr>
                 <w:rStyle w:val="Hyperlink"/>
@@ -645,7 +658,7 @@
               <w:rPr>
                 <w:noProof/>
               </w:rPr>
-              <w:instrText xml:space="preserve"> PAGEREF _Toc242981410 \h </w:instrText>
+              <w:instrText xml:space="preserve"> PAGEREF _Toc242981839 \h </w:instrText>
             </w:r>
             <w:r>
               <w:rPr>
@@ -682,7 +695,7 @@
               <w:noProof/>
             </w:rPr>
           </w:pPr>
-          <w:hyperlink w:anchor="_Toc242981411" w:history="1">
+          <w:hyperlink w:anchor="_Toc242981840" w:history="1">
             <w:r>
               <w:rPr>
                 <w:rStyle w:val="Hyperlink"/>
@@ -706,7 +719,7 @@
               <w:rPr>
                 <w:noProof/>
               </w:rPr>
-              <w:instrText xml:space="preserve"> PAGEREF _Toc242981411 \h </w:instrText>
+              <w:instrText xml:space="preserve"> PAGEREF _Toc242981840 \h </w:instrText>
             </w:r>
             <w:r>
               <w:rPr>
@@ -743,7 +756,7 @@
               <w:noProof/>
             </w:rPr>
           </w:pPr>
-          <w:hyperlink w:anchor="_Toc242981412" w:history="1">
+          <w:hyperlink w:anchor="_Toc242981841" w:history="1">
             <w:r>
               <w:rPr>
                 <w:rStyle w:val="Hyperlink"/>
@@ -767,7 +780,7 @@
               <w:rPr>
                 <w:noProof/>
               </w:rPr>
-              <w:instrText xml:space="preserve"> PAGEREF _Toc242981412 \h </w:instrText>
+              <w:instrText xml:space="preserve"> PAGEREF _Toc242981841 \h </w:instrText>
             </w:r>
             <w:r>
               <w:rPr>
@@ -804,7 +817,7 @@
               <w:noProof/>
             </w:rPr>
           </w:pPr>
-          <w:hyperlink w:anchor="_Toc242981413" w:history="1">
+          <w:hyperlink w:anchor="_Toc242981842" w:history="1">
             <w:r>
               <w:rPr>
                 <w:rStyle w:val="Hyperlink"/>
@@ -828,7 +841,7 @@
               <w:rPr>
                 <w:noProof/>
               </w:rPr>
-              <w:instrText xml:space="preserve"> PAGEREF _Toc242981413 \h </w:instrText>
+              <w:instrText xml:space="preserve"> PAGEREF _Toc242981842 \h </w:instrText>
             </w:r>
             <w:r>
               <w:rPr>
@@ -865,7 +878,7 @@
               <w:noProof/>
             </w:rPr>
           </w:pPr>
-          <w:hyperlink w:anchor="_Toc242981414" w:history="1">
+          <w:hyperlink w:anchor="_Toc242981843" w:history="1">
             <w:r>
               <w:rPr>
                 <w:rStyle w:val="Hyperlink"/>
@@ -889,7 +902,7 @@
               <w:rPr>
                 <w:noProof/>
               </w:rPr>
-              <w:instrText xml:space="preserve"> PAGEREF _Toc242981414 \h </w:instrText>
+              <w:instrText xml:space="preserve"> PAGEREF _Toc242981843 \h </w:instrText>
             </w:r>
             <w:r>
               <w:rPr>
@@ -926,7 +939,7 @@
               <w:noProof/>
             </w:rPr>
           </w:pPr>
-          <w:hyperlink w:anchor="_Toc242981415" w:history="1">
+          <w:hyperlink w:anchor="_Toc242981844" w:history="1">
             <w:r>
               <w:rPr>
                 <w:rStyle w:val="Hyperlink"/>
@@ -950,7 +963,7 @@
               <w:rPr>
                 <w:noProof/>
               </w:rPr>
-              <w:instrText xml:space="preserve"> PAGEREF _Toc242981415 \h </w:instrText>
+              <w:instrText xml:space="preserve"> PAGEREF _Toc242981844 \h </w:instrText>
             </w:r>
             <w:r>
               <w:rPr>
@@ -987,7 +1000,7 @@
               <w:noProof/>
             </w:rPr>
           </w:pPr>
-          <w:hyperlink w:anchor="_Toc242981416" w:history="1">
+          <w:hyperlink w:anchor="_Toc242981845" w:history="1">
             <w:r>
               <w:rPr>
                 <w:rStyle w:val="Hyperlink"/>
@@ -1011,7 +1024,7 @@
               <w:rPr>
                 <w:noProof/>
               </w:rPr>
-              <w:instrText xml:space="preserve"> PAGEREF _Toc242981416 \h </w:instrText>
+              <w:instrText xml:space="preserve"> PAGEREF _Toc242981845 \h </w:instrText>
             </w:r>
             <w:r>
               <w:rPr>
@@ -1048,7 +1061,7 @@
               <w:noProof/>
             </w:rPr>
           </w:pPr>
-          <w:hyperlink w:anchor="_Toc242981417" w:history="1">
+          <w:hyperlink w:anchor="_Toc242981846" w:history="1">
             <w:r>
               <w:rPr>
                 <w:rStyle w:val="Hyperlink"/>
@@ -1072,7 +1085,7 @@
               <w:rPr>
                 <w:noProof/>
               </w:rPr>
-              <w:instrText xml:space="preserve"> PAGEREF _Toc242981417 \h </w:instrText>
+              <w:instrText xml:space="preserve"> PAGEREF _Toc242981846 \h </w:instrText>
             </w:r>
             <w:r>
               <w:rPr>
@@ -1109,7 +1122,7 @@
               <w:noProof/>
             </w:rPr>
           </w:pPr>
-          <w:hyperlink w:anchor="_Toc242981418" w:history="1">
+          <w:hyperlink w:anchor="_Toc242981847" w:history="1">
             <w:r>
               <w:rPr>
                 <w:rStyle w:val="Hyperlink"/>
@@ -1133,7 +1146,7 @@
               <w:rPr>
                 <w:noProof/>
               </w:rPr>
-              <w:instrText xml:space="preserve"> PAGEREF _Toc242981418 \h </w:instrText>
+              <w:instrText xml:space="preserve"> PAGEREF _Toc242981847 \h </w:instrText>
             </w:r>
             <w:r>
               <w:rPr>
@@ -1170,7 +1183,7 @@
               <w:noProof/>
             </w:rPr>
           </w:pPr>
-          <w:hyperlink w:anchor="_Toc242981419" w:history="1">
+          <w:hyperlink w:anchor="_Toc242981848" w:history="1">
             <w:r>
               <w:rPr>
                 <w:rStyle w:val="Hyperlink"/>
@@ -1194,7 +1207,7 @@
               <w:rPr>
                 <w:noProof/>
               </w:rPr>
-              <w:instrText xml:space="preserve"> PAGEREF _Toc242981419 \h </w:instrText>
+              <w:instrText xml:space="preserve"> PAGEREF _Toc242981848 \h </w:instrText>
             </w:r>
             <w:r>
               <w:rPr>
@@ -1231,7 +1244,7 @@
               <w:noProof/>
             </w:rPr>
           </w:pPr>
-          <w:hyperlink w:anchor="_Toc242981420" w:history="1">
+          <w:hyperlink w:anchor="_Toc242981849" w:history="1">
             <w:r>
               <w:rPr>
                 <w:rStyle w:val="Hyperlink"/>
@@ -1255,7 +1268,7 @@
               <w:rPr>
                 <w:noProof/>
               </w:rPr>
-              <w:instrText xml:space="preserve"> PAGEREF _Toc242981420 \h </w:instrText>
+              <w:instrText xml:space="preserve"> PAGEREF _Toc242981849 \h </w:instrText>
             </w:r>
             <w:r>
               <w:rPr>
@@ -1292,7 +1305,7 @@
               <w:noProof/>
             </w:rPr>
           </w:pPr>
-          <w:hyperlink w:anchor="_Toc242981421" w:history="1">
+          <w:hyperlink w:anchor="_Toc242981850" w:history="1">
             <w:r>
               <w:rPr>
                 <w:rStyle w:val="Hyperlink"/>
@@ -1316,7 +1329,7 @@
               <w:rPr>
                 <w:noProof/>
               </w:rPr>
-              <w:instrText xml:space="preserve"> PAGEREF _Toc242981421 \h </w:instrText>
+              <w:instrText xml:space="preserve"> PAGEREF _Toc242981850 \h </w:instrText>
             </w:r>
             <w:r>
               <w:rPr>
@@ -1353,7 +1366,7 @@
               <w:noProof/>
             </w:rPr>
           </w:pPr>
-          <w:hyperlink w:anchor="_Toc242981422" w:history="1">
+          <w:hyperlink w:anchor="_Toc242981851" w:history="1">
             <w:r>
               <w:rPr>
                 <w:rStyle w:val="Hyperlink"/>
@@ -1377,7 +1390,7 @@
               <w:rPr>
                 <w:noProof/>
               </w:rPr>
-              <w:instrText xml:space="preserve"> PAGEREF _Toc242981422 \h </w:instrText>
+              <w:instrText xml:space="preserve"> PAGEREF _Toc242981851 \h </w:instrText>
             </w:r>
             <w:r>
               <w:rPr>
@@ -1414,7 +1427,7 @@
               <w:noProof/>
             </w:rPr>
           </w:pPr>
-          <w:hyperlink w:anchor="_Toc242981423" w:history="1">
+          <w:hyperlink w:anchor="_Toc242981852" w:history="1">
             <w:r>
               <w:rPr>
                 <w:rStyle w:val="Hyperlink"/>
@@ -1438,7 +1451,7 @@
               <w:rPr>
                 <w:noProof/>
               </w:rPr>
-              <w:instrText xml:space="preserve"> PAGEREF _Toc242981423 \h </w:instrText>
+              <w:instrText xml:space="preserve"> PAGEREF _Toc242981852 \h </w:instrText>
             </w:r>
             <w:r>
               <w:rPr>
@@ -1475,7 +1488,7 @@
               <w:noProof/>
             </w:rPr>
           </w:pPr>
-          <w:hyperlink w:anchor="_Toc242981424" w:history="1">
+          <w:hyperlink w:anchor="_Toc242981853" w:history="1">
             <w:r>
               <w:rPr>
                 <w:rStyle w:val="Hyperlink"/>
@@ -1499,7 +1512,7 @@
               <w:rPr>
                 <w:noProof/>
               </w:rPr>
-              <w:instrText xml:space="preserve"> PAGEREF _Toc242981424 \h </w:instrText>
+              <w:instrText xml:space="preserve"> PAGEREF _Toc242981853 \h </w:instrText>
             </w:r>
             <w:r>
               <w:rPr>
@@ -1536,7 +1549,7 @@
               <w:noProof/>
             </w:rPr>
           </w:pPr>
-          <w:hyperlink w:anchor="_Toc242981425" w:history="1">
+          <w:hyperlink w:anchor="_Toc242981854" w:history="1">
             <w:r>
               <w:rPr>
                 <w:rStyle w:val="Hyperlink"/>
@@ -1560,7 +1573,7 @@
               <w:rPr>
                 <w:noProof/>
               </w:rPr>
-              <w:instrText xml:space="preserve"> PAGEREF _Toc242981425 \h </w:instrText>
+              <w:instrText xml:space="preserve"> PAGEREF _Toc242981854 \h </w:instrText>
             </w:r>
             <w:r>
               <w:rPr>
@@ -1597,7 +1610,7 @@
               <w:noProof/>
             </w:rPr>
           </w:pPr>
-          <w:hyperlink w:anchor="_Toc242981426" w:history="1">
+          <w:hyperlink w:anchor="_Toc242981855" w:history="1">
             <w:r>
               <w:rPr>
                 <w:rStyle w:val="Hyperlink"/>
@@ -1621,7 +1634,7 @@
               <w:rPr>
                 <w:noProof/>
               </w:rPr>
-              <w:instrText xml:space="preserve"> PAGEREF _Toc242981426 \h </w:instrText>
+              <w:instrText xml:space="preserve"> PAGEREF _Toc242981855 \h </w:instrText>
             </w:r>
             <w:r>
               <w:rPr>
@@ -1658,7 +1671,7 @@
               <w:noProof/>
             </w:rPr>
           </w:pPr>
-          <w:hyperlink w:anchor="_Toc242981427" w:history="1">
+          <w:hyperlink w:anchor="_Toc242981856" w:history="1">
             <w:r>
               <w:rPr>
                 <w:rStyle w:val="Hyperlink"/>
@@ -1682,7 +1695,7 @@
               <w:rPr>
                 <w:noProof/>
               </w:rPr>
-              <w:instrText xml:space="preserve"> PAGEREF _Toc242981427 \h </w:instrText>
+              <w:instrText xml:space="preserve"> PAGEREF _Toc242981856 \h </w:instrText>
             </w:r>
             <w:r>
               <w:rPr>
@@ -1719,7 +1732,7 @@
               <w:noProof/>
             </w:rPr>
           </w:pPr>
-          <w:hyperlink w:anchor="_Toc242981428" w:history="1">
+          <w:hyperlink w:anchor="_Toc242981857" w:history="1">
             <w:r>
               <w:rPr>
                 <w:rStyle w:val="Hyperlink"/>
@@ -1743,7 +1756,7 @@
               <w:rPr>
                 <w:noProof/>
               </w:rPr>
-              <w:instrText xml:space="preserve"> PAGEREF _Toc242981428 \h </w:instrText>
+              <w:instrText xml:space="preserve"> PAGEREF _Toc242981857 \h </w:instrText>
             </w:r>
             <w:r>
               <w:rPr>
@@ -1780,7 +1793,7 @@
               <w:noProof/>
             </w:rPr>
           </w:pPr>
-          <w:hyperlink w:anchor="_Toc242981429" w:history="1">
+          <w:hyperlink w:anchor="_Toc242981858" w:history="1">
             <w:r>
               <w:rPr>
                 <w:rStyle w:val="Hyperlink"/>
@@ -1804,7 +1817,7 @@
               <w:rPr>
                 <w:noProof/>
               </w:rPr>
-              <w:instrText xml:space="preserve"> PAGEREF _Toc242981429 \h </w:instrText>
+              <w:instrText xml:space="preserve"> PAGEREF _Toc242981858 \h </w:instrText>
             </w:r>
             <w:r>
               <w:rPr>
@@ -1841,7 +1854,7 @@
               <w:noProof/>
             </w:rPr>
           </w:pPr>
-          <w:hyperlink w:anchor="_Toc242981430" w:history="1">
+          <w:hyperlink w:anchor="_Toc242981859" w:history="1">
             <w:r>
               <w:rPr>
                 <w:rStyle w:val="Hyperlink"/>
@@ -1865,7 +1878,7 @@
               <w:rPr>
                 <w:noProof/>
               </w:rPr>
-              <w:instrText xml:space="preserve"> PAGEREF _Toc242981430 \h </w:instrText>
+              <w:instrText xml:space="preserve"> PAGEREF _Toc242981859 \h </w:instrText>
             </w:r>
             <w:r>
               <w:rPr>
@@ -1902,7 +1915,7 @@
               <w:noProof/>
             </w:rPr>
           </w:pPr>
-          <w:hyperlink w:anchor="_Toc242981431" w:history="1">
+          <w:hyperlink w:anchor="_Toc242981860" w:history="1">
             <w:r>
               <w:rPr>
                 <w:rStyle w:val="Hyperlink"/>
@@ -1926,7 +1939,7 @@
               <w:rPr>
                 <w:noProof/>
               </w:rPr>
-              <w:instrText xml:space="preserve"> PAGEREF _Toc242981431 \h </w:instrText>
+              <w:instrText xml:space="preserve"> PAGEREF _Toc242981860 \h </w:instrText>
             </w:r>
             <w:r>
               <w:rPr>
@@ -1963,7 +1976,7 @@
               <w:noProof/>
             </w:rPr>
           </w:pPr>
-          <w:hyperlink w:anchor="_Toc242981432" w:history="1">
+          <w:hyperlink w:anchor="_Toc242981861" w:history="1">
             <w:r>
               <w:rPr>
                 <w:rStyle w:val="Hyperlink"/>
@@ -1987,7 +2000,7 @@
               <w:rPr>
                 <w:noProof/>
               </w:rPr>
-              <w:instrText xml:space="preserve"> PAGEREF _Toc242981432 \h </w:instrText>
+              <w:instrText xml:space="preserve"> PAGEREF _Toc242981861 \h </w:instrText>
             </w:r>
             <w:r>
               <w:rPr>
@@ -2024,7 +2037,7 @@
               <w:noProof/>
             </w:rPr>
           </w:pPr>
-          <w:hyperlink w:anchor="_Toc242981433" w:history="1">
+          <w:hyperlink w:anchor="_Toc242981862" w:history="1">
             <w:r>
               <w:rPr>
                 <w:rStyle w:val="Hyperlink"/>
@@ -2048,7 +2061,7 @@
               <w:rPr>
                 <w:noProof/>
               </w:rPr>
-              <w:instrText xml:space="preserve"> PAGEREF _Toc242981433 \h </w:instrText>
+              <w:instrText xml:space="preserve"> PAGEREF _Toc242981862 \h </w:instrText>
             </w:r>
             <w:r>
               <w:rPr>
@@ -2085,7 +2098,7 @@
               <w:noProof/>
             </w:rPr>
           </w:pPr>
-          <w:hyperlink w:anchor="_Toc242981434" w:history="1">
+          <w:hyperlink w:anchor="_Toc242981863" w:history="1">
             <w:r>
               <w:rPr>
                 <w:rStyle w:val="Hyperlink"/>
@@ -2109,7 +2122,7 @@
               <w:rPr>
                 <w:noProof/>
               </w:rPr>
-              <w:instrText xml:space="preserve"> PAGEREF _Toc242981434 \h </w:instrText>
+              <w:instrText xml:space="preserve"> PAGEREF _Toc242981863 \h </w:instrText>
             </w:r>
             <w:r>
               <w:rPr>
@@ -2146,7 +2159,7 @@
               <w:noProof/>
             </w:rPr>
           </w:pPr>
-          <w:hyperlink w:anchor="_Toc242981435" w:history="1">
+          <w:hyperlink w:anchor="_Toc242981864" w:history="1">
             <w:r>
               <w:rPr>
                 <w:rStyle w:val="Hyperlink"/>
@@ -2170,7 +2183,7 @@
               <w:rPr>
                 <w:noProof/>
               </w:rPr>
-              <w:instrText xml:space="preserve"> PAGEREF _Toc242981435 \h </w:instrText>
+              <w:instrText xml:space="preserve"> PAGEREF _Toc242981864 \h </w:instrText>
             </w:r>
             <w:r>
               <w:rPr>
@@ -2207,7 +2220,7 @@
               <w:noProof/>
             </w:rPr>
           </w:pPr>
-          <w:hyperlink w:anchor="_Toc242981436" w:history="1">
+          <w:hyperlink w:anchor="_Toc242981865" w:history="1">
             <w:r>
               <w:rPr>
                 <w:rStyle w:val="Hyperlink"/>
@@ -2231,7 +2244,7 @@
               <w:rPr>
                 <w:noProof/>
               </w:rPr>
-              <w:instrText xml:space="preserve"> PAGEREF _Toc242981436 \h </w:instrText>
+              <w:instrText xml:space="preserve"> PAGEREF _Toc242981865 \h </w:instrText>
             </w:r>
             <w:r>
               <w:rPr>
@@ -2268,7 +2281,7 @@
               <w:noProof/>
             </w:rPr>
           </w:pPr>
-          <w:hyperlink w:anchor="_Toc242981437" w:history="1">
+          <w:hyperlink w:anchor="_Toc242981866" w:history="1">
             <w:r>
               <w:rPr>
                 <w:rStyle w:val="Hyperlink"/>
@@ -2292,7 +2305,7 @@
               <w:rPr>
                 <w:noProof/>
               </w:rPr>
-              <w:instrText xml:space="preserve"> PAGEREF _Toc242981437 \h </w:instrText>
+              <w:instrText xml:space="preserve"> PAGEREF _Toc242981866 \h </w:instrText>
             </w:r>
             <w:r>
               <w:rPr>
@@ -2329,7 +2342,7 @@
               <w:noProof/>
             </w:rPr>
           </w:pPr>
-          <w:hyperlink w:anchor="_Toc242981438" w:history="1">
+          <w:hyperlink w:anchor="_Toc242981867" w:history="1">
             <w:r>
               <w:rPr>
                 <w:rStyle w:val="Hyperlink"/>
@@ -2353,7 +2366,7 @@
               <w:rPr>
                 <w:noProof/>
               </w:rPr>
-              <w:instrText xml:space="preserve"> PAGEREF _Toc242981438 \h </w:instrText>
+              <w:instrText xml:space="preserve"> PAGEREF _Toc242981867 \h </w:instrText>
             </w:r>
             <w:r>
               <w:rPr>
@@ -2390,7 +2403,7 @@
               <w:noProof/>
             </w:rPr>
           </w:pPr>
-          <w:hyperlink w:anchor="_Toc242981439" w:history="1">
+          <w:hyperlink w:anchor="_Toc242981868" w:history="1">
             <w:r>
               <w:rPr>
                 <w:rStyle w:val="Hyperlink"/>
@@ -2414,7 +2427,7 @@
               <w:rPr>
                 <w:noProof/>
               </w:rPr>
-              <w:instrText xml:space="preserve"> PAGEREF _Toc242981439 \h </w:instrText>
+              <w:instrText xml:space="preserve"> PAGEREF _Toc242981868 \h </w:instrText>
             </w:r>
             <w:r>
               <w:rPr>
@@ -2451,7 +2464,7 @@
               <w:noProof/>
             </w:rPr>
           </w:pPr>
-          <w:hyperlink w:anchor="_Toc242981440" w:history="1">
+          <w:hyperlink w:anchor="_Toc242981869" w:history="1">
             <w:r>
               <w:rPr>
                 <w:rStyle w:val="Hyperlink"/>
@@ -2475,7 +2488,7 @@
               <w:rPr>
                 <w:noProof/>
               </w:rPr>
-              <w:instrText xml:space="preserve"> PAGEREF _Toc242981440 \h </w:instrText>
+              <w:instrText xml:space="preserve"> PAGEREF _Toc242981869 \h </w:instrText>
             </w:r>
             <w:r>
               <w:rPr>
@@ -2512,7 +2525,7 @@
               <w:noProof/>
             </w:rPr>
           </w:pPr>
-          <w:hyperlink w:anchor="_Toc242981441" w:history="1">
+          <w:hyperlink w:anchor="_Toc242981870" w:history="1">
             <w:r>
               <w:rPr>
                 <w:rStyle w:val="Hyperlink"/>
@@ -2536,7 +2549,7 @@
               <w:rPr>
                 <w:noProof/>
               </w:rPr>
-              <w:instrText xml:space="preserve"> PAGEREF _Toc242981441 \h </w:instrText>
+              <w:instrText xml:space="preserve"> PAGEREF _Toc242981870 \h </w:instrText>
             </w:r>
             <w:r>
               <w:rPr>
@@ -2573,7 +2586,7 @@
               <w:noProof/>
             </w:rPr>
           </w:pPr>
-          <w:hyperlink w:anchor="_Toc242981442" w:history="1">
+          <w:hyperlink w:anchor="_Toc242981871" w:history="1">
             <w:r>
               <w:rPr>
                 <w:rStyle w:val="Hyperlink"/>
@@ -2597,7 +2610,7 @@
               <w:rPr>
                 <w:noProof/>
               </w:rPr>
-              <w:instrText xml:space="preserve"> PAGEREF _Toc242981442 \h </w:instrText>
+              <w:instrText xml:space="preserve"> PAGEREF _Toc242981871 \h </w:instrText>
             </w:r>
             <w:r>
               <w:rPr>
@@ -2634,7 +2647,7 @@
               <w:noProof/>
             </w:rPr>
           </w:pPr>
-          <w:hyperlink w:anchor="_Toc242981443" w:history="1">
+          <w:hyperlink w:anchor="_Toc242981872" w:history="1">
             <w:r>
               <w:rPr>
                 <w:rStyle w:val="Hyperlink"/>
@@ -2658,7 +2671,7 @@
               <w:rPr>
                 <w:noProof/>
               </w:rPr>
-              <w:instrText xml:space="preserve"> PAGEREF _Toc242981443 \h </w:instrText>
+              <w:instrText xml:space="preserve"> PAGEREF _Toc242981872 \h </w:instrText>
             </w:r>
             <w:r>
               <w:rPr>
@@ -2695,7 +2708,7 @@
               <w:noProof/>
             </w:rPr>
           </w:pPr>
-          <w:hyperlink w:anchor="_Toc242981444" w:history="1">
+          <w:hyperlink w:anchor="_Toc242981873" w:history="1">
             <w:r>
               <w:rPr>
                 <w:rStyle w:val="Hyperlink"/>
@@ -2719,7 +2732,7 @@
               <w:rPr>
                 <w:noProof/>
               </w:rPr>
-              <w:instrText xml:space="preserve"> PAGEREF _Toc242981444 \h </w:instrText>
+              <w:instrText xml:space="preserve"> PAGEREF _Toc242981873 \h </w:instrText>
             </w:r>
             <w:r>
               <w:rPr>
@@ -2756,7 +2769,7 @@
               <w:noProof/>
             </w:rPr>
           </w:pPr>
-          <w:hyperlink w:anchor="_Toc242981445" w:history="1">
+          <w:hyperlink w:anchor="_Toc242981874" w:history="1">
             <w:r>
               <w:rPr>
                 <w:rStyle w:val="Hyperlink"/>
@@ -2780,7 +2793,7 @@
               <w:rPr>
                 <w:noProof/>
               </w:rPr>
-              <w:instrText xml:space="preserve"> PAGEREF _Toc242981445 \h </w:instrText>
+              <w:instrText xml:space="preserve"> PAGEREF _Toc242981874 \h </w:instrText>
             </w:r>
             <w:r>
               <w:rPr>
@@ -2817,7 +2830,7 @@
               <w:noProof/>
             </w:rPr>
           </w:pPr>
-          <w:hyperlink w:anchor="_Toc242981446" w:history="1">
+          <w:hyperlink w:anchor="_Toc242981875" w:history="1">
             <w:r>
               <w:rPr>
                 <w:rStyle w:val="Hyperlink"/>
@@ -2841,7 +2854,7 @@
               <w:rPr>
                 <w:noProof/>
               </w:rPr>
-              <w:instrText xml:space="preserve"> PAGEREF _Toc242981446 \h </w:instrText>
+              <w:instrText xml:space="preserve"> PAGEREF _Toc242981875 \h </w:instrText>
             </w:r>
             <w:r>
               <w:rPr>
@@ -2878,7 +2891,7 @@
               <w:noProof/>
             </w:rPr>
           </w:pPr>
-          <w:hyperlink w:anchor="_Toc242981447" w:history="1">
+          <w:hyperlink w:anchor="_Toc242981876" w:history="1">
             <w:r>
               <w:rPr>
                 <w:rStyle w:val="Hyperlink"/>
@@ -2902,7 +2915,7 @@
               <w:rPr>
                 <w:noProof/>
               </w:rPr>
-              <w:instrText xml:space="preserve"> PAGEREF _Toc242981447 \h </w:instrText>
+              <w:instrText xml:space="preserve"> PAGEREF _Toc242981876 \h </w:instrText>
             </w:r>
             <w:r>
               <w:rPr>
@@ -2939,7 +2952,7 @@
               <w:noProof/>
             </w:rPr>
           </w:pPr>
-          <w:hyperlink w:anchor="_Toc242981448" w:history="1">
+          <w:hyperlink w:anchor="_Toc242981877" w:history="1">
             <w:r>
               <w:rPr>
                 <w:rStyle w:val="Hyperlink"/>
@@ -2963,7 +2976,7 @@
               <w:rPr>
                 <w:noProof/>
               </w:rPr>
-              <w:instrText xml:space="preserve"> PAGEREF _Toc242981448 \h </w:instrText>
+              <w:instrText xml:space="preserve"> PAGEREF _Toc242981877 \h </w:instrText>
             </w:r>
             <w:r>
               <w:rPr>
@@ -3000,7 +3013,7 @@
               <w:noProof/>
             </w:rPr>
           </w:pPr>
-          <w:hyperlink w:anchor="_Toc242981449" w:history="1">
+          <w:hyperlink w:anchor="_Toc242981878" w:history="1">
             <w:r>
               <w:rPr>
                 <w:rStyle w:val="Hyperlink"/>
@@ -3024,7 +3037,7 @@
               <w:rPr>
                 <w:noProof/>
               </w:rPr>
-              <w:instrText xml:space="preserve"> PAGEREF _Toc242981449 \h </w:instrText>
+              <w:instrText xml:space="preserve"> PAGEREF _Toc242981878 \h </w:instrText>
             </w:r>
             <w:r>
               <w:rPr>
@@ -3061,7 +3074,7 @@
               <w:noProof/>
             </w:rPr>
           </w:pPr>
-          <w:hyperlink w:anchor="_Toc242981450" w:history="1">
+          <w:hyperlink w:anchor="_Toc242981879" w:history="1">
             <w:r>
               <w:rPr>
                 <w:rStyle w:val="Hyperlink"/>
@@ -3085,7 +3098,7 @@
               <w:rPr>
                 <w:noProof/>
               </w:rPr>
-              <w:instrText xml:space="preserve"> PAGEREF _Toc242981450 \h </w:instrText>
+              <w:instrText xml:space="preserve"> PAGEREF _Toc242981879 \h </w:instrText>
             </w:r>
             <w:r>
               <w:rPr>
@@ -3122,7 +3135,7 @@
               <w:noProof/>
             </w:rPr>
           </w:pPr>
-          <w:hyperlink w:anchor="_Toc242981451" w:history="1">
+          <w:hyperlink w:anchor="_Toc242981880" w:history="1">
             <w:r>
               <w:rPr>
                 <w:rStyle w:val="Hyperlink"/>
@@ -3146,7 +3159,7 @@
               <w:rPr>
                 <w:noProof/>
               </w:rPr>
-              <w:instrText xml:space="preserve"> PAGEREF _Toc242981451 \h </w:instrText>
+              <w:instrText xml:space="preserve"> PAGEREF _Toc242981880 \h </w:instrText>
             </w:r>
             <w:r>
               <w:rPr>
@@ -3183,7 +3196,7 @@
               <w:noProof/>
             </w:rPr>
           </w:pPr>
-          <w:hyperlink w:anchor="_Toc242981452" w:history="1">
+          <w:hyperlink w:anchor="_Toc242981881" w:history="1">
             <w:r>
               <w:rPr>
                 <w:rStyle w:val="Hyperlink"/>
@@ -3207,7 +3220,7 @@
               <w:rPr>
                 <w:noProof/>
               </w:rPr>
-              <w:instrText xml:space="preserve"> PAGEREF _Toc242981452 \h </w:instrText>
+              <w:instrText xml:space="preserve"> PAGEREF _Toc242981881 \h </w:instrText>
             </w:r>
             <w:r>
               <w:rPr>
@@ -3244,7 +3257,7 @@
               <w:noProof/>
             </w:rPr>
           </w:pPr>
-          <w:hyperlink w:anchor="_Toc242981453" w:history="1">
+          <w:hyperlink w:anchor="_Toc242981882" w:history="1">
             <w:r>
               <w:rPr>
                 <w:rStyle w:val="Hyperlink"/>
@@ -3268,7 +3281,7 @@
               <w:rPr>
                 <w:noProof/>
               </w:rPr>
-              <w:instrText xml:space="preserve"> PAGEREF _Toc242981453 \h </w:instrText>
+              <w:instrText xml:space="preserve"> PAGEREF _Toc242981882 \h </w:instrText>
             </w:r>
             <w:r>
               <w:rPr>
@@ -3305,7 +3318,7 @@
               <w:noProof/>
             </w:rPr>
           </w:pPr>
-          <w:hyperlink w:anchor="_Toc242981454" w:history="1">
+          <w:hyperlink w:anchor="_Toc242981883" w:history="1">
             <w:r>
               <w:rPr>
                 <w:rStyle w:val="Hyperlink"/>
@@ -3329,7 +3342,7 @@
               <w:rPr>
                 <w:noProof/>
               </w:rPr>
-              <w:instrText xml:space="preserve"> PAGEREF _Toc242981454 \h </w:instrText>
+              <w:instrText xml:space="preserve"> PAGEREF _Toc242981883 \h </w:instrText>
             </w:r>
             <w:r>
               <w:rPr>
@@ -3366,7 +3379,7 @@
               <w:noProof/>
             </w:rPr>
           </w:pPr>
-          <w:hyperlink w:anchor="_Toc242981455" w:history="1">
+          <w:hyperlink w:anchor="_Toc242981884" w:history="1">
             <w:r>
               <w:rPr>
                 <w:rStyle w:val="Hyperlink"/>
@@ -3390,7 +3403,7 @@
               <w:rPr>
                 <w:noProof/>
               </w:rPr>
-              <w:instrText xml:space="preserve"> PAGEREF _Toc242981455 \h </w:instrText>
+              <w:instrText xml:space="preserve"> PAGEREF _Toc242981884 \h </w:instrText>
             </w:r>
             <w:r>
               <w:rPr>
@@ -3427,7 +3440,7 @@
               <w:noProof/>
             </w:rPr>
           </w:pPr>
-          <w:hyperlink w:anchor="_Toc242981456" w:history="1">
+          <w:hyperlink w:anchor="_Toc242981885" w:history="1">
             <w:r>
               <w:rPr>
                 <w:rStyle w:val="Hyperlink"/>
@@ -3451,7 +3464,7 @@
               <w:rPr>
                 <w:noProof/>
               </w:rPr>
-              <w:instrText xml:space="preserve"> PAGEREF _Toc242981456 \h </w:instrText>
+              <w:instrText xml:space="preserve"> PAGEREF _Toc242981885 \h </w:instrText>
             </w:r>
             <w:r>
               <w:rPr>
@@ -3488,7 +3501,7 @@
               <w:noProof/>
             </w:rPr>
           </w:pPr>
-          <w:hyperlink w:anchor="_Toc242981457" w:history="1">
+          <w:hyperlink w:anchor="_Toc242981886" w:history="1">
             <w:r>
               <w:rPr>
                 <w:rStyle w:val="Hyperlink"/>
@@ -3512,7 +3525,7 @@
               <w:rPr>
                 <w:noProof/>
               </w:rPr>
-              <w:instrText xml:space="preserve"> PAGEREF _Toc242981457 \h </w:instrText>
+              <w:instrText xml:space="preserve"> PAGEREF _Toc242981886 \h </w:instrText>
             </w:r>
             <w:r>
               <w:rPr>
@@ -3549,7 +3562,7 @@
               <w:noProof/>
             </w:rPr>
           </w:pPr>
-          <w:hyperlink w:anchor="_Toc242981458" w:history="1">
+          <w:hyperlink w:anchor="_Toc242981887" w:history="1">
             <w:r>
               <w:rPr>
                 <w:rStyle w:val="Hyperlink"/>
@@ -3573,7 +3586,7 @@
               <w:rPr>
                 <w:noProof/>
               </w:rPr>
-              <w:instrText xml:space="preserve"> PAGEREF _Toc242981458 \h </w:instrText>
+              <w:instrText xml:space="preserve"> PAGEREF _Toc242981887 \h </w:instrText>
             </w:r>
             <w:r>
               <w:rPr>
@@ -3616,7 +3629,7 @@
       <w:pPr>
         <w:pStyle w:val="Heading1"/>
       </w:pPr>
-      <w:bookmarkStart w:id="3" w:name="_Toc242981407"/>
+      <w:bookmarkStart w:id="3" w:name="_Toc242981836"/>
       <w:r>
         <w:lastRenderedPageBreak/>
         <w:t>1. Introduction</w:t>
@@ -3627,7 +3640,7 @@
       <w:pPr>
         <w:pStyle w:val="Heading2"/>
       </w:pPr>
-      <w:bookmarkStart w:id="4" w:name="_Toc242981408"/>
+      <w:bookmarkStart w:id="4" w:name="_Toc242981837"/>
       <w:r>
         <w:t>1.1 Background</w:t>
       </w:r>
@@ -3658,7 +3671,7 @@
       <w:pPr>
         <w:pStyle w:val="Heading2"/>
       </w:pPr>
-      <w:bookmarkStart w:id="5" w:name="_Toc242981409"/>
+      <w:bookmarkStart w:id="5" w:name="_Toc242981838"/>
       <w:r>
         <w:t>1.2 Problem Statement</w:t>
       </w:r>
@@ -3684,7 +3697,7 @@
       <w:pPr>
         <w:pStyle w:val="Heading2"/>
       </w:pPr>
-      <w:bookmarkStart w:id="6" w:name="_Toc242981410"/>
+      <w:bookmarkStart w:id="6" w:name="_Toc242981839"/>
       <w:r>
         <w:t>1.3 Motivation and Significance</w:t>
       </w:r>
@@ -3703,7 +3716,7 @@
       <w:pPr>
         <w:pStyle w:val="Heading2"/>
       </w:pPr>
-      <w:bookmarkStart w:id="7" w:name="_Toc242981411"/>
+      <w:bookmarkStart w:id="7" w:name="_Toc242981840"/>
       <w:r>
         <w:lastRenderedPageBreak/>
         <w:t>1.4 Scope</w:t>
@@ -3746,7 +3759,7 @@
       <w:pPr>
         <w:pStyle w:val="Heading2"/>
       </w:pPr>
-      <w:bookmarkStart w:id="8" w:name="_Toc242981412"/>
+      <w:bookmarkStart w:id="8" w:name="_Toc242981841"/>
       <w:r>
         <w:t>1.5 Report Organisation</w:t>
       </w:r>
@@ -3765,7 +3778,7 @@
       <w:pPr>
         <w:pStyle w:val="Heading1"/>
       </w:pPr>
-      <w:bookmarkStart w:id="9" w:name="_Toc242981413"/>
+      <w:bookmarkStart w:id="9" w:name="_Toc242981842"/>
       <w:r>
         <w:t>2. Literature Survey / Related Work</w:t>
       </w:r>
@@ -6739,7 +6752,7 @@
       <w:pPr>
         <w:pStyle w:val="Heading2"/>
       </w:pPr>
-      <w:bookmarkStart w:id="10" w:name="_Toc242981414"/>
+      <w:bookmarkStart w:id="10" w:name="_Toc242981843"/>
       <w:r>
         <w:t>2.1 Comparative Synthesis</w:t>
       </w:r>
@@ -6813,7 +6826,7 @@
       <w:pPr>
         <w:pStyle w:val="Heading2"/>
       </w:pPr>
-      <w:bookmarkStart w:id="11" w:name="_Toc242981415"/>
+      <w:bookmarkStart w:id="11" w:name="_Toc242981844"/>
       <w:r>
         <w:t>2.2 Individual Research Gap Analysis</w:t>
       </w:r>
@@ -10228,7 +10241,7 @@
       <w:pPr>
         <w:pStyle w:val="Heading2"/>
       </w:pPr>
-      <w:bookmarkStart w:id="12" w:name="_Toc242981416"/>
+      <w:bookmarkStart w:id="12" w:name="_Toc242981845"/>
       <w:r>
         <w:t>2.3 Consolidated Research Gap</w:t>
       </w:r>
@@ -10250,7 +10263,7 @@
       <w:pPr>
         <w:pStyle w:val="Heading1"/>
       </w:pPr>
-      <w:bookmarkStart w:id="13" w:name="_Toc242981417"/>
+      <w:bookmarkStart w:id="13" w:name="_Toc242981846"/>
       <w:r>
         <w:t>3. Project Objectives</w:t>
       </w:r>
@@ -10441,7 +10454,7 @@
       <w:pPr>
         <w:pStyle w:val="Heading2"/>
       </w:pPr>
-      <w:bookmarkStart w:id="14" w:name="_Toc242981418"/>
+      <w:bookmarkStart w:id="14" w:name="_Toc242981847"/>
       <w:r>
         <w:t>3.1 Expected Outcomes</w:t>
       </w:r>
@@ -10463,7 +10476,7 @@
       <w:pPr>
         <w:pStyle w:val="Heading1"/>
       </w:pPr>
-      <w:bookmarkStart w:id="15" w:name="_Toc242981419"/>
+      <w:bookmarkStart w:id="15" w:name="_Toc242981848"/>
       <w:r>
         <w:t>4. Novelty Summary</w:t>
       </w:r>
@@ -11160,7 +11173,7 @@
       <w:pPr>
         <w:pStyle w:val="Heading1"/>
       </w:pPr>
-      <w:bookmarkStart w:id="16" w:name="_Toc242981420"/>
+      <w:bookmarkStart w:id="16" w:name="_Toc242981849"/>
       <w:r>
         <w:t>5. Proposed System and Architecture</w:t>
       </w:r>
@@ -11170,7 +11183,7 @@
       <w:pPr>
         <w:pStyle w:val="Heading2"/>
       </w:pPr>
-      <w:bookmarkStart w:id="17" w:name="_Toc242981421"/>
+      <w:bookmarkStart w:id="17" w:name="_Toc242981850"/>
       <w:r>
         <w:t>5.1 System Overview</w:t>
       </w:r>
@@ -11226,7 +11239,7 @@
       <w:pPr>
         <w:pStyle w:val="Heading2"/>
       </w:pPr>
-      <w:bookmarkStart w:id="18" w:name="_Toc242981422"/>
+      <w:bookmarkStart w:id="18" w:name="_Toc242981851"/>
       <w:r>
         <w:lastRenderedPageBreak/>
         <w:t>5.2 Diagram 1 - Cloud Deployment Architecture</w:t>
@@ -11244,7 +11257,7 @@
           <w:noProof/>
         </w:rPr>
         <w:drawing>
-          <wp:inline distT="0" distB="0" distL="0" distR="0" wp14:anchorId="3FD71007" wp14:editId="388EB5C9">
+          <wp:inline distT="0" distB="0" distL="0" distR="0" wp14:anchorId="7DCF1D5A" wp14:editId="0DA5F3EB">
             <wp:extent cx="5734050" cy="4019550"/>
             <wp:effectExtent l="0" t="0" r="0" b="0"/>
             <wp:docPr id="1" name="fig1_cloud_architecture.png" descr="Cloud Deployment Architecture (as deployed in AWS us-east-1)." title="Cloud Deployment Architecture (as deployed in AWS us-east-1)."/>
@@ -11497,7 +11510,7 @@
       <w:pPr>
         <w:pStyle w:val="Heading2"/>
       </w:pPr>
-      <w:bookmarkStart w:id="19" w:name="_Toc242981423"/>
+      <w:bookmarkStart w:id="19" w:name="_Toc242981852"/>
       <w:r>
         <w:lastRenderedPageBreak/>
         <w:t>5.3 Diagram 2 - Complete System Architecture / Workflow</w:t>
@@ -11515,7 +11528,7 @@
           <w:noProof/>
         </w:rPr>
         <w:drawing>
-          <wp:inline distT="0" distB="0" distL="0" distR="0" wp14:anchorId="55E0A04F" wp14:editId="2572CAB2">
+          <wp:inline distT="0" distB="0" distL="0" distR="0" wp14:anchorId="328B3957" wp14:editId="22239693">
             <wp:extent cx="5734050" cy="3629025"/>
             <wp:effectExtent l="0" t="0" r="0" b="0"/>
             <wp:docPr id="2" name="fig2_system_workflow.png" descr="Complete System Architecture and Workflow (ingestion path A and query path B)." title="Complete System Architecture and Workflow (ingestion path A and query path B)."/>
@@ -11601,7 +11614,7 @@
       <w:pPr>
         <w:pStyle w:val="Heading2"/>
       </w:pPr>
-      <w:bookmarkStart w:id="20" w:name="_Toc242981424"/>
+      <w:bookmarkStart w:id="20" w:name="_Toc242981853"/>
       <w:r>
         <w:t>5.4 Workflow and Use Cases</w:t>
       </w:r>
@@ -11722,7 +11735,7 @@
       <w:pPr>
         <w:pStyle w:val="Heading2"/>
       </w:pPr>
-      <w:bookmarkStart w:id="21" w:name="_Toc242981425"/>
+      <w:bookmarkStart w:id="21" w:name="_Toc242981854"/>
       <w:r>
         <w:t>5.5 Security, Availability and Scalability</w:t>
       </w:r>
@@ -11873,7 +11886,7 @@
       <w:pPr>
         <w:pStyle w:val="Heading1"/>
       </w:pPr>
-      <w:bookmarkStart w:id="22" w:name="_Toc242981426"/>
+      <w:bookmarkStart w:id="22" w:name="_Toc242981855"/>
       <w:r>
         <w:t>6. Dataset / Input Data Description</w:t>
       </w:r>
@@ -14299,7 +14312,7 @@
       <w:pPr>
         <w:pStyle w:val="Heading2"/>
       </w:pPr>
-      <w:bookmarkStart w:id="23" w:name="_Toc242981427"/>
+      <w:bookmarkStart w:id="23" w:name="_Toc242981856"/>
       <w:r>
         <w:t>6.1 Data Preparation</w:t>
       </w:r>
@@ -14365,7 +14378,7 @@
       <w:pPr>
         <w:pStyle w:val="Heading1"/>
       </w:pPr>
-      <w:bookmarkStart w:id="24" w:name="_Toc242981428"/>
+      <w:bookmarkStart w:id="24" w:name="_Toc242981857"/>
       <w:r>
         <w:lastRenderedPageBreak/>
         <w:t>7. Cloud Platform and Services Planning</w:t>
@@ -16713,7 +16726,7 @@
       <w:pPr>
         <w:pStyle w:val="Heading2"/>
       </w:pPr>
-      <w:bookmarkStart w:id="25" w:name="_Toc242981429"/>
+      <w:bookmarkStart w:id="25" w:name="_Toc242981858"/>
       <w:r>
         <w:t>7.1 Deployment and Network Design</w:t>
       </w:r>
@@ -16736,7 +16749,7 @@
       <w:pPr>
         <w:pStyle w:val="Heading2"/>
       </w:pPr>
-      <w:bookmarkStart w:id="26" w:name="_Toc242981430"/>
+      <w:bookmarkStart w:id="26" w:name="_Toc242981859"/>
       <w:r>
         <w:t>7.2 Cost Estimation</w:t>
       </w:r>
@@ -17389,7 +17402,7 @@
       <w:pPr>
         <w:pStyle w:val="Heading2"/>
       </w:pPr>
-      <w:bookmarkStart w:id="27" w:name="_Toc242981431"/>
+      <w:bookmarkStart w:id="27" w:name="_Toc242981860"/>
       <w:r>
         <w:t>7.3 Portability / Provider-Specific Choices</w:t>
       </w:r>
@@ -17412,7 +17425,7 @@
       <w:pPr>
         <w:pStyle w:val="Heading1"/>
       </w:pPr>
-      <w:bookmarkStart w:id="28" w:name="_Toc242981432"/>
+      <w:bookmarkStart w:id="28" w:name="_Toc242981861"/>
       <w:r>
         <w:t>8. Methodology and Implementation Plan</w:t>
       </w:r>
@@ -17422,7 +17435,7 @@
       <w:pPr>
         <w:pStyle w:val="Heading2"/>
       </w:pPr>
-      <w:bookmarkStart w:id="29" w:name="_Toc242981433"/>
+      <w:bookmarkStart w:id="29" w:name="_Toc242981862"/>
       <w:r>
         <w:t>8.1 Overall Methodology</w:t>
       </w:r>
@@ -17444,7 +17457,7 @@
       <w:pPr>
         <w:pStyle w:val="Heading2"/>
       </w:pPr>
-      <w:bookmarkStart w:id="30" w:name="_Toc242981434"/>
+      <w:bookmarkStart w:id="30" w:name="_Toc242981863"/>
       <w:r>
         <w:t>8.2 Tools and Technologies</w:t>
       </w:r>
@@ -18240,7 +18253,7 @@
       <w:pPr>
         <w:pStyle w:val="Heading2"/>
       </w:pPr>
-      <w:bookmarkStart w:id="31" w:name="_Toc242981435"/>
+      <w:bookmarkStart w:id="31" w:name="_Toc242981864"/>
       <w:r>
         <w:t>8.3 Step-by-Step Implementation Plan</w:t>
       </w:r>
@@ -18391,7 +18404,7 @@
       <w:pPr>
         <w:pStyle w:val="Heading2"/>
       </w:pPr>
-      <w:bookmarkStart w:id="32" w:name="_Toc242981436"/>
+      <w:bookmarkStart w:id="32" w:name="_Toc242981865"/>
       <w:r>
         <w:t>8.4 Evaluation Metrics</w:t>
       </w:r>
@@ -18501,7 +18514,7 @@
       <w:pPr>
         <w:pStyle w:val="Heading1"/>
       </w:pPr>
-      <w:bookmarkStart w:id="33" w:name="_Toc242981437"/>
+      <w:bookmarkStart w:id="33" w:name="_Toc242981866"/>
       <w:r>
         <w:t>9. Implementation / Development</w:t>
       </w:r>
@@ -18520,7 +18533,7 @@
       <w:pPr>
         <w:pStyle w:val="Heading2"/>
       </w:pPr>
-      <w:bookmarkStart w:id="34" w:name="_Toc242981438"/>
+      <w:bookmarkStart w:id="34" w:name="_Toc242981867"/>
       <w:r>
         <w:lastRenderedPageBreak/>
         <w:t>9.1 Implemented Modules</w:t>
@@ -20089,7 +20102,7 @@
       <w:pPr>
         <w:pStyle w:val="Heading2"/>
       </w:pPr>
-      <w:bookmarkStart w:id="35" w:name="_Toc242981439"/>
+      <w:bookmarkStart w:id="35" w:name="_Toc242981868"/>
       <w:r>
         <w:t>9.2 Screenshots and Configuration Evidence</w:t>
       </w:r>
@@ -20106,7 +20119,7 @@
           <w:noProof/>
         </w:rPr>
         <w:drawing>
-          <wp:inline distT="0" distB="0" distL="0" distR="0" wp14:anchorId="3FD6D9E4" wp14:editId="3071E7C1">
+          <wp:inline distT="0" distB="0" distL="0" distR="0" wp14:anchorId="4A544252" wp14:editId="1D81111E">
             <wp:extent cx="5734050" cy="3581400"/>
             <wp:effectExtent l="0" t="0" r="0" b="0"/>
             <wp:docPr id="3" name="01_landing.png" descr="Public landing page with live graph statistics and in-page Cognito sign-in (15 Oct 2026)." title="Public landing page with live graph statistics and in-page Cognito sign-in (15 Oct 2026)."/>
@@ -20190,7 +20203,7 @@
           <w:noProof/>
         </w:rPr>
         <w:drawing>
-          <wp:inline distT="0" distB="0" distL="0" distR="0" wp14:anchorId="1CD4AE7B" wp14:editId="26367695">
+          <wp:inline distT="0" distB="0" distL="0" distR="0" wp14:anchorId="7B7A70C1" wp14:editId="2344998C">
             <wp:extent cx="5734050" cy="3581400"/>
             <wp:effectExtent l="0" t="0" r="0" b="0"/>
             <wp:docPr id="4" name="03_ask.png" descr="Ask: GraphRAG answer to &quot;Which methods are used for link prediction?&quot; with citations, the graph of retrieved facts, and graph size (signed-in member)." title="Ask: GraphRAG answer to &quot;Which methods are used for link prediction?&quot; with citations, the graph of retrieved facts, and graph size (signed-in member)."/>
@@ -20274,7 +20287,7 @@
         </w:rPr>
         <w:lastRenderedPageBreak/>
         <w:drawing>
-          <wp:inline distT="0" distB="0" distL="0" distR="0" wp14:anchorId="126FFA10" wp14:editId="6CD8F9AC">
+          <wp:inline distT="0" distB="0" distL="0" distR="0" wp14:anchorId="19C34609" wp14:editId="73628741">
             <wp:extent cx="3295650" cy="4143375"/>
             <wp:effectExtent l="0" t="0" r="0" b="0"/>
             <wp:docPr id="5" name="05_connect.png" descr="Connect: the shortest multi-hop path between TransE and BERT (TransE is used by a survey that KG-CF cites, and KG-CF uses BERT)." title="Connect: the shortest multi-hop path between TransE and BERT (TransE is used by a survey that KG-CF cites, and KG-CF uses BERT)."/>
@@ -20350,7 +20363,7 @@
       <w:pPr>
         <w:pStyle w:val="Heading2"/>
       </w:pPr>
-      <w:bookmarkStart w:id="36" w:name="_Toc242981440"/>
+      <w:bookmarkStart w:id="36" w:name="_Toc242981869"/>
       <w:r>
         <w:t>9.3 Repository and Project Structure</w:t>
       </w:r>
@@ -21086,7 +21099,7 @@
       <w:pPr>
         <w:pStyle w:val="Heading2"/>
       </w:pPr>
-      <w:bookmarkStart w:id="37" w:name="_Toc242981441"/>
+      <w:bookmarkStart w:id="37" w:name="_Toc242981870"/>
       <w:r>
         <w:t>9.4 Version Control Workflow</w:t>
       </w:r>
@@ -21108,7 +21121,7 @@
       <w:pPr>
         <w:pStyle w:val="Heading1"/>
       </w:pPr>
-      <w:bookmarkStart w:id="38" w:name="_Toc242981442"/>
+      <w:bookmarkStart w:id="38" w:name="_Toc242981871"/>
       <w:r>
         <w:t>10. Testing, Results and Observations</w:t>
       </w:r>
@@ -21118,7 +21131,7 @@
       <w:pPr>
         <w:pStyle w:val="Heading2"/>
       </w:pPr>
-      <w:bookmarkStart w:id="39" w:name="_Toc242981443"/>
+      <w:bookmarkStart w:id="39" w:name="_Toc242981872"/>
       <w:r>
         <w:t>10.1 Test Plan and Test Cases</w:t>
       </w:r>
@@ -23706,7 +23719,7 @@
       <w:pPr>
         <w:pStyle w:val="Heading2"/>
       </w:pPr>
-      <w:bookmarkStart w:id="40" w:name="_Toc242981444"/>
+      <w:bookmarkStart w:id="40" w:name="_Toc242981873"/>
       <w:r>
         <w:t>10.2 Results</w:t>
       </w:r>
@@ -23740,7 +23753,7 @@
           <w:noProof/>
         </w:rPr>
         <w:drawing>
-          <wp:inline distT="0" distB="0" distL="0" distR="0" wp14:anchorId="5AEF2EB9" wp14:editId="24E05722">
+          <wp:inline distT="0" distB="0" distL="0" distR="0" wp14:anchorId="25EBCD77" wp14:editId="623603A7">
             <wp:extent cx="5124450" cy="2466975"/>
             <wp:effectExtent l="0" t="0" r="0" b="0"/>
             <wp:docPr id="6" name="fig_ner_f1.png" descr="SciBERT NER test F1 per entity type (overall 0.618; precision 0.593, recall 0.645)." title="SciBERT NER test F1 per entity type (overall 0.618; precision 0.593, recall 0.645)."/>
@@ -23815,7 +23828,7 @@
         </w:rPr>
         <w:lastRenderedPageBreak/>
         <w:drawing>
-          <wp:inline distT="0" distB="0" distL="0" distR="0" wp14:anchorId="4D7B8AB8" wp14:editId="178586BE">
+          <wp:inline distT="0" distB="0" distL="0" distR="0" wp14:anchorId="4D370B10" wp14:editId="53B04625">
             <wp:extent cx="5124450" cy="2619375"/>
             <wp:effectExtent l="0" t="0" r="0" b="0"/>
             <wp:docPr id="7" name="fig_re.png" descr="Relation extraction before and after the model improvement (SciERC test, calibrated on dev)." title="Relation extraction before and after the model improvement (SciERC test, calibrated on dev)."/>
@@ -23924,7 +23937,7 @@
           <w:noProof/>
         </w:rPr>
         <w:drawing>
-          <wp:inline distT="0" distB="0" distL="0" distR="0" wp14:anchorId="788EEEF4" wp14:editId="1E71EEDE">
+          <wp:inline distT="0" distB="0" distL="0" distR="0" wp14:anchorId="2C7FD169" wp14:editId="3E916610">
             <wp:extent cx="5124450" cy="2924175"/>
             <wp:effectExtent l="0" t="0" r="0" b="0"/>
             <wp:docPr id="8" name="fig_graphrag.png" descr="Hallucination benchmark: GraphRAG vs the same LLM without the graph (28 questions: 24 answerable, 4 about made-up entities)." title="Hallucination benchmark: GraphRAG vs the same LLM without the graph (28 questions: 24 answerable, 4 about made-up entities)."/>
@@ -24037,7 +24050,7 @@
       <w:pPr>
         <w:pStyle w:val="Heading2"/>
       </w:pPr>
-      <w:bookmarkStart w:id="41" w:name="_Toc242981445"/>
+      <w:bookmarkStart w:id="41" w:name="_Toc242981874"/>
       <w:r>
         <w:lastRenderedPageBreak/>
         <w:t>10.3 Baseline Comparison</w:t>
@@ -24949,7 +24962,7 @@
       <w:pPr>
         <w:pStyle w:val="Heading2"/>
       </w:pPr>
-      <w:bookmarkStart w:id="42" w:name="_Toc242981446"/>
+      <w:bookmarkStart w:id="42" w:name="_Toc242981875"/>
       <w:r>
         <w:t>10.4 Results Summary</w:t>
       </w:r>
@@ -25860,7 +25873,7 @@
       <w:pPr>
         <w:pStyle w:val="Heading1"/>
       </w:pPr>
-      <w:bookmarkStart w:id="43" w:name="_Toc242981447"/>
+      <w:bookmarkStart w:id="43" w:name="_Toc242981876"/>
       <w:r>
         <w:t>11. Discussion, Limitations and Risk Analysis</w:t>
       </w:r>
@@ -25870,7 +25883,7 @@
       <w:pPr>
         <w:pStyle w:val="Heading2"/>
       </w:pPr>
-      <w:bookmarkStart w:id="44" w:name="_Toc242981448"/>
+      <w:bookmarkStart w:id="44" w:name="_Toc242981877"/>
       <w:r>
         <w:t>11.1 Discussion</w:t>
       </w:r>
@@ -25902,7 +25915,7 @@
       <w:pPr>
         <w:pStyle w:val="Heading2"/>
       </w:pPr>
-      <w:bookmarkStart w:id="45" w:name="_Toc242981449"/>
+      <w:bookmarkStart w:id="45" w:name="_Toc242981878"/>
       <w:r>
         <w:t>11.2 Limitations</w:t>
       </w:r>
@@ -26036,7 +26049,7 @@
       <w:pPr>
         <w:pStyle w:val="Heading2"/>
       </w:pPr>
-      <w:bookmarkStart w:id="46" w:name="_Toc242981450"/>
+      <w:bookmarkStart w:id="46" w:name="_Toc242981879"/>
       <w:r>
         <w:t>11.3 Risks and Mitigation</w:t>
       </w:r>
@@ -26947,7 +26960,7 @@
       <w:pPr>
         <w:pStyle w:val="Heading1"/>
       </w:pPr>
-      <w:bookmarkStart w:id="47" w:name="_Toc242981451"/>
+      <w:bookmarkStart w:id="47" w:name="_Toc242981880"/>
       <w:r>
         <w:t>12. Team Contribution and Project Management</w:t>
       </w:r>
@@ -28100,7 +28113,7 @@
       <w:pPr>
         <w:pStyle w:val="Heading2"/>
       </w:pPr>
-      <w:bookmarkStart w:id="48" w:name="_Toc242981452"/>
+      <w:bookmarkStart w:id="48" w:name="_Toc242981881"/>
       <w:r>
         <w:lastRenderedPageBreak/>
         <w:t>12.1 Individual Contribution Evidence</w:t>
@@ -28180,7 +28193,7 @@
       <w:pPr>
         <w:pStyle w:val="Heading1"/>
       </w:pPr>
-      <w:bookmarkStart w:id="49" w:name="_Toc242981453"/>
+      <w:bookmarkStart w:id="49" w:name="_Toc242981882"/>
       <w:r>
         <w:t>13. Conclusion and Future Enhancements</w:t>
       </w:r>
@@ -28190,7 +28203,7 @@
       <w:pPr>
         <w:pStyle w:val="Heading2"/>
       </w:pPr>
-      <w:bookmarkStart w:id="50" w:name="_Toc242981454"/>
+      <w:bookmarkStart w:id="50" w:name="_Toc242981883"/>
       <w:r>
         <w:t>13.1 Conclusion</w:t>
       </w:r>
@@ -28212,7 +28225,7 @@
       <w:pPr>
         <w:pStyle w:val="Heading2"/>
       </w:pPr>
-      <w:bookmarkStart w:id="51" w:name="_Toc242981455"/>
+      <w:bookmarkStart w:id="51" w:name="_Toc242981884"/>
       <w:r>
         <w:t>13.2 Future Enhancements</w:t>
       </w:r>
@@ -28288,7 +28301,7 @@
       <w:pPr>
         <w:pStyle w:val="Heading1"/>
       </w:pPr>
-      <w:bookmarkStart w:id="52" w:name="_Toc242981456"/>
+      <w:bookmarkStart w:id="52" w:name="_Toc242981885"/>
       <w:r>
         <w:t>References</w:t>
       </w:r>
@@ -28531,7 +28544,7 @@
       <w:pPr>
         <w:pStyle w:val="Heading1"/>
       </w:pPr>
-      <w:bookmarkStart w:id="53" w:name="_Toc242981457"/>
+      <w:bookmarkStart w:id="53" w:name="_Toc242981886"/>
       <w:r>
         <w:t>Appendix A - Project Timeline</w:t>
       </w:r>
@@ -29787,7 +29800,7 @@
       <w:pPr>
         <w:pStyle w:val="Heading1"/>
       </w:pPr>
-      <w:bookmarkStart w:id="54" w:name="_Toc242981458"/>
+      <w:bookmarkStart w:id="54" w:name="_Toc242981887"/>
       <w:r>
         <w:t>Appendix B - Final Review Checklist</w:t>
       </w:r>
@@ -30021,64 +30034,10 @@
 <file path=word/numbering.xml><?xml version="1.0" encoding="utf-8"?>
 <w:numbering xmlns:wpc="http://schemas.microsoft.com/office/word/2010/wordprocessingCanvas" xmlns:cx="http://schemas.microsoft.com/office/drawing/2014/chartex" xmlns:cx1="http://schemas.microsoft.com/office/drawing/2015/9/8/chartex" xmlns:cx2="http://schemas.microsoft.com/office/drawing/2015/10/21/chartex" xmlns:cx3="http://schemas.microsoft.com/office/drawing/2016/5/9/chartex" xmlns:cx4="http://schemas.microsoft.com/office/drawing/2016/5/10/chartex" xmlns:cx5="http://schemas.microsoft.com/office/drawing/2016/5/11/chartex" xmlns:cx6="http://schemas.microsoft.com/office/drawing/2016/5/12/chartex" xmlns:cx7="http://schemas.microsoft.com/office/drawing/2016/5/13/chartex" xmlns:cx8="http://schemas.microsoft.com/office/drawing/2016/5/14/chartex" xmlns:mc="http://schemas.openxmlformats.org/markup-compatibility/2006" xmlns:aink="http://schemas.microsoft.com/office/drawing/2016/ink" xmlns:am3d="http://schemas.microsoft.com/office/drawing/2017/model3d" xmlns:o="urn:schemas-microsoft-com:office:office" xmlns:oel="http://schemas.microsoft.com/office/2019/extlst" xmlns:r="http://schemas.openxmlformats.org/officeDocument/2006/relationships" xmlns:m="http://schemas.openxmlformats.org/officeDocument/2006/math" xmlns:v="urn:schemas-microsoft-com:vml" xmlns:wp14="http://schemas.microsoft.com/office/word/2010/wordprocessingDrawing" xmlns:wp="http://schemas.openxmlformats.org/drawingml/2006/wordprocessingDrawing" xmlns:w10="urn:schemas-microsoft-com:office:word" xmlns:w="http://schemas.openxmlformats.org/wordprocessingml/2006/main" xmlns:w14="http://schemas.microsoft.com/office/word/2010/wordml" xmlns:w15="http://schemas.microsoft.com/office/word/2012/wordml" xmlns:w16cex="http://schemas.microsoft.com/office/word/2018/wordml/cex" xmlns:w16cid="http://schemas.microsoft.com/office/word/2016/wordml/cid" xmlns:w16="http://schemas.microsoft.com/office/word/2018/wordml" xmlns:w16du="http://schemas.microsoft.com/office/word/2023/wordml/word16du" xmlns:w16sdtdh="http://schemas.microsoft.com/office/word/2020/wordml/sdtdatahash" xmlns:w16sdtfl="http://schemas.microsoft.com/office/word/2024/wordml/sdtformatlock" xmlns:w16se="http://schemas.microsoft.com/office/word/2015/wordml/symex" xmlns:wpg="http://schemas.microsoft.com/office/word/2010/wordprocessingGroup" xmlns:wpi="http://schemas.microsoft.com/office/word/2010/wordprocessingInk" xmlns:wne="http://schemas.microsoft.com/office/word/2006/wordml" xmlns:wps="http://schemas.microsoft.com/office/word/2010/wordprocessingShape" mc:Ignorable="w14 w15 w16se w16cid w16 w16cex w16sdtdh w16sdtfl w16du wp14">
   <w:abstractNum w:abstractNumId="0" w15:restartNumberingAfterBreak="0">
-    <w:nsid w:val="0E3F36EB"/>
+    <w:nsid w:val="15A80A85"/>
     <w:multiLevelType w:val="hybridMultilevel"/>
-    <w:tmpl w:val="4E4C2F5E"/>
-    <w:lvl w:ilvl="0" w:tplc="8E280F82">
-      <w:start w:val="1"/>
-      <w:numFmt w:val="decimal"/>
-      <w:lvlText w:val="%1."/>
-      <w:lvlJc w:val="left"/>
-      <w:pPr>
-        <w:ind w:left="540" w:hanging="360"/>
-      </w:pPr>
-    </w:lvl>
-    <w:lvl w:ilvl="1" w:tplc="4F7CB902">
-      <w:numFmt w:val="decimal"/>
-      <w:lvlText w:val=""/>
-      <w:lvlJc w:val="left"/>
-    </w:lvl>
-    <w:lvl w:ilvl="2" w:tplc="05BEA384">
-      <w:numFmt w:val="decimal"/>
-      <w:lvlText w:val=""/>
-      <w:lvlJc w:val="left"/>
-    </w:lvl>
-    <w:lvl w:ilvl="3" w:tplc="9BE08CB2">
-      <w:numFmt w:val="decimal"/>
-      <w:lvlText w:val=""/>
-      <w:lvlJc w:val="left"/>
-    </w:lvl>
-    <w:lvl w:ilvl="4" w:tplc="FF808F6A">
-      <w:numFmt w:val="decimal"/>
-      <w:lvlText w:val=""/>
-      <w:lvlJc w:val="left"/>
-    </w:lvl>
-    <w:lvl w:ilvl="5" w:tplc="7BA6ECF2">
-      <w:numFmt w:val="decimal"/>
-      <w:lvlText w:val=""/>
-      <w:lvlJc w:val="left"/>
-    </w:lvl>
-    <w:lvl w:ilvl="6" w:tplc="93F46FE6">
-      <w:numFmt w:val="decimal"/>
-      <w:lvlText w:val=""/>
-      <w:lvlJc w:val="left"/>
-    </w:lvl>
-    <w:lvl w:ilvl="7" w:tplc="27925604">
-      <w:numFmt w:val="decimal"/>
-      <w:lvlText w:val=""/>
-      <w:lvlJc w:val="left"/>
-    </w:lvl>
-    <w:lvl w:ilvl="8" w:tplc="4F60A808">
-      <w:numFmt w:val="decimal"/>
-      <w:lvlText w:val=""/>
-      <w:lvlJc w:val="left"/>
-    </w:lvl>
-  </w:abstractNum>
-  <w:abstractNum w:abstractNumId="1" w15:restartNumberingAfterBreak="0">
-    <w:nsid w:val="2073234C"/>
-    <w:multiLevelType w:val="hybridMultilevel"/>
-    <w:tmpl w:val="B6987950"/>
-    <w:lvl w:ilvl="0" w:tplc="548E2B14" w:tentative="1">
+    <w:tmpl w:val="33245C74"/>
+    <w:lvl w:ilvl="0" w:tplc="55F2C0B8" w:tentative="1">
       <w:start w:val="1"/>
       <w:numFmt w:val="bullet"/>
       <w:lvlText w:val="●"/>
@@ -30087,7 +30046,7 @@
         <w:ind w:left="720" w:hanging="360"/>
       </w:pPr>
     </w:lvl>
-    <w:lvl w:ilvl="1" w:tplc="26F02608" w:tentative="1">
+    <w:lvl w:ilvl="1" w:tplc="E8242D28" w:tentative="1">
       <w:start w:val="1"/>
       <w:numFmt w:val="bullet"/>
       <w:lvlText w:val="○"/>
@@ -30096,7 +30055,7 @@
         <w:ind w:left="1440" w:hanging="360"/>
       </w:pPr>
     </w:lvl>
-    <w:lvl w:ilvl="2" w:tplc="78BC4DEE" w:tentative="1">
+    <w:lvl w:ilvl="2" w:tplc="CC9865D0" w:tentative="1">
       <w:start w:val="1"/>
       <w:numFmt w:val="bullet"/>
       <w:lvlText w:val="■"/>
@@ -30105,7 +30064,7 @@
         <w:ind w:left="2160" w:hanging="360"/>
       </w:pPr>
     </w:lvl>
-    <w:lvl w:ilvl="3" w:tplc="214EF912" w:tentative="1">
+    <w:lvl w:ilvl="3" w:tplc="538CBC4E" w:tentative="1">
       <w:start w:val="1"/>
       <w:numFmt w:val="bullet"/>
       <w:lvlText w:val="●"/>
@@ -30114,7 +30073,7 @@
         <w:ind w:left="2880" w:hanging="360"/>
       </w:pPr>
     </w:lvl>
-    <w:lvl w:ilvl="4" w:tplc="AF0CD89E" w:tentative="1">
+    <w:lvl w:ilvl="4" w:tplc="A2C6312A" w:tentative="1">
       <w:start w:val="1"/>
       <w:numFmt w:val="bullet"/>
       <w:lvlText w:val="○"/>
@@ -30123,7 +30082,7 @@
         <w:ind w:left="3600" w:hanging="360"/>
       </w:pPr>
     </w:lvl>
-    <w:lvl w:ilvl="5" w:tplc="E04E90D0" w:tentative="1">
+    <w:lvl w:ilvl="5" w:tplc="A5E81ED4" w:tentative="1">
       <w:start w:val="1"/>
       <w:numFmt w:val="bullet"/>
       <w:lvlText w:val="■"/>
@@ -30132,7 +30091,7 @@
         <w:ind w:left="4320" w:hanging="360"/>
       </w:pPr>
     </w:lvl>
-    <w:lvl w:ilvl="6" w:tplc="1AD6CEB0" w:tentative="1">
+    <w:lvl w:ilvl="6" w:tplc="2A267028" w:tentative="1">
       <w:start w:val="1"/>
       <w:numFmt w:val="bullet"/>
       <w:lvlText w:val="●"/>
@@ -30141,7 +30100,7 @@
         <w:ind w:left="5040" w:hanging="360"/>
       </w:pPr>
     </w:lvl>
-    <w:lvl w:ilvl="7" w:tplc="F5BCBE48" w:tentative="1">
+    <w:lvl w:ilvl="7" w:tplc="3F063D00" w:tentative="1">
       <w:start w:val="1"/>
       <w:numFmt w:val="bullet"/>
       <w:lvlText w:val="●"/>
@@ -30150,7 +30109,7 @@
         <w:ind w:left="5760" w:hanging="360"/>
       </w:pPr>
     </w:lvl>
-    <w:lvl w:ilvl="8" w:tplc="84E81F1E" w:tentative="1">
+    <w:lvl w:ilvl="8" w:tplc="A8A408F4" w:tentative="1">
       <w:start w:val="1"/>
       <w:numFmt w:val="bullet"/>
       <w:lvlText w:val="●"/>
@@ -30160,11 +30119,11 @@
       </w:pPr>
     </w:lvl>
   </w:abstractNum>
-  <w:abstractNum w:abstractNumId="2" w15:restartNumberingAfterBreak="0">
-    <w:nsid w:val="2F8823FC"/>
+  <w:abstractNum w:abstractNumId="1" w15:restartNumberingAfterBreak="0">
+    <w:nsid w:val="1CFE6C44"/>
     <w:multiLevelType w:val="hybridMultilevel"/>
-    <w:tmpl w:val="717ABF50"/>
-    <w:lvl w:ilvl="0" w:tplc="D0F874D6">
+    <w:tmpl w:val="632882B6"/>
+    <w:lvl w:ilvl="0" w:tplc="E03ACB6C">
       <w:start w:val="1"/>
       <w:numFmt w:val="decimal"/>
       <w:lvlText w:val="%1."/>
@@ -30173,52 +30132,106 @@
         <w:ind w:left="540" w:hanging="360"/>
       </w:pPr>
     </w:lvl>
-    <w:lvl w:ilvl="1" w:tplc="C6ECC43A">
+    <w:lvl w:ilvl="1" w:tplc="9E00E716">
       <w:numFmt w:val="decimal"/>
       <w:lvlText w:val=""/>
       <w:lvlJc w:val="left"/>
     </w:lvl>
-    <w:lvl w:ilvl="2" w:tplc="820A2C62">
+    <w:lvl w:ilvl="2" w:tplc="CD0E263E">
       <w:numFmt w:val="decimal"/>
       <w:lvlText w:val=""/>
       <w:lvlJc w:val="left"/>
     </w:lvl>
-    <w:lvl w:ilvl="3" w:tplc="16E22686">
+    <w:lvl w:ilvl="3" w:tplc="A2C4B922">
       <w:numFmt w:val="decimal"/>
       <w:lvlText w:val=""/>
       <w:lvlJc w:val="left"/>
     </w:lvl>
-    <w:lvl w:ilvl="4" w:tplc="4CFE1248">
+    <w:lvl w:ilvl="4" w:tplc="D868A74E">
       <w:numFmt w:val="decimal"/>
       <w:lvlText w:val=""/>
       <w:lvlJc w:val="left"/>
     </w:lvl>
-    <w:lvl w:ilvl="5" w:tplc="CA3045EC">
+    <w:lvl w:ilvl="5" w:tplc="CD2227A4">
       <w:numFmt w:val="decimal"/>
       <w:lvlText w:val=""/>
       <w:lvlJc w:val="left"/>
     </w:lvl>
-    <w:lvl w:ilvl="6" w:tplc="E794C500">
+    <w:lvl w:ilvl="6" w:tplc="2428592A">
       <w:numFmt w:val="decimal"/>
       <w:lvlText w:val=""/>
       <w:lvlJc w:val="left"/>
     </w:lvl>
-    <w:lvl w:ilvl="7" w:tplc="32AECCE8">
+    <w:lvl w:ilvl="7" w:tplc="05BAF740">
       <w:numFmt w:val="decimal"/>
       <w:lvlText w:val=""/>
       <w:lvlJc w:val="left"/>
     </w:lvl>
-    <w:lvl w:ilvl="8" w:tplc="5ACCD8EA">
+    <w:lvl w:ilvl="8" w:tplc="FDBEE784">
+      <w:numFmt w:val="decimal"/>
+      <w:lvlText w:val=""/>
+      <w:lvlJc w:val="left"/>
+    </w:lvl>
+  </w:abstractNum>
+  <w:abstractNum w:abstractNumId="2" w15:restartNumberingAfterBreak="0">
+    <w:nsid w:val="23047898"/>
+    <w:multiLevelType w:val="hybridMultilevel"/>
+    <w:tmpl w:val="52783098"/>
+    <w:lvl w:ilvl="0" w:tplc="8C865C38">
+      <w:start w:val="1"/>
+      <w:numFmt w:val="decimal"/>
+      <w:lvlText w:val="%1."/>
+      <w:lvlJc w:val="left"/>
+      <w:pPr>
+        <w:ind w:left="540" w:hanging="360"/>
+      </w:pPr>
+    </w:lvl>
+    <w:lvl w:ilvl="1" w:tplc="4C4A0E18">
+      <w:numFmt w:val="decimal"/>
+      <w:lvlText w:val=""/>
+      <w:lvlJc w:val="left"/>
+    </w:lvl>
+    <w:lvl w:ilvl="2" w:tplc="F85EE64C">
+      <w:numFmt w:val="decimal"/>
+      <w:lvlText w:val=""/>
+      <w:lvlJc w:val="left"/>
+    </w:lvl>
+    <w:lvl w:ilvl="3" w:tplc="B7525810">
+      <w:numFmt w:val="decimal"/>
+      <w:lvlText w:val=""/>
+      <w:lvlJc w:val="left"/>
+    </w:lvl>
+    <w:lvl w:ilvl="4" w:tplc="BBE6FC06">
+      <w:numFmt w:val="decimal"/>
+      <w:lvlText w:val=""/>
+      <w:lvlJc w:val="left"/>
+    </w:lvl>
+    <w:lvl w:ilvl="5" w:tplc="04384D56">
+      <w:numFmt w:val="decimal"/>
+      <w:lvlText w:val=""/>
+      <w:lvlJc w:val="left"/>
+    </w:lvl>
+    <w:lvl w:ilvl="6" w:tplc="508A3D38">
+      <w:numFmt w:val="decimal"/>
+      <w:lvlText w:val=""/>
+      <w:lvlJc w:val="left"/>
+    </w:lvl>
+    <w:lvl w:ilvl="7" w:tplc="1302B2B0">
+      <w:numFmt w:val="decimal"/>
+      <w:lvlText w:val=""/>
+      <w:lvlJc w:val="left"/>
+    </w:lvl>
+    <w:lvl w:ilvl="8" w:tplc="87F443E0">
       <w:numFmt w:val="decimal"/>
       <w:lvlText w:val=""/>
       <w:lvlJc w:val="left"/>
     </w:lvl>
   </w:abstractNum>
   <w:abstractNum w:abstractNumId="3" w15:restartNumberingAfterBreak="0">
-    <w:nsid w:val="567F16EB"/>
+    <w:nsid w:val="31CE7A88"/>
     <w:multiLevelType w:val="hybridMultilevel"/>
-    <w:tmpl w:val="D72E7EAE"/>
-    <w:lvl w:ilvl="0" w:tplc="7CB82E94">
+    <w:tmpl w:val="02CA3A3E"/>
+    <w:lvl w:ilvl="0" w:tplc="CE3E9AF0">
       <w:start w:val="1"/>
       <w:numFmt w:val="bullet"/>
       <w:lvlText w:val="•"/>
@@ -30227,7 +30240,7 @@
         <w:ind w:left="540" w:hanging="300"/>
       </w:pPr>
     </w:lvl>
-    <w:lvl w:ilvl="1" w:tplc="2DAA519A" w:tentative="1">
+    <w:lvl w:ilvl="1" w:tplc="8CAACDFC" w:tentative="1">
       <w:start w:val="1"/>
       <w:numFmt w:val="bullet"/>
       <w:lvlText w:val="–"/>
@@ -30236,47 +30249,47 @@
         <w:ind w:left="1080" w:hanging="300"/>
       </w:pPr>
     </w:lvl>
-    <w:lvl w:ilvl="2" w:tplc="E19010A8">
+    <w:lvl w:ilvl="2" w:tplc="B13CD7A0">
       <w:numFmt w:val="decimal"/>
       <w:lvlText w:val=""/>
       <w:lvlJc w:val="left"/>
     </w:lvl>
-    <w:lvl w:ilvl="3" w:tplc="65B07092">
+    <w:lvl w:ilvl="3" w:tplc="9EB878A2">
       <w:numFmt w:val="decimal"/>
       <w:lvlText w:val=""/>
       <w:lvlJc w:val="left"/>
     </w:lvl>
-    <w:lvl w:ilvl="4" w:tplc="2806B11C">
+    <w:lvl w:ilvl="4" w:tplc="7DF6AF50">
       <w:numFmt w:val="decimal"/>
       <w:lvlText w:val=""/>
       <w:lvlJc w:val="left"/>
     </w:lvl>
-    <w:lvl w:ilvl="5" w:tplc="28D4C0CC">
+    <w:lvl w:ilvl="5" w:tplc="123034AC">
       <w:numFmt w:val="decimal"/>
       <w:lvlText w:val=""/>
       <w:lvlJc w:val="left"/>
     </w:lvl>
-    <w:lvl w:ilvl="6" w:tplc="D71C07FC">
+    <w:lvl w:ilvl="6" w:tplc="1F48547E">
       <w:numFmt w:val="decimal"/>
       <w:lvlText w:val=""/>
       <w:lvlJc w:val="left"/>
     </w:lvl>
-    <w:lvl w:ilvl="7" w:tplc="AEE40E3A">
+    <w:lvl w:ilvl="7" w:tplc="FAD2DB02">
       <w:numFmt w:val="decimal"/>
       <w:lvlText w:val=""/>
       <w:lvlJc w:val="left"/>
     </w:lvl>
-    <w:lvl w:ilvl="8" w:tplc="47C60246">
+    <w:lvl w:ilvl="8" w:tplc="7F64BB5C">
       <w:numFmt w:val="decimal"/>
       <w:lvlText w:val=""/>
       <w:lvlJc w:val="left"/>
     </w:lvl>
   </w:abstractNum>
   <w:abstractNum w:abstractNumId="4" w15:restartNumberingAfterBreak="0">
-    <w:nsid w:val="75870D52"/>
+    <w:nsid w:val="75522BC1"/>
     <w:multiLevelType w:val="hybridMultilevel"/>
-    <w:tmpl w:val="46A0D5DA"/>
-    <w:lvl w:ilvl="0" w:tplc="C7EEA9C2">
+    <w:tmpl w:val="73CAAAE8"/>
+    <w:lvl w:ilvl="0" w:tplc="1D28DCE2">
       <w:start w:val="1"/>
       <w:numFmt w:val="decimal"/>
       <w:lvlText w:val="%1."/>
@@ -30285,73 +30298,73 @@
         <w:ind w:left="540" w:hanging="360"/>
       </w:pPr>
     </w:lvl>
-    <w:lvl w:ilvl="1" w:tplc="F0A6D474">
+    <w:lvl w:ilvl="1" w:tplc="86E6A690">
       <w:numFmt w:val="decimal"/>
       <w:lvlText w:val=""/>
       <w:lvlJc w:val="left"/>
     </w:lvl>
-    <w:lvl w:ilvl="2" w:tplc="F25C4022">
+    <w:lvl w:ilvl="2" w:tplc="8EC48040">
       <w:numFmt w:val="decimal"/>
       <w:lvlText w:val=""/>
       <w:lvlJc w:val="left"/>
     </w:lvl>
-    <w:lvl w:ilvl="3" w:tplc="DC8EBDDE">
+    <w:lvl w:ilvl="3" w:tplc="AB3CC642">
       <w:numFmt w:val="decimal"/>
       <w:lvlText w:val=""/>
       <w:lvlJc w:val="left"/>
     </w:lvl>
-    <w:lvl w:ilvl="4" w:tplc="9286866A">
+    <w:lvl w:ilvl="4" w:tplc="5D0057C0">
       <w:numFmt w:val="decimal"/>
       <w:lvlText w:val=""/>
       <w:lvlJc w:val="left"/>
     </w:lvl>
-    <w:lvl w:ilvl="5" w:tplc="F54C2F7C">
+    <w:lvl w:ilvl="5" w:tplc="F0F440EE">
       <w:numFmt w:val="decimal"/>
       <w:lvlText w:val=""/>
       <w:lvlJc w:val="left"/>
     </w:lvl>
-    <w:lvl w:ilvl="6" w:tplc="021059D6">
+    <w:lvl w:ilvl="6" w:tplc="66C0553C">
       <w:numFmt w:val="decimal"/>
       <w:lvlText w:val=""/>
       <w:lvlJc w:val="left"/>
     </w:lvl>
-    <w:lvl w:ilvl="7" w:tplc="CCB841DC">
+    <w:lvl w:ilvl="7" w:tplc="67603DCA">
       <w:numFmt w:val="decimal"/>
       <w:lvlText w:val=""/>
       <w:lvlJc w:val="left"/>
     </w:lvl>
-    <w:lvl w:ilvl="8" w:tplc="1178A7D0">
+    <w:lvl w:ilvl="8" w:tplc="02D2B520">
       <w:numFmt w:val="decimal"/>
       <w:lvlText w:val=""/>
       <w:lvlJc w:val="left"/>
     </w:lvl>
   </w:abstractNum>
-  <w:num w:numId="1" w16cid:durableId="1948537850">
-    <w:abstractNumId w:val="1"/>
+  <w:num w:numId="1" w16cid:durableId="1498306831">
+    <w:abstractNumId w:val="0"/>
     <w:lvlOverride w:ilvl="0">
       <w:startOverride w:val="1"/>
     </w:lvlOverride>
   </w:num>
-  <w:num w:numId="2" w16cid:durableId="1194228754">
+  <w:num w:numId="2" w16cid:durableId="167329306">
+    <w:abstractNumId w:val="4"/>
+    <w:lvlOverride w:ilvl="0">
+      <w:startOverride w:val="1"/>
+    </w:lvlOverride>
+  </w:num>
+  <w:num w:numId="3" w16cid:durableId="16349437">
     <w:abstractNumId w:val="2"/>
     <w:lvlOverride w:ilvl="0">
       <w:startOverride w:val="1"/>
     </w:lvlOverride>
   </w:num>
-  <w:num w:numId="3" w16cid:durableId="242877609">
-    <w:abstractNumId w:val="0"/>
-    <w:lvlOverride w:ilvl="0">
-      <w:startOverride w:val="1"/>
-    </w:lvlOverride>
-  </w:num>
-  <w:num w:numId="4" w16cid:durableId="134297632">
+  <w:num w:numId="4" w16cid:durableId="709573556">
     <w:abstractNumId w:val="3"/>
     <w:lvlOverride w:ilvl="0">
       <w:startOverride w:val="1"/>
     </w:lvlOverride>
   </w:num>
-  <w:num w:numId="5" w16cid:durableId="1933396486">
-    <w:abstractNumId w:val="4"/>
+  <w:num w:numId="5" w16cid:durableId="422995097">
+    <w:abstractNumId w:val="1"/>
     <w:lvlOverride w:ilvl="0">
       <w:startOverride w:val="1"/>
     </w:lvlOverride>
@@ -31002,7 +31015,7 @@
     <w:autoRedefine/>
     <w:uiPriority w:val="39"/>
     <w:unhideWhenUsed/>
-    <w:rsid w:val="00BF5445"/>
+    <w:rsid w:val="004D3996"/>
     <w:pPr>
       <w:spacing w:after="100"/>
     </w:pPr>
@@ -31014,7 +31027,7 @@
     <w:autoRedefine/>
     <w:uiPriority w:val="39"/>
     <w:unhideWhenUsed/>
-    <w:rsid w:val="00BF5445"/>
+    <w:rsid w:val="004D3996"/>
     <w:pPr>
       <w:spacing w:after="100"/>
       <w:ind w:left="240"/>

</xml_diff>

<commit_message>
Report: describe each member's contribution by area, split equally
Co-Authored-By: Claude Opus 5.5 <noreply@anthropic.com>
</commit_message>
<xml_diff>
--- a/docs/Project_Report.docx
+++ b/docs/Project_Report.docx
@@ -182,7 +182,7 @@
       <w:pPr>
         <w:pStyle w:val="Heading1"/>
       </w:pPr>
-      <w:bookmarkStart w:id="0" w:name="_Toc242981833"/>
+      <w:bookmarkStart w:id="0" w:name="_Toc242982065"/>
       <w:r>
         <w:lastRenderedPageBreak/>
         <w:t>Abstract</w:t>
@@ -211,7 +211,7 @@
       <w:pPr>
         <w:pStyle w:val="Heading2"/>
       </w:pPr>
-      <w:bookmarkStart w:id="1" w:name="_Toc242981834"/>
+      <w:bookmarkStart w:id="1" w:name="_Toc242982066"/>
       <w:r>
         <w:t>Keywords</w:t>
       </w:r>
@@ -235,7 +235,7 @@
       <w:pPr>
         <w:pStyle w:val="Heading1"/>
       </w:pPr>
-      <w:bookmarkStart w:id="2" w:name="_Toc242981835"/>
+      <w:bookmarkStart w:id="2" w:name="_Toc242982067"/>
       <w:r>
         <w:lastRenderedPageBreak/>
         <w:t>Table of Contents</w:t>
@@ -245,7 +245,7 @@
     <w:sdt>
       <w:sdtPr>
         <w:alias w:val="Table of Contents"/>
-        <w:id w:val="-1310475086"/>
+        <w:id w:val="984979076"/>
       </w:sdtPr>
       <w:sdtEndPr/>
       <w:sdtContent>
@@ -268,7 +268,7 @@
           <w:r>
             <w:fldChar w:fldCharType="separate"/>
           </w:r>
-          <w:hyperlink w:anchor="_Toc242981833" w:history="1">
+          <w:hyperlink w:anchor="_Toc242982065" w:history="1">
             <w:r>
               <w:rPr>
                 <w:rStyle w:val="Hyperlink"/>
@@ -292,7 +292,7 @@
               <w:rPr>
                 <w:noProof/>
               </w:rPr>
-              <w:instrText xml:space="preserve"> PAGEREF _Toc242981833 \h </w:instrText>
+              <w:instrText xml:space="preserve"> PAGEREF _Toc242982065 \h </w:instrText>
             </w:r>
             <w:r>
               <w:rPr>
@@ -329,7 +329,7 @@
               <w:noProof/>
             </w:rPr>
           </w:pPr>
-          <w:hyperlink w:anchor="_Toc242981834" w:history="1">
+          <w:hyperlink w:anchor="_Toc242982066" w:history="1">
             <w:r>
               <w:rPr>
                 <w:rStyle w:val="Hyperlink"/>
@@ -353,7 +353,7 @@
               <w:rPr>
                 <w:noProof/>
               </w:rPr>
-              <w:instrText xml:space="preserve"> PAGEREF _Toc242981834 \h </w:instrText>
+              <w:instrText xml:space="preserve"> PAGEREF _Toc242982066 \h </w:instrText>
             </w:r>
             <w:r>
               <w:rPr>
@@ -390,7 +390,7 @@
               <w:noProof/>
             </w:rPr>
           </w:pPr>
-          <w:hyperlink w:anchor="_Toc242981835" w:history="1">
+          <w:hyperlink w:anchor="_Toc242982067" w:history="1">
             <w:r>
               <w:rPr>
                 <w:rStyle w:val="Hyperlink"/>
@@ -414,7 +414,7 @@
               <w:rPr>
                 <w:noProof/>
               </w:rPr>
-              <w:instrText xml:space="preserve"> PAGEREF _Toc242981835 \h </w:instrText>
+              <w:instrText xml:space="preserve"> PAGEREF _Toc242982067 \h </w:instrText>
             </w:r>
             <w:r>
               <w:rPr>
@@ -451,7 +451,7 @@
               <w:noProof/>
             </w:rPr>
           </w:pPr>
-          <w:hyperlink w:anchor="_Toc242981836" w:history="1">
+          <w:hyperlink w:anchor="_Toc242982068" w:history="1">
             <w:r>
               <w:rPr>
                 <w:rStyle w:val="Hyperlink"/>
@@ -475,7 +475,7 @@
               <w:rPr>
                 <w:noProof/>
               </w:rPr>
-              <w:instrText xml:space="preserve"> PAGEREF _Toc242981836 \h </w:instrText>
+              <w:instrText xml:space="preserve"> PAGEREF _Toc242982068 \h </w:instrText>
             </w:r>
             <w:r>
               <w:rPr>
@@ -512,7 +512,7 @@
               <w:noProof/>
             </w:rPr>
           </w:pPr>
-          <w:hyperlink w:anchor="_Toc242981837" w:history="1">
+          <w:hyperlink w:anchor="_Toc242982069" w:history="1">
             <w:r>
               <w:rPr>
                 <w:rStyle w:val="Hyperlink"/>
@@ -536,7 +536,7 @@
               <w:rPr>
                 <w:noProof/>
               </w:rPr>
-              <w:instrText xml:space="preserve"> PAGEREF _Toc242981837 \h </w:instrText>
+              <w:instrText xml:space="preserve"> PAGEREF _Toc242982069 \h </w:instrText>
             </w:r>
             <w:r>
               <w:rPr>
@@ -573,7 +573,7 @@
               <w:noProof/>
             </w:rPr>
           </w:pPr>
-          <w:hyperlink w:anchor="_Toc242981838" w:history="1">
+          <w:hyperlink w:anchor="_Toc242982070" w:history="1">
             <w:r>
               <w:rPr>
                 <w:rStyle w:val="Hyperlink"/>
@@ -597,7 +597,7 @@
               <w:rPr>
                 <w:noProof/>
               </w:rPr>
-              <w:instrText xml:space="preserve"> PAGEREF _Toc242981838 \h </w:instrText>
+              <w:instrText xml:space="preserve"> PAGEREF _Toc242982070 \h </w:instrText>
             </w:r>
             <w:r>
               <w:rPr>
@@ -634,7 +634,7 @@
               <w:noProof/>
             </w:rPr>
           </w:pPr>
-          <w:hyperlink w:anchor="_Toc242981839" w:history="1">
+          <w:hyperlink w:anchor="_Toc242982071" w:history="1">
             <w:r>
               <w:rPr>
                 <w:rStyle w:val="Hyperlink"/>
@@ -658,7 +658,7 @@
               <w:rPr>
                 <w:noProof/>
               </w:rPr>
-              <w:instrText xml:space="preserve"> PAGEREF _Toc242981839 \h </w:instrText>
+              <w:instrText xml:space="preserve"> PAGEREF _Toc242982071 \h </w:instrText>
             </w:r>
             <w:r>
               <w:rPr>
@@ -695,7 +695,7 @@
               <w:noProof/>
             </w:rPr>
           </w:pPr>
-          <w:hyperlink w:anchor="_Toc242981840" w:history="1">
+          <w:hyperlink w:anchor="_Toc242982072" w:history="1">
             <w:r>
               <w:rPr>
                 <w:rStyle w:val="Hyperlink"/>
@@ -719,7 +719,7 @@
               <w:rPr>
                 <w:noProof/>
               </w:rPr>
-              <w:instrText xml:space="preserve"> PAGEREF _Toc242981840 \h </w:instrText>
+              <w:instrText xml:space="preserve"> PAGEREF _Toc242982072 \h </w:instrText>
             </w:r>
             <w:r>
               <w:rPr>
@@ -756,7 +756,7 @@
               <w:noProof/>
             </w:rPr>
           </w:pPr>
-          <w:hyperlink w:anchor="_Toc242981841" w:history="1">
+          <w:hyperlink w:anchor="_Toc242982073" w:history="1">
             <w:r>
               <w:rPr>
                 <w:rStyle w:val="Hyperlink"/>
@@ -780,7 +780,7 @@
               <w:rPr>
                 <w:noProof/>
               </w:rPr>
-              <w:instrText xml:space="preserve"> PAGEREF _Toc242981841 \h </w:instrText>
+              <w:instrText xml:space="preserve"> PAGEREF _Toc242982073 \h </w:instrText>
             </w:r>
             <w:r>
               <w:rPr>
@@ -817,7 +817,7 @@
               <w:noProof/>
             </w:rPr>
           </w:pPr>
-          <w:hyperlink w:anchor="_Toc242981842" w:history="1">
+          <w:hyperlink w:anchor="_Toc242982074" w:history="1">
             <w:r>
               <w:rPr>
                 <w:rStyle w:val="Hyperlink"/>
@@ -841,7 +841,7 @@
               <w:rPr>
                 <w:noProof/>
               </w:rPr>
-              <w:instrText xml:space="preserve"> PAGEREF _Toc242981842 \h </w:instrText>
+              <w:instrText xml:space="preserve"> PAGEREF _Toc242982074 \h </w:instrText>
             </w:r>
             <w:r>
               <w:rPr>
@@ -878,7 +878,7 @@
               <w:noProof/>
             </w:rPr>
           </w:pPr>
-          <w:hyperlink w:anchor="_Toc242981843" w:history="1">
+          <w:hyperlink w:anchor="_Toc242982075" w:history="1">
             <w:r>
               <w:rPr>
                 <w:rStyle w:val="Hyperlink"/>
@@ -902,7 +902,7 @@
               <w:rPr>
                 <w:noProof/>
               </w:rPr>
-              <w:instrText xml:space="preserve"> PAGEREF _Toc242981843 \h </w:instrText>
+              <w:instrText xml:space="preserve"> PAGEREF _Toc242982075 \h </w:instrText>
             </w:r>
             <w:r>
               <w:rPr>
@@ -939,7 +939,7 @@
               <w:noProof/>
             </w:rPr>
           </w:pPr>
-          <w:hyperlink w:anchor="_Toc242981844" w:history="1">
+          <w:hyperlink w:anchor="_Toc242982076" w:history="1">
             <w:r>
               <w:rPr>
                 <w:rStyle w:val="Hyperlink"/>
@@ -963,7 +963,7 @@
               <w:rPr>
                 <w:noProof/>
               </w:rPr>
-              <w:instrText xml:space="preserve"> PAGEREF _Toc242981844 \h </w:instrText>
+              <w:instrText xml:space="preserve"> PAGEREF _Toc242982076 \h </w:instrText>
             </w:r>
             <w:r>
               <w:rPr>
@@ -1000,7 +1000,7 @@
               <w:noProof/>
             </w:rPr>
           </w:pPr>
-          <w:hyperlink w:anchor="_Toc242981845" w:history="1">
+          <w:hyperlink w:anchor="_Toc242982077" w:history="1">
             <w:r>
               <w:rPr>
                 <w:rStyle w:val="Hyperlink"/>
@@ -1024,7 +1024,7 @@
               <w:rPr>
                 <w:noProof/>
               </w:rPr>
-              <w:instrText xml:space="preserve"> PAGEREF _Toc242981845 \h </w:instrText>
+              <w:instrText xml:space="preserve"> PAGEREF _Toc242982077 \h </w:instrText>
             </w:r>
             <w:r>
               <w:rPr>
@@ -1061,7 +1061,7 @@
               <w:noProof/>
             </w:rPr>
           </w:pPr>
-          <w:hyperlink w:anchor="_Toc242981846" w:history="1">
+          <w:hyperlink w:anchor="_Toc242982078" w:history="1">
             <w:r>
               <w:rPr>
                 <w:rStyle w:val="Hyperlink"/>
@@ -1085,7 +1085,7 @@
               <w:rPr>
                 <w:noProof/>
               </w:rPr>
-              <w:instrText xml:space="preserve"> PAGEREF _Toc242981846 \h </w:instrText>
+              <w:instrText xml:space="preserve"> PAGEREF _Toc242982078 \h </w:instrText>
             </w:r>
             <w:r>
               <w:rPr>
@@ -1122,7 +1122,7 @@
               <w:noProof/>
             </w:rPr>
           </w:pPr>
-          <w:hyperlink w:anchor="_Toc242981847" w:history="1">
+          <w:hyperlink w:anchor="_Toc242982079" w:history="1">
             <w:r>
               <w:rPr>
                 <w:rStyle w:val="Hyperlink"/>
@@ -1146,7 +1146,7 @@
               <w:rPr>
                 <w:noProof/>
               </w:rPr>
-              <w:instrText xml:space="preserve"> PAGEREF _Toc242981847 \h </w:instrText>
+              <w:instrText xml:space="preserve"> PAGEREF _Toc242982079 \h </w:instrText>
             </w:r>
             <w:r>
               <w:rPr>
@@ -1183,7 +1183,7 @@
               <w:noProof/>
             </w:rPr>
           </w:pPr>
-          <w:hyperlink w:anchor="_Toc242981848" w:history="1">
+          <w:hyperlink w:anchor="_Toc242982080" w:history="1">
             <w:r>
               <w:rPr>
                 <w:rStyle w:val="Hyperlink"/>
@@ -1207,7 +1207,7 @@
               <w:rPr>
                 <w:noProof/>
               </w:rPr>
-              <w:instrText xml:space="preserve"> PAGEREF _Toc242981848 \h </w:instrText>
+              <w:instrText xml:space="preserve"> PAGEREF _Toc242982080 \h </w:instrText>
             </w:r>
             <w:r>
               <w:rPr>
@@ -1244,7 +1244,7 @@
               <w:noProof/>
             </w:rPr>
           </w:pPr>
-          <w:hyperlink w:anchor="_Toc242981849" w:history="1">
+          <w:hyperlink w:anchor="_Toc242982081" w:history="1">
             <w:r>
               <w:rPr>
                 <w:rStyle w:val="Hyperlink"/>
@@ -1268,7 +1268,7 @@
               <w:rPr>
                 <w:noProof/>
               </w:rPr>
-              <w:instrText xml:space="preserve"> PAGEREF _Toc242981849 \h </w:instrText>
+              <w:instrText xml:space="preserve"> PAGEREF _Toc242982081 \h </w:instrText>
             </w:r>
             <w:r>
               <w:rPr>
@@ -1305,7 +1305,7 @@
               <w:noProof/>
             </w:rPr>
           </w:pPr>
-          <w:hyperlink w:anchor="_Toc242981850" w:history="1">
+          <w:hyperlink w:anchor="_Toc242982082" w:history="1">
             <w:r>
               <w:rPr>
                 <w:rStyle w:val="Hyperlink"/>
@@ -1329,7 +1329,7 @@
               <w:rPr>
                 <w:noProof/>
               </w:rPr>
-              <w:instrText xml:space="preserve"> PAGEREF _Toc242981850 \h </w:instrText>
+              <w:instrText xml:space="preserve"> PAGEREF _Toc242982082 \h </w:instrText>
             </w:r>
             <w:r>
               <w:rPr>
@@ -1366,7 +1366,7 @@
               <w:noProof/>
             </w:rPr>
           </w:pPr>
-          <w:hyperlink w:anchor="_Toc242981851" w:history="1">
+          <w:hyperlink w:anchor="_Toc242982083" w:history="1">
             <w:r>
               <w:rPr>
                 <w:rStyle w:val="Hyperlink"/>
@@ -1390,7 +1390,7 @@
               <w:rPr>
                 <w:noProof/>
               </w:rPr>
-              <w:instrText xml:space="preserve"> PAGEREF _Toc242981851 \h </w:instrText>
+              <w:instrText xml:space="preserve"> PAGEREF _Toc242982083 \h </w:instrText>
             </w:r>
             <w:r>
               <w:rPr>
@@ -1427,7 +1427,7 @@
               <w:noProof/>
             </w:rPr>
           </w:pPr>
-          <w:hyperlink w:anchor="_Toc242981852" w:history="1">
+          <w:hyperlink w:anchor="_Toc242982084" w:history="1">
             <w:r>
               <w:rPr>
                 <w:rStyle w:val="Hyperlink"/>
@@ -1451,7 +1451,7 @@
               <w:rPr>
                 <w:noProof/>
               </w:rPr>
-              <w:instrText xml:space="preserve"> PAGEREF _Toc242981852 \h </w:instrText>
+              <w:instrText xml:space="preserve"> PAGEREF _Toc242982084 \h </w:instrText>
             </w:r>
             <w:r>
               <w:rPr>
@@ -1488,7 +1488,7 @@
               <w:noProof/>
             </w:rPr>
           </w:pPr>
-          <w:hyperlink w:anchor="_Toc242981853" w:history="1">
+          <w:hyperlink w:anchor="_Toc242982085" w:history="1">
             <w:r>
               <w:rPr>
                 <w:rStyle w:val="Hyperlink"/>
@@ -1512,7 +1512,7 @@
               <w:rPr>
                 <w:noProof/>
               </w:rPr>
-              <w:instrText xml:space="preserve"> PAGEREF _Toc242981853 \h </w:instrText>
+              <w:instrText xml:space="preserve"> PAGEREF _Toc242982085 \h </w:instrText>
             </w:r>
             <w:r>
               <w:rPr>
@@ -1549,7 +1549,7 @@
               <w:noProof/>
             </w:rPr>
           </w:pPr>
-          <w:hyperlink w:anchor="_Toc242981854" w:history="1">
+          <w:hyperlink w:anchor="_Toc242982086" w:history="1">
             <w:r>
               <w:rPr>
                 <w:rStyle w:val="Hyperlink"/>
@@ -1573,7 +1573,7 @@
               <w:rPr>
                 <w:noProof/>
               </w:rPr>
-              <w:instrText xml:space="preserve"> PAGEREF _Toc242981854 \h </w:instrText>
+              <w:instrText xml:space="preserve"> PAGEREF _Toc242982086 \h </w:instrText>
             </w:r>
             <w:r>
               <w:rPr>
@@ -1610,7 +1610,7 @@
               <w:noProof/>
             </w:rPr>
           </w:pPr>
-          <w:hyperlink w:anchor="_Toc242981855" w:history="1">
+          <w:hyperlink w:anchor="_Toc242982087" w:history="1">
             <w:r>
               <w:rPr>
                 <w:rStyle w:val="Hyperlink"/>
@@ -1634,7 +1634,7 @@
               <w:rPr>
                 <w:noProof/>
               </w:rPr>
-              <w:instrText xml:space="preserve"> PAGEREF _Toc242981855 \h </w:instrText>
+              <w:instrText xml:space="preserve"> PAGEREF _Toc242982087 \h </w:instrText>
             </w:r>
             <w:r>
               <w:rPr>
@@ -1671,7 +1671,7 @@
               <w:noProof/>
             </w:rPr>
           </w:pPr>
-          <w:hyperlink w:anchor="_Toc242981856" w:history="1">
+          <w:hyperlink w:anchor="_Toc242982088" w:history="1">
             <w:r>
               <w:rPr>
                 <w:rStyle w:val="Hyperlink"/>
@@ -1695,7 +1695,7 @@
               <w:rPr>
                 <w:noProof/>
               </w:rPr>
-              <w:instrText xml:space="preserve"> PAGEREF _Toc242981856 \h </w:instrText>
+              <w:instrText xml:space="preserve"> PAGEREF _Toc242982088 \h </w:instrText>
             </w:r>
             <w:r>
               <w:rPr>
@@ -1732,7 +1732,7 @@
               <w:noProof/>
             </w:rPr>
           </w:pPr>
-          <w:hyperlink w:anchor="_Toc242981857" w:history="1">
+          <w:hyperlink w:anchor="_Toc242982089" w:history="1">
             <w:r>
               <w:rPr>
                 <w:rStyle w:val="Hyperlink"/>
@@ -1756,7 +1756,7 @@
               <w:rPr>
                 <w:noProof/>
               </w:rPr>
-              <w:instrText xml:space="preserve"> PAGEREF _Toc242981857 \h </w:instrText>
+              <w:instrText xml:space="preserve"> PAGEREF _Toc242982089 \h </w:instrText>
             </w:r>
             <w:r>
               <w:rPr>
@@ -1793,7 +1793,7 @@
               <w:noProof/>
             </w:rPr>
           </w:pPr>
-          <w:hyperlink w:anchor="_Toc242981858" w:history="1">
+          <w:hyperlink w:anchor="_Toc242982090" w:history="1">
             <w:r>
               <w:rPr>
                 <w:rStyle w:val="Hyperlink"/>
@@ -1817,7 +1817,7 @@
               <w:rPr>
                 <w:noProof/>
               </w:rPr>
-              <w:instrText xml:space="preserve"> PAGEREF _Toc242981858 \h </w:instrText>
+              <w:instrText xml:space="preserve"> PAGEREF _Toc242982090 \h </w:instrText>
             </w:r>
             <w:r>
               <w:rPr>
@@ -1854,7 +1854,7 @@
               <w:noProof/>
             </w:rPr>
           </w:pPr>
-          <w:hyperlink w:anchor="_Toc242981859" w:history="1">
+          <w:hyperlink w:anchor="_Toc242982091" w:history="1">
             <w:r>
               <w:rPr>
                 <w:rStyle w:val="Hyperlink"/>
@@ -1878,7 +1878,7 @@
               <w:rPr>
                 <w:noProof/>
               </w:rPr>
-              <w:instrText xml:space="preserve"> PAGEREF _Toc242981859 \h </w:instrText>
+              <w:instrText xml:space="preserve"> PAGEREF _Toc242982091 \h </w:instrText>
             </w:r>
             <w:r>
               <w:rPr>
@@ -1915,7 +1915,7 @@
               <w:noProof/>
             </w:rPr>
           </w:pPr>
-          <w:hyperlink w:anchor="_Toc242981860" w:history="1">
+          <w:hyperlink w:anchor="_Toc242982092" w:history="1">
             <w:r>
               <w:rPr>
                 <w:rStyle w:val="Hyperlink"/>
@@ -1939,7 +1939,7 @@
               <w:rPr>
                 <w:noProof/>
               </w:rPr>
-              <w:instrText xml:space="preserve"> PAGEREF _Toc242981860 \h </w:instrText>
+              <w:instrText xml:space="preserve"> PAGEREF _Toc242982092 \h </w:instrText>
             </w:r>
             <w:r>
               <w:rPr>
@@ -1976,7 +1976,7 @@
               <w:noProof/>
             </w:rPr>
           </w:pPr>
-          <w:hyperlink w:anchor="_Toc242981861" w:history="1">
+          <w:hyperlink w:anchor="_Toc242982093" w:history="1">
             <w:r>
               <w:rPr>
                 <w:rStyle w:val="Hyperlink"/>
@@ -2000,7 +2000,7 @@
               <w:rPr>
                 <w:noProof/>
               </w:rPr>
-              <w:instrText xml:space="preserve"> PAGEREF _Toc242981861 \h </w:instrText>
+              <w:instrText xml:space="preserve"> PAGEREF _Toc242982093 \h </w:instrText>
             </w:r>
             <w:r>
               <w:rPr>
@@ -2037,7 +2037,7 @@
               <w:noProof/>
             </w:rPr>
           </w:pPr>
-          <w:hyperlink w:anchor="_Toc242981862" w:history="1">
+          <w:hyperlink w:anchor="_Toc242982094" w:history="1">
             <w:r>
               <w:rPr>
                 <w:rStyle w:val="Hyperlink"/>
@@ -2061,7 +2061,7 @@
               <w:rPr>
                 <w:noProof/>
               </w:rPr>
-              <w:instrText xml:space="preserve"> PAGEREF _Toc242981862 \h </w:instrText>
+              <w:instrText xml:space="preserve"> PAGEREF _Toc242982094 \h </w:instrText>
             </w:r>
             <w:r>
               <w:rPr>
@@ -2098,7 +2098,7 @@
               <w:noProof/>
             </w:rPr>
           </w:pPr>
-          <w:hyperlink w:anchor="_Toc242981863" w:history="1">
+          <w:hyperlink w:anchor="_Toc242982095" w:history="1">
             <w:r>
               <w:rPr>
                 <w:rStyle w:val="Hyperlink"/>
@@ -2122,7 +2122,7 @@
               <w:rPr>
                 <w:noProof/>
               </w:rPr>
-              <w:instrText xml:space="preserve"> PAGEREF _Toc242981863 \h </w:instrText>
+              <w:instrText xml:space="preserve"> PAGEREF _Toc242982095 \h </w:instrText>
             </w:r>
             <w:r>
               <w:rPr>
@@ -2159,7 +2159,7 @@
               <w:noProof/>
             </w:rPr>
           </w:pPr>
-          <w:hyperlink w:anchor="_Toc242981864" w:history="1">
+          <w:hyperlink w:anchor="_Toc242982096" w:history="1">
             <w:r>
               <w:rPr>
                 <w:rStyle w:val="Hyperlink"/>
@@ -2183,7 +2183,7 @@
               <w:rPr>
                 <w:noProof/>
               </w:rPr>
-              <w:instrText xml:space="preserve"> PAGEREF _Toc242981864 \h </w:instrText>
+              <w:instrText xml:space="preserve"> PAGEREF _Toc242982096 \h </w:instrText>
             </w:r>
             <w:r>
               <w:rPr>
@@ -2220,7 +2220,7 @@
               <w:noProof/>
             </w:rPr>
           </w:pPr>
-          <w:hyperlink w:anchor="_Toc242981865" w:history="1">
+          <w:hyperlink w:anchor="_Toc242982097" w:history="1">
             <w:r>
               <w:rPr>
                 <w:rStyle w:val="Hyperlink"/>
@@ -2244,7 +2244,7 @@
               <w:rPr>
                 <w:noProof/>
               </w:rPr>
-              <w:instrText xml:space="preserve"> PAGEREF _Toc242981865 \h </w:instrText>
+              <w:instrText xml:space="preserve"> PAGEREF _Toc242982097 \h </w:instrText>
             </w:r>
             <w:r>
               <w:rPr>
@@ -2281,7 +2281,7 @@
               <w:noProof/>
             </w:rPr>
           </w:pPr>
-          <w:hyperlink w:anchor="_Toc242981866" w:history="1">
+          <w:hyperlink w:anchor="_Toc242982098" w:history="1">
             <w:r>
               <w:rPr>
                 <w:rStyle w:val="Hyperlink"/>
@@ -2305,7 +2305,7 @@
               <w:rPr>
                 <w:noProof/>
               </w:rPr>
-              <w:instrText xml:space="preserve"> PAGEREF _Toc242981866 \h </w:instrText>
+              <w:instrText xml:space="preserve"> PAGEREF _Toc242982098 \h </w:instrText>
             </w:r>
             <w:r>
               <w:rPr>
@@ -2342,7 +2342,7 @@
               <w:noProof/>
             </w:rPr>
           </w:pPr>
-          <w:hyperlink w:anchor="_Toc242981867" w:history="1">
+          <w:hyperlink w:anchor="_Toc242982099" w:history="1">
             <w:r>
               <w:rPr>
                 <w:rStyle w:val="Hyperlink"/>
@@ -2366,7 +2366,7 @@
               <w:rPr>
                 <w:noProof/>
               </w:rPr>
-              <w:instrText xml:space="preserve"> PAGEREF _Toc242981867 \h </w:instrText>
+              <w:instrText xml:space="preserve"> PAGEREF _Toc242982099 \h </w:instrText>
             </w:r>
             <w:r>
               <w:rPr>
@@ -2403,7 +2403,7 @@
               <w:noProof/>
             </w:rPr>
           </w:pPr>
-          <w:hyperlink w:anchor="_Toc242981868" w:history="1">
+          <w:hyperlink w:anchor="_Toc242982100" w:history="1">
             <w:r>
               <w:rPr>
                 <w:rStyle w:val="Hyperlink"/>
@@ -2427,7 +2427,7 @@
               <w:rPr>
                 <w:noProof/>
               </w:rPr>
-              <w:instrText xml:space="preserve"> PAGEREF _Toc242981868 \h </w:instrText>
+              <w:instrText xml:space="preserve"> PAGEREF _Toc242982100 \h </w:instrText>
             </w:r>
             <w:r>
               <w:rPr>
@@ -2464,7 +2464,7 @@
               <w:noProof/>
             </w:rPr>
           </w:pPr>
-          <w:hyperlink w:anchor="_Toc242981869" w:history="1">
+          <w:hyperlink w:anchor="_Toc242982101" w:history="1">
             <w:r>
               <w:rPr>
                 <w:rStyle w:val="Hyperlink"/>
@@ -2488,7 +2488,7 @@
               <w:rPr>
                 <w:noProof/>
               </w:rPr>
-              <w:instrText xml:space="preserve"> PAGEREF _Toc242981869 \h </w:instrText>
+              <w:instrText xml:space="preserve"> PAGEREF _Toc242982101 \h </w:instrText>
             </w:r>
             <w:r>
               <w:rPr>
@@ -2525,7 +2525,7 @@
               <w:noProof/>
             </w:rPr>
           </w:pPr>
-          <w:hyperlink w:anchor="_Toc242981870" w:history="1">
+          <w:hyperlink w:anchor="_Toc242982102" w:history="1">
             <w:r>
               <w:rPr>
                 <w:rStyle w:val="Hyperlink"/>
@@ -2549,7 +2549,7 @@
               <w:rPr>
                 <w:noProof/>
               </w:rPr>
-              <w:instrText xml:space="preserve"> PAGEREF _Toc242981870 \h </w:instrText>
+              <w:instrText xml:space="preserve"> PAGEREF _Toc242982102 \h </w:instrText>
             </w:r>
             <w:r>
               <w:rPr>
@@ -2586,7 +2586,7 @@
               <w:noProof/>
             </w:rPr>
           </w:pPr>
-          <w:hyperlink w:anchor="_Toc242981871" w:history="1">
+          <w:hyperlink w:anchor="_Toc242982103" w:history="1">
             <w:r>
               <w:rPr>
                 <w:rStyle w:val="Hyperlink"/>
@@ -2610,7 +2610,7 @@
               <w:rPr>
                 <w:noProof/>
               </w:rPr>
-              <w:instrText xml:space="preserve"> PAGEREF _Toc242981871 \h </w:instrText>
+              <w:instrText xml:space="preserve"> PAGEREF _Toc242982103 \h </w:instrText>
             </w:r>
             <w:r>
               <w:rPr>
@@ -2647,7 +2647,7 @@
               <w:noProof/>
             </w:rPr>
           </w:pPr>
-          <w:hyperlink w:anchor="_Toc242981872" w:history="1">
+          <w:hyperlink w:anchor="_Toc242982104" w:history="1">
             <w:r>
               <w:rPr>
                 <w:rStyle w:val="Hyperlink"/>
@@ -2671,7 +2671,7 @@
               <w:rPr>
                 <w:noProof/>
               </w:rPr>
-              <w:instrText xml:space="preserve"> PAGEREF _Toc242981872 \h </w:instrText>
+              <w:instrText xml:space="preserve"> PAGEREF _Toc242982104 \h </w:instrText>
             </w:r>
             <w:r>
               <w:rPr>
@@ -2708,7 +2708,7 @@
               <w:noProof/>
             </w:rPr>
           </w:pPr>
-          <w:hyperlink w:anchor="_Toc242981873" w:history="1">
+          <w:hyperlink w:anchor="_Toc242982105" w:history="1">
             <w:r>
               <w:rPr>
                 <w:rStyle w:val="Hyperlink"/>
@@ -2732,7 +2732,7 @@
               <w:rPr>
                 <w:noProof/>
               </w:rPr>
-              <w:instrText xml:space="preserve"> PAGEREF _Toc242981873 \h </w:instrText>
+              <w:instrText xml:space="preserve"> PAGEREF _Toc242982105 \h </w:instrText>
             </w:r>
             <w:r>
               <w:rPr>
@@ -2769,7 +2769,7 @@
               <w:noProof/>
             </w:rPr>
           </w:pPr>
-          <w:hyperlink w:anchor="_Toc242981874" w:history="1">
+          <w:hyperlink w:anchor="_Toc242982106" w:history="1">
             <w:r>
               <w:rPr>
                 <w:rStyle w:val="Hyperlink"/>
@@ -2793,7 +2793,7 @@
               <w:rPr>
                 <w:noProof/>
               </w:rPr>
-              <w:instrText xml:space="preserve"> PAGEREF _Toc242981874 \h </w:instrText>
+              <w:instrText xml:space="preserve"> PAGEREF _Toc242982106 \h </w:instrText>
             </w:r>
             <w:r>
               <w:rPr>
@@ -2830,7 +2830,7 @@
               <w:noProof/>
             </w:rPr>
           </w:pPr>
-          <w:hyperlink w:anchor="_Toc242981875" w:history="1">
+          <w:hyperlink w:anchor="_Toc242982107" w:history="1">
             <w:r>
               <w:rPr>
                 <w:rStyle w:val="Hyperlink"/>
@@ -2854,7 +2854,7 @@
               <w:rPr>
                 <w:noProof/>
               </w:rPr>
-              <w:instrText xml:space="preserve"> PAGEREF _Toc242981875 \h </w:instrText>
+              <w:instrText xml:space="preserve"> PAGEREF _Toc242982107 \h </w:instrText>
             </w:r>
             <w:r>
               <w:rPr>
@@ -2891,7 +2891,7 @@
               <w:noProof/>
             </w:rPr>
           </w:pPr>
-          <w:hyperlink w:anchor="_Toc242981876" w:history="1">
+          <w:hyperlink w:anchor="_Toc242982108" w:history="1">
             <w:r>
               <w:rPr>
                 <w:rStyle w:val="Hyperlink"/>
@@ -2915,7 +2915,7 @@
               <w:rPr>
                 <w:noProof/>
               </w:rPr>
-              <w:instrText xml:space="preserve"> PAGEREF _Toc242981876 \h </w:instrText>
+              <w:instrText xml:space="preserve"> PAGEREF _Toc242982108 \h </w:instrText>
             </w:r>
             <w:r>
               <w:rPr>
@@ -2952,7 +2952,7 @@
               <w:noProof/>
             </w:rPr>
           </w:pPr>
-          <w:hyperlink w:anchor="_Toc242981877" w:history="1">
+          <w:hyperlink w:anchor="_Toc242982109" w:history="1">
             <w:r>
               <w:rPr>
                 <w:rStyle w:val="Hyperlink"/>
@@ -2976,7 +2976,7 @@
               <w:rPr>
                 <w:noProof/>
               </w:rPr>
-              <w:instrText xml:space="preserve"> PAGEREF _Toc242981877 \h </w:instrText>
+              <w:instrText xml:space="preserve"> PAGEREF _Toc242982109 \h </w:instrText>
             </w:r>
             <w:r>
               <w:rPr>
@@ -3013,7 +3013,7 @@
               <w:noProof/>
             </w:rPr>
           </w:pPr>
-          <w:hyperlink w:anchor="_Toc242981878" w:history="1">
+          <w:hyperlink w:anchor="_Toc242982110" w:history="1">
             <w:r>
               <w:rPr>
                 <w:rStyle w:val="Hyperlink"/>
@@ -3037,7 +3037,7 @@
               <w:rPr>
                 <w:noProof/>
               </w:rPr>
-              <w:instrText xml:space="preserve"> PAGEREF _Toc242981878 \h </w:instrText>
+              <w:instrText xml:space="preserve"> PAGEREF _Toc242982110 \h </w:instrText>
             </w:r>
             <w:r>
               <w:rPr>
@@ -3074,7 +3074,7 @@
               <w:noProof/>
             </w:rPr>
           </w:pPr>
-          <w:hyperlink w:anchor="_Toc242981879" w:history="1">
+          <w:hyperlink w:anchor="_Toc242982111" w:history="1">
             <w:r>
               <w:rPr>
                 <w:rStyle w:val="Hyperlink"/>
@@ -3098,7 +3098,7 @@
               <w:rPr>
                 <w:noProof/>
               </w:rPr>
-              <w:instrText xml:space="preserve"> PAGEREF _Toc242981879 \h </w:instrText>
+              <w:instrText xml:space="preserve"> PAGEREF _Toc242982111 \h </w:instrText>
             </w:r>
             <w:r>
               <w:rPr>
@@ -3135,7 +3135,7 @@
               <w:noProof/>
             </w:rPr>
           </w:pPr>
-          <w:hyperlink w:anchor="_Toc242981880" w:history="1">
+          <w:hyperlink w:anchor="_Toc242982112" w:history="1">
             <w:r>
               <w:rPr>
                 <w:rStyle w:val="Hyperlink"/>
@@ -3159,7 +3159,7 @@
               <w:rPr>
                 <w:noProof/>
               </w:rPr>
-              <w:instrText xml:space="preserve"> PAGEREF _Toc242981880 \h </w:instrText>
+              <w:instrText xml:space="preserve"> PAGEREF _Toc242982112 \h </w:instrText>
             </w:r>
             <w:r>
               <w:rPr>
@@ -3196,7 +3196,7 @@
               <w:noProof/>
             </w:rPr>
           </w:pPr>
-          <w:hyperlink w:anchor="_Toc242981881" w:history="1">
+          <w:hyperlink w:anchor="_Toc242982113" w:history="1">
             <w:r>
               <w:rPr>
                 <w:rStyle w:val="Hyperlink"/>
@@ -3220,7 +3220,7 @@
               <w:rPr>
                 <w:noProof/>
               </w:rPr>
-              <w:instrText xml:space="preserve"> PAGEREF _Toc242981881 \h </w:instrText>
+              <w:instrText xml:space="preserve"> PAGEREF _Toc242982113 \h </w:instrText>
             </w:r>
             <w:r>
               <w:rPr>
@@ -3257,7 +3257,7 @@
               <w:noProof/>
             </w:rPr>
           </w:pPr>
-          <w:hyperlink w:anchor="_Toc242981882" w:history="1">
+          <w:hyperlink w:anchor="_Toc242982114" w:history="1">
             <w:r>
               <w:rPr>
                 <w:rStyle w:val="Hyperlink"/>
@@ -3281,7 +3281,7 @@
               <w:rPr>
                 <w:noProof/>
               </w:rPr>
-              <w:instrText xml:space="preserve"> PAGEREF _Toc242981882 \h </w:instrText>
+              <w:instrText xml:space="preserve"> PAGEREF _Toc242982114 \h </w:instrText>
             </w:r>
             <w:r>
               <w:rPr>
@@ -3298,7 +3298,7 @@
               <w:rPr>
                 <w:noProof/>
               </w:rPr>
-              <w:t>34</w:t>
+              <w:t>35</w:t>
             </w:r>
             <w:r>
               <w:rPr>
@@ -3318,7 +3318,7 @@
               <w:noProof/>
             </w:rPr>
           </w:pPr>
-          <w:hyperlink w:anchor="_Toc242981883" w:history="1">
+          <w:hyperlink w:anchor="_Toc242982115" w:history="1">
             <w:r>
               <w:rPr>
                 <w:rStyle w:val="Hyperlink"/>
@@ -3342,7 +3342,7 @@
               <w:rPr>
                 <w:noProof/>
               </w:rPr>
-              <w:instrText xml:space="preserve"> PAGEREF _Toc242981883 \h </w:instrText>
+              <w:instrText xml:space="preserve"> PAGEREF _Toc242982115 \h </w:instrText>
             </w:r>
             <w:r>
               <w:rPr>
@@ -3359,7 +3359,7 @@
               <w:rPr>
                 <w:noProof/>
               </w:rPr>
-              <w:t>34</w:t>
+              <w:t>35</w:t>
             </w:r>
             <w:r>
               <w:rPr>
@@ -3379,7 +3379,7 @@
               <w:noProof/>
             </w:rPr>
           </w:pPr>
-          <w:hyperlink w:anchor="_Toc242981884" w:history="1">
+          <w:hyperlink w:anchor="_Toc242982116" w:history="1">
             <w:r>
               <w:rPr>
                 <w:rStyle w:val="Hyperlink"/>
@@ -3403,7 +3403,7 @@
               <w:rPr>
                 <w:noProof/>
               </w:rPr>
-              <w:instrText xml:space="preserve"> PAGEREF _Toc242981884 \h </w:instrText>
+              <w:instrText xml:space="preserve"> PAGEREF _Toc242982116 \h </w:instrText>
             </w:r>
             <w:r>
               <w:rPr>
@@ -3420,7 +3420,7 @@
               <w:rPr>
                 <w:noProof/>
               </w:rPr>
-              <w:t>34</w:t>
+              <w:t>35</w:t>
             </w:r>
             <w:r>
               <w:rPr>
@@ -3440,7 +3440,7 @@
               <w:noProof/>
             </w:rPr>
           </w:pPr>
-          <w:hyperlink w:anchor="_Toc242981885" w:history="1">
+          <w:hyperlink w:anchor="_Toc242982117" w:history="1">
             <w:r>
               <w:rPr>
                 <w:rStyle w:val="Hyperlink"/>
@@ -3464,7 +3464,7 @@
               <w:rPr>
                 <w:noProof/>
               </w:rPr>
-              <w:instrText xml:space="preserve"> PAGEREF _Toc242981885 \h </w:instrText>
+              <w:instrText xml:space="preserve"> PAGEREF _Toc242982117 \h </w:instrText>
             </w:r>
             <w:r>
               <w:rPr>
@@ -3481,7 +3481,7 @@
               <w:rPr>
                 <w:noProof/>
               </w:rPr>
-              <w:t>35</w:t>
+              <w:t>36</w:t>
             </w:r>
             <w:r>
               <w:rPr>
@@ -3501,7 +3501,7 @@
               <w:noProof/>
             </w:rPr>
           </w:pPr>
-          <w:hyperlink w:anchor="_Toc242981886" w:history="1">
+          <w:hyperlink w:anchor="_Toc242982118" w:history="1">
             <w:r>
               <w:rPr>
                 <w:rStyle w:val="Hyperlink"/>
@@ -3525,7 +3525,7 @@
               <w:rPr>
                 <w:noProof/>
               </w:rPr>
-              <w:instrText xml:space="preserve"> PAGEREF _Toc242981886 \h </w:instrText>
+              <w:instrText xml:space="preserve"> PAGEREF _Toc242982118 \h </w:instrText>
             </w:r>
             <w:r>
               <w:rPr>
@@ -3542,7 +3542,7 @@
               <w:rPr>
                 <w:noProof/>
               </w:rPr>
-              <w:t>37</w:t>
+              <w:t>38</w:t>
             </w:r>
             <w:r>
               <w:rPr>
@@ -3562,7 +3562,7 @@
               <w:noProof/>
             </w:rPr>
           </w:pPr>
-          <w:hyperlink w:anchor="_Toc242981887" w:history="1">
+          <w:hyperlink w:anchor="_Toc242982119" w:history="1">
             <w:r>
               <w:rPr>
                 <w:rStyle w:val="Hyperlink"/>
@@ -3586,7 +3586,7 @@
               <w:rPr>
                 <w:noProof/>
               </w:rPr>
-              <w:instrText xml:space="preserve"> PAGEREF _Toc242981887 \h </w:instrText>
+              <w:instrText xml:space="preserve"> PAGEREF _Toc242982119 \h </w:instrText>
             </w:r>
             <w:r>
               <w:rPr>
@@ -3603,7 +3603,7 @@
               <w:rPr>
                 <w:noProof/>
               </w:rPr>
-              <w:t>38</w:t>
+              <w:t>39</w:t>
             </w:r>
             <w:r>
               <w:rPr>
@@ -3629,7 +3629,7 @@
       <w:pPr>
         <w:pStyle w:val="Heading1"/>
       </w:pPr>
-      <w:bookmarkStart w:id="3" w:name="_Toc242981836"/>
+      <w:bookmarkStart w:id="3" w:name="_Toc242982068"/>
       <w:r>
         <w:lastRenderedPageBreak/>
         <w:t>1. Introduction</w:t>
@@ -3640,7 +3640,7 @@
       <w:pPr>
         <w:pStyle w:val="Heading2"/>
       </w:pPr>
-      <w:bookmarkStart w:id="4" w:name="_Toc242981837"/>
+      <w:bookmarkStart w:id="4" w:name="_Toc242982069"/>
       <w:r>
         <w:t>1.1 Background</w:t>
       </w:r>
@@ -3671,7 +3671,7 @@
       <w:pPr>
         <w:pStyle w:val="Heading2"/>
       </w:pPr>
-      <w:bookmarkStart w:id="5" w:name="_Toc242981838"/>
+      <w:bookmarkStart w:id="5" w:name="_Toc242982070"/>
       <w:r>
         <w:t>1.2 Problem Statement</w:t>
       </w:r>
@@ -3697,7 +3697,7 @@
       <w:pPr>
         <w:pStyle w:val="Heading2"/>
       </w:pPr>
-      <w:bookmarkStart w:id="6" w:name="_Toc242981839"/>
+      <w:bookmarkStart w:id="6" w:name="_Toc242982071"/>
       <w:r>
         <w:t>1.3 Motivation and Significance</w:t>
       </w:r>
@@ -3716,7 +3716,7 @@
       <w:pPr>
         <w:pStyle w:val="Heading2"/>
       </w:pPr>
-      <w:bookmarkStart w:id="7" w:name="_Toc242981840"/>
+      <w:bookmarkStart w:id="7" w:name="_Toc242982072"/>
       <w:r>
         <w:lastRenderedPageBreak/>
         <w:t>1.4 Scope</w:t>
@@ -3759,7 +3759,7 @@
       <w:pPr>
         <w:pStyle w:val="Heading2"/>
       </w:pPr>
-      <w:bookmarkStart w:id="8" w:name="_Toc242981841"/>
+      <w:bookmarkStart w:id="8" w:name="_Toc242982073"/>
       <w:r>
         <w:t>1.5 Report Organisation</w:t>
       </w:r>
@@ -3778,7 +3778,7 @@
       <w:pPr>
         <w:pStyle w:val="Heading1"/>
       </w:pPr>
-      <w:bookmarkStart w:id="9" w:name="_Toc242981842"/>
+      <w:bookmarkStart w:id="9" w:name="_Toc242982074"/>
       <w:r>
         <w:t>2. Literature Survey / Related Work</w:t>
       </w:r>
@@ -6752,7 +6752,7 @@
       <w:pPr>
         <w:pStyle w:val="Heading2"/>
       </w:pPr>
-      <w:bookmarkStart w:id="10" w:name="_Toc242981843"/>
+      <w:bookmarkStart w:id="10" w:name="_Toc242982075"/>
       <w:r>
         <w:t>2.1 Comparative Synthesis</w:t>
       </w:r>
@@ -6826,7 +6826,7 @@
       <w:pPr>
         <w:pStyle w:val="Heading2"/>
       </w:pPr>
-      <w:bookmarkStart w:id="11" w:name="_Toc242981844"/>
+      <w:bookmarkStart w:id="11" w:name="_Toc242982076"/>
       <w:r>
         <w:t>2.2 Individual Research Gap Analysis</w:t>
       </w:r>
@@ -10241,7 +10241,7 @@
       <w:pPr>
         <w:pStyle w:val="Heading2"/>
       </w:pPr>
-      <w:bookmarkStart w:id="12" w:name="_Toc242981845"/>
+      <w:bookmarkStart w:id="12" w:name="_Toc242982077"/>
       <w:r>
         <w:t>2.3 Consolidated Research Gap</w:t>
       </w:r>
@@ -10263,7 +10263,7 @@
       <w:pPr>
         <w:pStyle w:val="Heading1"/>
       </w:pPr>
-      <w:bookmarkStart w:id="13" w:name="_Toc242981846"/>
+      <w:bookmarkStart w:id="13" w:name="_Toc242982078"/>
       <w:r>
         <w:t>3. Project Objectives</w:t>
       </w:r>
@@ -10454,7 +10454,7 @@
       <w:pPr>
         <w:pStyle w:val="Heading2"/>
       </w:pPr>
-      <w:bookmarkStart w:id="14" w:name="_Toc242981847"/>
+      <w:bookmarkStart w:id="14" w:name="_Toc242982079"/>
       <w:r>
         <w:t>3.1 Expected Outcomes</w:t>
       </w:r>
@@ -10476,7 +10476,7 @@
       <w:pPr>
         <w:pStyle w:val="Heading1"/>
       </w:pPr>
-      <w:bookmarkStart w:id="15" w:name="_Toc242981848"/>
+      <w:bookmarkStart w:id="15" w:name="_Toc242982080"/>
       <w:r>
         <w:t>4. Novelty Summary</w:t>
       </w:r>
@@ -11173,7 +11173,7 @@
       <w:pPr>
         <w:pStyle w:val="Heading1"/>
       </w:pPr>
-      <w:bookmarkStart w:id="16" w:name="_Toc242981849"/>
+      <w:bookmarkStart w:id="16" w:name="_Toc242982081"/>
       <w:r>
         <w:t>5. Proposed System and Architecture</w:t>
       </w:r>
@@ -11183,7 +11183,7 @@
       <w:pPr>
         <w:pStyle w:val="Heading2"/>
       </w:pPr>
-      <w:bookmarkStart w:id="17" w:name="_Toc242981850"/>
+      <w:bookmarkStart w:id="17" w:name="_Toc242982082"/>
       <w:r>
         <w:t>5.1 System Overview</w:t>
       </w:r>
@@ -11239,7 +11239,7 @@
       <w:pPr>
         <w:pStyle w:val="Heading2"/>
       </w:pPr>
-      <w:bookmarkStart w:id="18" w:name="_Toc242981851"/>
+      <w:bookmarkStart w:id="18" w:name="_Toc242982083"/>
       <w:r>
         <w:lastRenderedPageBreak/>
         <w:t>5.2 Diagram 1 - Cloud Deployment Architecture</w:t>
@@ -11257,7 +11257,7 @@
           <w:noProof/>
         </w:rPr>
         <w:drawing>
-          <wp:inline distT="0" distB="0" distL="0" distR="0" wp14:anchorId="7DCF1D5A" wp14:editId="0DA5F3EB">
+          <wp:inline distT="0" distB="0" distL="0" distR="0" wp14:anchorId="04839BA9" wp14:editId="47F742B0">
             <wp:extent cx="5734050" cy="4019550"/>
             <wp:effectExtent l="0" t="0" r="0" b="0"/>
             <wp:docPr id="1" name="fig1_cloud_architecture.png" descr="Cloud Deployment Architecture (as deployed in AWS us-east-1)." title="Cloud Deployment Architecture (as deployed in AWS us-east-1)."/>
@@ -11510,7 +11510,7 @@
       <w:pPr>
         <w:pStyle w:val="Heading2"/>
       </w:pPr>
-      <w:bookmarkStart w:id="19" w:name="_Toc242981852"/>
+      <w:bookmarkStart w:id="19" w:name="_Toc242982084"/>
       <w:r>
         <w:lastRenderedPageBreak/>
         <w:t>5.3 Diagram 2 - Complete System Architecture / Workflow</w:t>
@@ -11528,7 +11528,7 @@
           <w:noProof/>
         </w:rPr>
         <w:drawing>
-          <wp:inline distT="0" distB="0" distL="0" distR="0" wp14:anchorId="328B3957" wp14:editId="22239693">
+          <wp:inline distT="0" distB="0" distL="0" distR="0" wp14:anchorId="73C63ECA" wp14:editId="1763B7F5">
             <wp:extent cx="5734050" cy="3629025"/>
             <wp:effectExtent l="0" t="0" r="0" b="0"/>
             <wp:docPr id="2" name="fig2_system_workflow.png" descr="Complete System Architecture and Workflow (ingestion path A and query path B)." title="Complete System Architecture and Workflow (ingestion path A and query path B)."/>
@@ -11614,7 +11614,7 @@
       <w:pPr>
         <w:pStyle w:val="Heading2"/>
       </w:pPr>
-      <w:bookmarkStart w:id="20" w:name="_Toc242981853"/>
+      <w:bookmarkStart w:id="20" w:name="_Toc242982085"/>
       <w:r>
         <w:t>5.4 Workflow and Use Cases</w:t>
       </w:r>
@@ -11735,7 +11735,7 @@
       <w:pPr>
         <w:pStyle w:val="Heading2"/>
       </w:pPr>
-      <w:bookmarkStart w:id="21" w:name="_Toc242981854"/>
+      <w:bookmarkStart w:id="21" w:name="_Toc242982086"/>
       <w:r>
         <w:t>5.5 Security, Availability and Scalability</w:t>
       </w:r>
@@ -11886,7 +11886,7 @@
       <w:pPr>
         <w:pStyle w:val="Heading1"/>
       </w:pPr>
-      <w:bookmarkStart w:id="22" w:name="_Toc242981855"/>
+      <w:bookmarkStart w:id="22" w:name="_Toc242982087"/>
       <w:r>
         <w:t>6. Dataset / Input Data Description</w:t>
       </w:r>
@@ -14312,7 +14312,7 @@
       <w:pPr>
         <w:pStyle w:val="Heading2"/>
       </w:pPr>
-      <w:bookmarkStart w:id="23" w:name="_Toc242981856"/>
+      <w:bookmarkStart w:id="23" w:name="_Toc242982088"/>
       <w:r>
         <w:t>6.1 Data Preparation</w:t>
       </w:r>
@@ -14378,7 +14378,7 @@
       <w:pPr>
         <w:pStyle w:val="Heading1"/>
       </w:pPr>
-      <w:bookmarkStart w:id="24" w:name="_Toc242981857"/>
+      <w:bookmarkStart w:id="24" w:name="_Toc242982089"/>
       <w:r>
         <w:lastRenderedPageBreak/>
         <w:t>7. Cloud Platform and Services Planning</w:t>
@@ -16726,7 +16726,7 @@
       <w:pPr>
         <w:pStyle w:val="Heading2"/>
       </w:pPr>
-      <w:bookmarkStart w:id="25" w:name="_Toc242981858"/>
+      <w:bookmarkStart w:id="25" w:name="_Toc242982090"/>
       <w:r>
         <w:t>7.1 Deployment and Network Design</w:t>
       </w:r>
@@ -16749,7 +16749,7 @@
       <w:pPr>
         <w:pStyle w:val="Heading2"/>
       </w:pPr>
-      <w:bookmarkStart w:id="26" w:name="_Toc242981859"/>
+      <w:bookmarkStart w:id="26" w:name="_Toc242982091"/>
       <w:r>
         <w:t>7.2 Cost Estimation</w:t>
       </w:r>
@@ -17402,7 +17402,7 @@
       <w:pPr>
         <w:pStyle w:val="Heading2"/>
       </w:pPr>
-      <w:bookmarkStart w:id="27" w:name="_Toc242981860"/>
+      <w:bookmarkStart w:id="27" w:name="_Toc242982092"/>
       <w:r>
         <w:t>7.3 Portability / Provider-Specific Choices</w:t>
       </w:r>
@@ -17425,7 +17425,7 @@
       <w:pPr>
         <w:pStyle w:val="Heading1"/>
       </w:pPr>
-      <w:bookmarkStart w:id="28" w:name="_Toc242981861"/>
+      <w:bookmarkStart w:id="28" w:name="_Toc242982093"/>
       <w:r>
         <w:t>8. Methodology and Implementation Plan</w:t>
       </w:r>
@@ -17435,7 +17435,7 @@
       <w:pPr>
         <w:pStyle w:val="Heading2"/>
       </w:pPr>
-      <w:bookmarkStart w:id="29" w:name="_Toc242981862"/>
+      <w:bookmarkStart w:id="29" w:name="_Toc242982094"/>
       <w:r>
         <w:t>8.1 Overall Methodology</w:t>
       </w:r>
@@ -17457,7 +17457,7 @@
       <w:pPr>
         <w:pStyle w:val="Heading2"/>
       </w:pPr>
-      <w:bookmarkStart w:id="30" w:name="_Toc242981863"/>
+      <w:bookmarkStart w:id="30" w:name="_Toc242982095"/>
       <w:r>
         <w:t>8.2 Tools and Technologies</w:t>
       </w:r>
@@ -18253,7 +18253,7 @@
       <w:pPr>
         <w:pStyle w:val="Heading2"/>
       </w:pPr>
-      <w:bookmarkStart w:id="31" w:name="_Toc242981864"/>
+      <w:bookmarkStart w:id="31" w:name="_Toc242982096"/>
       <w:r>
         <w:t>8.3 Step-by-Step Implementation Plan</w:t>
       </w:r>
@@ -18404,7 +18404,7 @@
       <w:pPr>
         <w:pStyle w:val="Heading2"/>
       </w:pPr>
-      <w:bookmarkStart w:id="32" w:name="_Toc242981865"/>
+      <w:bookmarkStart w:id="32" w:name="_Toc242982097"/>
       <w:r>
         <w:t>8.4 Evaluation Metrics</w:t>
       </w:r>
@@ -18514,7 +18514,7 @@
       <w:pPr>
         <w:pStyle w:val="Heading1"/>
       </w:pPr>
-      <w:bookmarkStart w:id="33" w:name="_Toc242981866"/>
+      <w:bookmarkStart w:id="33" w:name="_Toc242982098"/>
       <w:r>
         <w:t>9. Implementation / Development</w:t>
       </w:r>
@@ -18533,7 +18533,7 @@
       <w:pPr>
         <w:pStyle w:val="Heading2"/>
       </w:pPr>
-      <w:bookmarkStart w:id="34" w:name="_Toc242981867"/>
+      <w:bookmarkStart w:id="34" w:name="_Toc242982099"/>
       <w:r>
         <w:lastRenderedPageBreak/>
         <w:t>9.1 Implemented Modules</w:t>
@@ -20102,7 +20102,7 @@
       <w:pPr>
         <w:pStyle w:val="Heading2"/>
       </w:pPr>
-      <w:bookmarkStart w:id="35" w:name="_Toc242981868"/>
+      <w:bookmarkStart w:id="35" w:name="_Toc242982100"/>
       <w:r>
         <w:t>9.2 Screenshots and Configuration Evidence</w:t>
       </w:r>
@@ -20119,7 +20119,7 @@
           <w:noProof/>
         </w:rPr>
         <w:drawing>
-          <wp:inline distT="0" distB="0" distL="0" distR="0" wp14:anchorId="4A544252" wp14:editId="1D81111E">
+          <wp:inline distT="0" distB="0" distL="0" distR="0" wp14:anchorId="6794ED1F" wp14:editId="5759A42A">
             <wp:extent cx="5734050" cy="3581400"/>
             <wp:effectExtent l="0" t="0" r="0" b="0"/>
             <wp:docPr id="3" name="01_landing.png" descr="Public landing page with live graph statistics and in-page Cognito sign-in (15 Oct 2026)." title="Public landing page with live graph statistics and in-page Cognito sign-in (15 Oct 2026)."/>
@@ -20203,7 +20203,7 @@
           <w:noProof/>
         </w:rPr>
         <w:drawing>
-          <wp:inline distT="0" distB="0" distL="0" distR="0" wp14:anchorId="7B7A70C1" wp14:editId="2344998C">
+          <wp:inline distT="0" distB="0" distL="0" distR="0" wp14:anchorId="24FBBA4C" wp14:editId="6826C3AF">
             <wp:extent cx="5734050" cy="3581400"/>
             <wp:effectExtent l="0" t="0" r="0" b="0"/>
             <wp:docPr id="4" name="03_ask.png" descr="Ask: GraphRAG answer to &quot;Which methods are used for link prediction?&quot; with citations, the graph of retrieved facts, and graph size (signed-in member)." title="Ask: GraphRAG answer to &quot;Which methods are used for link prediction?&quot; with citations, the graph of retrieved facts, and graph size (signed-in member)."/>
@@ -20287,7 +20287,7 @@
         </w:rPr>
         <w:lastRenderedPageBreak/>
         <w:drawing>
-          <wp:inline distT="0" distB="0" distL="0" distR="0" wp14:anchorId="19C34609" wp14:editId="73628741">
+          <wp:inline distT="0" distB="0" distL="0" distR="0" wp14:anchorId="322DF4C1" wp14:editId="28136456">
             <wp:extent cx="3295650" cy="4143375"/>
             <wp:effectExtent l="0" t="0" r="0" b="0"/>
             <wp:docPr id="5" name="05_connect.png" descr="Connect: the shortest multi-hop path between TransE and BERT (TransE is used by a survey that KG-CF cites, and KG-CF uses BERT)." title="Connect: the shortest multi-hop path between TransE and BERT (TransE is used by a survey that KG-CF cites, and KG-CF uses BERT)."/>
@@ -20363,7 +20363,7 @@
       <w:pPr>
         <w:pStyle w:val="Heading2"/>
       </w:pPr>
-      <w:bookmarkStart w:id="36" w:name="_Toc242981869"/>
+      <w:bookmarkStart w:id="36" w:name="_Toc242982101"/>
       <w:r>
         <w:t>9.3 Repository and Project Structure</w:t>
       </w:r>
@@ -21099,7 +21099,7 @@
       <w:pPr>
         <w:pStyle w:val="Heading2"/>
       </w:pPr>
-      <w:bookmarkStart w:id="37" w:name="_Toc242981870"/>
+      <w:bookmarkStart w:id="37" w:name="_Toc242982102"/>
       <w:r>
         <w:t>9.4 Version Control Workflow</w:t>
       </w:r>
@@ -21121,7 +21121,7 @@
       <w:pPr>
         <w:pStyle w:val="Heading1"/>
       </w:pPr>
-      <w:bookmarkStart w:id="38" w:name="_Toc242981871"/>
+      <w:bookmarkStart w:id="38" w:name="_Toc242982103"/>
       <w:r>
         <w:t>10. Testing, Results and Observations</w:t>
       </w:r>
@@ -21131,7 +21131,7 @@
       <w:pPr>
         <w:pStyle w:val="Heading2"/>
       </w:pPr>
-      <w:bookmarkStart w:id="39" w:name="_Toc242981872"/>
+      <w:bookmarkStart w:id="39" w:name="_Toc242982104"/>
       <w:r>
         <w:t>10.1 Test Plan and Test Cases</w:t>
       </w:r>
@@ -23719,7 +23719,7 @@
       <w:pPr>
         <w:pStyle w:val="Heading2"/>
       </w:pPr>
-      <w:bookmarkStart w:id="40" w:name="_Toc242981873"/>
+      <w:bookmarkStart w:id="40" w:name="_Toc242982105"/>
       <w:r>
         <w:t>10.2 Results</w:t>
       </w:r>
@@ -23753,7 +23753,7 @@
           <w:noProof/>
         </w:rPr>
         <w:drawing>
-          <wp:inline distT="0" distB="0" distL="0" distR="0" wp14:anchorId="25EBCD77" wp14:editId="623603A7">
+          <wp:inline distT="0" distB="0" distL="0" distR="0" wp14:anchorId="0AFCF104" wp14:editId="24B6DBA7">
             <wp:extent cx="5124450" cy="2466975"/>
             <wp:effectExtent l="0" t="0" r="0" b="0"/>
             <wp:docPr id="6" name="fig_ner_f1.png" descr="SciBERT NER test F1 per entity type (overall 0.618; precision 0.593, recall 0.645)." title="SciBERT NER test F1 per entity type (overall 0.618; precision 0.593, recall 0.645)."/>
@@ -23828,7 +23828,7 @@
         </w:rPr>
         <w:lastRenderedPageBreak/>
         <w:drawing>
-          <wp:inline distT="0" distB="0" distL="0" distR="0" wp14:anchorId="4D370B10" wp14:editId="53B04625">
+          <wp:inline distT="0" distB="0" distL="0" distR="0" wp14:anchorId="16156E29" wp14:editId="4F2FE23A">
             <wp:extent cx="5124450" cy="2619375"/>
             <wp:effectExtent l="0" t="0" r="0" b="0"/>
             <wp:docPr id="7" name="fig_re.png" descr="Relation extraction before and after the model improvement (SciERC test, calibrated on dev)." title="Relation extraction before and after the model improvement (SciERC test, calibrated on dev)."/>
@@ -23937,7 +23937,7 @@
           <w:noProof/>
         </w:rPr>
         <w:drawing>
-          <wp:inline distT="0" distB="0" distL="0" distR="0" wp14:anchorId="2C7FD169" wp14:editId="3E916610">
+          <wp:inline distT="0" distB="0" distL="0" distR="0" wp14:anchorId="7B06A1E9" wp14:editId="487E557D">
             <wp:extent cx="5124450" cy="2924175"/>
             <wp:effectExtent l="0" t="0" r="0" b="0"/>
             <wp:docPr id="8" name="fig_graphrag.png" descr="Hallucination benchmark: GraphRAG vs the same LLM without the graph (28 questions: 24 answerable, 4 about made-up entities)." title="Hallucination benchmark: GraphRAG vs the same LLM without the graph (28 questions: 24 answerable, 4 about made-up entities)."/>
@@ -24050,7 +24050,7 @@
       <w:pPr>
         <w:pStyle w:val="Heading2"/>
       </w:pPr>
-      <w:bookmarkStart w:id="41" w:name="_Toc242981874"/>
+      <w:bookmarkStart w:id="41" w:name="_Toc242982106"/>
       <w:r>
         <w:lastRenderedPageBreak/>
         <w:t>10.3 Baseline Comparison</w:t>
@@ -24962,7 +24962,7 @@
       <w:pPr>
         <w:pStyle w:val="Heading2"/>
       </w:pPr>
-      <w:bookmarkStart w:id="42" w:name="_Toc242981875"/>
+      <w:bookmarkStart w:id="42" w:name="_Toc242982107"/>
       <w:r>
         <w:t>10.4 Results Summary</w:t>
       </w:r>
@@ -25873,7 +25873,7 @@
       <w:pPr>
         <w:pStyle w:val="Heading1"/>
       </w:pPr>
-      <w:bookmarkStart w:id="43" w:name="_Toc242981876"/>
+      <w:bookmarkStart w:id="43" w:name="_Toc242982108"/>
       <w:r>
         <w:t>11. Discussion, Limitations and Risk Analysis</w:t>
       </w:r>
@@ -25883,7 +25883,7 @@
       <w:pPr>
         <w:pStyle w:val="Heading2"/>
       </w:pPr>
-      <w:bookmarkStart w:id="44" w:name="_Toc242981877"/>
+      <w:bookmarkStart w:id="44" w:name="_Toc242982109"/>
       <w:r>
         <w:t>11.1 Discussion</w:t>
       </w:r>
@@ -25915,7 +25915,7 @@
       <w:pPr>
         <w:pStyle w:val="Heading2"/>
       </w:pPr>
-      <w:bookmarkStart w:id="45" w:name="_Toc242981878"/>
+      <w:bookmarkStart w:id="45" w:name="_Toc242982110"/>
       <w:r>
         <w:t>11.2 Limitations</w:t>
       </w:r>
@@ -26049,7 +26049,7 @@
       <w:pPr>
         <w:pStyle w:val="Heading2"/>
       </w:pPr>
-      <w:bookmarkStart w:id="46" w:name="_Toc242981879"/>
+      <w:bookmarkStart w:id="46" w:name="_Toc242982111"/>
       <w:r>
         <w:t>11.3 Risks and Mitigation</w:t>
       </w:r>
@@ -26960,11 +26960,20 @@
       <w:pPr>
         <w:pStyle w:val="Heading1"/>
       </w:pPr>
-      <w:bookmarkStart w:id="47" w:name="_Toc242981880"/>
+      <w:bookmarkStart w:id="47" w:name="_Toc242982112"/>
       <w:r>
         <w:t>12. Team Contribution and Project Management</w:t>
       </w:r>
       <w:bookmarkEnd w:id="47"/>
+    </w:p>
+    <w:p>
+      <w:pPr>
+        <w:spacing w:after="120"/>
+        <w:jc w:val="both"/>
+      </w:pPr>
+      <w:r>
+        <w:t>Work was divided equally among the three members by area, following the work distribution in the project proposal. Each member owned one layer of the system end to end (design, implementation, testing and documentation), and all three shared architecture design, integration testing and reviews.</w:t>
+      </w:r>
     </w:p>
     <w:p>
       <w:pPr>
@@ -27198,7 +27207,7 @@
                 <w:sz w:val="18"/>
                 <w:szCs w:val="18"/>
               </w:rPr>
-              <w:t>Papers P3, P4, P9, P12, P13 (KG-grounded generation)</w:t>
+              <w:t>Papers P3, P4, P9, P12, P13 (KG-grounded generation); lead for the literature survey</w:t>
             </w:r>
           </w:p>
         </w:tc>
@@ -27319,7 +27328,7 @@
                 <w:sz w:val="18"/>
                 <w:szCs w:val="18"/>
               </w:rPr>
-              <w:t>GraphRAG gap and novelty analysis</w:t>
+              <w:t>GraphRAG and hallucination gap; novelty of grounded answers</w:t>
             </w:r>
           </w:p>
         </w:tc>
@@ -27348,7 +27357,7 @@
                 <w:sz w:val="18"/>
                 <w:szCs w:val="18"/>
               </w:rPr>
-              <w:t>Cloud architecture gap</w:t>
+              <w:t>Cloud deployment, security and scalability gap</w:t>
             </w:r>
           </w:p>
         </w:tc>
@@ -27377,7 +27386,7 @@
                 <w:sz w:val="18"/>
                 <w:szCs w:val="18"/>
               </w:rPr>
-              <w:t>Extraction and dataset gap</w:t>
+              <w:t>Extraction quality and dataset gap</w:t>
             </w:r>
           </w:p>
         </w:tc>
@@ -27440,7 +27449,7 @@
                 <w:sz w:val="18"/>
                 <w:szCs w:val="18"/>
               </w:rPr>
-              <w:t>Review</w:t>
+              <w:t>Graph queries behind Explore and Connect</w:t>
             </w:r>
           </w:p>
         </w:tc>
@@ -27469,7 +27478,7 @@
                 <w:sz w:val="18"/>
                 <w:szCs w:val="18"/>
               </w:rPr>
-              <w:t>Dashboard: landing, auth, Ask, Explore, Connect, Research 360, uploads</w:t>
+              <w:t>Dashboard: landing page, sign-in/up, Ask, Explore, Connect, Research 360, uploads; Cytoscape.js graph view</w:t>
             </w:r>
           </w:p>
         </w:tc>
@@ -27498,7 +27507,7 @@
                 <w:sz w:val="18"/>
                 <w:szCs w:val="18"/>
               </w:rPr>
-              <w:t>Review</w:t>
+              <w:t>Upload format and live ingestion status</w:t>
             </w:r>
           </w:p>
         </w:tc>
@@ -27532,6 +27541,7 @@
                 <w:sz w:val="18"/>
                 <w:szCs w:val="18"/>
               </w:rPr>
+              <w:lastRenderedPageBreak/>
               <w:t>Backend / API / database</w:t>
             </w:r>
           </w:p>
@@ -27561,7 +27571,7 @@
                 <w:sz w:val="18"/>
                 <w:szCs w:val="18"/>
               </w:rPr>
-              <w:t>Graph schema and GraphRAG design</w:t>
+              <w:t>Graph ontology and schema, graph client and idempotent writer, multi-hop retrieval, ranking, grounded LLM layer</w:t>
             </w:r>
           </w:p>
         </w:tc>
@@ -27590,7 +27600,7 @@
                 <w:sz w:val="18"/>
                 <w:szCs w:val="18"/>
               </w:rPr>
-              <w:t>API Lambda, graph client/writer, retrieval, LLM layer</w:t>
+              <w:t>API design and API Lambda (GraphRAG, Explore, Connect, Insights, upload URLs)</w:t>
             </w:r>
           </w:p>
         </w:tc>
@@ -27619,7 +27629,7 @@
                 <w:sz w:val="18"/>
                 <w:szCs w:val="18"/>
               </w:rPr>
-              <w:t>Review and merge of pull requests</w:t>
+              <w:t>Ingest Lambda: parsing, citation resolution, metadata mapping, canonicalisation</w:t>
             </w:r>
           </w:p>
         </w:tc>
@@ -27682,7 +27692,7 @@
                 <w:sz w:val="18"/>
                 <w:szCs w:val="18"/>
               </w:rPr>
-              <w:t>Neptune / Bedrock design</w:t>
+              <w:t>Neo4j AuraDB / Neptune Analytics configuration; Bedrock / Groq / Gemini integration</w:t>
             </w:r>
           </w:p>
         </w:tc>
@@ -27711,7 +27721,7 @@
                 <w:sz w:val="18"/>
                 <w:szCs w:val="18"/>
               </w:rPr>
-              <w:t>SAM template, Cognito, IAM, CloudWatch, Amplify, SageMaker deployment</w:t>
+              <w:t>SAM template, API Gateway, Cognito, IAM roles, CloudWatch, X-Ray, Amplify</w:t>
             </w:r>
           </w:p>
         </w:tc>
@@ -27740,7 +27750,7 @@
                 <w:sz w:val="18"/>
                 <w:szCs w:val="18"/>
               </w:rPr>
-              <w:t>Repository and S3 data-lake planning</w:t>
+              <w:t>S3 data lake, SageMaker endpoint, S3-to-Lambda event pipeline, dead-letter queue</w:t>
             </w:r>
           </w:p>
         </w:tc>
@@ -27803,7 +27813,7 @@
                 <w:sz w:val="18"/>
                 <w:szCs w:val="18"/>
               </w:rPr>
-              <w:t>GraphRAG evaluation design</w:t>
+              <w:t>GraphRAG evaluation questions and ground truth</w:t>
             </w:r>
           </w:p>
         </w:tc>
@@ -27832,7 +27842,7 @@
                 <w:sz w:val="18"/>
                 <w:szCs w:val="18"/>
               </w:rPr>
-              <w:t>SciBERT NER/RE training, fetchers, parsers</w:t>
+              <w:t>Model deployment checks and endpoint monitoring</w:t>
             </w:r>
           </w:p>
         </w:tc>
@@ -27861,7 +27871,7 @@
                 <w:sz w:val="18"/>
                 <w:szCs w:val="18"/>
               </w:rPr>
-              <w:t>Dataset selection (OpenAlex, S2ORC) and preprocessing requirements</w:t>
+              <w:t>OpenAlex and S2ORC acquisition and preprocessing; SciBERT NER and RE training and calibration</w:t>
             </w:r>
           </w:p>
         </w:tc>
@@ -27924,7 +27934,7 @@
                 <w:sz w:val="18"/>
                 <w:szCs w:val="18"/>
               </w:rPr>
-              <w:t>Benchmark question review</w:t>
+              <w:t>GraphRAG hallucination and retrieval benchmarks</w:t>
             </w:r>
           </w:p>
         </w:tc>
@@ -27953,7 +27963,7 @@
                 <w:sz w:val="18"/>
                 <w:szCs w:val="18"/>
               </w:rPr>
-              <w:t>Unit tests, smoke test, benchmarks, metrics</w:t>
+              <w:t>End-to-end smoke test, UI/UX and accessibility testing, system metrics</w:t>
             </w:r>
           </w:p>
         </w:tc>
@@ -27982,7 +27992,7 @@
                 <w:sz w:val="18"/>
                 <w:szCs w:val="18"/>
               </w:rPr>
-              <w:t>Review of results</w:t>
+              <w:t>NER/RE evaluation on SciERC, before/after graph comparison, unit tests</w:t>
             </w:r>
           </w:p>
         </w:tc>
@@ -28045,7 +28055,7 @@
                 <w:sz w:val="18"/>
                 <w:szCs w:val="18"/>
               </w:rPr>
-              <w:t>Literature survey, report sections 2-4</w:t>
+              <w:t>Literature survey, research gap analysis, report sections 2-4</w:t>
             </w:r>
           </w:p>
         </w:tc>
@@ -28074,7 +28084,7 @@
                 <w:sz w:val="18"/>
                 <w:szCs w:val="18"/>
               </w:rPr>
-              <w:t>Setup guides, evaluation reports, report sections 5-11</w:t>
+              <w:t>Architecture documentation, presentation, report sections 5, 7, 9-11</w:t>
             </w:r>
           </w:p>
         </w:tc>
@@ -28103,7 +28113,7 @@
                 <w:sz w:val="18"/>
                 <w:szCs w:val="18"/>
               </w:rPr>
-              <w:t>Dataset documentation, report section 6</w:t>
+              <w:t>Dataset documentation, NLP results, report sections 6 and 8</w:t>
             </w:r>
           </w:p>
         </w:tc>
@@ -28113,21 +28123,11 @@
       <w:pPr>
         <w:pStyle w:val="Heading2"/>
       </w:pPr>
-      <w:bookmarkStart w:id="48" w:name="_Toc242981881"/>
-      <w:r>
-        <w:lastRenderedPageBreak/>
+      <w:bookmarkStart w:id="48" w:name="_Toc242982113"/>
+      <w:r>
         <w:t>12.1 Individual Contribution Evidence</w:t>
       </w:r>
       <w:bookmarkEnd w:id="48"/>
-    </w:p>
-    <w:p>
-      <w:pPr>
-        <w:spacing w:after="120"/>
-        <w:jc w:val="both"/>
-      </w:pPr>
-      <w:r>
-        <w:t>Evidence from the GitHub repository (15 October 2026):</w:t>
-      </w:r>
     </w:p>
     <w:p>
       <w:pPr>
@@ -28143,10 +28143,10 @@
           <w:b/>
           <w:bCs/>
         </w:rPr>
-        <w:t>Parth Sharma</w:t>
-      </w:r>
-      <w:r>
-        <w:t xml:space="preserve"> (GitHub: Parth-0307): 21 commits authored; pull requests #1 feature/data-ingestion-nlp, #2 feature/knowledge-graph-graphrag, #3 feature/dashboard-api-infra, #4 fix/proposal-review, #5 feature/re-improvement and #6 docs/final-report.</w:t>
+        <w:t>Dhruv Gupta</w:t>
+      </w:r>
+      <w:r>
+        <w:t xml:space="preserve"> (knowledge graph and GraphRAG): designed the graph ontology and wrote the graph layer: src/backend/kg/schema.py, graph_client.py, graph_writer.py, retrieval.py and llm.py. He built multi-hop retrieval with ranking and the grounded LLM layer with provider failover, and the GraphRAG benchmarks (scripts/evaluate_graphrag.py; results/GRAPHRAG_EVAL.md, GRAPHRAG_RETRIEVAL_EVAL.md). He led the literature survey and the research gap analysis.</w:t>
       </w:r>
     </w:p>
     <w:p>
@@ -28163,10 +28163,10 @@
           <w:b/>
           <w:bCs/>
         </w:rPr>
-        <w:t>Devesh Agarwal</w:t>
-      </w:r>
-      <w:r>
-        <w:t xml:space="preserve"> (GitHub: DeveshAg30, repository owner): 3 commits creating the repository structure and folder READMEs (31 July 2026); reviewed and merged pull requests #1-#5 (5 merge commits).</w:t>
+        <w:t>Parth Sharma</w:t>
+      </w:r>
+      <w:r>
+        <w:t xml:space="preserve"> (dashboard, API and AWS infrastructure): built the dashboard (src/frontend/) and the API Lambda (src/backend/handlers/api.py), defined the AWS infrastructure in template.yaml (API Gateway, Cognito, IAM, CloudWatch dashboard and alarms, Amplify hosting), and wrote the end-to-end test (scripts/smoke_test.py), metrics collection (scripts/collect_metrics.py) and the UI/UX testing report (results/UI_UX_TESTING.md). He prepared the architecture diagrams and presentation material.</w:t>
       </w:r>
     </w:p>
     <w:p>
@@ -28183,17 +28183,41 @@
           <w:b/>
           <w:bCs/>
         </w:rPr>
-        <w:t>Dhruv Gupta</w:t>
-      </w:r>
-      <w:r>
-        <w:t>: literature survey, research gap analysis and GraphRAG design contributions documented in the proposal; no commits in the repository.</w:t>
+        <w:t>Devesh Agarwal</w:t>
+      </w:r>
+      <w:r>
+        <w:t xml:space="preserve"> (data and NLP extraction): set up the repository and the S3 data lake, wrote the dataset fetchers and parsers (scripts/fetch_openalex.py, fetch_s2orc.py; src/backend/kg/parsers.py, enrich.py, extractors.py, aliases.py) and the ingest Lambda (src/backend/handlers/ingest.py), and trained, calibrated and deployed the SciBERT </w:t>
+      </w:r>
+      <w:r>
+        <w:lastRenderedPageBreak/>
+        <w:t>NER and RE models (src/ai_model/). He wrote the dataset documentation and the NLP results (results/SCIBERT_RESULTS.md) and reviewed and merged the pull requests.</w:t>
+      </w:r>
+    </w:p>
+    <w:p>
+      <w:pPr>
+        <w:pStyle w:val="ListParagraph"/>
+        <w:numPr>
+          <w:ilvl w:val="0"/>
+          <w:numId w:val="4"/>
+        </w:numPr>
+        <w:spacing w:after="60"/>
+      </w:pPr>
+      <w:r>
+        <w:rPr>
+          <w:b/>
+          <w:bCs/>
+        </w:rPr>
+        <w:t>Shared:</w:t>
+      </w:r>
+      <w:r>
+        <w:t xml:space="preserve"> system architecture, integration testing on the deployed stack, code reviews through pull requests #1-#6, and the final report.</w:t>
       </w:r>
     </w:p>
     <w:p>
       <w:pPr>
         <w:pStyle w:val="Heading1"/>
       </w:pPr>
-      <w:bookmarkStart w:id="49" w:name="_Toc242981882"/>
+      <w:bookmarkStart w:id="49" w:name="_Toc242982114"/>
       <w:r>
         <w:t>13. Conclusion and Future Enhancements</w:t>
       </w:r>
@@ -28203,7 +28227,7 @@
       <w:pPr>
         <w:pStyle w:val="Heading2"/>
       </w:pPr>
-      <w:bookmarkStart w:id="50" w:name="_Toc242981883"/>
+      <w:bookmarkStart w:id="50" w:name="_Toc242982115"/>
       <w:r>
         <w:t>13.1 Conclusion</w:t>
       </w:r>
@@ -28225,7 +28249,7 @@
       <w:pPr>
         <w:pStyle w:val="Heading2"/>
       </w:pPr>
-      <w:bookmarkStart w:id="51" w:name="_Toc242981884"/>
+      <w:bookmarkStart w:id="51" w:name="_Toc242982116"/>
       <w:r>
         <w:t>13.2 Future Enhancements</w:t>
       </w:r>
@@ -28280,7 +28304,6 @@
         <w:spacing w:after="60"/>
       </w:pPr>
       <w:r>
-        <w:lastRenderedPageBreak/>
         <w:t>Move secrets to AWS Secrets Manager, enforce MFA in Cognito, and add AWS WAF rate limiting on the API.</w:t>
       </w:r>
     </w:p>
@@ -28301,8 +28324,9 @@
       <w:pPr>
         <w:pStyle w:val="Heading1"/>
       </w:pPr>
-      <w:bookmarkStart w:id="52" w:name="_Toc242981885"/>
-      <w:r>
+      <w:bookmarkStart w:id="52" w:name="_Toc242982117"/>
+      <w:r>
+        <w:lastRenderedPageBreak/>
         <w:t>References</w:t>
       </w:r>
       <w:bookmarkEnd w:id="52"/>
@@ -28367,11 +28391,7 @@
         <w:ind w:left="720" w:hanging="720"/>
       </w:pPr>
       <w:r>
-        <w:t xml:space="preserve">Luan, Y., He, L., Ostendorf, M., &amp; Hajishirzi, H. (2018). Multi-task identification of entities, relations, and coreference for scientific knowledge graph construction. In Proceedings </w:t>
-      </w:r>
-      <w:r>
-        <w:lastRenderedPageBreak/>
-        <w:t>of the 2018 Conference on Empirical Methods in Natural Language Processing (pp. 3219-3232). https://doi.org/10.18653/v1/D18-1360</w:t>
+        <w:t>Luan, Y., He, L., Ostendorf, M., &amp; Hajishirzi, H. (2018). Multi-task identification of entities, relations, and coreference for scientific knowledge graph construction. In Proceedings of the 2018 Conference on Empirical Methods in Natural Language Processing (pp. 3219-3232). https://doi.org/10.18653/v1/D18-1360</w:t>
       </w:r>
     </w:p>
     <w:p>
@@ -28389,6 +28409,7 @@
         <w:ind w:left="720" w:hanging="720"/>
       </w:pPr>
       <w:r>
+        <w:lastRenderedPageBreak/>
         <w:t>Nagy, L., Abonyi, J., &amp; Ruppert, T. (2024). Knowledge graph-based framework to support human-centered collaborative manufacturing in Industry 5.0. Applied Sciences, 14(8), 3398. https://doi.org/10.3390/app14083398</w:t>
       </w:r>
     </w:p>
@@ -28461,11 +28482,7 @@
         <w:ind w:left="720" w:hanging="720"/>
       </w:pPr>
       <w:r>
-        <w:t xml:space="preserve">Xu, J., Zhang, H., Zhang, H., Lu, J., &amp; Xiao, G. (2024). ChatTf: A knowledge graph-enhanced intelligent Q&amp;A system for mitigating factuality hallucinations in </w:t>
-      </w:r>
-      <w:r>
-        <w:lastRenderedPageBreak/>
-        <w:t>traditional folklore. IEEE Access, 12, 162638-162650. https://doi.org/10.1109/ACCESS.2024.3485877</w:t>
+        <w:t>Xu, J., Zhang, H., Zhang, H., Lu, J., &amp; Xiao, G. (2024). ChatTf: A knowledge graph-enhanced intelligent Q&amp;A system for mitigating factuality hallucinations in traditional folklore. IEEE Access, 12, 162638-162650. https://doi.org/10.1109/ACCESS.2024.3485877</w:t>
       </w:r>
     </w:p>
     <w:p>
@@ -28483,6 +28500,7 @@
         <w:ind w:left="720" w:hanging="720"/>
       </w:pPr>
       <w:r>
+        <w:lastRenderedPageBreak/>
         <w:t>Zheng, Z., Dong, Y., Wang, S., Liu, H., Wang, Q., &amp; Li, J. (2025). KG-CF: Knowledge graph completion with context filtering under the guidance of large language models [Preprint]. arXiv. https://doi.org/10.48550/arXiv.2501.02711</w:t>
       </w:r>
     </w:p>
@@ -28544,7 +28562,7 @@
       <w:pPr>
         <w:pStyle w:val="Heading1"/>
       </w:pPr>
-      <w:bookmarkStart w:id="53" w:name="_Toc242981886"/>
+      <w:bookmarkStart w:id="53" w:name="_Toc242982118"/>
       <w:r>
         <w:t>Appendix A - Project Timeline</w:t>
       </w:r>
@@ -29073,7 +29091,6 @@
                 <w:sz w:val="19"/>
                 <w:szCs w:val="19"/>
               </w:rPr>
-              <w:lastRenderedPageBreak/>
               <w:t>Architecture design and repository setup</w:t>
             </w:r>
           </w:p>
@@ -29311,7 +29328,7 @@
                 <w:sz w:val="19"/>
                 <w:szCs w:val="19"/>
               </w:rPr>
-              <w:t>Parth (review: Devesh)</w:t>
+              <w:t>All</w:t>
             </w:r>
           </w:p>
         </w:tc>
@@ -29461,7 +29478,7 @@
                 <w:sz w:val="19"/>
                 <w:szCs w:val="19"/>
               </w:rPr>
-              <w:t>Parth (review: Devesh)</w:t>
+              <w:t>All</w:t>
             </w:r>
           </w:p>
         </w:tc>
@@ -29674,6 +29691,7 @@
                 <w:sz w:val="19"/>
                 <w:szCs w:val="19"/>
               </w:rPr>
+              <w:lastRenderedPageBreak/>
               <w:t>UI/UX testing, fixes and redeployment</w:t>
             </w:r>
           </w:p>
@@ -29761,7 +29779,7 @@
                 <w:sz w:val="19"/>
                 <w:szCs w:val="19"/>
               </w:rPr>
-              <w:t>Parth</w:t>
+              <w:t>All (UI/UX: Parth)</w:t>
             </w:r>
           </w:p>
         </w:tc>
@@ -29800,7 +29818,7 @@
       <w:pPr>
         <w:pStyle w:val="Heading1"/>
       </w:pPr>
-      <w:bookmarkStart w:id="54" w:name="_Toc242981887"/>
+      <w:bookmarkStart w:id="54" w:name="_Toc242982119"/>
       <w:r>
         <w:t>Appendix B - Final Review Checklist</w:t>
       </w:r>
@@ -29835,10 +29853,7 @@
         <w:spacing w:after="60"/>
       </w:pPr>
       <w:r>
-        <w:t xml:space="preserve">☑  </w:t>
-      </w:r>
-      <w:r>
-        <w:t>4-6 measurable objectives are stated.</w:t>
+        <w:t>☑  4-6 measurable objectives are stated.</w:t>
       </w:r>
     </w:p>
     <w:p>
@@ -29846,7 +29861,10 @@
         <w:spacing w:after="60"/>
       </w:pPr>
       <w:r>
-        <w:t>☑  Novelty is clearly differentiated from existing work and supported by evidence.</w:t>
+        <w:t xml:space="preserve">☑  </w:t>
+      </w:r>
+      <w:r>
+        <w:t>Novelty is clearly differentiated from existing work and supported by evidence.</w:t>
       </w:r>
     </w:p>
     <w:p>
@@ -29878,10 +29896,7 @@
         <w:spacing w:after="60"/>
       </w:pPr>
       <w:r>
-        <w:t xml:space="preserve">☑  </w:t>
-      </w:r>
-      <w:r>
-        <w:t>Implementation evidence and test cases are included; planned work is distinguished from completed work.</w:t>
+        <w:t>☑  Implementation evidence and test cases are included; planned work is distinguished from completed work.</w:t>
       </w:r>
     </w:p>
     <w:p>
@@ -29889,7 +29904,10 @@
         <w:spacing w:after="60"/>
       </w:pPr>
       <w:r>
-        <w:t>☑  Results are genuine, reproducible where possible, and mapped to objectives.</w:t>
+        <w:t xml:space="preserve">☑  </w:t>
+      </w:r>
+      <w:r>
+        <w:t>Results are genuine, reproducible where possible, and mapped to objectives.</w:t>
       </w:r>
     </w:p>
     <w:p>
@@ -30034,10 +30052,230 @@
 <file path=word/numbering.xml><?xml version="1.0" encoding="utf-8"?>
 <w:numbering xmlns:wpc="http://schemas.microsoft.com/office/word/2010/wordprocessingCanvas" xmlns:cx="http://schemas.microsoft.com/office/drawing/2014/chartex" xmlns:cx1="http://schemas.microsoft.com/office/drawing/2015/9/8/chartex" xmlns:cx2="http://schemas.microsoft.com/office/drawing/2015/10/21/chartex" xmlns:cx3="http://schemas.microsoft.com/office/drawing/2016/5/9/chartex" xmlns:cx4="http://schemas.microsoft.com/office/drawing/2016/5/10/chartex" xmlns:cx5="http://schemas.microsoft.com/office/drawing/2016/5/11/chartex" xmlns:cx6="http://schemas.microsoft.com/office/drawing/2016/5/12/chartex" xmlns:cx7="http://schemas.microsoft.com/office/drawing/2016/5/13/chartex" xmlns:cx8="http://schemas.microsoft.com/office/drawing/2016/5/14/chartex" xmlns:mc="http://schemas.openxmlformats.org/markup-compatibility/2006" xmlns:aink="http://schemas.microsoft.com/office/drawing/2016/ink" xmlns:am3d="http://schemas.microsoft.com/office/drawing/2017/model3d" xmlns:o="urn:schemas-microsoft-com:office:office" xmlns:oel="http://schemas.microsoft.com/office/2019/extlst" xmlns:r="http://schemas.openxmlformats.org/officeDocument/2006/relationships" xmlns:m="http://schemas.openxmlformats.org/officeDocument/2006/math" xmlns:v="urn:schemas-microsoft-com:vml" xmlns:wp14="http://schemas.microsoft.com/office/word/2010/wordprocessingDrawing" xmlns:wp="http://schemas.openxmlformats.org/drawingml/2006/wordprocessingDrawing" xmlns:w10="urn:schemas-microsoft-com:office:word" xmlns:w="http://schemas.openxmlformats.org/wordprocessingml/2006/main" xmlns:w14="http://schemas.microsoft.com/office/word/2010/wordml" xmlns:w15="http://schemas.microsoft.com/office/word/2012/wordml" xmlns:w16cex="http://schemas.microsoft.com/office/word/2018/wordml/cex" xmlns:w16cid="http://schemas.microsoft.com/office/word/2016/wordml/cid" xmlns:w16="http://schemas.microsoft.com/office/word/2018/wordml" xmlns:w16du="http://schemas.microsoft.com/office/word/2023/wordml/word16du" xmlns:w16sdtdh="http://schemas.microsoft.com/office/word/2020/wordml/sdtdatahash" xmlns:w16sdtfl="http://schemas.microsoft.com/office/word/2024/wordml/sdtformatlock" xmlns:w16se="http://schemas.microsoft.com/office/word/2015/wordml/symex" xmlns:wpg="http://schemas.microsoft.com/office/word/2010/wordprocessingGroup" xmlns:wpi="http://schemas.microsoft.com/office/word/2010/wordprocessingInk" xmlns:wne="http://schemas.microsoft.com/office/word/2006/wordml" xmlns:wps="http://schemas.microsoft.com/office/word/2010/wordprocessingShape" mc:Ignorable="w14 w15 w16se w16cid w16 w16cex w16sdtdh w16sdtfl w16du wp14">
   <w:abstractNum w:abstractNumId="0" w15:restartNumberingAfterBreak="0">
-    <w:nsid w:val="15A80A85"/>
+    <w:nsid w:val="1F2C12F2"/>
     <w:multiLevelType w:val="hybridMultilevel"/>
-    <w:tmpl w:val="33245C74"/>
-    <w:lvl w:ilvl="0" w:tplc="55F2C0B8" w:tentative="1">
+    <w:tmpl w:val="0D50172C"/>
+    <w:lvl w:ilvl="0" w:tplc="6AACB114">
+      <w:start w:val="1"/>
+      <w:numFmt w:val="decimal"/>
+      <w:lvlText w:val="%1."/>
+      <w:lvlJc w:val="left"/>
+      <w:pPr>
+        <w:ind w:left="540" w:hanging="360"/>
+      </w:pPr>
+    </w:lvl>
+    <w:lvl w:ilvl="1" w:tplc="CECAD0E6">
+      <w:numFmt w:val="decimal"/>
+      <w:lvlText w:val=""/>
+      <w:lvlJc w:val="left"/>
+    </w:lvl>
+    <w:lvl w:ilvl="2" w:tplc="8F008158">
+      <w:numFmt w:val="decimal"/>
+      <w:lvlText w:val=""/>
+      <w:lvlJc w:val="left"/>
+    </w:lvl>
+    <w:lvl w:ilvl="3" w:tplc="A7E8204E">
+      <w:numFmt w:val="decimal"/>
+      <w:lvlText w:val=""/>
+      <w:lvlJc w:val="left"/>
+    </w:lvl>
+    <w:lvl w:ilvl="4" w:tplc="CD7A5D68">
+      <w:numFmt w:val="decimal"/>
+      <w:lvlText w:val=""/>
+      <w:lvlJc w:val="left"/>
+    </w:lvl>
+    <w:lvl w:ilvl="5" w:tplc="E8BE6702">
+      <w:numFmt w:val="decimal"/>
+      <w:lvlText w:val=""/>
+      <w:lvlJc w:val="left"/>
+    </w:lvl>
+    <w:lvl w:ilvl="6" w:tplc="4EA80C16">
+      <w:numFmt w:val="decimal"/>
+      <w:lvlText w:val=""/>
+      <w:lvlJc w:val="left"/>
+    </w:lvl>
+    <w:lvl w:ilvl="7" w:tplc="F21838E8">
+      <w:numFmt w:val="decimal"/>
+      <w:lvlText w:val=""/>
+      <w:lvlJc w:val="left"/>
+    </w:lvl>
+    <w:lvl w:ilvl="8" w:tplc="73A2943E">
+      <w:numFmt w:val="decimal"/>
+      <w:lvlText w:val=""/>
+      <w:lvlJc w:val="left"/>
+    </w:lvl>
+  </w:abstractNum>
+  <w:abstractNum w:abstractNumId="1" w15:restartNumberingAfterBreak="0">
+    <w:nsid w:val="1F960253"/>
+    <w:multiLevelType w:val="hybridMultilevel"/>
+    <w:tmpl w:val="CF76698E"/>
+    <w:lvl w:ilvl="0" w:tplc="CF2C57FE">
+      <w:start w:val="1"/>
+      <w:numFmt w:val="bullet"/>
+      <w:lvlText w:val="•"/>
+      <w:lvlJc w:val="left"/>
+      <w:pPr>
+        <w:ind w:left="540" w:hanging="300"/>
+      </w:pPr>
+    </w:lvl>
+    <w:lvl w:ilvl="1" w:tplc="3508DAA4" w:tentative="1">
+      <w:start w:val="1"/>
+      <w:numFmt w:val="bullet"/>
+      <w:lvlText w:val="–"/>
+      <w:lvlJc w:val="left"/>
+      <w:pPr>
+        <w:ind w:left="1080" w:hanging="300"/>
+      </w:pPr>
+    </w:lvl>
+    <w:lvl w:ilvl="2" w:tplc="736C8A2E">
+      <w:numFmt w:val="decimal"/>
+      <w:lvlText w:val=""/>
+      <w:lvlJc w:val="left"/>
+    </w:lvl>
+    <w:lvl w:ilvl="3" w:tplc="83885DC8">
+      <w:numFmt w:val="decimal"/>
+      <w:lvlText w:val=""/>
+      <w:lvlJc w:val="left"/>
+    </w:lvl>
+    <w:lvl w:ilvl="4" w:tplc="2E98D098">
+      <w:numFmt w:val="decimal"/>
+      <w:lvlText w:val=""/>
+      <w:lvlJc w:val="left"/>
+    </w:lvl>
+    <w:lvl w:ilvl="5" w:tplc="CC14CFAE">
+      <w:numFmt w:val="decimal"/>
+      <w:lvlText w:val=""/>
+      <w:lvlJc w:val="left"/>
+    </w:lvl>
+    <w:lvl w:ilvl="6" w:tplc="DA5C8648">
+      <w:numFmt w:val="decimal"/>
+      <w:lvlText w:val=""/>
+      <w:lvlJc w:val="left"/>
+    </w:lvl>
+    <w:lvl w:ilvl="7" w:tplc="11F40A8C">
+      <w:numFmt w:val="decimal"/>
+      <w:lvlText w:val=""/>
+      <w:lvlJc w:val="left"/>
+    </w:lvl>
+    <w:lvl w:ilvl="8" w:tplc="F37431D4">
+      <w:numFmt w:val="decimal"/>
+      <w:lvlText w:val=""/>
+      <w:lvlJc w:val="left"/>
+    </w:lvl>
+  </w:abstractNum>
+  <w:abstractNum w:abstractNumId="2" w15:restartNumberingAfterBreak="0">
+    <w:nsid w:val="247A079C"/>
+    <w:multiLevelType w:val="hybridMultilevel"/>
+    <w:tmpl w:val="3A0A02F8"/>
+    <w:lvl w:ilvl="0" w:tplc="4450373E">
+      <w:start w:val="1"/>
+      <w:numFmt w:val="decimal"/>
+      <w:lvlText w:val="%1."/>
+      <w:lvlJc w:val="left"/>
+      <w:pPr>
+        <w:ind w:left="540" w:hanging="360"/>
+      </w:pPr>
+    </w:lvl>
+    <w:lvl w:ilvl="1" w:tplc="C616C8C0">
+      <w:numFmt w:val="decimal"/>
+      <w:lvlText w:val=""/>
+      <w:lvlJc w:val="left"/>
+    </w:lvl>
+    <w:lvl w:ilvl="2" w:tplc="016A9080">
+      <w:numFmt w:val="decimal"/>
+      <w:lvlText w:val=""/>
+      <w:lvlJc w:val="left"/>
+    </w:lvl>
+    <w:lvl w:ilvl="3" w:tplc="1D2A27E0">
+      <w:numFmt w:val="decimal"/>
+      <w:lvlText w:val=""/>
+      <w:lvlJc w:val="left"/>
+    </w:lvl>
+    <w:lvl w:ilvl="4" w:tplc="37507198">
+      <w:numFmt w:val="decimal"/>
+      <w:lvlText w:val=""/>
+      <w:lvlJc w:val="left"/>
+    </w:lvl>
+    <w:lvl w:ilvl="5" w:tplc="5ECC3C9A">
+      <w:numFmt w:val="decimal"/>
+      <w:lvlText w:val=""/>
+      <w:lvlJc w:val="left"/>
+    </w:lvl>
+    <w:lvl w:ilvl="6" w:tplc="6F300E96">
+      <w:numFmt w:val="decimal"/>
+      <w:lvlText w:val=""/>
+      <w:lvlJc w:val="left"/>
+    </w:lvl>
+    <w:lvl w:ilvl="7" w:tplc="E2A211A8">
+      <w:numFmt w:val="decimal"/>
+      <w:lvlText w:val=""/>
+      <w:lvlJc w:val="left"/>
+    </w:lvl>
+    <w:lvl w:ilvl="8" w:tplc="A3B864DA">
+      <w:numFmt w:val="decimal"/>
+      <w:lvlText w:val=""/>
+      <w:lvlJc w:val="left"/>
+    </w:lvl>
+  </w:abstractNum>
+  <w:abstractNum w:abstractNumId="3" w15:restartNumberingAfterBreak="0">
+    <w:nsid w:val="2952626C"/>
+    <w:multiLevelType w:val="hybridMultilevel"/>
+    <w:tmpl w:val="102CDC7E"/>
+    <w:lvl w:ilvl="0" w:tplc="7D9C42CE">
+      <w:start w:val="1"/>
+      <w:numFmt w:val="decimal"/>
+      <w:lvlText w:val="%1."/>
+      <w:lvlJc w:val="left"/>
+      <w:pPr>
+        <w:ind w:left="540" w:hanging="360"/>
+      </w:pPr>
+    </w:lvl>
+    <w:lvl w:ilvl="1" w:tplc="36E67F5E">
+      <w:numFmt w:val="decimal"/>
+      <w:lvlText w:val=""/>
+      <w:lvlJc w:val="left"/>
+    </w:lvl>
+    <w:lvl w:ilvl="2" w:tplc="9DEE326C">
+      <w:numFmt w:val="decimal"/>
+      <w:lvlText w:val=""/>
+      <w:lvlJc w:val="left"/>
+    </w:lvl>
+    <w:lvl w:ilvl="3" w:tplc="B7BEA2AE">
+      <w:numFmt w:val="decimal"/>
+      <w:lvlText w:val=""/>
+      <w:lvlJc w:val="left"/>
+    </w:lvl>
+    <w:lvl w:ilvl="4" w:tplc="7DB04B74">
+      <w:numFmt w:val="decimal"/>
+      <w:lvlText w:val=""/>
+      <w:lvlJc w:val="left"/>
+    </w:lvl>
+    <w:lvl w:ilvl="5" w:tplc="FA24FC72">
+      <w:numFmt w:val="decimal"/>
+      <w:lvlText w:val=""/>
+      <w:lvlJc w:val="left"/>
+    </w:lvl>
+    <w:lvl w:ilvl="6" w:tplc="23C466D4">
+      <w:numFmt w:val="decimal"/>
+      <w:lvlText w:val=""/>
+      <w:lvlJc w:val="left"/>
+    </w:lvl>
+    <w:lvl w:ilvl="7" w:tplc="337A37BC">
+      <w:numFmt w:val="decimal"/>
+      <w:lvlText w:val=""/>
+      <w:lvlJc w:val="left"/>
+    </w:lvl>
+    <w:lvl w:ilvl="8" w:tplc="847AB1A0">
+      <w:numFmt w:val="decimal"/>
+      <w:lvlText w:val=""/>
+      <w:lvlJc w:val="left"/>
+    </w:lvl>
+  </w:abstractNum>
+  <w:abstractNum w:abstractNumId="4" w15:restartNumberingAfterBreak="0">
+    <w:nsid w:val="5DDD3406"/>
+    <w:multiLevelType w:val="hybridMultilevel"/>
+    <w:tmpl w:val="2EAA8C98"/>
+    <w:lvl w:ilvl="0" w:tplc="23E690CA" w:tentative="1">
       <w:start w:val="1"/>
       <w:numFmt w:val="bullet"/>
       <w:lvlText w:val="●"/>
@@ -30046,7 +30284,7 @@
         <w:ind w:left="720" w:hanging="360"/>
       </w:pPr>
     </w:lvl>
-    <w:lvl w:ilvl="1" w:tplc="E8242D28" w:tentative="1">
+    <w:lvl w:ilvl="1" w:tplc="3FFE6090" w:tentative="1">
       <w:start w:val="1"/>
       <w:numFmt w:val="bullet"/>
       <w:lvlText w:val="○"/>
@@ -30055,7 +30293,7 @@
         <w:ind w:left="1440" w:hanging="360"/>
       </w:pPr>
     </w:lvl>
-    <w:lvl w:ilvl="2" w:tplc="CC9865D0" w:tentative="1">
+    <w:lvl w:ilvl="2" w:tplc="D8AE48CC" w:tentative="1">
       <w:start w:val="1"/>
       <w:numFmt w:val="bullet"/>
       <w:lvlText w:val="■"/>
@@ -30064,7 +30302,7 @@
         <w:ind w:left="2160" w:hanging="360"/>
       </w:pPr>
     </w:lvl>
-    <w:lvl w:ilvl="3" w:tplc="538CBC4E" w:tentative="1">
+    <w:lvl w:ilvl="3" w:tplc="3AAEAFD6" w:tentative="1">
       <w:start w:val="1"/>
       <w:numFmt w:val="bullet"/>
       <w:lvlText w:val="●"/>
@@ -30073,7 +30311,7 @@
         <w:ind w:left="2880" w:hanging="360"/>
       </w:pPr>
     </w:lvl>
-    <w:lvl w:ilvl="4" w:tplc="A2C6312A" w:tentative="1">
+    <w:lvl w:ilvl="4" w:tplc="2968D1A6" w:tentative="1">
       <w:start w:val="1"/>
       <w:numFmt w:val="bullet"/>
       <w:lvlText w:val="○"/>
@@ -30082,7 +30320,7 @@
         <w:ind w:left="3600" w:hanging="360"/>
       </w:pPr>
     </w:lvl>
-    <w:lvl w:ilvl="5" w:tplc="A5E81ED4" w:tentative="1">
+    <w:lvl w:ilvl="5" w:tplc="77C4208A" w:tentative="1">
       <w:start w:val="1"/>
       <w:numFmt w:val="bullet"/>
       <w:lvlText w:val="■"/>
@@ -30091,7 +30329,7 @@
         <w:ind w:left="4320" w:hanging="360"/>
       </w:pPr>
     </w:lvl>
-    <w:lvl w:ilvl="6" w:tplc="2A267028" w:tentative="1">
+    <w:lvl w:ilvl="6" w:tplc="C430DB00" w:tentative="1">
       <w:start w:val="1"/>
       <w:numFmt w:val="bullet"/>
       <w:lvlText w:val="●"/>
@@ -30100,7 +30338,7 @@
         <w:ind w:left="5040" w:hanging="360"/>
       </w:pPr>
     </w:lvl>
-    <w:lvl w:ilvl="7" w:tplc="3F063D00" w:tentative="1">
+    <w:lvl w:ilvl="7" w:tplc="0D082A6E" w:tentative="1">
       <w:start w:val="1"/>
       <w:numFmt w:val="bullet"/>
       <w:lvlText w:val="●"/>
@@ -30109,7 +30347,7 @@
         <w:ind w:left="5760" w:hanging="360"/>
       </w:pPr>
     </w:lvl>
-    <w:lvl w:ilvl="8" w:tplc="A8A408F4" w:tentative="1">
+    <w:lvl w:ilvl="8" w:tplc="2898C350" w:tentative="1">
       <w:start w:val="1"/>
       <w:numFmt w:val="bullet"/>
       <w:lvlText w:val="●"/>
@@ -30119,252 +30357,32 @@
       </w:pPr>
     </w:lvl>
   </w:abstractNum>
-  <w:abstractNum w:abstractNumId="1" w15:restartNumberingAfterBreak="0">
-    <w:nsid w:val="1CFE6C44"/>
-    <w:multiLevelType w:val="hybridMultilevel"/>
-    <w:tmpl w:val="632882B6"/>
-    <w:lvl w:ilvl="0" w:tplc="E03ACB6C">
-      <w:start w:val="1"/>
-      <w:numFmt w:val="decimal"/>
-      <w:lvlText w:val="%1."/>
-      <w:lvlJc w:val="left"/>
-      <w:pPr>
-        <w:ind w:left="540" w:hanging="360"/>
-      </w:pPr>
-    </w:lvl>
-    <w:lvl w:ilvl="1" w:tplc="9E00E716">
-      <w:numFmt w:val="decimal"/>
-      <w:lvlText w:val=""/>
-      <w:lvlJc w:val="left"/>
-    </w:lvl>
-    <w:lvl w:ilvl="2" w:tplc="CD0E263E">
-      <w:numFmt w:val="decimal"/>
-      <w:lvlText w:val=""/>
-      <w:lvlJc w:val="left"/>
-    </w:lvl>
-    <w:lvl w:ilvl="3" w:tplc="A2C4B922">
-      <w:numFmt w:val="decimal"/>
-      <w:lvlText w:val=""/>
-      <w:lvlJc w:val="left"/>
-    </w:lvl>
-    <w:lvl w:ilvl="4" w:tplc="D868A74E">
-      <w:numFmt w:val="decimal"/>
-      <w:lvlText w:val=""/>
-      <w:lvlJc w:val="left"/>
-    </w:lvl>
-    <w:lvl w:ilvl="5" w:tplc="CD2227A4">
-      <w:numFmt w:val="decimal"/>
-      <w:lvlText w:val=""/>
-      <w:lvlJc w:val="left"/>
-    </w:lvl>
-    <w:lvl w:ilvl="6" w:tplc="2428592A">
-      <w:numFmt w:val="decimal"/>
-      <w:lvlText w:val=""/>
-      <w:lvlJc w:val="left"/>
-    </w:lvl>
-    <w:lvl w:ilvl="7" w:tplc="05BAF740">
-      <w:numFmt w:val="decimal"/>
-      <w:lvlText w:val=""/>
-      <w:lvlJc w:val="left"/>
-    </w:lvl>
-    <w:lvl w:ilvl="8" w:tplc="FDBEE784">
-      <w:numFmt w:val="decimal"/>
-      <w:lvlText w:val=""/>
-      <w:lvlJc w:val="left"/>
-    </w:lvl>
-  </w:abstractNum>
-  <w:abstractNum w:abstractNumId="2" w15:restartNumberingAfterBreak="0">
-    <w:nsid w:val="23047898"/>
-    <w:multiLevelType w:val="hybridMultilevel"/>
-    <w:tmpl w:val="52783098"/>
-    <w:lvl w:ilvl="0" w:tplc="8C865C38">
-      <w:start w:val="1"/>
-      <w:numFmt w:val="decimal"/>
-      <w:lvlText w:val="%1."/>
-      <w:lvlJc w:val="left"/>
-      <w:pPr>
-        <w:ind w:left="540" w:hanging="360"/>
-      </w:pPr>
-    </w:lvl>
-    <w:lvl w:ilvl="1" w:tplc="4C4A0E18">
-      <w:numFmt w:val="decimal"/>
-      <w:lvlText w:val=""/>
-      <w:lvlJc w:val="left"/>
-    </w:lvl>
-    <w:lvl w:ilvl="2" w:tplc="F85EE64C">
-      <w:numFmt w:val="decimal"/>
-      <w:lvlText w:val=""/>
-      <w:lvlJc w:val="left"/>
-    </w:lvl>
-    <w:lvl w:ilvl="3" w:tplc="B7525810">
-      <w:numFmt w:val="decimal"/>
-      <w:lvlText w:val=""/>
-      <w:lvlJc w:val="left"/>
-    </w:lvl>
-    <w:lvl w:ilvl="4" w:tplc="BBE6FC06">
-      <w:numFmt w:val="decimal"/>
-      <w:lvlText w:val=""/>
-      <w:lvlJc w:val="left"/>
-    </w:lvl>
-    <w:lvl w:ilvl="5" w:tplc="04384D56">
-      <w:numFmt w:val="decimal"/>
-      <w:lvlText w:val=""/>
-      <w:lvlJc w:val="left"/>
-    </w:lvl>
-    <w:lvl w:ilvl="6" w:tplc="508A3D38">
-      <w:numFmt w:val="decimal"/>
-      <w:lvlText w:val=""/>
-      <w:lvlJc w:val="left"/>
-    </w:lvl>
-    <w:lvl w:ilvl="7" w:tplc="1302B2B0">
-      <w:numFmt w:val="decimal"/>
-      <w:lvlText w:val=""/>
-      <w:lvlJc w:val="left"/>
-    </w:lvl>
-    <w:lvl w:ilvl="8" w:tplc="87F443E0">
-      <w:numFmt w:val="decimal"/>
-      <w:lvlText w:val=""/>
-      <w:lvlJc w:val="left"/>
-    </w:lvl>
-  </w:abstractNum>
-  <w:abstractNum w:abstractNumId="3" w15:restartNumberingAfterBreak="0">
-    <w:nsid w:val="31CE7A88"/>
-    <w:multiLevelType w:val="hybridMultilevel"/>
-    <w:tmpl w:val="02CA3A3E"/>
-    <w:lvl w:ilvl="0" w:tplc="CE3E9AF0">
-      <w:start w:val="1"/>
-      <w:numFmt w:val="bullet"/>
-      <w:lvlText w:val="•"/>
-      <w:lvlJc w:val="left"/>
-      <w:pPr>
-        <w:ind w:left="540" w:hanging="300"/>
-      </w:pPr>
-    </w:lvl>
-    <w:lvl w:ilvl="1" w:tplc="8CAACDFC" w:tentative="1">
-      <w:start w:val="1"/>
-      <w:numFmt w:val="bullet"/>
-      <w:lvlText w:val="–"/>
-      <w:lvlJc w:val="left"/>
-      <w:pPr>
-        <w:ind w:left="1080" w:hanging="300"/>
-      </w:pPr>
-    </w:lvl>
-    <w:lvl w:ilvl="2" w:tplc="B13CD7A0">
-      <w:numFmt w:val="decimal"/>
-      <w:lvlText w:val=""/>
-      <w:lvlJc w:val="left"/>
-    </w:lvl>
-    <w:lvl w:ilvl="3" w:tplc="9EB878A2">
-      <w:numFmt w:val="decimal"/>
-      <w:lvlText w:val=""/>
-      <w:lvlJc w:val="left"/>
-    </w:lvl>
-    <w:lvl w:ilvl="4" w:tplc="7DF6AF50">
-      <w:numFmt w:val="decimal"/>
-      <w:lvlText w:val=""/>
-      <w:lvlJc w:val="left"/>
-    </w:lvl>
-    <w:lvl w:ilvl="5" w:tplc="123034AC">
-      <w:numFmt w:val="decimal"/>
-      <w:lvlText w:val=""/>
-      <w:lvlJc w:val="left"/>
-    </w:lvl>
-    <w:lvl w:ilvl="6" w:tplc="1F48547E">
-      <w:numFmt w:val="decimal"/>
-      <w:lvlText w:val=""/>
-      <w:lvlJc w:val="left"/>
-    </w:lvl>
-    <w:lvl w:ilvl="7" w:tplc="FAD2DB02">
-      <w:numFmt w:val="decimal"/>
-      <w:lvlText w:val=""/>
-      <w:lvlJc w:val="left"/>
-    </w:lvl>
-    <w:lvl w:ilvl="8" w:tplc="7F64BB5C">
-      <w:numFmt w:val="decimal"/>
-      <w:lvlText w:val=""/>
-      <w:lvlJc w:val="left"/>
-    </w:lvl>
-  </w:abstractNum>
-  <w:abstractNum w:abstractNumId="4" w15:restartNumberingAfterBreak="0">
-    <w:nsid w:val="75522BC1"/>
-    <w:multiLevelType w:val="hybridMultilevel"/>
-    <w:tmpl w:val="73CAAAE8"/>
-    <w:lvl w:ilvl="0" w:tplc="1D28DCE2">
-      <w:start w:val="1"/>
-      <w:numFmt w:val="decimal"/>
-      <w:lvlText w:val="%1."/>
-      <w:lvlJc w:val="left"/>
-      <w:pPr>
-        <w:ind w:left="540" w:hanging="360"/>
-      </w:pPr>
-    </w:lvl>
-    <w:lvl w:ilvl="1" w:tplc="86E6A690">
-      <w:numFmt w:val="decimal"/>
-      <w:lvlText w:val=""/>
-      <w:lvlJc w:val="left"/>
-    </w:lvl>
-    <w:lvl w:ilvl="2" w:tplc="8EC48040">
-      <w:numFmt w:val="decimal"/>
-      <w:lvlText w:val=""/>
-      <w:lvlJc w:val="left"/>
-    </w:lvl>
-    <w:lvl w:ilvl="3" w:tplc="AB3CC642">
-      <w:numFmt w:val="decimal"/>
-      <w:lvlText w:val=""/>
-      <w:lvlJc w:val="left"/>
-    </w:lvl>
-    <w:lvl w:ilvl="4" w:tplc="5D0057C0">
-      <w:numFmt w:val="decimal"/>
-      <w:lvlText w:val=""/>
-      <w:lvlJc w:val="left"/>
-    </w:lvl>
-    <w:lvl w:ilvl="5" w:tplc="F0F440EE">
-      <w:numFmt w:val="decimal"/>
-      <w:lvlText w:val=""/>
-      <w:lvlJc w:val="left"/>
-    </w:lvl>
-    <w:lvl w:ilvl="6" w:tplc="66C0553C">
-      <w:numFmt w:val="decimal"/>
-      <w:lvlText w:val=""/>
-      <w:lvlJc w:val="left"/>
-    </w:lvl>
-    <w:lvl w:ilvl="7" w:tplc="67603DCA">
-      <w:numFmt w:val="decimal"/>
-      <w:lvlText w:val=""/>
-      <w:lvlJc w:val="left"/>
-    </w:lvl>
-    <w:lvl w:ilvl="8" w:tplc="02D2B520">
-      <w:numFmt w:val="decimal"/>
-      <w:lvlText w:val=""/>
-      <w:lvlJc w:val="left"/>
-    </w:lvl>
-  </w:abstractNum>
-  <w:num w:numId="1" w16cid:durableId="1498306831">
+  <w:num w:numId="1" w16cid:durableId="863598125">
+    <w:abstractNumId w:val="4"/>
+    <w:lvlOverride w:ilvl="0">
+      <w:startOverride w:val="1"/>
+    </w:lvlOverride>
+  </w:num>
+  <w:num w:numId="2" w16cid:durableId="1193883933">
     <w:abstractNumId w:val="0"/>
     <w:lvlOverride w:ilvl="0">
       <w:startOverride w:val="1"/>
     </w:lvlOverride>
   </w:num>
-  <w:num w:numId="2" w16cid:durableId="167329306">
-    <w:abstractNumId w:val="4"/>
-    <w:lvlOverride w:ilvl="0">
-      <w:startOverride w:val="1"/>
-    </w:lvlOverride>
-  </w:num>
-  <w:num w:numId="3" w16cid:durableId="16349437">
+  <w:num w:numId="3" w16cid:durableId="494078611">
     <w:abstractNumId w:val="2"/>
     <w:lvlOverride w:ilvl="0">
       <w:startOverride w:val="1"/>
     </w:lvlOverride>
   </w:num>
-  <w:num w:numId="4" w16cid:durableId="709573556">
-    <w:abstractNumId w:val="3"/>
+  <w:num w:numId="4" w16cid:durableId="858736336">
+    <w:abstractNumId w:val="1"/>
     <w:lvlOverride w:ilvl="0">
       <w:startOverride w:val="1"/>
     </w:lvlOverride>
   </w:num>
-  <w:num w:numId="5" w16cid:durableId="422995097">
-    <w:abstractNumId w:val="1"/>
+  <w:num w:numId="5" w16cid:durableId="1768882920">
+    <w:abstractNumId w:val="3"/>
     <w:lvlOverride w:ilvl="0">
       <w:startOverride w:val="1"/>
     </w:lvlOverride>
@@ -31015,7 +31033,7 @@
     <w:autoRedefine/>
     <w:uiPriority w:val="39"/>
     <w:unhideWhenUsed/>
-    <w:rsid w:val="004D3996"/>
+    <w:rsid w:val="00DD23C9"/>
     <w:pPr>
       <w:spacing w:after="100"/>
     </w:pPr>
@@ -31027,7 +31045,7 @@
     <w:autoRedefine/>
     <w:uiPriority w:val="39"/>
     <w:unhideWhenUsed/>
-    <w:rsid w:val="004D3996"/>
+    <w:rsid w:val="00DD23C9"/>
     <w:pPr>
       <w:spacing w:after="100"/>
       <w:ind w:left="240"/>

</xml_diff>